<commit_message>
Nosto napit valmis. Tek.määrittely muokkaus
</commit_message>
<xml_diff>
--- a/Documents/tekninen_maarittely.docx
+++ b/Documents/tekninen_maarittely.docx
@@ -2372,14 +2372,6 @@
                 <w:szCs w:val="20"/>
               </w:rPr>
             </w:pPr>
-            <w:r>
-              <w:rPr>
-                <w:color w:val="000000" w:themeColor="text1"/>
-                <w:sz w:val="20"/>
-                <w:szCs w:val="20"/>
-              </w:rPr>
-              <w:t>Talleta rahaa (Pano)</w:t>
-            </w:r>
           </w:p>
         </w:tc>
         <w:tc>
@@ -2397,14 +2389,6 @@
                 <w:szCs w:val="24"/>
               </w:rPr>
             </w:pPr>
-            <w:r>
-              <w:rPr>
-                <w:color w:val="000000" w:themeColor="text1"/>
-                <w:sz w:val="20"/>
-                <w:szCs w:val="20"/>
-              </w:rPr>
-              <w:t>Asiakas syöttää valitsemansa rahamäärän automaattiin ja automaatti tallettaa rahat asiakkaan tilille.</w:t>
-            </w:r>
           </w:p>
         </w:tc>
       </w:tr>
@@ -6468,16 +6452,6 @@
                 <w:szCs w:val="20"/>
               </w:rPr>
             </w:pPr>
-            <w:r>
-              <w:rPr>
-                <w:b/>
-                <w:bCs/>
-                <w:color w:val="000000" w:themeColor="text1"/>
-                <w:sz w:val="20"/>
-                <w:szCs w:val="20"/>
-              </w:rPr>
-              <w:t>Talleta rahaa (Pano)</w:t>
-            </w:r>
           </w:p>
         </w:tc>
       </w:tr>
@@ -6535,15 +6509,6 @@
                 <w:szCs w:val="20"/>
               </w:rPr>
             </w:pPr>
-            <w:r>
-              <w:rPr>
-                <w:rFonts w:ascii="Verdana" w:hAnsi="Verdana"/>
-                <w:color w:val="000000" w:themeColor="text1"/>
-                <w:sz w:val="20"/>
-                <w:szCs w:val="20"/>
-              </w:rPr>
-              <w:t>Pankkiautomaattisovellus</w:t>
-            </w:r>
           </w:p>
         </w:tc>
       </w:tr>
@@ -6601,33 +6566,6 @@
                 <w:szCs w:val="20"/>
               </w:rPr>
             </w:pPr>
-            <w:r>
-              <w:rPr>
-                <w:rFonts w:ascii="Verdana" w:hAnsi="Verdana"/>
-                <w:color w:val="000000" w:themeColor="text1"/>
-                <w:sz w:val="20"/>
-                <w:szCs w:val="20"/>
-              </w:rPr>
-              <w:t xml:space="preserve">Pankkiautomaatti vastaanottaa rahaa </w:t>
-            </w:r>
-            <w:r>
-              <w:rPr>
-                <w:rFonts w:ascii="Verdana" w:hAnsi="Verdana"/>
-                <w:color w:val="000000" w:themeColor="text1"/>
-                <w:sz w:val="20"/>
-                <w:szCs w:val="20"/>
-              </w:rPr>
-              <w:t>käyttäjältä</w:t>
-            </w:r>
-            <w:r>
-              <w:rPr>
-                <w:rFonts w:ascii="Verdana" w:hAnsi="Verdana"/>
-                <w:color w:val="000000" w:themeColor="text1"/>
-                <w:sz w:val="20"/>
-                <w:szCs w:val="20"/>
-              </w:rPr>
-              <w:t xml:space="preserve"> ja lisää ne hänen tililleen</w:t>
-            </w:r>
           </w:p>
         </w:tc>
       </w:tr>
@@ -6685,14 +6623,6 @@
                 <w:szCs w:val="20"/>
               </w:rPr>
             </w:pPr>
-            <w:r>
-              <w:rPr>
-                <w:rFonts w:ascii="Verdana" w:hAnsi="Verdana" w:cs="Verdana"/>
-                <w:sz w:val="20"/>
-                <w:szCs w:val="20"/>
-              </w:rPr>
-              <w:t>Kirjauduttu pankkiautomaatin käyttäjäksi, yhteys tietokantaan on kunnossa ja tietokanta on toiminnassa.</w:t>
-            </w:r>
           </w:p>
         </w:tc>
       </w:tr>
@@ -6749,102 +6679,6 @@
                 <w:szCs w:val="20"/>
               </w:rPr>
             </w:pPr>
-            <w:r>
-              <w:rPr>
-                <w:rFonts w:ascii="Verdana" w:hAnsi="Verdana" w:cs="Verdana"/>
-                <w:sz w:val="20"/>
-                <w:szCs w:val="20"/>
-              </w:rPr>
-              <w:t xml:space="preserve">1.  </w:t>
-            </w:r>
-            <w:r>
-              <w:rPr>
-                <w:rFonts w:ascii="Verdana" w:hAnsi="Verdana" w:cs="Verdana"/>
-                <w:sz w:val="20"/>
-                <w:szCs w:val="20"/>
-              </w:rPr>
-              <w:t xml:space="preserve"> </w:t>
-            </w:r>
-            <w:r>
-              <w:rPr>
-                <w:rFonts w:ascii="Verdana" w:hAnsi="Verdana" w:cs="Verdana"/>
-                <w:sz w:val="20"/>
-                <w:szCs w:val="20"/>
-              </w:rPr>
-              <w:t xml:space="preserve">Pääkäyttöliittymästä painetaan Talleta rahaa -painiketta. </w:t>
-            </w:r>
-          </w:p>
-          <w:p>
-            <w:pPr>
-              <w:pStyle w:val="Yltunniste"/>
-              <w:tabs>
-                <w:tab w:val="clear" w:pos="4819"/>
-                <w:tab w:val="clear" w:pos="9638"/>
-              </w:tabs>
-              <w:spacing w:line="360" w:lineRule="auto"/>
-              <w:jc w:val="both"/>
-              <w:rPr>
-                <w:rFonts w:ascii="Verdana" w:hAnsi="Verdana" w:cs="Verdana"/>
-                <w:sz w:val="20"/>
-                <w:szCs w:val="20"/>
-              </w:rPr>
-            </w:pPr>
-            <w:r>
-              <w:rPr>
-                <w:rFonts w:ascii="Verdana" w:hAnsi="Verdana" w:cs="Verdana"/>
-                <w:sz w:val="20"/>
-                <w:szCs w:val="20"/>
-              </w:rPr>
-              <w:t xml:space="preserve">2. Tietokannasta haetaan tiedot ja käyttöliittymässä näytetään omistajan tiedot ja tilin saldo. </w:t>
-            </w:r>
-          </w:p>
-          <w:p>
-            <w:pPr>
-              <w:pStyle w:val="Yltunniste"/>
-              <w:tabs>
-                <w:tab w:val="clear" w:pos="4819"/>
-                <w:tab w:val="clear" w:pos="9638"/>
-              </w:tabs>
-              <w:spacing w:line="360" w:lineRule="auto"/>
-              <w:jc w:val="both"/>
-              <w:rPr>
-                <w:rFonts w:ascii="Verdana" w:hAnsi="Verdana" w:cs="Verdana"/>
-                <w:sz w:val="20"/>
-                <w:szCs w:val="20"/>
-              </w:rPr>
-            </w:pPr>
-            <w:r>
-              <w:rPr>
-                <w:rFonts w:ascii="Verdana" w:hAnsi="Verdana" w:cs="Verdana"/>
-                <w:sz w:val="20"/>
-                <w:szCs w:val="20"/>
-              </w:rPr>
-              <w:t>3. Käyttäjä kirjoittaa vapaavalintaisen summan käyttöliittymässä</w:t>
-            </w:r>
-            <w:r>
-              <w:rPr>
-                <w:rFonts w:ascii="Verdana" w:hAnsi="Verdana" w:cs="Verdana"/>
-                <w:sz w:val="20"/>
-                <w:szCs w:val="20"/>
-              </w:rPr>
-              <w:t xml:space="preserve"> sijaitsevaan laatikkoon</w:t>
-            </w:r>
-            <w:r>
-              <w:rPr>
-                <w:rFonts w:ascii="Verdana" w:hAnsi="Verdana" w:cs="Verdana"/>
-                <w:sz w:val="20"/>
-                <w:szCs w:val="20"/>
-              </w:rPr>
-              <w:t xml:space="preserve"> ja painaa sen jälkeen Talleta -painiketta ja tämän jälkeen talletetut varat näkyvät käyttäjän tilillä</w:t>
-            </w:r>
-            <w:r>
-              <w:rPr>
-                <w:rFonts w:ascii="Verdana" w:hAnsi="Verdana" w:cs="Verdana"/>
-                <w:sz w:val="20"/>
-                <w:szCs w:val="20"/>
-              </w:rPr>
-              <w:t>. 4. Käyttöliittymän Sulje-painiketta painamalla palataan takaisin pääkäyttöliittymään.</w:t>
-            </w:r>
           </w:p>
         </w:tc>
       </w:tr>
@@ -6902,30 +6736,6 @@
                 <w:szCs w:val="20"/>
               </w:rPr>
             </w:pPr>
-            <w:r>
-              <w:rPr>
-                <w:rFonts w:ascii="Verdana" w:hAnsi="Verdana" w:cs="Verdana"/>
-                <w:sz w:val="20"/>
-                <w:szCs w:val="20"/>
-              </w:rPr>
-              <w:t>Käyttäjä on tallet</w:t>
-            </w:r>
-            <w:r>
-              <w:rPr>
-                <w:rFonts w:ascii="Verdana" w:hAnsi="Verdana" w:cs="Verdana"/>
-                <w:sz w:val="20"/>
-                <w:szCs w:val="20"/>
-              </w:rPr>
-              <w:t>t</w:t>
-            </w:r>
-            <w:r>
-              <w:rPr>
-                <w:rFonts w:ascii="Verdana" w:hAnsi="Verdana" w:cs="Verdana"/>
-                <w:sz w:val="20"/>
-                <w:szCs w:val="20"/>
-              </w:rPr>
-              <w:t>anut valitsemansa summan käyttöliittymään ja rahamäärä on päivittynyt käyttäjän tilille.</w:t>
-            </w:r>
           </w:p>
         </w:tc>
       </w:tr>
@@ -8154,7 +7964,7 @@
         <w:tblLook w:val="04A0" w:firstRow="1" w:lastRow="0" w:firstColumn="1" w:lastColumn="0" w:noHBand="0" w:noVBand="1"/>
       </w:tblPr>
       <w:tblGrid>
-        <w:gridCol w:w="10176"/>
+        <w:gridCol w:w="10536"/>
       </w:tblGrid>
       <w:tr>
         <w:trPr>
@@ -8182,10 +7992,10 @@
                 <w:noProof/>
               </w:rPr>
               <w:drawing>
-                <wp:inline distT="0" distB="0" distL="0" distR="0" wp14:anchorId="001B8719" wp14:editId="46498CA2">
-                  <wp:extent cx="6316392" cy="5049624"/>
-                  <wp:effectExtent l="0" t="0" r="8255" b="0"/>
-                  <wp:docPr id="2086759044" name="Kuva 4" descr="Kuva, joka sisältää kohteen teksti, kuvakaappaus, diagrammi, Samansuuntainen"/>
+                <wp:inline distT="0" distB="0" distL="0" distR="0" wp14:anchorId="28C60472" wp14:editId="3D99732B">
+                  <wp:extent cx="6548755" cy="5229225"/>
+                  <wp:effectExtent l="0" t="0" r="4445" b="9525"/>
+                  <wp:docPr id="192012832" name="Kuva 1" descr="Kuva, joka sisältää kohteen teksti, kuvakaappaus, diagrammi, Samansuuntainen&#10;&#10;Tekoälyllä luotu sisältö voi olla virheellistä."/>
                   <wp:cNvGraphicFramePr>
                     <a:graphicFrameLocks xmlns:a="http://schemas.openxmlformats.org/drawingml/2006/main" noChangeAspect="1"/>
                   </wp:cNvGraphicFramePr>
@@ -8193,7 +8003,7 @@
                     <a:graphicData uri="http://schemas.openxmlformats.org/drawingml/2006/picture">
                       <pic:pic xmlns:pic="http://schemas.openxmlformats.org/drawingml/2006/picture">
                         <pic:nvPicPr>
-                          <pic:cNvPr id="2086759044" name="Kuva 4" descr="Kuva, joka sisältää kohteen teksti, kuvakaappaus, diagrammi, Samansuuntainen"/>
+                          <pic:cNvPr id="192012832" name="Kuva 1" descr="Kuva, joka sisältää kohteen teksti, kuvakaappaus, diagrammi, Samansuuntainen&#10;&#10;Tekoälyllä luotu sisältö voi olla virheellistä."/>
                           <pic:cNvPicPr/>
                         </pic:nvPicPr>
                         <pic:blipFill>
@@ -8205,7 +8015,7 @@
                         <pic:spPr>
                           <a:xfrm>
                             <a:off x="0" y="0"/>
-                            <a:ext cx="6346194" cy="5073449"/>
+                            <a:ext cx="6566312" cy="5243244"/>
                           </a:xfrm>
                           <a:prstGeom prst="rect">
                             <a:avLst/>
@@ -8540,7 +8350,7 @@
           <w:sz w:val="36"/>
           <w:szCs w:val="36"/>
         </w:rPr>
-        <w:t>Komponentin nimi</w:t>
+        <w:t>Nosto</w:t>
       </w:r>
     </w:p>
     <w:tbl>
@@ -8611,7 +8421,7 @@
                 <w:sz w:val="20"/>
                 <w:szCs w:val="20"/>
               </w:rPr>
-              <w:t>Mihin tarkoitukseen komponentti tehtiin? Miten komponentti toimii? Lyhyt parin rivin selitys.</w:t>
+              <w:t>Komponentin tarkoituksena on, että asiakas voi nostaa rahaa tililtään. Pääkäyttöliittymästä asiakas siirtyy nosto ikkunaan missä voi nostaa eri summia eri napeista. Myös vapaavalintainen summa on mahdollista, kunhan summa on kymppejä</w:t>
             </w:r>
             <w:r>
               <w:rPr>
@@ -9167,6 +8977,7 @@
                 <w:sz w:val="20"/>
                 <w:szCs w:val="20"/>
               </w:rPr>
+              <w:lastRenderedPageBreak/>
               <w:t>Vastuuhenkilö(t)</w:t>
             </w:r>
           </w:p>
@@ -15235,17 +15046,6 @@
 </file>
 
 <file path=customXml/item1.xml><?xml version="1.0" encoding="utf-8"?>
-<p:properties xmlns:p="http://schemas.microsoft.com/office/2006/metadata/properties" xmlns:xsi="http://www.w3.org/2001/XMLSchema-instance" xmlns:pc="http://schemas.microsoft.com/office/infopath/2007/PartnerControls">
-  <documentManagement>
-    <lcf76f155ced4ddcb4097134ff3c332f xmlns="d3831626-fde5-4fc8-acc5-9526b66ab2bb">
-      <Terms xmlns="http://schemas.microsoft.com/office/infopath/2007/PartnerControls"/>
-    </lcf76f155ced4ddcb4097134ff3c332f>
-    <TaxCatchAll xmlns="b5314b1c-0f5c-4851-9378-7099df4806ca" xsi:nil="true"/>
-  </documentManagement>
-</p:properties>
-</file>
-
-<file path=customXml/item2.xml><?xml version="1.0" encoding="utf-8"?>
 <ct:contentTypeSchema xmlns:ct="http://schemas.microsoft.com/office/2006/metadata/contentType" xmlns:ma="http://schemas.microsoft.com/office/2006/metadata/properties/metaAttributes" ct:_="" ma:_="" ma:contentTypeName="Document" ma:contentTypeID="0x0101009C12936ABBAE164AB3E3B1E737DB3796" ma:contentTypeVersion="12" ma:contentTypeDescription="Create a new document." ma:contentTypeScope="" ma:versionID="a3c7e968aca90f61141995ffe44e8398">
   <xsd:schema xmlns:xsd="http://www.w3.org/2001/XMLSchema" xmlns:xs="http://www.w3.org/2001/XMLSchema" xmlns:p="http://schemas.microsoft.com/office/2006/metadata/properties" xmlns:ns2="d3831626-fde5-4fc8-acc5-9526b66ab2bb" xmlns:ns3="b5314b1c-0f5c-4851-9378-7099df4806ca" targetNamespace="http://schemas.microsoft.com/office/2006/metadata/properties" ma:root="true" ma:fieldsID="87450be8a9b396dcd3e7509fc153b825" ns2:_="" ns3:_="">
     <xsd:import namespace="d3831626-fde5-4fc8-acc5-9526b66ab2bb"/>
@@ -15446,11 +15246,18 @@
 </ct:contentTypeSchema>
 </file>
 
-<file path=customXml/item3.xml><?xml version="1.0" encoding="utf-8"?>
-<b:Sources xmlns:b="http://schemas.openxmlformats.org/officeDocument/2006/bibliography" xmlns="http://schemas.openxmlformats.org/officeDocument/2006/bibliography" SelectedStyle="\APA.XSL" StyleName="APA"/>
+<file path=customXml/item2.xml><?xml version="1.0" encoding="utf-8"?>
+<p:properties xmlns:p="http://schemas.microsoft.com/office/2006/metadata/properties" xmlns:xsi="http://www.w3.org/2001/XMLSchema-instance" xmlns:pc="http://schemas.microsoft.com/office/infopath/2007/PartnerControls">
+  <documentManagement>
+    <lcf76f155ced4ddcb4097134ff3c332f xmlns="d3831626-fde5-4fc8-acc5-9526b66ab2bb">
+      <Terms xmlns="http://schemas.microsoft.com/office/infopath/2007/PartnerControls"/>
+    </lcf76f155ced4ddcb4097134ff3c332f>
+    <TaxCatchAll xmlns="b5314b1c-0f5c-4851-9378-7099df4806ca" xsi:nil="true"/>
+  </documentManagement>
+</p:properties>
 </file>
 
-<file path=customXml/item4.xml><?xml version="1.0" encoding="utf-8"?>
+<file path=customXml/item3.xml><?xml version="1.0" encoding="utf-8"?>
 <?mso-contentType ?>
 <FormTemplates xmlns="http://schemas.microsoft.com/sharepoint/v3/contenttype/forms">
   <Display>DocumentLibraryForm</Display>
@@ -15459,18 +15266,11 @@
 </FormTemplates>
 </file>
 
-<file path=customXml/itemProps1.xml><?xml version="1.0" encoding="utf-8"?>
-<ds:datastoreItem xmlns:ds="http://schemas.openxmlformats.org/officeDocument/2006/customXml" ds:itemID="{EE41A236-5C73-4451-B1B7-A171E48F7377}">
-  <ds:schemaRefs>
-    <ds:schemaRef ds:uri="http://schemas.microsoft.com/office/2006/metadata/properties"/>
-    <ds:schemaRef ds:uri="http://schemas.microsoft.com/office/infopath/2007/PartnerControls"/>
-    <ds:schemaRef ds:uri="d3831626-fde5-4fc8-acc5-9526b66ab2bb"/>
-    <ds:schemaRef ds:uri="b5314b1c-0f5c-4851-9378-7099df4806ca"/>
-  </ds:schemaRefs>
-</ds:datastoreItem>
+<file path=customXml/item4.xml><?xml version="1.0" encoding="utf-8"?>
+<b:Sources xmlns:b="http://schemas.openxmlformats.org/officeDocument/2006/bibliography" xmlns="http://schemas.openxmlformats.org/officeDocument/2006/bibliography" SelectedStyle="\APA.XSL" StyleName="APA"/>
 </file>
 
-<file path=customXml/itemProps2.xml><?xml version="1.0" encoding="utf-8"?>
+<file path=customXml/itemProps1.xml><?xml version="1.0" encoding="utf-8"?>
 <ds:datastoreItem xmlns:ds="http://schemas.openxmlformats.org/officeDocument/2006/customXml" ds:itemID="{3BB198E8-0F36-4C71-8940-04215BB7641E}">
   <ds:schemaRefs>
     <ds:schemaRef ds:uri="http://schemas.microsoft.com/office/2006/metadata/contentType"/>
@@ -15489,18 +15289,29 @@
 </ds:datastoreItem>
 </file>
 
+<file path=customXml/itemProps2.xml><?xml version="1.0" encoding="utf-8"?>
+<ds:datastoreItem xmlns:ds="http://schemas.openxmlformats.org/officeDocument/2006/customXml" ds:itemID="{EE41A236-5C73-4451-B1B7-A171E48F7377}">
+  <ds:schemaRefs>
+    <ds:schemaRef ds:uri="http://schemas.microsoft.com/office/2006/metadata/properties"/>
+    <ds:schemaRef ds:uri="http://schemas.microsoft.com/office/infopath/2007/PartnerControls"/>
+    <ds:schemaRef ds:uri="d3831626-fde5-4fc8-acc5-9526b66ab2bb"/>
+    <ds:schemaRef ds:uri="b5314b1c-0f5c-4851-9378-7099df4806ca"/>
+  </ds:schemaRefs>
+</ds:datastoreItem>
+</file>
+
 <file path=customXml/itemProps3.xml><?xml version="1.0" encoding="utf-8"?>
+<ds:datastoreItem xmlns:ds="http://schemas.openxmlformats.org/officeDocument/2006/customXml" ds:itemID="{13DB4B30-73AF-4FCD-BA9E-CA11CB4B5807}">
+  <ds:schemaRefs>
+    <ds:schemaRef ds:uri="http://schemas.microsoft.com/sharepoint/v3/contenttype/forms"/>
+  </ds:schemaRefs>
+</ds:datastoreItem>
+</file>
+
+<file path=customXml/itemProps4.xml><?xml version="1.0" encoding="utf-8"?>
 <ds:datastoreItem xmlns:ds="http://schemas.openxmlformats.org/officeDocument/2006/customXml" ds:itemID="{2BA0B919-FBBB-4BB8-90D2-33E6A0B69F94}">
   <ds:schemaRefs>
     <ds:schemaRef ds:uri="http://schemas.openxmlformats.org/officeDocument/2006/bibliography"/>
   </ds:schemaRefs>
 </ds:datastoreItem>
-</file>
-
-<file path=customXml/itemProps4.xml><?xml version="1.0" encoding="utf-8"?>
-<ds:datastoreItem xmlns:ds="http://schemas.openxmlformats.org/officeDocument/2006/customXml" ds:itemID="{13DB4B30-73AF-4FCD-BA9E-CA11CB4B5807}">
-  <ds:schemaRefs>
-    <ds:schemaRef ds:uri="http://schemas.microsoft.com/sharepoint/v3/contenttype/forms"/>
-  </ds:schemaRefs>
-</ds:datastoreItem>
 </file>
</xml_diff>

<commit_message>
Nosto komponentti kuvaus lisätty
</commit_message>
<xml_diff>
--- a/Documents/tekninen_maarittely.docx
+++ b/Documents/tekninen_maarittely.docx
@@ -8334,7 +8334,7 @@
           <w:bCs/>
           <w:i/>
           <w:iCs/>
-          <w:color w:val="FF0000"/>
+          <w:color w:val="000000" w:themeColor="text1"/>
           <w:sz w:val="36"/>
           <w:szCs w:val="36"/>
         </w:rPr>
@@ -8346,7 +8346,7 @@
           <w:bCs/>
           <w:i/>
           <w:iCs/>
-          <w:color w:val="FF0000"/>
+          <w:color w:val="000000" w:themeColor="text1"/>
           <w:sz w:val="36"/>
           <w:szCs w:val="36"/>
         </w:rPr>
@@ -8379,6 +8379,7 @@
                 <w:rFonts w:ascii="Verdana" w:hAnsi="Verdana" w:cs="Verdana"/>
                 <w:b/>
                 <w:bCs/>
+                <w:color w:val="000000" w:themeColor="text1"/>
                 <w:sz w:val="20"/>
                 <w:szCs w:val="20"/>
               </w:rPr>
@@ -8388,6 +8389,7 @@
                 <w:rFonts w:ascii="Verdana" w:hAnsi="Verdana" w:cs="Verdana"/>
                 <w:b/>
                 <w:bCs/>
+                <w:color w:val="000000" w:themeColor="text1"/>
                 <w:sz w:val="20"/>
                 <w:szCs w:val="20"/>
               </w:rPr>
@@ -8408,6 +8410,7 @@
                 <w:rFonts w:ascii="Verdana" w:hAnsi="Verdana" w:cs="Verdana"/>
                 <w:i/>
                 <w:iCs/>
+                <w:color w:val="000000" w:themeColor="text1"/>
                 <w:sz w:val="20"/>
                 <w:szCs w:val="20"/>
               </w:rPr>
@@ -8417,7 +8420,7 @@
                 <w:rFonts w:ascii="Verdana" w:hAnsi="Verdana" w:cs="Verdana"/>
                 <w:i/>
                 <w:iCs/>
-                <w:color w:val="FF0000"/>
+                <w:color w:val="000000" w:themeColor="text1"/>
                 <w:sz w:val="20"/>
                 <w:szCs w:val="20"/>
               </w:rPr>
@@ -8428,7 +8431,7 @@
                 <w:rFonts w:ascii="Verdana" w:hAnsi="Verdana" w:cs="Verdana"/>
                 <w:i/>
                 <w:iCs/>
-                <w:color w:val="FF0000"/>
+                <w:color w:val="000000" w:themeColor="text1"/>
                 <w:sz w:val="20"/>
                 <w:szCs w:val="20"/>
               </w:rPr>
@@ -8444,6 +8447,7 @@
                 <w:rFonts w:ascii="Verdana" w:hAnsi="Verdana" w:cs="Verdana"/>
                 <w:i/>
                 <w:iCs/>
+                <w:color w:val="000000" w:themeColor="text1"/>
                 <w:sz w:val="20"/>
                 <w:szCs w:val="20"/>
               </w:rPr>
@@ -8503,11 +8507,81 @@
                 <w:rFonts w:ascii="Verdana" w:hAnsi="Verdana" w:cs="Verdana"/>
                 <w:i/>
                 <w:iCs/>
-                <w:color w:val="FF0000"/>
-                <w:sz w:val="20"/>
-                <w:szCs w:val="20"/>
-              </w:rPr>
-              <w:t>Sovellus, DLL, REST API, tietokanta, muu?</w:t>
+                <w:color w:val="000000" w:themeColor="text1"/>
+                <w:sz w:val="20"/>
+                <w:szCs w:val="20"/>
+              </w:rPr>
+              <w:t xml:space="preserve">Käyttöliittymä komponentti, joka kommunikoi REST API </w:t>
+            </w:r>
+            <w:proofErr w:type="spellStart"/>
+            <w:r>
+              <w:rPr>
+                <w:rFonts w:ascii="Verdana" w:hAnsi="Verdana" w:cs="Verdana"/>
+                <w:i/>
+                <w:iCs/>
+                <w:color w:val="000000" w:themeColor="text1"/>
+                <w:sz w:val="20"/>
+                <w:szCs w:val="20"/>
+              </w:rPr>
+              <w:t>backendin</w:t>
+            </w:r>
+            <w:proofErr w:type="spellEnd"/>
+            <w:r>
+              <w:rPr>
+                <w:rFonts w:ascii="Verdana" w:hAnsi="Verdana" w:cs="Verdana"/>
+                <w:i/>
+                <w:iCs/>
+                <w:color w:val="000000" w:themeColor="text1"/>
+                <w:sz w:val="20"/>
+                <w:szCs w:val="20"/>
+              </w:rPr>
+              <w:t xml:space="preserve"> kanssa. Tämä komponentti toimii osana </w:t>
+            </w:r>
+            <w:r>
+              <w:rPr>
+                <w:rFonts w:ascii="Verdana" w:hAnsi="Verdana" w:cs="Verdana"/>
+                <w:i/>
+                <w:iCs/>
+                <w:color w:val="000000" w:themeColor="text1"/>
+                <w:sz w:val="20"/>
+                <w:szCs w:val="20"/>
+              </w:rPr>
+              <w:t xml:space="preserve">pankkiautomaatti </w:t>
+            </w:r>
+            <w:r>
+              <w:rPr>
+                <w:rFonts w:ascii="Verdana" w:hAnsi="Verdana" w:cs="Verdana"/>
+                <w:i/>
+                <w:iCs/>
+                <w:color w:val="000000" w:themeColor="text1"/>
+                <w:sz w:val="20"/>
+                <w:szCs w:val="20"/>
+              </w:rPr>
+              <w:t xml:space="preserve">asiakassovellusta. Komponentti on </w:t>
+            </w:r>
+            <w:proofErr w:type="spellStart"/>
+            <w:r>
+              <w:rPr>
+                <w:rFonts w:ascii="Verdana" w:hAnsi="Verdana" w:cs="Verdana"/>
+                <w:i/>
+                <w:iCs/>
+                <w:color w:val="000000" w:themeColor="text1"/>
+                <w:sz w:val="20"/>
+                <w:szCs w:val="20"/>
+              </w:rPr>
+              <w:t>Qt</w:t>
+            </w:r>
+            <w:proofErr w:type="spellEnd"/>
+            <w:r>
+              <w:rPr>
+                <w:rFonts w:ascii="Verdana" w:hAnsi="Verdana" w:cs="Verdana"/>
+                <w:i/>
+                <w:iCs/>
+                <w:color w:val="000000" w:themeColor="text1"/>
+                <w:sz w:val="20"/>
+                <w:szCs w:val="20"/>
+              </w:rPr>
+              <w:t>-pohjainen.</w:t>
             </w:r>
             <w:r>
               <w:rPr>
@@ -8569,15 +8643,64 @@
                 <w:szCs w:val="20"/>
               </w:rPr>
             </w:pPr>
-            <w:r>
-              <w:rPr>
-                <w:rFonts w:ascii="Verdana" w:hAnsi="Verdana" w:cs="Verdana"/>
-                <w:i/>
-                <w:iCs/>
-                <w:color w:val="FF0000"/>
-                <w:szCs w:val="20"/>
-              </w:rPr>
-              <w:t>Kuva tähän.</w:t>
+          </w:p>
+          <w:p>
+            <w:pPr>
+              <w:autoSpaceDE/>
+              <w:autoSpaceDN/>
+              <w:spacing w:line="276" w:lineRule="auto"/>
+              <w:rPr>
+                <w:rFonts w:ascii="Verdana" w:hAnsi="Verdana" w:cs="Verdana"/>
+                <w:b/>
+                <w:bCs/>
+                <w:sz w:val="20"/>
+                <w:szCs w:val="20"/>
+              </w:rPr>
+            </w:pPr>
+            <w:r>
+              <w:rPr>
+                <w:rFonts w:ascii="Verdana" w:hAnsi="Verdana" w:cs="Verdana"/>
+                <w:b/>
+                <w:bCs/>
+                <w:noProof/>
+                <w:sz w:val="20"/>
+                <w:szCs w:val="20"/>
+              </w:rPr>
+              <w:drawing>
+                <wp:inline distT="0" distB="0" distL="0" distR="0" wp14:anchorId="1F6B7FD6" wp14:editId="4DB88528">
+                  <wp:extent cx="3067050" cy="3419191"/>
+                  <wp:effectExtent l="0" t="0" r="0" b="0"/>
+                  <wp:docPr id="1046487142" name="Kuva 1" descr="Kuva, joka sisältää kohteen teksti, kuvakaappaus, Fontti, dokumentti&#10;&#10;Tekoälyllä luotu sisältö voi olla virheellistä."/>
+                  <wp:cNvGraphicFramePr>
+                    <a:graphicFrameLocks xmlns:a="http://schemas.openxmlformats.org/drawingml/2006/main" noChangeAspect="1"/>
+                  </wp:cNvGraphicFramePr>
+                  <a:graphic xmlns:a="http://schemas.openxmlformats.org/drawingml/2006/main">
+                    <a:graphicData uri="http://schemas.openxmlformats.org/drawingml/2006/picture">
+                      <pic:pic xmlns:pic="http://schemas.openxmlformats.org/drawingml/2006/picture">
+                        <pic:nvPicPr>
+                          <pic:cNvPr id="1046487142" name="Kuva 1" descr="Kuva, joka sisältää kohteen teksti, kuvakaappaus, Fontti, dokumentti&#10;&#10;Tekoälyllä luotu sisältö voi olla virheellistä."/>
+                          <pic:cNvPicPr/>
+                        </pic:nvPicPr>
+                        <pic:blipFill>
+                          <a:blip r:embed="rId17"/>
+                          <a:stretch>
+                            <a:fillRect/>
+                          </a:stretch>
+                        </pic:blipFill>
+                        <pic:spPr>
+                          <a:xfrm>
+                            <a:off x="0" y="0"/>
+                            <a:ext cx="3110047" cy="3467125"/>
+                          </a:xfrm>
+                          <a:prstGeom prst="rect">
+                            <a:avLst/>
+                          </a:prstGeom>
+                        </pic:spPr>
+                      </pic:pic>
+                    </a:graphicData>
+                  </a:graphic>
+                </wp:inline>
+              </w:drawing>
             </w:r>
           </w:p>
           <w:p>
@@ -8627,6 +8750,7 @@
                 <w:sz w:val="20"/>
                 <w:szCs w:val="20"/>
               </w:rPr>
+              <w:lastRenderedPageBreak/>
               <w:t xml:space="preserve">Rajapinnat </w:t>
             </w:r>
             <w:r>
@@ -8644,64 +8768,42 @@
                 <w:rFonts w:ascii="Verdana" w:hAnsi="Verdana" w:cs="Verdana"/>
                 <w:i/>
                 <w:iCs/>
-                <w:color w:val="FF0000"/>
-                <w:sz w:val="20"/>
-                <w:szCs w:val="20"/>
-              </w:rPr>
-              <w:t>Funktiot mitä tarjoaa muille / signaalit mitä komponentti vastaanottaa tai lähettää muille. (ryhmän itse toteuttamat</w:t>
-            </w:r>
+                <w:color w:val="000000" w:themeColor="text1"/>
+                <w:sz w:val="20"/>
+                <w:szCs w:val="20"/>
+              </w:rPr>
+              <w:t xml:space="preserve">Funktiot mitä tarjoaa muille / signaalit mitä komponentti vastaanottaa tai lähettää muille. (ryhmän itse toteuttamat, ei </w:t>
+            </w:r>
+            <w:proofErr w:type="spellStart"/>
             <w:r>
               <w:rPr>
                 <w:rFonts w:ascii="Verdana" w:hAnsi="Verdana" w:cs="Verdana"/>
                 <w:i/>
                 <w:iCs/>
-                <w:color w:val="FF0000"/>
-                <w:sz w:val="20"/>
-                <w:szCs w:val="20"/>
-              </w:rPr>
-              <w:t>, ei</w:t>
-            </w:r>
+                <w:color w:val="000000" w:themeColor="text1"/>
+                <w:sz w:val="20"/>
+                <w:szCs w:val="20"/>
+              </w:rPr>
+              <w:t>Qt:n</w:t>
+            </w:r>
+            <w:proofErr w:type="spellEnd"/>
             <w:r>
               <w:rPr>
                 <w:rFonts w:ascii="Verdana" w:hAnsi="Verdana" w:cs="Verdana"/>
                 <w:i/>
                 <w:iCs/>
-                <w:color w:val="FF0000"/>
-                <w:sz w:val="20"/>
-                <w:szCs w:val="20"/>
-              </w:rPr>
-              <w:t xml:space="preserve"> </w:t>
-            </w:r>
-            <w:proofErr w:type="spellStart"/>
+                <w:color w:val="000000" w:themeColor="text1"/>
+                <w:sz w:val="20"/>
+                <w:szCs w:val="20"/>
+              </w:rPr>
+              <w:t xml:space="preserve"> sisäisiä.)</w:t>
+            </w:r>
             <w:r>
               <w:rPr>
                 <w:rFonts w:ascii="Verdana" w:hAnsi="Verdana" w:cs="Verdana"/>
                 <w:i/>
                 <w:iCs/>
-                <w:color w:val="FF0000"/>
-                <w:sz w:val="20"/>
-                <w:szCs w:val="20"/>
-              </w:rPr>
-              <w:t>Qt:n</w:t>
-            </w:r>
-            <w:proofErr w:type="spellEnd"/>
-            <w:r>
-              <w:rPr>
-                <w:rFonts w:ascii="Verdana" w:hAnsi="Verdana" w:cs="Verdana"/>
-                <w:i/>
-                <w:iCs/>
-                <w:color w:val="FF0000"/>
-                <w:sz w:val="20"/>
-                <w:szCs w:val="20"/>
-              </w:rPr>
-              <w:t xml:space="preserve"> sisäisiä.)</w:t>
-            </w:r>
-            <w:r>
-              <w:rPr>
-                <w:rFonts w:ascii="Verdana" w:hAnsi="Verdana" w:cs="Verdana"/>
-                <w:i/>
-                <w:iCs/>
-                <w:color w:val="FF0000"/>
+                <w:color w:val="000000" w:themeColor="text1"/>
                 <w:sz w:val="20"/>
                 <w:szCs w:val="20"/>
               </w:rPr>
@@ -8796,6 +8898,80 @@
                       <w:szCs w:val="20"/>
                     </w:rPr>
                   </w:pPr>
+                  <w:proofErr w:type="spellStart"/>
+                  <w:proofErr w:type="gramStart"/>
+                  <w:r>
+                    <w:rPr>
+                      <w:rFonts w:ascii="Verdana" w:hAnsi="Verdana" w:cs="Verdana"/>
+                      <w:sz w:val="20"/>
+                      <w:szCs w:val="20"/>
+                    </w:rPr>
+                    <w:t>setToken</w:t>
+                  </w:r>
+                  <w:proofErr w:type="spellEnd"/>
+                  <w:r>
+                    <w:rPr>
+                      <w:rFonts w:ascii="Verdana" w:hAnsi="Verdana" w:cs="Verdana"/>
+                      <w:sz w:val="20"/>
+                      <w:szCs w:val="20"/>
+                    </w:rPr>
+                    <w:t>(</w:t>
+                  </w:r>
+                  <w:proofErr w:type="spellStart"/>
+                  <w:proofErr w:type="gramEnd"/>
+                  <w:r>
+                    <w:rPr>
+                      <w:rFonts w:ascii="Verdana" w:hAnsi="Verdana" w:cs="Verdana"/>
+                      <w:sz w:val="20"/>
+                      <w:szCs w:val="20"/>
+                    </w:rPr>
+                    <w:t>const</w:t>
+                  </w:r>
+                  <w:proofErr w:type="spellEnd"/>
+                  <w:r>
+                    <w:rPr>
+                      <w:rFonts w:ascii="Verdana" w:hAnsi="Verdana" w:cs="Verdana"/>
+                      <w:sz w:val="20"/>
+                      <w:szCs w:val="20"/>
+                    </w:rPr>
+                    <w:t xml:space="preserve"> </w:t>
+                  </w:r>
+                  <w:proofErr w:type="spellStart"/>
+                  <w:r>
+                    <w:rPr>
+                      <w:rFonts w:ascii="Verdana" w:hAnsi="Verdana" w:cs="Verdana"/>
+                      <w:sz w:val="20"/>
+                      <w:szCs w:val="20"/>
+                    </w:rPr>
+                    <w:t>QString</w:t>
+                  </w:r>
+                  <w:proofErr w:type="spellEnd"/>
+                  <w:r>
+                    <w:rPr>
+                      <w:rFonts w:ascii="Verdana" w:hAnsi="Verdana" w:cs="Verdana"/>
+                      <w:sz w:val="20"/>
+                      <w:szCs w:val="20"/>
+                    </w:rPr>
+                    <w:t xml:space="preserve"> &amp;</w:t>
+                  </w:r>
+                  <w:proofErr w:type="spellStart"/>
+                  <w:r>
+                    <w:rPr>
+                      <w:rFonts w:ascii="Verdana" w:hAnsi="Verdana" w:cs="Verdana"/>
+                      <w:sz w:val="20"/>
+                      <w:szCs w:val="20"/>
+                    </w:rPr>
+                    <w:t>newToken</w:t>
+                  </w:r>
+                  <w:proofErr w:type="spellEnd"/>
+                  <w:r>
+                    <w:rPr>
+                      <w:rFonts w:ascii="Verdana" w:hAnsi="Verdana" w:cs="Verdana"/>
+                      <w:sz w:val="20"/>
+                      <w:szCs w:val="20"/>
+                    </w:rPr>
+                    <w:t>)</w:t>
+                  </w:r>
                 </w:p>
               </w:tc>
               <w:tc>
@@ -8813,6 +8989,14 @@
                       <w:szCs w:val="20"/>
                     </w:rPr>
                   </w:pPr>
+                  <w:r>
+                    <w:rPr>
+                      <w:rFonts w:ascii="Verdana" w:hAnsi="Verdana" w:cs="Verdana"/>
+                      <w:sz w:val="20"/>
+                      <w:szCs w:val="20"/>
+                    </w:rPr>
+                    <w:t>Saa JWT-tokenin kirjautumisen yhteydessä, jota käytetään nostopyynnön autentikointiin REST API kutsussa.</w:t>
+                  </w:r>
                 </w:p>
               </w:tc>
             </w:tr>
@@ -8833,6 +9017,68 @@
                       <w:szCs w:val="20"/>
                     </w:rPr>
                   </w:pPr>
+                  <w:proofErr w:type="spellStart"/>
+                  <w:proofErr w:type="gramStart"/>
+                  <w:r>
+                    <w:rPr>
+                      <w:rFonts w:ascii="Verdana" w:hAnsi="Verdana" w:cs="Verdana"/>
+                      <w:color w:val="000000" w:themeColor="text1"/>
+                      <w:sz w:val="20"/>
+                      <w:szCs w:val="20"/>
+                    </w:rPr>
+                    <w:t>setIdtili</w:t>
+                  </w:r>
+                  <w:proofErr w:type="spellEnd"/>
+                  <w:r>
+                    <w:rPr>
+                      <w:rFonts w:ascii="Verdana" w:hAnsi="Verdana" w:cs="Verdana"/>
+                      <w:color w:val="000000" w:themeColor="text1"/>
+                      <w:sz w:val="20"/>
+                      <w:szCs w:val="20"/>
+                    </w:rPr>
+                    <w:t>(</w:t>
+                  </w:r>
+                  <w:proofErr w:type="spellStart"/>
+                  <w:proofErr w:type="gramEnd"/>
+                  <w:r>
+                    <w:rPr>
+                      <w:rFonts w:ascii="Verdana" w:hAnsi="Verdana" w:cs="Verdana"/>
+                      <w:color w:val="000000" w:themeColor="text1"/>
+                      <w:sz w:val="20"/>
+                      <w:szCs w:val="20"/>
+                    </w:rPr>
+                    <w:t>int</w:t>
+                  </w:r>
+                  <w:proofErr w:type="spellEnd"/>
+                  <w:r>
+                    <w:rPr>
+                      <w:rFonts w:ascii="Verdana" w:hAnsi="Verdana" w:cs="Verdana"/>
+                      <w:color w:val="000000" w:themeColor="text1"/>
+                      <w:sz w:val="20"/>
+                      <w:szCs w:val="20"/>
+                    </w:rPr>
+                    <w:t xml:space="preserve"> </w:t>
+                  </w:r>
+                  <w:proofErr w:type="spellStart"/>
+                  <w:r>
+                    <w:rPr>
+                      <w:rFonts w:ascii="Verdana" w:hAnsi="Verdana" w:cs="Verdana"/>
+                      <w:color w:val="000000" w:themeColor="text1"/>
+                      <w:sz w:val="20"/>
+                      <w:szCs w:val="20"/>
+                    </w:rPr>
+                    <w:t>newIdTili</w:t>
+                  </w:r>
+                  <w:proofErr w:type="spellEnd"/>
+                  <w:r>
+                    <w:rPr>
+                      <w:rFonts w:ascii="Verdana" w:hAnsi="Verdana" w:cs="Verdana"/>
+                      <w:color w:val="000000" w:themeColor="text1"/>
+                      <w:sz w:val="20"/>
+                      <w:szCs w:val="20"/>
+                    </w:rPr>
+                    <w:t>)</w:t>
+                  </w:r>
                 </w:p>
               </w:tc>
               <w:tc>
@@ -8846,11 +9092,20 @@
                     <w:spacing w:line="276" w:lineRule="auto"/>
                     <w:rPr>
                       <w:rFonts w:ascii="Verdana" w:hAnsi="Verdana" w:cs="Verdana"/>
-                      <w:color w:val="FF0000"/>
+                      <w:color w:val="000000" w:themeColor="text1"/>
                       <w:sz w:val="20"/>
                       <w:szCs w:val="20"/>
                     </w:rPr>
                   </w:pPr>
+                  <w:r>
+                    <w:rPr>
+                      <w:rFonts w:ascii="Verdana" w:hAnsi="Verdana" w:cs="Verdana"/>
+                      <w:color w:val="000000" w:themeColor="text1"/>
+                      <w:sz w:val="20"/>
+                      <w:szCs w:val="20"/>
+                    </w:rPr>
+                    <w:t>Noston kohdistus asetetun tilin tunnisteeseen.</w:t>
+                  </w:r>
                 </w:p>
               </w:tc>
             </w:tr>
@@ -8866,11 +9121,53 @@
                     <w:spacing w:line="276" w:lineRule="auto"/>
                     <w:rPr>
                       <w:rFonts w:ascii="Verdana" w:hAnsi="Verdana" w:cs="Verdana"/>
-                      <w:color w:val="FF0000"/>
+                      <w:color w:val="000000" w:themeColor="text1"/>
                       <w:sz w:val="20"/>
                       <w:szCs w:val="20"/>
                     </w:rPr>
                   </w:pPr>
+                  <w:proofErr w:type="spellStart"/>
+                  <w:proofErr w:type="gramStart"/>
+                  <w:r>
+                    <w:rPr>
+                      <w:rFonts w:ascii="Verdana" w:hAnsi="Verdana" w:cs="Verdana"/>
+                      <w:color w:val="000000" w:themeColor="text1"/>
+                      <w:sz w:val="20"/>
+                      <w:szCs w:val="20"/>
+                    </w:rPr>
+                    <w:t>getIdtili</w:t>
+                  </w:r>
+                  <w:proofErr w:type="spellEnd"/>
+                  <w:r>
+                    <w:rPr>
+                      <w:rFonts w:ascii="Verdana" w:hAnsi="Verdana" w:cs="Verdana"/>
+                      <w:color w:val="000000" w:themeColor="text1"/>
+                      <w:sz w:val="20"/>
+                      <w:szCs w:val="20"/>
+                    </w:rPr>
+                    <w:t>(</w:t>
+                  </w:r>
+                  <w:proofErr w:type="gramEnd"/>
+                  <w:r>
+                    <w:rPr>
+                      <w:rFonts w:ascii="Verdana" w:hAnsi="Verdana" w:cs="Verdana"/>
+                      <w:color w:val="000000" w:themeColor="text1"/>
+                      <w:sz w:val="20"/>
+                      <w:szCs w:val="20"/>
+                    </w:rPr>
+                    <w:t xml:space="preserve">) </w:t>
+                  </w:r>
+                  <w:proofErr w:type="spellStart"/>
+                  <w:r>
+                    <w:rPr>
+                      <w:rFonts w:ascii="Verdana" w:hAnsi="Verdana" w:cs="Verdana"/>
+                      <w:color w:val="000000" w:themeColor="text1"/>
+                      <w:sz w:val="20"/>
+                      <w:szCs w:val="20"/>
+                    </w:rPr>
+                    <w:t>const</w:t>
+                  </w:r>
+                  <w:proofErr w:type="spellEnd"/>
                 </w:p>
               </w:tc>
               <w:tc>
@@ -8884,11 +9181,40 @@
                     <w:spacing w:line="276" w:lineRule="auto"/>
                     <w:rPr>
                       <w:rFonts w:ascii="Verdana" w:hAnsi="Verdana" w:cs="Verdana"/>
-                      <w:color w:val="FF0000"/>
+                      <w:color w:val="000000" w:themeColor="text1"/>
                       <w:sz w:val="20"/>
                       <w:szCs w:val="20"/>
                     </w:rPr>
                   </w:pPr>
+                  <w:r>
+                    <w:rPr>
+                      <w:rFonts w:ascii="Verdana" w:hAnsi="Verdana" w:cs="Verdana"/>
+                      <w:color w:val="000000" w:themeColor="text1"/>
+                      <w:sz w:val="20"/>
+                      <w:szCs w:val="20"/>
+                    </w:rPr>
+                    <w:t xml:space="preserve">Asetetun tilin </w:t>
+                  </w:r>
+                  <w:proofErr w:type="spellStart"/>
+                  <w:r>
+                    <w:rPr>
+                      <w:rFonts w:ascii="Verdana" w:hAnsi="Verdana" w:cs="Verdana"/>
+                      <w:color w:val="000000" w:themeColor="text1"/>
+                      <w:sz w:val="20"/>
+                      <w:szCs w:val="20"/>
+                    </w:rPr>
+                    <w:t>ID:n</w:t>
+                  </w:r>
+                  <w:proofErr w:type="spellEnd"/>
+                  <w:r>
+                    <w:rPr>
+                      <w:rFonts w:ascii="Verdana" w:hAnsi="Verdana" w:cs="Verdana"/>
+                      <w:color w:val="000000" w:themeColor="text1"/>
+                      <w:sz w:val="20"/>
+                      <w:szCs w:val="20"/>
+                    </w:rPr>
+                    <w:t xml:space="preserve"> palauttaminen.</w:t>
+                  </w:r>
                 </w:p>
               </w:tc>
             </w:tr>
@@ -8977,7 +9303,6 @@
                 <w:sz w:val="20"/>
                 <w:szCs w:val="20"/>
               </w:rPr>
-              <w:lastRenderedPageBreak/>
               <w:t>Vastuuhenkilö(t)</w:t>
             </w:r>
           </w:p>
@@ -8996,6 +9321,7 @@
                 <w:rFonts w:ascii="Verdana" w:hAnsi="Verdana" w:cs="Verdana"/>
                 <w:i/>
                 <w:iCs/>
+                <w:color w:val="000000" w:themeColor="text1"/>
                 <w:sz w:val="20"/>
                 <w:szCs w:val="20"/>
               </w:rPr>
@@ -9005,22 +9331,11 @@
                 <w:rFonts w:ascii="Verdana" w:hAnsi="Verdana" w:cs="Verdana"/>
                 <w:i/>
                 <w:iCs/>
-                <w:color w:val="FF0000"/>
-                <w:sz w:val="20"/>
-                <w:szCs w:val="20"/>
-              </w:rPr>
-              <w:t>K</w:t>
-            </w:r>
-            <w:r>
-              <w:rPr>
-                <w:rFonts w:ascii="Verdana" w:hAnsi="Verdana" w:cs="Verdana"/>
-                <w:i/>
-                <w:iCs/>
-                <w:color w:val="FF0000"/>
-                <w:sz w:val="20"/>
-                <w:szCs w:val="20"/>
-              </w:rPr>
-              <w:t>etkä tekivät komponentin suunnittelun, toteutuksen, testauksen ja dokumentoinnin</w:t>
+                <w:color w:val="000000" w:themeColor="text1"/>
+                <w:sz w:val="20"/>
+                <w:szCs w:val="20"/>
+              </w:rPr>
+              <w:t>Sander Vassel</w:t>
             </w:r>
           </w:p>
         </w:tc>
@@ -9433,8 +9748,8 @@
         <w:tblLook w:val="04A0" w:firstRow="1" w:lastRow="0" w:firstColumn="1" w:lastColumn="0" w:noHBand="0" w:noVBand="1"/>
       </w:tblPr>
       <w:tblGrid>
-        <w:gridCol w:w="4949"/>
-        <w:gridCol w:w="4949"/>
+        <w:gridCol w:w="5020"/>
+        <w:gridCol w:w="4878"/>
       </w:tblGrid>
       <w:tr>
         <w:trPr>
@@ -9459,9 +9774,42 @@
                 <w:rFonts w:ascii="Verdana" w:hAnsi="Verdana" w:cs="Verdana"/>
                 <w:i/>
                 <w:iCs/>
-                <w:color w:val="FF0000"/>
-              </w:rPr>
-              <w:t>Kuvat tänne.</w:t>
+              </w:rPr>
+              <w:drawing>
+                <wp:inline distT="0" distB="0" distL="0" distR="0" wp14:anchorId="1E9EBEFA" wp14:editId="546DF01F">
+                  <wp:extent cx="3050993" cy="2028825"/>
+                  <wp:effectExtent l="0" t="0" r="0" b="0"/>
+                  <wp:docPr id="762079431" name="Kuva 1"/>
+                  <wp:cNvGraphicFramePr>
+                    <a:graphicFrameLocks xmlns:a="http://schemas.openxmlformats.org/drawingml/2006/main" noChangeAspect="1"/>
+                  </wp:cNvGraphicFramePr>
+                  <a:graphic xmlns:a="http://schemas.openxmlformats.org/drawingml/2006/main">
+                    <a:graphicData uri="http://schemas.openxmlformats.org/drawingml/2006/picture">
+                      <pic:pic xmlns:pic="http://schemas.openxmlformats.org/drawingml/2006/picture">
+                        <pic:nvPicPr>
+                          <pic:cNvPr id="762079431" name=""/>
+                          <pic:cNvPicPr/>
+                        </pic:nvPicPr>
+                        <pic:blipFill>
+                          <a:blip r:embed="rId18"/>
+                          <a:stretch>
+                            <a:fillRect/>
+                          </a:stretch>
+                        </pic:blipFill>
+                        <pic:spPr>
+                          <a:xfrm>
+                            <a:off x="0" y="0"/>
+                            <a:ext cx="3077406" cy="2046389"/>
+                          </a:xfrm>
+                          <a:prstGeom prst="rect">
+                            <a:avLst/>
+                          </a:prstGeom>
+                        </pic:spPr>
+                      </pic:pic>
+                    </a:graphicData>
+                  </a:graphic>
+                </wp:inline>
+              </w:drawing>
             </w:r>
           </w:p>
         </w:tc>
@@ -13962,7 +14310,6 @@
   <w:style w:type="character" w:default="1" w:styleId="Kappaleenoletusfontti">
     <w:name w:val="Default Paragraph Font"/>
     <w:uiPriority w:val="1"/>
-    <w:semiHidden/>
     <w:unhideWhenUsed/>
   </w:style>
   <w:style w:type="table" w:default="1" w:styleId="Normaalitaulukko">
@@ -15046,6 +15393,17 @@
 </file>
 
 <file path=customXml/item1.xml><?xml version="1.0" encoding="utf-8"?>
+<p:properties xmlns:p="http://schemas.microsoft.com/office/2006/metadata/properties" xmlns:xsi="http://www.w3.org/2001/XMLSchema-instance" xmlns:pc="http://schemas.microsoft.com/office/infopath/2007/PartnerControls">
+  <documentManagement>
+    <lcf76f155ced4ddcb4097134ff3c332f xmlns="d3831626-fde5-4fc8-acc5-9526b66ab2bb">
+      <Terms xmlns="http://schemas.microsoft.com/office/infopath/2007/PartnerControls"/>
+    </lcf76f155ced4ddcb4097134ff3c332f>
+    <TaxCatchAll xmlns="b5314b1c-0f5c-4851-9378-7099df4806ca" xsi:nil="true"/>
+  </documentManagement>
+</p:properties>
+</file>
+
+<file path=customXml/item2.xml><?xml version="1.0" encoding="utf-8"?>
 <ct:contentTypeSchema xmlns:ct="http://schemas.microsoft.com/office/2006/metadata/contentType" xmlns:ma="http://schemas.microsoft.com/office/2006/metadata/properties/metaAttributes" ct:_="" ma:_="" ma:contentTypeName="Document" ma:contentTypeID="0x0101009C12936ABBAE164AB3E3B1E737DB3796" ma:contentTypeVersion="12" ma:contentTypeDescription="Create a new document." ma:contentTypeScope="" ma:versionID="a3c7e968aca90f61141995ffe44e8398">
   <xsd:schema xmlns:xsd="http://www.w3.org/2001/XMLSchema" xmlns:xs="http://www.w3.org/2001/XMLSchema" xmlns:p="http://schemas.microsoft.com/office/2006/metadata/properties" xmlns:ns2="d3831626-fde5-4fc8-acc5-9526b66ab2bb" xmlns:ns3="b5314b1c-0f5c-4851-9378-7099df4806ca" targetNamespace="http://schemas.microsoft.com/office/2006/metadata/properties" ma:root="true" ma:fieldsID="87450be8a9b396dcd3e7509fc153b825" ns2:_="" ns3:_="">
     <xsd:import namespace="d3831626-fde5-4fc8-acc5-9526b66ab2bb"/>
@@ -15246,18 +15604,11 @@
 </ct:contentTypeSchema>
 </file>
 
-<file path=customXml/item2.xml><?xml version="1.0" encoding="utf-8"?>
-<p:properties xmlns:p="http://schemas.microsoft.com/office/2006/metadata/properties" xmlns:xsi="http://www.w3.org/2001/XMLSchema-instance" xmlns:pc="http://schemas.microsoft.com/office/infopath/2007/PartnerControls">
-  <documentManagement>
-    <lcf76f155ced4ddcb4097134ff3c332f xmlns="d3831626-fde5-4fc8-acc5-9526b66ab2bb">
-      <Terms xmlns="http://schemas.microsoft.com/office/infopath/2007/PartnerControls"/>
-    </lcf76f155ced4ddcb4097134ff3c332f>
-    <TaxCatchAll xmlns="b5314b1c-0f5c-4851-9378-7099df4806ca" xsi:nil="true"/>
-  </documentManagement>
-</p:properties>
+<file path=customXml/item3.xml><?xml version="1.0" encoding="utf-8"?>
+<b:Sources xmlns:b="http://schemas.openxmlformats.org/officeDocument/2006/bibliography" xmlns="http://schemas.openxmlformats.org/officeDocument/2006/bibliography" SelectedStyle="\APA.XSL" StyleName="APA"/>
 </file>
 
-<file path=customXml/item3.xml><?xml version="1.0" encoding="utf-8"?>
+<file path=customXml/item4.xml><?xml version="1.0" encoding="utf-8"?>
 <?mso-contentType ?>
 <FormTemplates xmlns="http://schemas.microsoft.com/sharepoint/v3/contenttype/forms">
   <Display>DocumentLibraryForm</Display>
@@ -15266,11 +15617,18 @@
 </FormTemplates>
 </file>
 
-<file path=customXml/item4.xml><?xml version="1.0" encoding="utf-8"?>
-<b:Sources xmlns:b="http://schemas.openxmlformats.org/officeDocument/2006/bibliography" xmlns="http://schemas.openxmlformats.org/officeDocument/2006/bibliography" SelectedStyle="\APA.XSL" StyleName="APA"/>
+<file path=customXml/itemProps1.xml><?xml version="1.0" encoding="utf-8"?>
+<ds:datastoreItem xmlns:ds="http://schemas.openxmlformats.org/officeDocument/2006/customXml" ds:itemID="{EE41A236-5C73-4451-B1B7-A171E48F7377}">
+  <ds:schemaRefs>
+    <ds:schemaRef ds:uri="http://schemas.microsoft.com/office/2006/metadata/properties"/>
+    <ds:schemaRef ds:uri="http://schemas.microsoft.com/office/infopath/2007/PartnerControls"/>
+    <ds:schemaRef ds:uri="d3831626-fde5-4fc8-acc5-9526b66ab2bb"/>
+    <ds:schemaRef ds:uri="b5314b1c-0f5c-4851-9378-7099df4806ca"/>
+  </ds:schemaRefs>
+</ds:datastoreItem>
 </file>
 
-<file path=customXml/itemProps1.xml><?xml version="1.0" encoding="utf-8"?>
+<file path=customXml/itemProps2.xml><?xml version="1.0" encoding="utf-8"?>
 <ds:datastoreItem xmlns:ds="http://schemas.openxmlformats.org/officeDocument/2006/customXml" ds:itemID="{3BB198E8-0F36-4C71-8940-04215BB7641E}">
   <ds:schemaRefs>
     <ds:schemaRef ds:uri="http://schemas.microsoft.com/office/2006/metadata/contentType"/>
@@ -15289,29 +15647,18 @@
 </ds:datastoreItem>
 </file>
 
-<file path=customXml/itemProps2.xml><?xml version="1.0" encoding="utf-8"?>
-<ds:datastoreItem xmlns:ds="http://schemas.openxmlformats.org/officeDocument/2006/customXml" ds:itemID="{EE41A236-5C73-4451-B1B7-A171E48F7377}">
+<file path=customXml/itemProps3.xml><?xml version="1.0" encoding="utf-8"?>
+<ds:datastoreItem xmlns:ds="http://schemas.openxmlformats.org/officeDocument/2006/customXml" ds:itemID="{2BA0B919-FBBB-4BB8-90D2-33E6A0B69F94}">
   <ds:schemaRefs>
-    <ds:schemaRef ds:uri="http://schemas.microsoft.com/office/2006/metadata/properties"/>
-    <ds:schemaRef ds:uri="http://schemas.microsoft.com/office/infopath/2007/PartnerControls"/>
-    <ds:schemaRef ds:uri="d3831626-fde5-4fc8-acc5-9526b66ab2bb"/>
-    <ds:schemaRef ds:uri="b5314b1c-0f5c-4851-9378-7099df4806ca"/>
+    <ds:schemaRef ds:uri="http://schemas.openxmlformats.org/officeDocument/2006/bibliography"/>
   </ds:schemaRefs>
 </ds:datastoreItem>
 </file>
 
-<file path=customXml/itemProps3.xml><?xml version="1.0" encoding="utf-8"?>
+<file path=customXml/itemProps4.xml><?xml version="1.0" encoding="utf-8"?>
 <ds:datastoreItem xmlns:ds="http://schemas.openxmlformats.org/officeDocument/2006/customXml" ds:itemID="{13DB4B30-73AF-4FCD-BA9E-CA11CB4B5807}">
   <ds:schemaRefs>
     <ds:schemaRef ds:uri="http://schemas.microsoft.com/sharepoint/v3/contenttype/forms"/>
   </ds:schemaRefs>
 </ds:datastoreItem>
-</file>
-
-<file path=customXml/itemProps4.xml><?xml version="1.0" encoding="utf-8"?>
-<ds:datastoreItem xmlns:ds="http://schemas.openxmlformats.org/officeDocument/2006/customXml" ds:itemID="{2BA0B919-FBBB-4BB8-90D2-33E6A0B69F94}">
-  <ds:schemaRefs>
-    <ds:schemaRef ds:uri="http://schemas.openxmlformats.org/officeDocument/2006/bibliography"/>
-  </ds:schemaRefs>
-</ds:datastoreItem>
 </file>
</xml_diff>

<commit_message>
Teknistä määrittelyä vähän muokattu turhaksi todettu users.js poistettu.
</commit_message>
<xml_diff>
--- a/Documents/tekninen_maarittely.docx
+++ b/Documents/tekninen_maarittely.docx
@@ -4,7 +4,7 @@
   <w:body>
     <w:p>
       <w:pPr>
-        <w:pStyle w:val="Alaviitteenteksti"/>
+        <w:pStyle w:val="FootnoteText"/>
       </w:pPr>
     </w:p>
     <w:p>
@@ -25,7 +25,7 @@
     </w:p>
     <w:p>
       <w:pPr>
-        <w:pStyle w:val="Yltunniste"/>
+        <w:pStyle w:val="Header"/>
         <w:tabs>
           <w:tab w:val="clear" w:pos="4819"/>
           <w:tab w:val="clear" w:pos="9638"/>
@@ -70,7 +70,7 @@
     </w:p>
     <w:p>
       <w:pPr>
-        <w:pStyle w:val="Otsikko7"/>
+        <w:pStyle w:val="Heading7"/>
         <w:ind w:firstLine="0"/>
         <w:jc w:val="center"/>
       </w:pPr>
@@ -137,7 +137,7 @@
     </w:p>
     <w:p>
       <w:pPr>
-        <w:pStyle w:val="Yltunniste"/>
+        <w:pStyle w:val="Header"/>
         <w:tabs>
           <w:tab w:val="clear" w:pos="4819"/>
           <w:tab w:val="clear" w:pos="9638"/>
@@ -151,7 +151,7 @@
     </w:p>
     <w:p>
       <w:pPr>
-        <w:pStyle w:val="Yltunniste"/>
+        <w:pStyle w:val="Header"/>
         <w:tabs>
           <w:tab w:val="clear" w:pos="4819"/>
           <w:tab w:val="clear" w:pos="9638"/>
@@ -165,7 +165,7 @@
     </w:p>
     <w:p>
       <w:pPr>
-        <w:pStyle w:val="Yltunniste"/>
+        <w:pStyle w:val="Header"/>
         <w:tabs>
           <w:tab w:val="clear" w:pos="4819"/>
           <w:tab w:val="clear" w:pos="9638"/>
@@ -179,7 +179,7 @@
     </w:p>
     <w:p>
       <w:pPr>
-        <w:pStyle w:val="Yltunniste"/>
+        <w:pStyle w:val="Header"/>
         <w:tabs>
           <w:tab w:val="clear" w:pos="4819"/>
           <w:tab w:val="clear" w:pos="9638"/>
@@ -193,7 +193,7 @@
     </w:p>
     <w:p>
       <w:pPr>
-        <w:pStyle w:val="Yltunniste"/>
+        <w:pStyle w:val="Header"/>
         <w:tabs>
           <w:tab w:val="clear" w:pos="4819"/>
           <w:tab w:val="clear" w:pos="9638"/>
@@ -207,7 +207,7 @@
     </w:p>
     <w:p>
       <w:pPr>
-        <w:pStyle w:val="Yltunniste"/>
+        <w:pStyle w:val="Header"/>
         <w:tabs>
           <w:tab w:val="clear" w:pos="4819"/>
           <w:tab w:val="clear" w:pos="9638"/>
@@ -221,7 +221,7 @@
     </w:p>
     <w:p>
       <w:pPr>
-        <w:pStyle w:val="Yltunniste"/>
+        <w:pStyle w:val="Header"/>
         <w:tabs>
           <w:tab w:val="clear" w:pos="4819"/>
           <w:tab w:val="clear" w:pos="9638"/>
@@ -235,7 +235,7 @@
     </w:p>
     <w:tbl>
       <w:tblPr>
-        <w:tblStyle w:val="TaulukkoRuudukko"/>
+        <w:tblStyle w:val="TableGrid"/>
         <w:tblW w:w="0" w:type="auto"/>
         <w:jc w:val="center"/>
         <w:tblLook w:val="04A0" w:firstRow="1" w:lastRow="0" w:firstColumn="1" w:lastColumn="0" w:noHBand="0" w:noVBand="1"/>
@@ -255,7 +255,7 @@
           </w:tcPr>
           <w:p>
             <w:pPr>
-              <w:pStyle w:val="Yltunniste"/>
+              <w:pStyle w:val="Header"/>
               <w:tabs>
                 <w:tab w:val="clear" w:pos="4819"/>
                 <w:tab w:val="clear" w:pos="9638"/>
@@ -287,7 +287,7 @@
           </w:tcPr>
           <w:p>
             <w:pPr>
-              <w:pStyle w:val="Yltunniste"/>
+              <w:pStyle w:val="Header"/>
               <w:tabs>
                 <w:tab w:val="clear" w:pos="4819"/>
                 <w:tab w:val="clear" w:pos="9638"/>
@@ -321,7 +321,7 @@
                 <w:sz w:val="20"/>
                 <w:szCs w:val="20"/>
               </w:rPr>
-              <w:t>2</w:t>
+              <w:t>3</w:t>
             </w:r>
           </w:p>
         </w:tc>
@@ -329,7 +329,7 @@
     </w:tbl>
     <w:p>
       <w:pPr>
-        <w:pStyle w:val="Yltunniste"/>
+        <w:pStyle w:val="Header"/>
         <w:tabs>
           <w:tab w:val="clear" w:pos="4819"/>
           <w:tab w:val="clear" w:pos="9638"/>
@@ -373,7 +373,7 @@
     </w:p>
     <w:tbl>
       <w:tblPr>
-        <w:tblStyle w:val="TaulukkoRuudukko"/>
+        <w:tblStyle w:val="TableGrid"/>
         <w:tblW w:w="0" w:type="auto"/>
         <w:tblLook w:val="04A0" w:firstRow="1" w:lastRow="0" w:firstColumn="1" w:lastColumn="0" w:noHBand="0" w:noVBand="1"/>
       </w:tblPr>
@@ -492,18 +492,8 @@
                 <w:sz w:val="20"/>
                 <w:szCs w:val="20"/>
               </w:rPr>
-              <w:t xml:space="preserve">Matti </w:t>
-            </w:r>
-            <w:proofErr w:type="spellStart"/>
-            <w:r>
-              <w:rPr>
-                <w:rFonts w:ascii="Verdana" w:hAnsi="Verdana" w:cs="Verdana"/>
-                <w:sz w:val="20"/>
-                <w:szCs w:val="20"/>
-              </w:rPr>
-              <w:t>Rundelin</w:t>
-            </w:r>
-            <w:proofErr w:type="spellEnd"/>
+              <w:t>Matti Rundelin</w:t>
+            </w:r>
           </w:p>
         </w:tc>
       </w:tr>
@@ -625,7 +615,7 @@
     </w:p>
     <w:p>
       <w:pPr>
-        <w:pStyle w:val="Otsikko1"/>
+        <w:pStyle w:val="Heading1"/>
         <w:shd w:val="pct10" w:color="auto" w:fill="FFFFFF"/>
         <w:spacing w:after="240"/>
         <w:rPr>
@@ -666,7 +656,7 @@
     </w:p>
     <w:p>
       <w:pPr>
-        <w:pStyle w:val="Yltunniste"/>
+        <w:pStyle w:val="Header"/>
         <w:tabs>
           <w:tab w:val="clear" w:pos="4819"/>
           <w:tab w:val="clear" w:pos="9638"/>
@@ -936,7 +926,7 @@
     </w:p>
     <w:p>
       <w:pPr>
-        <w:pStyle w:val="Otsikko1"/>
+        <w:pStyle w:val="Heading1"/>
         <w:shd w:val="pct10" w:color="auto" w:fill="FFFFFF"/>
         <w:spacing w:after="240"/>
         <w:rPr>
@@ -1069,7 +1059,7 @@
     </w:p>
     <w:tbl>
       <w:tblPr>
-        <w:tblStyle w:val="TaulukkoRuudukko"/>
+        <w:tblStyle w:val="TableGrid"/>
         <w:tblW w:w="9704" w:type="dxa"/>
         <w:tblLook w:val="04A0" w:firstRow="1" w:lastRow="0" w:firstColumn="1" w:lastColumn="0" w:noHBand="0" w:noVBand="1"/>
       </w:tblPr>
@@ -1350,7 +1340,7 @@
     </w:p>
     <w:p>
       <w:pPr>
-        <w:pStyle w:val="Luettelokappale"/>
+        <w:pStyle w:val="ListParagraph"/>
         <w:numPr>
           <w:ilvl w:val="0"/>
           <w:numId w:val="29"/>
@@ -1554,7 +1544,7 @@
     </w:p>
     <w:p>
       <w:pPr>
-        <w:pStyle w:val="Luettelokappale"/>
+        <w:pStyle w:val="ListParagraph"/>
         <w:numPr>
           <w:ilvl w:val="0"/>
           <w:numId w:val="29"/>
@@ -1628,7 +1618,7 @@
     </w:p>
     <w:p>
       <w:pPr>
-        <w:pStyle w:val="Luettelokappale"/>
+        <w:pStyle w:val="ListParagraph"/>
         <w:numPr>
           <w:ilvl w:val="0"/>
           <w:numId w:val="29"/>
@@ -1840,7 +1830,7 @@
       <w:hyperlink r:id="rId12" w:history="1">
         <w:r>
           <w:rPr>
-            <w:rStyle w:val="Hyperlinkki"/>
+            <w:rStyle w:val="Hyperlink"/>
             <w:rFonts w:ascii="Verdana" w:hAnsi="Verdana" w:cs="Verdana"/>
             <w:szCs w:val="20"/>
           </w:rPr>
@@ -1885,7 +1875,7 @@
       <w:hyperlink r:id="rId13" w:history="1">
         <w:r>
           <w:rPr>
-            <w:rStyle w:val="Hyperlinkki"/>
+            <w:rStyle w:val="Hyperlink"/>
             <w:rFonts w:ascii="Verdana" w:hAnsi="Verdana" w:cs="Verdana"/>
             <w:szCs w:val="20"/>
           </w:rPr>
@@ -1926,7 +1916,7 @@
     </w:p>
     <w:p>
       <w:pPr>
-        <w:pStyle w:val="Otsikko1"/>
+        <w:pStyle w:val="Heading1"/>
         <w:shd w:val="pct10" w:color="auto" w:fill="auto"/>
         <w:spacing w:after="240"/>
         <w:rPr>
@@ -2037,7 +2027,7 @@
           </w:tcPr>
           <w:p>
             <w:pPr>
-              <w:pStyle w:val="Sisennettyleipteksti2"/>
+              <w:pStyle w:val="BodyTextIndent2"/>
               <w:spacing w:line="240" w:lineRule="auto"/>
               <w:ind w:left="0"/>
               <w:rPr>
@@ -2068,7 +2058,7 @@
           </w:tcPr>
           <w:p>
             <w:pPr>
-              <w:pStyle w:val="Sisennettyleipteksti2"/>
+              <w:pStyle w:val="BodyTextIndent2"/>
               <w:spacing w:line="240" w:lineRule="auto"/>
               <w:ind w:left="0"/>
               <w:rPr>
@@ -2149,7 +2139,7 @@
           </w:tcPr>
           <w:p>
             <w:pPr>
-              <w:pStyle w:val="Leipteksti"/>
+              <w:pStyle w:val="BodyText"/>
               <w:rPr>
                 <w:color w:val="000000" w:themeColor="text1"/>
                 <w:sz w:val="20"/>
@@ -2172,7 +2162,7 @@
           </w:tcPr>
           <w:p>
             <w:pPr>
-              <w:pStyle w:val="Leipteksti"/>
+              <w:pStyle w:val="BodyText"/>
               <w:rPr>
                 <w:rFonts w:cs="Times New Roman"/>
                 <w:bCs/>
@@ -2255,7 +2245,7 @@
           </w:tcPr>
           <w:p>
             <w:pPr>
-              <w:pStyle w:val="Leipteksti"/>
+              <w:pStyle w:val="BodyText"/>
               <w:rPr>
                 <w:color w:val="000000" w:themeColor="text1"/>
                 <w:sz w:val="20"/>
@@ -2278,7 +2268,7 @@
           </w:tcPr>
           <w:p>
             <w:pPr>
-              <w:pStyle w:val="Leipteksti"/>
+              <w:pStyle w:val="BodyText"/>
               <w:rPr>
                 <w:rFonts w:cs="Times New Roman"/>
                 <w:bCs/>
@@ -2310,7 +2300,7 @@
           </w:tcPr>
           <w:p>
             <w:pPr>
-              <w:pStyle w:val="Leipteksti"/>
+              <w:pStyle w:val="BodyText"/>
               <w:rPr>
                 <w:color w:val="000000" w:themeColor="text1"/>
                 <w:sz w:val="20"/>
@@ -2333,7 +2323,7 @@
           </w:tcPr>
           <w:p>
             <w:pPr>
-              <w:pStyle w:val="Leipteksti"/>
+              <w:pStyle w:val="BodyText"/>
               <w:rPr>
                 <w:rFonts w:cs="Times New Roman"/>
                 <w:bCs/>
@@ -2365,7 +2355,7 @@
           </w:tcPr>
           <w:p>
             <w:pPr>
-              <w:pStyle w:val="Leipteksti"/>
+              <w:pStyle w:val="BodyText"/>
               <w:rPr>
                 <w:color w:val="F2F2F2" w:themeColor="background1" w:themeShade="F2"/>
                 <w:sz w:val="20"/>
@@ -2380,7 +2370,7 @@
           </w:tcPr>
           <w:p>
             <w:pPr>
-              <w:pStyle w:val="Leipteksti"/>
+              <w:pStyle w:val="BodyText"/>
               <w:rPr>
                 <w:rFonts w:cs="Times New Roman"/>
                 <w:bCs/>
@@ -2402,7 +2392,7 @@
           </w:tcPr>
           <w:p>
             <w:pPr>
-              <w:pStyle w:val="Leipteksti"/>
+              <w:pStyle w:val="BodyText"/>
               <w:rPr>
                 <w:color w:val="FF0000"/>
                 <w:sz w:val="20"/>
@@ -2425,7 +2415,7 @@
           </w:tcPr>
           <w:p>
             <w:pPr>
-              <w:pStyle w:val="Leipteksti"/>
+              <w:pStyle w:val="BodyText"/>
               <w:rPr>
                 <w:rFonts w:cs="Times New Roman"/>
                 <w:bCs/>
@@ -2457,7 +2447,7 @@
           </w:tcPr>
           <w:p>
             <w:pPr>
-              <w:pStyle w:val="Leipteksti"/>
+              <w:pStyle w:val="BodyText"/>
               <w:rPr>
                 <w:color w:val="FF0000"/>
                 <w:sz w:val="20"/>
@@ -2480,7 +2470,7 @@
           </w:tcPr>
           <w:p>
             <w:pPr>
-              <w:pStyle w:val="Leipteksti"/>
+              <w:pStyle w:val="BodyText"/>
               <w:rPr>
                 <w:rFonts w:cs="Times New Roman"/>
                 <w:bCs/>
@@ -2739,7 +2729,7 @@
     </w:p>
     <w:tbl>
       <w:tblPr>
-        <w:tblStyle w:val="TaulukkoRuudukko"/>
+        <w:tblStyle w:val="TableGrid"/>
         <w:tblW w:w="10550" w:type="dxa"/>
         <w:tblLook w:val="04A0" w:firstRow="1" w:lastRow="0" w:firstColumn="1" w:lastColumn="0" w:noHBand="0" w:noVBand="1"/>
       </w:tblPr>
@@ -2940,7 +2930,7 @@
           </w:tcPr>
           <w:p>
             <w:pPr>
-              <w:pStyle w:val="Yltunniste"/>
+              <w:pStyle w:val="Header"/>
               <w:tabs>
                 <w:tab w:val="clear" w:pos="4819"/>
                 <w:tab w:val="clear" w:pos="9638"/>
@@ -2971,7 +2961,7 @@
           </w:tcPr>
           <w:p>
             <w:pPr>
-              <w:pStyle w:val="Yltunniste"/>
+              <w:pStyle w:val="Header"/>
               <w:tabs>
                 <w:tab w:val="clear" w:pos="4819"/>
                 <w:tab w:val="clear" w:pos="9638"/>
@@ -3007,7 +2997,7 @@
           </w:tcPr>
           <w:p>
             <w:pPr>
-              <w:pStyle w:val="Yltunniste"/>
+              <w:pStyle w:val="Header"/>
               <w:tabs>
                 <w:tab w:val="clear" w:pos="4819"/>
                 <w:tab w:val="clear" w:pos="9638"/>
@@ -3038,7 +3028,7 @@
           </w:tcPr>
           <w:p>
             <w:pPr>
-              <w:pStyle w:val="Yltunniste"/>
+              <w:pStyle w:val="Header"/>
               <w:tabs>
                 <w:tab w:val="clear" w:pos="4819"/>
                 <w:tab w:val="clear" w:pos="9638"/>
@@ -3094,7 +3084,7 @@
           </w:tcPr>
           <w:p>
             <w:pPr>
-              <w:pStyle w:val="Yltunniste"/>
+              <w:pStyle w:val="Header"/>
               <w:tabs>
                 <w:tab w:val="clear" w:pos="4819"/>
                 <w:tab w:val="clear" w:pos="9638"/>
@@ -3125,7 +3115,7 @@
           </w:tcPr>
           <w:p>
             <w:pPr>
-              <w:pStyle w:val="Yltunniste"/>
+              <w:pStyle w:val="Header"/>
               <w:tabs>
                 <w:tab w:val="clear" w:pos="4819"/>
                 <w:tab w:val="clear" w:pos="9638"/>
@@ -3157,7 +3147,7 @@
           </w:tcPr>
           <w:p>
             <w:pPr>
-              <w:pStyle w:val="Yltunniste"/>
+              <w:pStyle w:val="Header"/>
               <w:tabs>
                 <w:tab w:val="clear" w:pos="4819"/>
                 <w:tab w:val="clear" w:pos="9638"/>
@@ -3188,7 +3178,7 @@
           </w:tcPr>
           <w:p>
             <w:pPr>
-              <w:pStyle w:val="Yltunniste"/>
+              <w:pStyle w:val="Header"/>
               <w:spacing w:line="360" w:lineRule="auto"/>
               <w:jc w:val="both"/>
               <w:rPr>
@@ -3232,7 +3222,7 @@
           </w:tcPr>
           <w:p>
             <w:pPr>
-              <w:pStyle w:val="Yltunniste"/>
+              <w:pStyle w:val="Header"/>
               <w:tabs>
                 <w:tab w:val="clear" w:pos="4819"/>
                 <w:tab w:val="clear" w:pos="9638"/>
@@ -3263,7 +3253,7 @@
           </w:tcPr>
           <w:p>
             <w:pPr>
-              <w:pStyle w:val="Yltunniste"/>
+              <w:pStyle w:val="Header"/>
               <w:numPr>
                 <w:ilvl w:val="0"/>
                 <w:numId w:val="12"/>
@@ -3308,7 +3298,7 @@
           </w:p>
           <w:p>
             <w:pPr>
-              <w:pStyle w:val="Yltunniste"/>
+              <w:pStyle w:val="Header"/>
               <w:numPr>
                 <w:ilvl w:val="0"/>
                 <w:numId w:val="12"/>
@@ -3356,7 +3346,7 @@
           </w:p>
           <w:p>
             <w:pPr>
-              <w:pStyle w:val="Yltunniste"/>
+              <w:pStyle w:val="Header"/>
               <w:numPr>
                 <w:ilvl w:val="0"/>
                 <w:numId w:val="12"/>
@@ -3380,7 +3370,7 @@
           </w:p>
           <w:p>
             <w:pPr>
-              <w:pStyle w:val="Yltunniste"/>
+              <w:pStyle w:val="Header"/>
               <w:spacing w:line="360" w:lineRule="auto"/>
               <w:ind w:left="360"/>
               <w:jc w:val="both"/>
@@ -3432,7 +3422,7 @@
           </w:p>
           <w:p>
             <w:pPr>
-              <w:pStyle w:val="Yltunniste"/>
+              <w:pStyle w:val="Header"/>
               <w:numPr>
                 <w:ilvl w:val="0"/>
                 <w:numId w:val="12"/>
@@ -3480,7 +3470,7 @@
           </w:p>
           <w:p>
             <w:pPr>
-              <w:pStyle w:val="Yltunniste"/>
+              <w:pStyle w:val="Header"/>
               <w:spacing w:line="360" w:lineRule="auto"/>
               <w:ind w:left="360"/>
               <w:jc w:val="both"/>
@@ -3509,7 +3499,7 @@
           </w:p>
           <w:p>
             <w:pPr>
-              <w:pStyle w:val="Yltunniste"/>
+              <w:pStyle w:val="Header"/>
               <w:spacing w:line="360" w:lineRule="auto"/>
               <w:ind w:left="360"/>
               <w:jc w:val="both"/>
@@ -3546,7 +3536,7 @@
           </w:p>
           <w:p>
             <w:pPr>
-              <w:pStyle w:val="Yltunniste"/>
+              <w:pStyle w:val="Header"/>
               <w:numPr>
                 <w:ilvl w:val="0"/>
                 <w:numId w:val="12"/>
@@ -3578,7 +3568,7 @@
           </w:p>
           <w:p>
             <w:pPr>
-              <w:pStyle w:val="Yltunniste"/>
+              <w:pStyle w:val="Header"/>
               <w:numPr>
                 <w:ilvl w:val="0"/>
                 <w:numId w:val="12"/>
@@ -3671,7 +3661,7 @@
           </w:p>
           <w:p>
             <w:pPr>
-              <w:pStyle w:val="Yltunniste"/>
+              <w:pStyle w:val="Header"/>
               <w:numPr>
                 <w:ilvl w:val="0"/>
                 <w:numId w:val="12"/>
@@ -3725,7 +3715,7 @@
           </w:tcPr>
           <w:p>
             <w:pPr>
-              <w:pStyle w:val="Yltunniste"/>
+              <w:pStyle w:val="Header"/>
               <w:tabs>
                 <w:tab w:val="clear" w:pos="4819"/>
                 <w:tab w:val="clear" w:pos="9638"/>
@@ -3756,7 +3746,7 @@
           </w:tcPr>
           <w:p>
             <w:pPr>
-              <w:pStyle w:val="Yltunniste"/>
+              <w:pStyle w:val="Header"/>
               <w:tabs>
                 <w:tab w:val="clear" w:pos="4819"/>
                 <w:tab w:val="clear" w:pos="9638"/>
@@ -3788,7 +3778,7 @@
           </w:tcPr>
           <w:p>
             <w:pPr>
-              <w:pStyle w:val="Yltunniste"/>
+              <w:pStyle w:val="Header"/>
               <w:tabs>
                 <w:tab w:val="clear" w:pos="4819"/>
                 <w:tab w:val="clear" w:pos="9638"/>
@@ -3819,7 +3809,7 @@
           </w:tcPr>
           <w:p>
             <w:pPr>
-              <w:pStyle w:val="Yltunniste"/>
+              <w:pStyle w:val="Header"/>
               <w:tabs>
                 <w:tab w:val="clear" w:pos="4819"/>
                 <w:tab w:val="clear" w:pos="9638"/>
@@ -3871,7 +3861,7 @@
           </w:tcPr>
           <w:p>
             <w:pPr>
-              <w:pStyle w:val="Yltunniste"/>
+              <w:pStyle w:val="Header"/>
               <w:tabs>
                 <w:tab w:val="clear" w:pos="4819"/>
                 <w:tab w:val="clear" w:pos="9638"/>
@@ -3903,7 +3893,7 @@
           </w:tcPr>
           <w:p>
             <w:pPr>
-              <w:pStyle w:val="Yltunniste"/>
+              <w:pStyle w:val="Header"/>
               <w:tabs>
                 <w:tab w:val="clear" w:pos="4819"/>
                 <w:tab w:val="clear" w:pos="9638"/>
@@ -3939,7 +3929,7 @@
           </w:tcPr>
           <w:p>
             <w:pPr>
-              <w:pStyle w:val="Yltunniste"/>
+              <w:pStyle w:val="Header"/>
               <w:tabs>
                 <w:tab w:val="clear" w:pos="4819"/>
                 <w:tab w:val="clear" w:pos="9638"/>
@@ -3970,7 +3960,7 @@
           </w:tcPr>
           <w:p>
             <w:pPr>
-              <w:pStyle w:val="Yltunniste"/>
+              <w:pStyle w:val="Header"/>
               <w:tabs>
                 <w:tab w:val="clear" w:pos="4819"/>
                 <w:tab w:val="clear" w:pos="9638"/>
@@ -4002,7 +3992,7 @@
           </w:tcPr>
           <w:p>
             <w:pPr>
-              <w:pStyle w:val="Yltunniste"/>
+              <w:pStyle w:val="Header"/>
               <w:tabs>
                 <w:tab w:val="clear" w:pos="4819"/>
                 <w:tab w:val="clear" w:pos="9638"/>
@@ -4033,7 +4023,7 @@
           </w:tcPr>
           <w:p>
             <w:pPr>
-              <w:pStyle w:val="Yltunniste"/>
+              <w:pStyle w:val="Header"/>
               <w:tabs>
                 <w:tab w:val="clear" w:pos="4819"/>
                 <w:tab w:val="clear" w:pos="9638"/>
@@ -4081,7 +4071,7 @@
           </w:tcPr>
           <w:p>
             <w:pPr>
-              <w:pStyle w:val="Yltunniste"/>
+              <w:pStyle w:val="Header"/>
               <w:tabs>
                 <w:tab w:val="clear" w:pos="4819"/>
                 <w:tab w:val="clear" w:pos="9638"/>
@@ -4112,7 +4102,7 @@
           </w:tcPr>
           <w:p>
             <w:pPr>
-              <w:pStyle w:val="Yltunniste"/>
+              <w:pStyle w:val="Header"/>
               <w:tabs>
                 <w:tab w:val="clear" w:pos="4819"/>
                 <w:tab w:val="clear" w:pos="9638"/>
@@ -4160,7 +4150,7 @@
           </w:tcPr>
           <w:p>
             <w:pPr>
-              <w:pStyle w:val="Yltunniste"/>
+              <w:pStyle w:val="Header"/>
               <w:tabs>
                 <w:tab w:val="clear" w:pos="4819"/>
                 <w:tab w:val="clear" w:pos="9638"/>
@@ -4191,7 +4181,7 @@
           </w:tcPr>
           <w:p>
             <w:pPr>
-              <w:pStyle w:val="Yltunniste"/>
+              <w:pStyle w:val="Header"/>
               <w:tabs>
                 <w:tab w:val="clear" w:pos="4819"/>
                 <w:tab w:val="clear" w:pos="9638"/>
@@ -4223,7 +4213,7 @@
           </w:p>
           <w:p>
             <w:pPr>
-              <w:pStyle w:val="Yltunniste"/>
+              <w:pStyle w:val="Header"/>
               <w:tabs>
                 <w:tab w:val="clear" w:pos="4819"/>
                 <w:tab w:val="clear" w:pos="9638"/>
@@ -4247,7 +4237,7 @@
           </w:p>
           <w:p>
             <w:pPr>
-              <w:pStyle w:val="Yltunniste"/>
+              <w:pStyle w:val="Header"/>
               <w:tabs>
                 <w:tab w:val="clear" w:pos="4819"/>
                 <w:tab w:val="clear" w:pos="9638"/>
@@ -4287,7 +4277,7 @@
           </w:p>
           <w:p>
             <w:pPr>
-              <w:pStyle w:val="Yltunniste"/>
+              <w:pStyle w:val="Header"/>
               <w:tabs>
                 <w:tab w:val="clear" w:pos="4819"/>
                 <w:tab w:val="clear" w:pos="9638"/>
@@ -4381,7 +4371,7 @@
           </w:tcPr>
           <w:p>
             <w:pPr>
-              <w:pStyle w:val="Yltunniste"/>
+              <w:pStyle w:val="Header"/>
               <w:tabs>
                 <w:tab w:val="clear" w:pos="4819"/>
                 <w:tab w:val="clear" w:pos="9638"/>
@@ -4412,7 +4402,7 @@
           </w:tcPr>
           <w:p>
             <w:pPr>
-              <w:pStyle w:val="Yltunniste"/>
+              <w:pStyle w:val="Header"/>
               <w:tabs>
                 <w:tab w:val="clear" w:pos="4819"/>
                 <w:tab w:val="clear" w:pos="9638"/>
@@ -4439,7 +4429,7 @@
     </w:tbl>
     <w:p>
       <w:pPr>
-        <w:pStyle w:val="Yltunniste"/>
+        <w:pStyle w:val="Header"/>
         <w:tabs>
           <w:tab w:val="clear" w:pos="4819"/>
           <w:tab w:val="clear" w:pos="9638"/>
@@ -4453,7 +4443,7 @@
     </w:p>
     <w:p>
       <w:pPr>
-        <w:pStyle w:val="Yltunniste"/>
+        <w:pStyle w:val="Header"/>
         <w:tabs>
           <w:tab w:val="clear" w:pos="4819"/>
           <w:tab w:val="clear" w:pos="9638"/>
@@ -4469,7 +4459,7 @@
     </w:p>
     <w:p>
       <w:pPr>
-        <w:pStyle w:val="Yltunniste"/>
+        <w:pStyle w:val="Header"/>
         <w:tabs>
           <w:tab w:val="clear" w:pos="4819"/>
           <w:tab w:val="clear" w:pos="9638"/>
@@ -4485,7 +4475,7 @@
     </w:p>
     <w:p>
       <w:pPr>
-        <w:pStyle w:val="Yltunniste"/>
+        <w:pStyle w:val="Header"/>
         <w:tabs>
           <w:tab w:val="clear" w:pos="4819"/>
           <w:tab w:val="clear" w:pos="9638"/>
@@ -4500,7 +4490,7 @@
     </w:p>
     <w:p>
       <w:pPr>
-        <w:pStyle w:val="Yltunniste"/>
+        <w:pStyle w:val="Header"/>
         <w:tabs>
           <w:tab w:val="clear" w:pos="4819"/>
           <w:tab w:val="clear" w:pos="9638"/>
@@ -4546,7 +4536,7 @@
           </w:tcPr>
           <w:p>
             <w:pPr>
-              <w:pStyle w:val="Yltunniste"/>
+              <w:pStyle w:val="Header"/>
               <w:tabs>
                 <w:tab w:val="clear" w:pos="4819"/>
                 <w:tab w:val="clear" w:pos="9638"/>
@@ -4578,7 +4568,7 @@
           </w:tcPr>
           <w:p>
             <w:pPr>
-              <w:pStyle w:val="Yltunniste"/>
+              <w:pStyle w:val="Header"/>
               <w:tabs>
                 <w:tab w:val="clear" w:pos="4819"/>
                 <w:tab w:val="clear" w:pos="9638"/>
@@ -4614,7 +4604,7 @@
           </w:tcPr>
           <w:p>
             <w:pPr>
-              <w:pStyle w:val="Yltunniste"/>
+              <w:pStyle w:val="Header"/>
               <w:tabs>
                 <w:tab w:val="clear" w:pos="4819"/>
                 <w:tab w:val="clear" w:pos="9638"/>
@@ -4645,7 +4635,7 @@
           </w:tcPr>
           <w:p>
             <w:pPr>
-              <w:pStyle w:val="Yltunniste"/>
+              <w:pStyle w:val="Header"/>
               <w:tabs>
                 <w:tab w:val="clear" w:pos="4819"/>
                 <w:tab w:val="clear" w:pos="9638"/>
@@ -4677,7 +4667,7 @@
           </w:tcPr>
           <w:p>
             <w:pPr>
-              <w:pStyle w:val="Yltunniste"/>
+              <w:pStyle w:val="Header"/>
               <w:tabs>
                 <w:tab w:val="clear" w:pos="4819"/>
                 <w:tab w:val="clear" w:pos="9638"/>
@@ -4708,7 +4698,7 @@
           </w:tcPr>
           <w:p>
             <w:pPr>
-              <w:pStyle w:val="Yltunniste"/>
+              <w:pStyle w:val="Header"/>
               <w:tabs>
                 <w:tab w:val="clear" w:pos="4819"/>
                 <w:tab w:val="clear" w:pos="9638"/>
@@ -4740,7 +4730,7 @@
           </w:tcPr>
           <w:p>
             <w:pPr>
-              <w:pStyle w:val="Yltunniste"/>
+              <w:pStyle w:val="Header"/>
               <w:tabs>
                 <w:tab w:val="clear" w:pos="4819"/>
                 <w:tab w:val="clear" w:pos="9638"/>
@@ -4771,7 +4761,7 @@
           </w:tcPr>
           <w:p>
             <w:pPr>
-              <w:pStyle w:val="Yltunniste"/>
+              <w:pStyle w:val="Header"/>
               <w:tabs>
                 <w:tab w:val="clear" w:pos="4819"/>
                 <w:tab w:val="clear" w:pos="9638"/>
@@ -4837,7 +4827,7 @@
           </w:tcPr>
           <w:p>
             <w:pPr>
-              <w:pStyle w:val="Yltunniste"/>
+              <w:pStyle w:val="Header"/>
               <w:tabs>
                 <w:tab w:val="clear" w:pos="4819"/>
                 <w:tab w:val="clear" w:pos="9638"/>
@@ -4868,7 +4858,7 @@
           </w:tcPr>
           <w:p>
             <w:pPr>
-              <w:pStyle w:val="Yltunniste"/>
+              <w:pStyle w:val="Header"/>
               <w:tabs>
                 <w:tab w:val="clear" w:pos="4819"/>
                 <w:tab w:val="clear" w:pos="9638"/>
@@ -4900,7 +4890,7 @@
           </w:p>
           <w:p>
             <w:pPr>
-              <w:pStyle w:val="Yltunniste"/>
+              <w:pStyle w:val="Header"/>
               <w:tabs>
                 <w:tab w:val="clear" w:pos="4819"/>
                 <w:tab w:val="clear" w:pos="9638"/>
@@ -4940,7 +4930,7 @@
           </w:p>
           <w:p>
             <w:pPr>
-              <w:pStyle w:val="Yltunniste"/>
+              <w:pStyle w:val="Header"/>
               <w:tabs>
                 <w:tab w:val="clear" w:pos="4819"/>
                 <w:tab w:val="clear" w:pos="9638"/>
@@ -4964,7 +4954,7 @@
           </w:p>
           <w:p>
             <w:pPr>
-              <w:pStyle w:val="Yltunniste"/>
+              <w:pStyle w:val="Header"/>
               <w:tabs>
                 <w:tab w:val="clear" w:pos="4819"/>
                 <w:tab w:val="clear" w:pos="9638"/>
@@ -5004,7 +4994,7 @@
           </w:p>
           <w:p>
             <w:pPr>
-              <w:pStyle w:val="Yltunniste"/>
+              <w:pStyle w:val="Header"/>
               <w:tabs>
                 <w:tab w:val="clear" w:pos="4819"/>
                 <w:tab w:val="clear" w:pos="9638"/>
@@ -5066,7 +5056,7 @@
           </w:tcPr>
           <w:p>
             <w:pPr>
-              <w:pStyle w:val="Yltunniste"/>
+              <w:pStyle w:val="Header"/>
               <w:tabs>
                 <w:tab w:val="clear" w:pos="4819"/>
                 <w:tab w:val="clear" w:pos="9638"/>
@@ -5097,7 +5087,7 @@
           </w:tcPr>
           <w:p>
             <w:pPr>
-              <w:pStyle w:val="Yltunniste"/>
+              <w:pStyle w:val="Header"/>
               <w:tabs>
                 <w:tab w:val="clear" w:pos="4819"/>
                 <w:tab w:val="clear" w:pos="9638"/>
@@ -5215,7 +5205,7 @@
           </w:tcPr>
           <w:p>
             <w:pPr>
-              <w:pStyle w:val="Yltunniste"/>
+              <w:pStyle w:val="Header"/>
               <w:tabs>
                 <w:tab w:val="clear" w:pos="4819"/>
                 <w:tab w:val="clear" w:pos="9638"/>
@@ -5246,7 +5236,7 @@
           </w:tcPr>
           <w:p>
             <w:pPr>
-              <w:pStyle w:val="Yltunniste"/>
+              <w:pStyle w:val="Header"/>
               <w:tabs>
                 <w:tab w:val="clear" w:pos="4819"/>
                 <w:tab w:val="clear" w:pos="9638"/>
@@ -5282,7 +5272,7 @@
           </w:tcPr>
           <w:p>
             <w:pPr>
-              <w:pStyle w:val="Yltunniste"/>
+              <w:pStyle w:val="Header"/>
               <w:tabs>
                 <w:tab w:val="clear" w:pos="4819"/>
                 <w:tab w:val="clear" w:pos="9638"/>
@@ -5313,7 +5303,7 @@
           </w:tcPr>
           <w:p>
             <w:pPr>
-              <w:pStyle w:val="Yltunniste"/>
+              <w:pStyle w:val="Header"/>
               <w:tabs>
                 <w:tab w:val="clear" w:pos="4819"/>
                 <w:tab w:val="clear" w:pos="9638"/>
@@ -5345,7 +5335,7 @@
           </w:tcPr>
           <w:p>
             <w:pPr>
-              <w:pStyle w:val="Yltunniste"/>
+              <w:pStyle w:val="Header"/>
               <w:tabs>
                 <w:tab w:val="clear" w:pos="4819"/>
                 <w:tab w:val="clear" w:pos="9638"/>
@@ -5376,7 +5366,7 @@
           </w:tcPr>
           <w:p>
             <w:pPr>
-              <w:pStyle w:val="Yltunniste"/>
+              <w:pStyle w:val="Header"/>
               <w:tabs>
                 <w:tab w:val="clear" w:pos="4819"/>
                 <w:tab w:val="clear" w:pos="9638"/>
@@ -5408,7 +5398,7 @@
           </w:tcPr>
           <w:p>
             <w:pPr>
-              <w:pStyle w:val="Yltunniste"/>
+              <w:pStyle w:val="Header"/>
               <w:tabs>
                 <w:tab w:val="clear" w:pos="4819"/>
                 <w:tab w:val="clear" w:pos="9638"/>
@@ -5439,7 +5429,7 @@
           </w:tcPr>
           <w:p>
             <w:pPr>
-              <w:pStyle w:val="Yltunniste"/>
+              <w:pStyle w:val="Header"/>
               <w:tabs>
                 <w:tab w:val="clear" w:pos="4819"/>
                 <w:tab w:val="clear" w:pos="9638"/>
@@ -5487,7 +5477,7 @@
           </w:tcPr>
           <w:p>
             <w:pPr>
-              <w:pStyle w:val="Yltunniste"/>
+              <w:pStyle w:val="Header"/>
               <w:tabs>
                 <w:tab w:val="clear" w:pos="4819"/>
                 <w:tab w:val="clear" w:pos="9638"/>
@@ -5518,7 +5508,7 @@
           </w:tcPr>
           <w:p>
             <w:pPr>
-              <w:pStyle w:val="Yltunniste"/>
+              <w:pStyle w:val="Header"/>
               <w:tabs>
                 <w:tab w:val="clear" w:pos="4819"/>
                 <w:tab w:val="clear" w:pos="9638"/>
@@ -5550,7 +5540,7 @@
           </w:p>
           <w:p>
             <w:pPr>
-              <w:pStyle w:val="Yltunniste"/>
+              <w:pStyle w:val="Header"/>
               <w:tabs>
                 <w:tab w:val="clear" w:pos="4819"/>
                 <w:tab w:val="clear" w:pos="9638"/>
@@ -5622,7 +5612,7 @@
           </w:p>
           <w:p>
             <w:pPr>
-              <w:pStyle w:val="Yltunniste"/>
+              <w:pStyle w:val="Header"/>
               <w:tabs>
                 <w:tab w:val="clear" w:pos="4819"/>
                 <w:tab w:val="clear" w:pos="9638"/>
@@ -5646,7 +5636,7 @@
           </w:p>
           <w:p>
             <w:pPr>
-              <w:pStyle w:val="Yltunniste"/>
+              <w:pStyle w:val="Header"/>
               <w:tabs>
                 <w:tab w:val="clear" w:pos="4819"/>
                 <w:tab w:val="clear" w:pos="9638"/>
@@ -5670,7 +5660,7 @@
           </w:p>
           <w:p>
             <w:pPr>
-              <w:pStyle w:val="Yltunniste"/>
+              <w:pStyle w:val="Header"/>
               <w:tabs>
                 <w:tab w:val="clear" w:pos="4819"/>
                 <w:tab w:val="clear" w:pos="9638"/>
@@ -5718,7 +5708,7 @@
           </w:tcPr>
           <w:p>
             <w:pPr>
-              <w:pStyle w:val="Yltunniste"/>
+              <w:pStyle w:val="Header"/>
               <w:tabs>
                 <w:tab w:val="clear" w:pos="4819"/>
                 <w:tab w:val="clear" w:pos="9638"/>
@@ -5749,7 +5739,7 @@
           </w:tcPr>
           <w:p>
             <w:pPr>
-              <w:pStyle w:val="Yltunniste"/>
+              <w:pStyle w:val="Header"/>
               <w:tabs>
                 <w:tab w:val="clear" w:pos="4819"/>
                 <w:tab w:val="clear" w:pos="9638"/>
@@ -5846,7 +5836,7 @@
           </w:tcPr>
           <w:p>
             <w:pPr>
-              <w:pStyle w:val="Yltunniste"/>
+              <w:pStyle w:val="Header"/>
               <w:tabs>
                 <w:tab w:val="clear" w:pos="4819"/>
                 <w:tab w:val="clear" w:pos="9638"/>
@@ -5884,7 +5874,7 @@
           </w:tcPr>
           <w:p>
             <w:pPr>
-              <w:pStyle w:val="Yltunniste"/>
+              <w:pStyle w:val="Header"/>
               <w:tabs>
                 <w:tab w:val="clear" w:pos="4819"/>
                 <w:tab w:val="clear" w:pos="9638"/>
@@ -5920,7 +5910,7 @@
           </w:tcPr>
           <w:p>
             <w:pPr>
-              <w:pStyle w:val="Yltunniste"/>
+              <w:pStyle w:val="Header"/>
               <w:tabs>
                 <w:tab w:val="clear" w:pos="4819"/>
                 <w:tab w:val="clear" w:pos="9638"/>
@@ -5951,7 +5941,7 @@
           </w:tcPr>
           <w:p>
             <w:pPr>
-              <w:pStyle w:val="Yltunniste"/>
+              <w:pStyle w:val="Header"/>
               <w:tabs>
                 <w:tab w:val="clear" w:pos="4819"/>
                 <w:tab w:val="clear" w:pos="9638"/>
@@ -5983,7 +5973,7 @@
           </w:tcPr>
           <w:p>
             <w:pPr>
-              <w:pStyle w:val="Yltunniste"/>
+              <w:pStyle w:val="Header"/>
               <w:tabs>
                 <w:tab w:val="clear" w:pos="4819"/>
                 <w:tab w:val="clear" w:pos="9638"/>
@@ -6014,7 +6004,7 @@
           </w:tcPr>
           <w:p>
             <w:pPr>
-              <w:pStyle w:val="Yltunniste"/>
+              <w:pStyle w:val="Header"/>
               <w:tabs>
                 <w:tab w:val="clear" w:pos="4819"/>
                 <w:tab w:val="clear" w:pos="9638"/>
@@ -6046,7 +6036,7 @@
           </w:tcPr>
           <w:p>
             <w:pPr>
-              <w:pStyle w:val="Yltunniste"/>
+              <w:pStyle w:val="Header"/>
               <w:tabs>
                 <w:tab w:val="clear" w:pos="4819"/>
                 <w:tab w:val="clear" w:pos="9638"/>
@@ -6077,7 +6067,7 @@
           </w:tcPr>
           <w:p>
             <w:pPr>
-              <w:pStyle w:val="Yltunniste"/>
+              <w:pStyle w:val="Header"/>
               <w:tabs>
                 <w:tab w:val="clear" w:pos="4819"/>
                 <w:tab w:val="clear" w:pos="9638"/>
@@ -6143,7 +6133,7 @@
           </w:tcPr>
           <w:p>
             <w:pPr>
-              <w:pStyle w:val="Yltunniste"/>
+              <w:pStyle w:val="Header"/>
               <w:tabs>
                 <w:tab w:val="clear" w:pos="4819"/>
                 <w:tab w:val="clear" w:pos="9638"/>
@@ -6174,7 +6164,7 @@
           </w:tcPr>
           <w:p>
             <w:pPr>
-              <w:pStyle w:val="Yltunniste"/>
+              <w:pStyle w:val="Header"/>
               <w:tabs>
                 <w:tab w:val="clear" w:pos="4819"/>
                 <w:tab w:val="clear" w:pos="9638"/>
@@ -6206,7 +6196,7 @@
           </w:p>
           <w:p>
             <w:pPr>
-              <w:pStyle w:val="Yltunniste"/>
+              <w:pStyle w:val="Header"/>
               <w:tabs>
                 <w:tab w:val="clear" w:pos="4819"/>
                 <w:tab w:val="clear" w:pos="9638"/>
@@ -6230,7 +6220,7 @@
           </w:p>
           <w:p>
             <w:pPr>
-              <w:pStyle w:val="Yltunniste"/>
+              <w:pStyle w:val="Header"/>
               <w:tabs>
                 <w:tab w:val="clear" w:pos="4819"/>
                 <w:tab w:val="clear" w:pos="9638"/>
@@ -6262,7 +6252,7 @@
           </w:tcPr>
           <w:p>
             <w:pPr>
-              <w:pStyle w:val="Yltunniste"/>
+              <w:pStyle w:val="Header"/>
               <w:tabs>
                 <w:tab w:val="clear" w:pos="4819"/>
                 <w:tab w:val="clear" w:pos="9638"/>
@@ -6293,7 +6283,7 @@
           </w:tcPr>
           <w:p>
             <w:pPr>
-              <w:pStyle w:val="Yltunniste"/>
+              <w:pStyle w:val="Header"/>
               <w:tabs>
                 <w:tab w:val="clear" w:pos="4819"/>
                 <w:tab w:val="clear" w:pos="9638"/>
@@ -6364,7 +6354,7 @@
     </w:p>
     <w:p>
       <w:pPr>
-        <w:pStyle w:val="Yltunniste"/>
+        <w:pStyle w:val="Header"/>
         <w:tabs>
           <w:tab w:val="clear" w:pos="4819"/>
           <w:tab w:val="clear" w:pos="9638"/>
@@ -6403,7 +6393,7 @@
           </w:tcPr>
           <w:p>
             <w:pPr>
-              <w:pStyle w:val="Yltunniste"/>
+              <w:pStyle w:val="Header"/>
               <w:tabs>
                 <w:tab w:val="clear" w:pos="4819"/>
                 <w:tab w:val="clear" w:pos="9638"/>
@@ -6436,7 +6426,7 @@
           </w:tcPr>
           <w:p>
             <w:pPr>
-              <w:pStyle w:val="Yltunniste"/>
+              <w:pStyle w:val="Header"/>
               <w:tabs>
                 <w:tab w:val="clear" w:pos="4819"/>
                 <w:tab w:val="clear" w:pos="9638"/>
@@ -6463,7 +6453,7 @@
           </w:tcPr>
           <w:p>
             <w:pPr>
-              <w:pStyle w:val="Yltunniste"/>
+              <w:pStyle w:val="Header"/>
               <w:tabs>
                 <w:tab w:val="clear" w:pos="4819"/>
                 <w:tab w:val="clear" w:pos="9638"/>
@@ -6495,7 +6485,7 @@
           </w:tcPr>
           <w:p>
             <w:pPr>
-              <w:pStyle w:val="Yltunniste"/>
+              <w:pStyle w:val="Header"/>
               <w:tabs>
                 <w:tab w:val="clear" w:pos="4819"/>
                 <w:tab w:val="clear" w:pos="9638"/>
@@ -6520,7 +6510,7 @@
           </w:tcPr>
           <w:p>
             <w:pPr>
-              <w:pStyle w:val="Yltunniste"/>
+              <w:pStyle w:val="Header"/>
               <w:tabs>
                 <w:tab w:val="clear" w:pos="4819"/>
                 <w:tab w:val="clear" w:pos="9638"/>
@@ -6552,7 +6542,7 @@
           </w:tcPr>
           <w:p>
             <w:pPr>
-              <w:pStyle w:val="Yltunniste"/>
+              <w:pStyle w:val="Header"/>
               <w:tabs>
                 <w:tab w:val="clear" w:pos="4819"/>
                 <w:tab w:val="clear" w:pos="9638"/>
@@ -6577,7 +6567,7 @@
           </w:tcPr>
           <w:p>
             <w:pPr>
-              <w:pStyle w:val="Yltunniste"/>
+              <w:pStyle w:val="Header"/>
               <w:tabs>
                 <w:tab w:val="clear" w:pos="4819"/>
                 <w:tab w:val="clear" w:pos="9638"/>
@@ -6609,7 +6599,7 @@
           </w:tcPr>
           <w:p>
             <w:pPr>
-              <w:pStyle w:val="Yltunniste"/>
+              <w:pStyle w:val="Header"/>
               <w:tabs>
                 <w:tab w:val="clear" w:pos="4819"/>
                 <w:tab w:val="clear" w:pos="9638"/>
@@ -6634,7 +6624,7 @@
           </w:tcPr>
           <w:p>
             <w:pPr>
-              <w:pStyle w:val="Yltunniste"/>
+              <w:pStyle w:val="Header"/>
               <w:tabs>
                 <w:tab w:val="clear" w:pos="4819"/>
                 <w:tab w:val="clear" w:pos="9638"/>
@@ -6666,7 +6656,7 @@
           </w:tcPr>
           <w:p>
             <w:pPr>
-              <w:pStyle w:val="Yltunniste"/>
+              <w:pStyle w:val="Header"/>
               <w:tabs>
                 <w:tab w:val="clear" w:pos="4819"/>
                 <w:tab w:val="clear" w:pos="9638"/>
@@ -6690,7 +6680,7 @@
           </w:tcPr>
           <w:p>
             <w:pPr>
-              <w:pStyle w:val="Yltunniste"/>
+              <w:pStyle w:val="Header"/>
               <w:tabs>
                 <w:tab w:val="clear" w:pos="4819"/>
                 <w:tab w:val="clear" w:pos="9638"/>
@@ -6722,7 +6712,7 @@
           </w:tcPr>
           <w:p>
             <w:pPr>
-              <w:pStyle w:val="Yltunniste"/>
+              <w:pStyle w:val="Header"/>
               <w:tabs>
                 <w:tab w:val="clear" w:pos="4819"/>
                 <w:tab w:val="clear" w:pos="9638"/>
@@ -6747,7 +6737,7 @@
           </w:tcPr>
           <w:p>
             <w:pPr>
-              <w:pStyle w:val="Yltunniste"/>
+              <w:pStyle w:val="Header"/>
               <w:tabs>
                 <w:tab w:val="clear" w:pos="4819"/>
                 <w:tab w:val="clear" w:pos="9638"/>
@@ -6780,7 +6770,7 @@
           </w:tcPr>
           <w:p>
             <w:pPr>
-              <w:pStyle w:val="Yltunniste"/>
+              <w:pStyle w:val="Header"/>
               <w:tabs>
                 <w:tab w:val="clear" w:pos="4819"/>
                 <w:tab w:val="clear" w:pos="9638"/>
@@ -6809,7 +6799,7 @@
     </w:tbl>
     <w:p>
       <w:pPr>
-        <w:pStyle w:val="Yltunniste"/>
+        <w:pStyle w:val="Header"/>
         <w:tabs>
           <w:tab w:val="clear" w:pos="4819"/>
           <w:tab w:val="clear" w:pos="9638"/>
@@ -6824,7 +6814,7 @@
     </w:p>
     <w:p>
       <w:pPr>
-        <w:pStyle w:val="Yltunniste"/>
+        <w:pStyle w:val="Header"/>
         <w:tabs>
           <w:tab w:val="clear" w:pos="4819"/>
           <w:tab w:val="clear" w:pos="9638"/>
@@ -6854,7 +6844,7 @@
     </w:p>
     <w:p>
       <w:pPr>
-        <w:pStyle w:val="Otsikko1"/>
+        <w:pStyle w:val="Heading1"/>
         <w:shd w:val="pct10" w:color="auto" w:fill="auto"/>
         <w:spacing w:after="240"/>
         <w:rPr>
@@ -6959,7 +6949,7 @@
     </w:p>
     <w:p>
       <w:pPr>
-        <w:pStyle w:val="Otsikko2"/>
+        <w:pStyle w:val="Heading2"/>
         <w:spacing w:after="120" w:line="360" w:lineRule="auto"/>
         <w:jc w:val="both"/>
         <w:rPr>
@@ -7358,7 +7348,7 @@
     </w:p>
     <w:tbl>
       <w:tblPr>
-        <w:tblStyle w:val="TaulukkoRuudukko"/>
+        <w:tblStyle w:val="TableGrid"/>
         <w:tblW w:w="0" w:type="auto"/>
         <w:tblLook w:val="04A0" w:firstRow="1" w:lastRow="0" w:firstColumn="1" w:lastColumn="0" w:noHBand="0" w:noVBand="1"/>
       </w:tblPr>
@@ -7393,7 +7383,7 @@
           </w:p>
           <w:p>
             <w:pPr>
-              <w:pStyle w:val="Luettelokappale"/>
+              <w:pStyle w:val="ListParagraph"/>
               <w:numPr>
                 <w:ilvl w:val="1"/>
                 <w:numId w:val="1"/>
@@ -7419,7 +7409,7 @@
           </w:p>
           <w:p>
             <w:pPr>
-              <w:pStyle w:val="Luettelokappale"/>
+              <w:pStyle w:val="ListParagraph"/>
               <w:numPr>
                 <w:ilvl w:val="1"/>
                 <w:numId w:val="1"/>
@@ -7445,7 +7435,7 @@
           </w:p>
           <w:p>
             <w:pPr>
-              <w:pStyle w:val="Luettelokappale"/>
+              <w:pStyle w:val="ListParagraph"/>
               <w:numPr>
                 <w:ilvl w:val="1"/>
                 <w:numId w:val="1"/>
@@ -7471,7 +7461,7 @@
           </w:p>
           <w:p>
             <w:pPr>
-              <w:pStyle w:val="Luettelokappale"/>
+              <w:pStyle w:val="ListParagraph"/>
               <w:numPr>
                 <w:ilvl w:val="1"/>
                 <w:numId w:val="1"/>
@@ -7523,7 +7513,7 @@
           </w:p>
           <w:p>
             <w:pPr>
-              <w:pStyle w:val="Luettelokappale"/>
+              <w:pStyle w:val="ListParagraph"/>
               <w:numPr>
                 <w:ilvl w:val="1"/>
                 <w:numId w:val="1"/>
@@ -7549,7 +7539,7 @@
           </w:p>
           <w:p>
             <w:pPr>
-              <w:pStyle w:val="Luettelokappale"/>
+              <w:pStyle w:val="ListParagraph"/>
               <w:numPr>
                 <w:ilvl w:val="1"/>
                 <w:numId w:val="1"/>
@@ -7613,7 +7603,7 @@
           </w:p>
           <w:p>
             <w:pPr>
-              <w:pStyle w:val="Luettelokappale"/>
+              <w:pStyle w:val="ListParagraph"/>
               <w:numPr>
                 <w:ilvl w:val="1"/>
                 <w:numId w:val="1"/>
@@ -7639,7 +7629,7 @@
           </w:p>
           <w:p>
             <w:pPr>
-              <w:pStyle w:val="Luettelokappale"/>
+              <w:pStyle w:val="ListParagraph"/>
               <w:numPr>
                 <w:ilvl w:val="1"/>
                 <w:numId w:val="1"/>
@@ -7691,7 +7681,7 @@
           </w:p>
           <w:p>
             <w:pPr>
-              <w:pStyle w:val="Luettelokappale"/>
+              <w:pStyle w:val="ListParagraph"/>
               <w:numPr>
                 <w:ilvl w:val="1"/>
                 <w:numId w:val="1"/>
@@ -7717,7 +7707,7 @@
           </w:p>
           <w:p>
             <w:pPr>
-              <w:pStyle w:val="Luettelokappale"/>
+              <w:pStyle w:val="ListParagraph"/>
               <w:numPr>
                 <w:ilvl w:val="1"/>
                 <w:numId w:val="1"/>
@@ -7743,7 +7733,7 @@
           </w:p>
           <w:p>
             <w:pPr>
-              <w:pStyle w:val="Luettelokappale"/>
+              <w:pStyle w:val="ListParagraph"/>
               <w:numPr>
                 <w:ilvl w:val="1"/>
                 <w:numId w:val="1"/>
@@ -7769,7 +7759,7 @@
           </w:p>
           <w:p>
             <w:pPr>
-              <w:pStyle w:val="Luettelokappale"/>
+              <w:pStyle w:val="ListParagraph"/>
               <w:numPr>
                 <w:ilvl w:val="1"/>
                 <w:numId w:val="1"/>
@@ -7795,7 +7785,7 @@
           </w:p>
           <w:p>
             <w:pPr>
-              <w:pStyle w:val="Luettelokappale"/>
+              <w:pStyle w:val="ListParagraph"/>
               <w:numPr>
                 <w:ilvl w:val="1"/>
                 <w:numId w:val="1"/>
@@ -7959,7 +7949,7 @@
     </w:p>
     <w:tbl>
       <w:tblPr>
-        <w:tblStyle w:val="TaulukkoRuudukko"/>
+        <w:tblStyle w:val="TableGrid"/>
         <w:tblW w:w="9842" w:type="dxa"/>
         <w:tblLook w:val="04A0" w:firstRow="1" w:lastRow="0" w:firstColumn="1" w:lastColumn="0" w:noHBand="0" w:noVBand="1"/>
       </w:tblPr>
@@ -7976,7 +7966,7 @@
           </w:tcPr>
           <w:p>
             <w:pPr>
-              <w:pStyle w:val="Yltunniste"/>
+              <w:pStyle w:val="Header"/>
               <w:tabs>
                 <w:tab w:val="clear" w:pos="4819"/>
                 <w:tab w:val="clear" w:pos="9638"/>
@@ -8033,7 +8023,7 @@
     </w:tbl>
     <w:p>
       <w:pPr>
-        <w:pStyle w:val="Yltunniste"/>
+        <w:pStyle w:val="Header"/>
         <w:tabs>
           <w:tab w:val="clear" w:pos="4819"/>
           <w:tab w:val="clear" w:pos="9638"/>
@@ -8061,7 +8051,7 @@
     </w:p>
     <w:p>
       <w:pPr>
-        <w:pStyle w:val="Otsikko1"/>
+        <w:pStyle w:val="Heading1"/>
         <w:shd w:val="pct10" w:color="auto" w:fill="auto"/>
         <w:spacing w:after="240"/>
         <w:rPr>
@@ -8214,7 +8204,7 @@
     </w:p>
     <w:tbl>
       <w:tblPr>
-        <w:tblStyle w:val="TaulukkoRuudukko"/>
+        <w:tblStyle w:val="TableGrid"/>
         <w:tblW w:w="10373" w:type="dxa"/>
         <w:tblLook w:val="04A0" w:firstRow="1" w:lastRow="0" w:firstColumn="1" w:lastColumn="0" w:noHBand="0" w:noVBand="1"/>
       </w:tblPr>
@@ -8303,7 +8293,7 @@
     </w:p>
     <w:p>
       <w:pPr>
-        <w:pStyle w:val="Otsikko1"/>
+        <w:pStyle w:val="Heading1"/>
         <w:shd w:val="pct10" w:color="auto" w:fill="auto"/>
         <w:spacing w:after="240"/>
         <w:rPr>
@@ -8355,7 +8345,7 @@
     </w:p>
     <w:tbl>
       <w:tblPr>
-        <w:tblStyle w:val="TaulukkoRuudukko"/>
+        <w:tblStyle w:val="TableGrid"/>
         <w:tblW w:w="0" w:type="auto"/>
         <w:tblLook w:val="04A0" w:firstRow="1" w:lastRow="0" w:firstColumn="1" w:lastColumn="0" w:noHBand="0" w:noVBand="1"/>
       </w:tblPr>
@@ -8365,6 +8355,9 @@
         <w:gridCol w:w="6573"/>
       </w:tblGrid>
       <w:tr>
+        <w:trPr>
+          <w:trHeight w:val="1448"/>
+        </w:trPr>
         <w:tc>
           <w:tcPr>
             <w:tcW w:w="3055" w:type="dxa"/>
@@ -8426,32 +8419,6 @@
               </w:rPr>
               <w:t>Komponentin tarkoituksena on, että asiakas voi nostaa rahaa tililtään. Pääkäyttöliittymästä asiakas siirtyy nosto ikkunaan missä voi nostaa eri summia eri napeista. Myös vapaavalintainen summa on mahdollista, kunhan summa on kymppejä</w:t>
             </w:r>
-            <w:r>
-              <w:rPr>
-                <w:rFonts w:ascii="Verdana" w:hAnsi="Verdana" w:cs="Verdana"/>
-                <w:i/>
-                <w:iCs/>
-                <w:color w:val="000000" w:themeColor="text1"/>
-                <w:sz w:val="20"/>
-                <w:szCs w:val="20"/>
-              </w:rPr>
-              <w:br/>
-            </w:r>
-          </w:p>
-          <w:p>
-            <w:pPr>
-              <w:autoSpaceDE/>
-              <w:autoSpaceDN/>
-              <w:spacing w:line="276" w:lineRule="auto"/>
-              <w:rPr>
-                <w:rFonts w:ascii="Verdana" w:hAnsi="Verdana" w:cs="Verdana"/>
-                <w:i/>
-                <w:iCs/>
-                <w:color w:val="000000" w:themeColor="text1"/>
-                <w:sz w:val="20"/>
-                <w:szCs w:val="20"/>
-              </w:rPr>
-            </w:pPr>
           </w:p>
         </w:tc>
       </w:tr>
@@ -8599,7 +8566,7 @@
       </w:tr>
       <w:tr>
         <w:trPr>
-          <w:trHeight w:val="5943"/>
+          <w:trHeight w:val="4585"/>
         </w:trPr>
         <w:tc>
           <w:tcPr>
@@ -8624,52 +8591,30 @@
                 <w:rFonts w:ascii="Verdana" w:hAnsi="Verdana" w:cs="Verdana"/>
                 <w:b/>
                 <w:bCs/>
-                <w:sz w:val="20"/>
-                <w:szCs w:val="20"/>
-              </w:rPr>
-              <w:t>Luokkakaavio (UML)</w:t>
-            </w:r>
-          </w:p>
-          <w:p>
-            <w:pPr>
-              <w:autoSpaceDE/>
-              <w:autoSpaceDN/>
-              <w:spacing w:line="276" w:lineRule="auto"/>
-              <w:rPr>
-                <w:rFonts w:ascii="Verdana" w:hAnsi="Verdana" w:cs="Verdana"/>
-                <w:b/>
-                <w:bCs/>
-                <w:sz w:val="20"/>
-                <w:szCs w:val="20"/>
-              </w:rPr>
-            </w:pPr>
-          </w:p>
-          <w:p>
-            <w:pPr>
-              <w:autoSpaceDE/>
-              <w:autoSpaceDN/>
-              <w:spacing w:line="276" w:lineRule="auto"/>
-              <w:rPr>
-                <w:rFonts w:ascii="Verdana" w:hAnsi="Verdana" w:cs="Verdana"/>
-                <w:b/>
-                <w:bCs/>
-                <w:sz w:val="20"/>
-                <w:szCs w:val="20"/>
-              </w:rPr>
-            </w:pPr>
-            <w:r>
-              <w:rPr>
-                <w:rFonts w:ascii="Verdana" w:hAnsi="Verdana" w:cs="Verdana"/>
-                <w:b/>
-                <w:bCs/>
                 <w:noProof/>
                 <w:sz w:val="20"/>
                 <w:szCs w:val="20"/>
               </w:rPr>
               <w:drawing>
-                <wp:inline distT="0" distB="0" distL="0" distR="0" wp14:anchorId="1F6B7FD6" wp14:editId="4DB88528">
-                  <wp:extent cx="3067050" cy="3419191"/>
-                  <wp:effectExtent l="0" t="0" r="0" b="0"/>
+                <wp:anchor distT="0" distB="0" distL="114300" distR="114300" simplePos="0" relativeHeight="251660288" behindDoc="1" locked="0" layoutInCell="1" allowOverlap="1" wp14:anchorId="1F6B7FD6" wp14:editId="0CF4C37B">
+                  <wp:simplePos x="0" y="0"/>
+                  <wp:positionH relativeFrom="column">
+                    <wp:posOffset>1665605</wp:posOffset>
+                  </wp:positionH>
+                  <wp:positionV relativeFrom="paragraph">
+                    <wp:posOffset>80645</wp:posOffset>
+                  </wp:positionV>
+                  <wp:extent cx="3708400" cy="4133850"/>
+                  <wp:effectExtent l="0" t="0" r="6350" b="0"/>
+                  <wp:wrapTight wrapText="bothSides">
+                    <wp:wrapPolygon edited="0">
+                      <wp:start x="0" y="0"/>
+                      <wp:lineTo x="0" y="21500"/>
+                      <wp:lineTo x="21526" y="21500"/>
+                      <wp:lineTo x="21526" y="0"/>
+                      <wp:lineTo x="0" y="0"/>
+                    </wp:wrapPolygon>
+                  </wp:wrapTight>
                   <wp:docPr id="1046487142" name="Kuva 1" descr="Kuva, joka sisältää kohteen teksti, kuvakaappaus, Fontti, dokumentti&#10;&#10;Tekoälyllä luotu sisältö voi olla virheellistä."/>
                   <wp:cNvGraphicFramePr>
                     <a:graphicFrameLocks xmlns:a="http://schemas.openxmlformats.org/drawingml/2006/main" noChangeAspect="1"/>
@@ -8690,7 +8635,7 @@
                         <pic:spPr>
                           <a:xfrm>
                             <a:off x="0" y="0"/>
-                            <a:ext cx="3110047" cy="3467125"/>
+                            <a:ext cx="3708400" cy="4133850"/>
                           </a:xfrm>
                           <a:prstGeom prst="rect">
                             <a:avLst/>
@@ -8699,8 +8644,24 @@
                       </pic:pic>
                     </a:graphicData>
                   </a:graphic>
-                </wp:inline>
+                  <wp14:sizeRelH relativeFrom="margin">
+                    <wp14:pctWidth>0</wp14:pctWidth>
+                  </wp14:sizeRelH>
+                  <wp14:sizeRelV relativeFrom="margin">
+                    <wp14:pctHeight>0</wp14:pctHeight>
+                  </wp14:sizeRelV>
+                </wp:anchor>
               </w:drawing>
+            </w:r>
+            <w:r>
+              <w:rPr>
+                <w:rFonts w:ascii="Verdana" w:hAnsi="Verdana" w:cs="Verdana"/>
+                <w:b/>
+                <w:bCs/>
+                <w:sz w:val="20"/>
+                <w:szCs w:val="20"/>
+              </w:rPr>
+              <w:t>Luokkakaavio (UML)</w:t>
             </w:r>
           </w:p>
           <w:p>
@@ -8721,7 +8682,7 @@
       </w:tr>
       <w:tr>
         <w:trPr>
-          <w:trHeight w:val="3324"/>
+          <w:trHeight w:val="2543"/>
         </w:trPr>
         <w:tc>
           <w:tcPr>
@@ -8750,7 +8711,6 @@
                 <w:sz w:val="20"/>
                 <w:szCs w:val="20"/>
               </w:rPr>
-              <w:lastRenderedPageBreak/>
               <w:t xml:space="preserve">Rajapinnat </w:t>
             </w:r>
             <w:r>
@@ -8798,21 +8758,10 @@
               </w:rPr>
               <w:t xml:space="preserve"> sisäisiä.)</w:t>
             </w:r>
-            <w:r>
-              <w:rPr>
-                <w:rFonts w:ascii="Verdana" w:hAnsi="Verdana" w:cs="Verdana"/>
-                <w:i/>
-                <w:iCs/>
-                <w:color w:val="000000" w:themeColor="text1"/>
-                <w:sz w:val="20"/>
-                <w:szCs w:val="20"/>
-              </w:rPr>
-              <w:br/>
-            </w:r>
           </w:p>
           <w:tbl>
             <w:tblPr>
-              <w:tblStyle w:val="TaulukkoRuudukko"/>
+              <w:tblStyle w:val="TableGrid"/>
               <w:tblW w:w="0" w:type="auto"/>
               <w:tblLook w:val="04A0" w:firstRow="1" w:lastRow="0" w:firstColumn="1" w:lastColumn="0" w:noHBand="0" w:noVBand="1"/>
             </w:tblPr>
@@ -9218,44 +9167,6 @@
                 </w:p>
               </w:tc>
             </w:tr>
-            <w:tr>
-              <w:tc>
-                <w:tcPr>
-                  <w:tcW w:w="2492" w:type="dxa"/>
-                </w:tcPr>
-                <w:p>
-                  <w:pPr>
-                    <w:autoSpaceDE/>
-                    <w:autoSpaceDN/>
-                    <w:spacing w:line="276" w:lineRule="auto"/>
-                    <w:rPr>
-                      <w:rFonts w:ascii="Verdana" w:hAnsi="Verdana" w:cs="Verdana"/>
-                      <w:color w:val="FF0000"/>
-                      <w:sz w:val="20"/>
-                      <w:szCs w:val="20"/>
-                    </w:rPr>
-                  </w:pPr>
-                </w:p>
-              </w:tc>
-              <w:tc>
-                <w:tcPr>
-                  <w:tcW w:w="6910" w:type="dxa"/>
-                </w:tcPr>
-                <w:p>
-                  <w:pPr>
-                    <w:autoSpaceDE/>
-                    <w:autoSpaceDN/>
-                    <w:spacing w:line="276" w:lineRule="auto"/>
-                    <w:rPr>
-                      <w:rFonts w:ascii="Verdana" w:hAnsi="Verdana" w:cs="Verdana"/>
-                      <w:color w:val="FF0000"/>
-                      <w:sz w:val="20"/>
-                      <w:szCs w:val="20"/>
-                    </w:rPr>
-                  </w:pPr>
-                </w:p>
-              </w:tc>
-            </w:tr>
           </w:tbl>
           <w:p>
             <w:pPr>
@@ -9276,7 +9187,7 @@
       </w:tr>
       <w:tr>
         <w:trPr>
-          <w:trHeight w:val="1155"/>
+          <w:trHeight w:val="694"/>
         </w:trPr>
         <w:tc>
           <w:tcPr>
@@ -9344,23 +9255,6 @@
     </w:tbl>
     <w:p>
       <w:pPr>
-        <w:autoSpaceDE/>
-        <w:autoSpaceDN/>
-        <w:spacing w:after="200" w:line="276" w:lineRule="auto"/>
-        <w:rPr>
-          <w:rFonts w:ascii="Verdana" w:hAnsi="Verdana" w:cs="Verdana"/>
-          <w:b/>
-          <w:bCs/>
-          <w:i/>
-          <w:iCs/>
-          <w:color w:val="FF0000"/>
-          <w:sz w:val="36"/>
-          <w:szCs w:val="36"/>
-        </w:rPr>
-      </w:pPr>
-    </w:p>
-    <w:p>
-      <w:pPr>
         <w:spacing w:line="360" w:lineRule="auto"/>
         <w:rPr>
           <w:rFonts w:ascii="Verdana" w:hAnsi="Verdana"/>
@@ -9434,7 +9328,41 @@
     </w:p>
     <w:p>
       <w:pPr>
-        <w:pStyle w:val="Otsikko1"/>
+        <w:autoSpaceDE/>
+        <w:autoSpaceDN/>
+        <w:rPr>
+          <w:rFonts w:ascii="Verdana" w:hAnsi="Verdana"/>
+          <w:i/>
+          <w:iCs/>
+          <w:color w:val="FF0000"/>
+        </w:rPr>
+      </w:pPr>
+      <w:r>
+        <w:rPr>
+          <w:rFonts w:ascii="Verdana" w:hAnsi="Verdana"/>
+          <w:i/>
+          <w:iCs/>
+          <w:color w:val="FF0000"/>
+        </w:rPr>
+        <w:lastRenderedPageBreak/>
+        <w:br w:type="page"/>
+      </w:r>
+    </w:p>
+    <w:p>
+      <w:pPr>
+        <w:autoSpaceDE/>
+        <w:autoSpaceDN/>
+        <w:rPr>
+          <w:rFonts w:ascii="Verdana" w:hAnsi="Verdana"/>
+          <w:i/>
+          <w:iCs/>
+          <w:color w:val="FF0000"/>
+        </w:rPr>
+      </w:pPr>
+    </w:p>
+    <w:p>
+      <w:pPr>
+        <w:pStyle w:val="Heading1"/>
         <w:shd w:val="pct10" w:color="auto" w:fill="auto"/>
         <w:spacing w:after="240"/>
         <w:rPr>
@@ -9449,13 +9377,12 @@
           <w:sz w:val="24"/>
           <w:szCs w:val="24"/>
         </w:rPr>
-        <w:lastRenderedPageBreak/>
         <w:t>KÄYTTÖLIITTYMÄN KUVAUS</w:t>
       </w:r>
     </w:p>
     <w:p>
       <w:pPr>
-        <w:pStyle w:val="Luettelokappale"/>
+        <w:pStyle w:val="ListParagraph"/>
         <w:keepNext/>
         <w:numPr>
           <w:ilvl w:val="0"/>
@@ -9473,7 +9400,7 @@
     </w:p>
     <w:p>
       <w:pPr>
-        <w:pStyle w:val="Luettelokappale"/>
+        <w:pStyle w:val="ListParagraph"/>
         <w:keepNext/>
         <w:numPr>
           <w:ilvl w:val="0"/>
@@ -9491,7 +9418,7 @@
     </w:p>
     <w:p>
       <w:pPr>
-        <w:pStyle w:val="Luettelokappale"/>
+        <w:pStyle w:val="ListParagraph"/>
         <w:keepNext/>
         <w:numPr>
           <w:ilvl w:val="0"/>
@@ -9509,7 +9436,7 @@
     </w:p>
     <w:p>
       <w:pPr>
-        <w:pStyle w:val="Otsikko2"/>
+        <w:pStyle w:val="Heading2"/>
         <w:spacing w:line="360" w:lineRule="auto"/>
         <w:rPr>
           <w:rFonts w:ascii="Verdana" w:hAnsi="Verdana" w:cs="Verdana"/>
@@ -9573,7 +9500,7 @@
     </w:p>
     <w:tbl>
       <w:tblPr>
-        <w:tblStyle w:val="TaulukkoRuudukko"/>
+        <w:tblStyle w:val="TableGrid"/>
         <w:tblW w:w="19416" w:type="dxa"/>
         <w:tblLook w:val="04A0" w:firstRow="1" w:lastRow="0" w:firstColumn="1" w:lastColumn="0" w:noHBand="0" w:noVBand="1"/>
       </w:tblPr>
@@ -9662,7 +9589,7 @@
     </w:p>
     <w:p>
       <w:pPr>
-        <w:pStyle w:val="Otsikko2"/>
+        <w:pStyle w:val="Heading2"/>
         <w:spacing w:line="360" w:lineRule="auto"/>
         <w:rPr>
           <w:rFonts w:ascii="Verdana" w:hAnsi="Verdana" w:cs="Verdana"/>
@@ -9730,7 +9657,7 @@
     </w:p>
     <w:p>
       <w:pPr>
-        <w:pStyle w:val="Yltunniste"/>
+        <w:pStyle w:val="Header"/>
         <w:tabs>
           <w:tab w:val="clear" w:pos="4819"/>
           <w:tab w:val="clear" w:pos="9638"/>
@@ -9743,7 +9670,7 @@
     </w:p>
     <w:tbl>
       <w:tblPr>
-        <w:tblStyle w:val="TaulukkoRuudukko"/>
+        <w:tblStyle w:val="TableGrid"/>
         <w:tblW w:w="9898" w:type="dxa"/>
         <w:tblLook w:val="04A0" w:firstRow="1" w:lastRow="0" w:firstColumn="1" w:lastColumn="0" w:noHBand="0" w:noVBand="1"/>
       </w:tblPr>
@@ -9774,6 +9701,7 @@
                 <w:rFonts w:ascii="Verdana" w:hAnsi="Verdana" w:cs="Verdana"/>
                 <w:i/>
                 <w:iCs/>
+                <w:noProof/>
               </w:rPr>
               <w:drawing>
                 <wp:inline distT="0" distB="0" distL="0" distR="0" wp14:anchorId="1E9EBEFA" wp14:editId="546DF01F">
@@ -9879,7 +9807,7 @@
     </w:p>
     <w:p>
       <w:pPr>
-        <w:pStyle w:val="Otsikko1"/>
+        <w:pStyle w:val="Heading1"/>
         <w:shd w:val="pct10" w:color="auto" w:fill="auto"/>
         <w:spacing w:after="240"/>
         <w:rPr>
@@ -9900,7 +9828,7 @@
     </w:p>
     <w:p>
       <w:pPr>
-        <w:pStyle w:val="Yltunniste"/>
+        <w:pStyle w:val="Header"/>
         <w:tabs>
           <w:tab w:val="clear" w:pos="4819"/>
           <w:tab w:val="clear" w:pos="9638"/>
@@ -9963,7 +9891,7 @@
     </w:p>
     <w:p>
       <w:pPr>
-        <w:pStyle w:val="Yltunniste"/>
+        <w:pStyle w:val="Header"/>
         <w:tabs>
           <w:tab w:val="clear" w:pos="4819"/>
           <w:tab w:val="clear" w:pos="9638"/>
@@ -9974,6 +9902,152 @@
           <w:color w:val="FF0000"/>
         </w:rPr>
       </w:pPr>
+      <w:r>
+        <w:rPr>
+          <w:rFonts w:ascii="Verdana" w:hAnsi="Verdana" w:cs="Verdana"/>
+          <w:noProof/>
+          <w:color w:val="FF0000"/>
+        </w:rPr>
+        <w:drawing>
+          <wp:anchor distT="0" distB="0" distL="114300" distR="114300" simplePos="0" relativeHeight="251658240" behindDoc="0" locked="0" layoutInCell="1" allowOverlap="1" wp14:anchorId="58D2CD41" wp14:editId="27E1E5FF">
+            <wp:simplePos x="0" y="0"/>
+            <wp:positionH relativeFrom="column">
+              <wp:posOffset>4356735</wp:posOffset>
+            </wp:positionH>
+            <wp:positionV relativeFrom="paragraph">
+              <wp:posOffset>84137</wp:posOffset>
+            </wp:positionV>
+            <wp:extent cx="2287310" cy="6310630"/>
+            <wp:effectExtent l="0" t="0" r="0" b="0"/>
+            <wp:wrapNone/>
+            <wp:docPr id="1285836443" name="Picture 1"/>
+            <wp:cNvGraphicFramePr>
+              <a:graphicFrameLocks xmlns:a="http://schemas.openxmlformats.org/drawingml/2006/main" noChangeAspect="1"/>
+            </wp:cNvGraphicFramePr>
+            <a:graphic xmlns:a="http://schemas.openxmlformats.org/drawingml/2006/main">
+              <a:graphicData uri="http://schemas.openxmlformats.org/drawingml/2006/picture">
+                <pic:pic xmlns:pic="http://schemas.openxmlformats.org/drawingml/2006/picture">
+                  <pic:nvPicPr>
+                    <pic:cNvPr id="0" name="Picture 1"/>
+                    <pic:cNvPicPr>
+                      <a:picLocks noChangeAspect="1" noChangeArrowheads="1"/>
+                    </pic:cNvPicPr>
+                  </pic:nvPicPr>
+                  <pic:blipFill>
+                    <a:blip r:embed="rId19">
+                      <a:extLst>
+                        <a:ext uri="{28A0092B-C50C-407E-A947-70E740481C1C}">
+                          <a14:useLocalDpi xmlns:a14="http://schemas.microsoft.com/office/drawing/2010/main" val="0"/>
+                        </a:ext>
+                      </a:extLst>
+                    </a:blip>
+                    <a:srcRect/>
+                    <a:stretch>
+                      <a:fillRect/>
+                    </a:stretch>
+                  </pic:blipFill>
+                  <pic:spPr bwMode="auto">
+                    <a:xfrm>
+                      <a:off x="0" y="0"/>
+                      <a:ext cx="2287310" cy="6310630"/>
+                    </a:xfrm>
+                    <a:prstGeom prst="rect">
+                      <a:avLst/>
+                    </a:prstGeom>
+                    <a:noFill/>
+                    <a:ln>
+                      <a:noFill/>
+                    </a:ln>
+                  </pic:spPr>
+                </pic:pic>
+              </a:graphicData>
+            </a:graphic>
+          </wp:anchor>
+        </w:drawing>
+      </w:r>
+    </w:p>
+    <w:p>
+      <w:pPr>
+        <w:pStyle w:val="Header"/>
+        <w:tabs>
+          <w:tab w:val="clear" w:pos="4819"/>
+          <w:tab w:val="clear" w:pos="9638"/>
+        </w:tabs>
+        <w:spacing w:line="360" w:lineRule="auto"/>
+        <w:rPr>
+          <w:rFonts w:ascii="Verdana" w:hAnsi="Verdana" w:cs="Verdana"/>
+          <w:color w:val="FF0000"/>
+        </w:rPr>
+      </w:pPr>
+      <w:r>
+        <w:rPr>
+          <w:rFonts w:ascii="Verdana" w:hAnsi="Verdana" w:cs="Verdana"/>
+          <w:noProof/>
+          <w:color w:val="FF0000"/>
+        </w:rPr>
+        <w:drawing>
+          <wp:anchor distT="0" distB="0" distL="114300" distR="114300" simplePos="0" relativeHeight="251659264" behindDoc="0" locked="0" layoutInCell="1" allowOverlap="1" wp14:anchorId="7284E670" wp14:editId="020C7BE9">
+            <wp:simplePos x="0" y="0"/>
+            <wp:positionH relativeFrom="column">
+              <wp:posOffset>-510540</wp:posOffset>
+            </wp:positionH>
+            <wp:positionV relativeFrom="paragraph">
+              <wp:posOffset>943292</wp:posOffset>
+            </wp:positionV>
+            <wp:extent cx="4733925" cy="4863211"/>
+            <wp:effectExtent l="0" t="0" r="0" b="0"/>
+            <wp:wrapNone/>
+            <wp:docPr id="746956447" name="Picture 2"/>
+            <wp:cNvGraphicFramePr>
+              <a:graphicFrameLocks xmlns:a="http://schemas.openxmlformats.org/drawingml/2006/main" noChangeAspect="1"/>
+            </wp:cNvGraphicFramePr>
+            <a:graphic xmlns:a="http://schemas.openxmlformats.org/drawingml/2006/main">
+              <a:graphicData uri="http://schemas.openxmlformats.org/drawingml/2006/picture">
+                <pic:pic xmlns:pic="http://schemas.openxmlformats.org/drawingml/2006/picture">
+                  <pic:nvPicPr>
+                    <pic:cNvPr id="0" name="Picture 2"/>
+                    <pic:cNvPicPr>
+                      <a:picLocks noChangeAspect="1" noChangeArrowheads="1"/>
+                    </pic:cNvPicPr>
+                  </pic:nvPicPr>
+                  <pic:blipFill>
+                    <a:blip r:embed="rId20">
+                      <a:extLst>
+                        <a:ext uri="{28A0092B-C50C-407E-A947-70E740481C1C}">
+                          <a14:useLocalDpi xmlns:a14="http://schemas.microsoft.com/office/drawing/2010/main" val="0"/>
+                        </a:ext>
+                      </a:extLst>
+                    </a:blip>
+                    <a:srcRect/>
+                    <a:stretch>
+                      <a:fillRect/>
+                    </a:stretch>
+                  </pic:blipFill>
+                  <pic:spPr bwMode="auto">
+                    <a:xfrm>
+                      <a:off x="0" y="0"/>
+                      <a:ext cx="4733925" cy="4863211"/>
+                    </a:xfrm>
+                    <a:prstGeom prst="rect">
+                      <a:avLst/>
+                    </a:prstGeom>
+                    <a:noFill/>
+                    <a:ln>
+                      <a:noFill/>
+                    </a:ln>
+                  </pic:spPr>
+                </pic:pic>
+              </a:graphicData>
+            </a:graphic>
+            <wp14:sizeRelH relativeFrom="margin">
+              <wp14:pctWidth>0</wp14:pctWidth>
+            </wp14:sizeRelH>
+            <wp14:sizeRelV relativeFrom="margin">
+              <wp14:pctHeight>0</wp14:pctHeight>
+            </wp14:sizeRelV>
+          </wp:anchor>
+        </w:drawing>
+      </w:r>
     </w:p>
     <w:sectPr>
       <w:pgSz w:w="11906" w:h="16838" w:code="9"/>
@@ -12620,7 +12694,7 @@
     <w:lvl w:ilvl="7">
       <w:start w:val="1"/>
       <w:numFmt w:val="decimal"/>
-      <w:pStyle w:val="Otsikko8"/>
+      <w:pStyle w:val="Heading8"/>
       <w:lvlText w:val="%1.%2.%3.%4.%5.%6.%7.%8"/>
       <w:lvlJc w:val="left"/>
       <w:pPr>
@@ -12636,7 +12710,7 @@
     <w:lvl w:ilvl="8">
       <w:start w:val="1"/>
       <w:numFmt w:val="decimal"/>
-      <w:pStyle w:val="Otsikko9"/>
+      <w:pStyle w:val="Heading9"/>
       <w:lvlText w:val="%1.%2.%3.%4.%5.%6.%7.%8.%9"/>
       <w:lvlJc w:val="left"/>
       <w:pPr>
@@ -14096,7 +14170,7 @@
     <w:lsdException w:name="Unresolved Mention" w:semiHidden="1" w:unhideWhenUsed="1"/>
     <w:lsdException w:name="Smart Link" w:semiHidden="1" w:unhideWhenUsed="1"/>
   </w:latentStyles>
-  <w:style w:type="paragraph" w:default="1" w:styleId="Normaali">
+  <w:style w:type="paragraph" w:default="1" w:styleId="Normal">
     <w:name w:val="Normal"/>
     <w:qFormat/>
     <w:pPr>
@@ -14109,11 +14183,11 @@
       <w:lang w:eastAsia="en-US"/>
     </w:rPr>
   </w:style>
-  <w:style w:type="paragraph" w:styleId="Otsikko1">
+  <w:style w:type="paragraph" w:styleId="Heading1">
     <w:name w:val="heading 1"/>
-    <w:basedOn w:val="Normaali"/>
-    <w:next w:val="Normaali"/>
-    <w:link w:val="Otsikko1Char"/>
+    <w:basedOn w:val="Normal"/>
+    <w:next w:val="Normal"/>
+    <w:link w:val="Heading1Char"/>
     <w:uiPriority w:val="99"/>
     <w:qFormat/>
     <w:pPr>
@@ -14130,11 +14204,11 @@
       <w:szCs w:val="32"/>
     </w:rPr>
   </w:style>
-  <w:style w:type="paragraph" w:styleId="Otsikko2">
+  <w:style w:type="paragraph" w:styleId="Heading2">
     <w:name w:val="heading 2"/>
-    <w:basedOn w:val="Normaali"/>
-    <w:next w:val="Normaali"/>
-    <w:link w:val="Otsikko2Char"/>
+    <w:basedOn w:val="Normal"/>
+    <w:next w:val="Normal"/>
+    <w:link w:val="Heading2Char"/>
     <w:uiPriority w:val="99"/>
     <w:qFormat/>
     <w:pPr>
@@ -14152,11 +14226,11 @@
       <w:szCs w:val="28"/>
     </w:rPr>
   </w:style>
-  <w:style w:type="paragraph" w:styleId="Otsikko3">
+  <w:style w:type="paragraph" w:styleId="Heading3">
     <w:name w:val="heading 3"/>
-    <w:basedOn w:val="Normaali"/>
-    <w:next w:val="Normaali"/>
-    <w:link w:val="Otsikko3Char"/>
+    <w:basedOn w:val="Normal"/>
+    <w:next w:val="Normal"/>
+    <w:link w:val="Heading3Char"/>
     <w:uiPriority w:val="99"/>
     <w:qFormat/>
     <w:pPr>
@@ -14172,11 +14246,11 @@
       <w:szCs w:val="26"/>
     </w:rPr>
   </w:style>
-  <w:style w:type="paragraph" w:styleId="Otsikko4">
+  <w:style w:type="paragraph" w:styleId="Heading4">
     <w:name w:val="heading 4"/>
-    <w:basedOn w:val="Normaali"/>
-    <w:next w:val="Normaali"/>
-    <w:link w:val="Otsikko4Char"/>
+    <w:basedOn w:val="Normal"/>
+    <w:next w:val="Normal"/>
+    <w:link w:val="Heading4Char"/>
     <w:uiPriority w:val="99"/>
     <w:qFormat/>
     <w:pPr>
@@ -14194,11 +14268,11 @@
       <w:szCs w:val="22"/>
     </w:rPr>
   </w:style>
-  <w:style w:type="paragraph" w:styleId="Otsikko5">
+  <w:style w:type="paragraph" w:styleId="Heading5">
     <w:name w:val="heading 5"/>
-    <w:basedOn w:val="Normaali"/>
-    <w:next w:val="Normaali"/>
-    <w:link w:val="Otsikko5Char"/>
+    <w:basedOn w:val="Normal"/>
+    <w:next w:val="Normal"/>
+    <w:link w:val="Heading5Char"/>
     <w:uiPriority w:val="99"/>
     <w:qFormat/>
     <w:pPr>
@@ -14213,11 +14287,11 @@
       <w:szCs w:val="20"/>
     </w:rPr>
   </w:style>
-  <w:style w:type="paragraph" w:styleId="Otsikko6">
+  <w:style w:type="paragraph" w:styleId="Heading6">
     <w:name w:val="heading 6"/>
-    <w:basedOn w:val="Normaali"/>
-    <w:next w:val="Normaali"/>
-    <w:link w:val="Otsikko6Char"/>
+    <w:basedOn w:val="Normal"/>
+    <w:next w:val="Normal"/>
+    <w:link w:val="Heading6Char"/>
     <w:uiPriority w:val="99"/>
     <w:qFormat/>
     <w:pPr>
@@ -14233,11 +14307,11 @@
       <w:szCs w:val="20"/>
     </w:rPr>
   </w:style>
-  <w:style w:type="paragraph" w:styleId="Otsikko7">
+  <w:style w:type="paragraph" w:styleId="Heading7">
     <w:name w:val="heading 7"/>
-    <w:basedOn w:val="Normaali"/>
-    <w:next w:val="Normaali"/>
-    <w:link w:val="Otsikko7Char"/>
+    <w:basedOn w:val="Normal"/>
+    <w:next w:val="Normal"/>
+    <w:link w:val="Heading7Char"/>
     <w:uiPriority w:val="99"/>
     <w:qFormat/>
     <w:pPr>
@@ -14253,11 +14327,11 @@
       <w:szCs w:val="48"/>
     </w:rPr>
   </w:style>
-  <w:style w:type="paragraph" w:styleId="Otsikko8">
+  <w:style w:type="paragraph" w:styleId="Heading8">
     <w:name w:val="heading 8"/>
-    <w:basedOn w:val="Normaali"/>
-    <w:next w:val="Leipteksti"/>
-    <w:link w:val="Otsikko8Char"/>
+    <w:basedOn w:val="Normal"/>
+    <w:next w:val="BodyText"/>
+    <w:link w:val="Heading8Char"/>
     <w:uiPriority w:val="99"/>
     <w:qFormat/>
     <w:pPr>
@@ -14281,11 +14355,11 @@
       <w:lang w:val="en-AU"/>
     </w:rPr>
   </w:style>
-  <w:style w:type="paragraph" w:styleId="Otsikko9">
+  <w:style w:type="paragraph" w:styleId="Heading9">
     <w:name w:val="heading 9"/>
-    <w:basedOn w:val="Normaali"/>
-    <w:next w:val="Leipteksti"/>
-    <w:link w:val="Otsikko9Char"/>
+    <w:basedOn w:val="Normal"/>
+    <w:next w:val="BodyText"/>
+    <w:link w:val="Heading9Char"/>
     <w:uiPriority w:val="99"/>
     <w:qFormat/>
     <w:pPr>
@@ -14307,12 +14381,13 @@
       <w:lang w:val="en-AU"/>
     </w:rPr>
   </w:style>
-  <w:style w:type="character" w:default="1" w:styleId="Kappaleenoletusfontti">
+  <w:style w:type="character" w:default="1" w:styleId="DefaultParagraphFont">
     <w:name w:val="Default Paragraph Font"/>
     <w:uiPriority w:val="1"/>
+    <w:semiHidden/>
     <w:unhideWhenUsed/>
   </w:style>
-  <w:style w:type="table" w:default="1" w:styleId="Normaalitaulukko">
+  <w:style w:type="table" w:default="1" w:styleId="TableNormal">
     <w:name w:val="Normal Table"/>
     <w:uiPriority w:val="99"/>
     <w:semiHidden/>
@@ -14327,15 +14402,15 @@
       </w:tblCellMar>
     </w:tblPr>
   </w:style>
-  <w:style w:type="numbering" w:default="1" w:styleId="Eiluetteloa">
+  <w:style w:type="numbering" w:default="1" w:styleId="NoList">
     <w:name w:val="No List"/>
     <w:uiPriority w:val="99"/>
     <w:semiHidden/>
     <w:unhideWhenUsed/>
   </w:style>
-  <w:style w:type="character" w:customStyle="1" w:styleId="Otsikko1Char">
-    <w:name w:val="Otsikko 1 Char"/>
-    <w:link w:val="Otsikko1"/>
+  <w:style w:type="character" w:customStyle="1" w:styleId="Heading1Char">
+    <w:name w:val="Heading 1 Char"/>
+    <w:link w:val="Heading1"/>
     <w:uiPriority w:val="99"/>
     <w:locked/>
     <w:rPr>
@@ -14348,9 +14423,9 @@
       <w:lang w:val="fi-FI" w:eastAsia="x-none"/>
     </w:rPr>
   </w:style>
-  <w:style w:type="character" w:customStyle="1" w:styleId="Otsikko2Char">
-    <w:name w:val="Otsikko 2 Char"/>
-    <w:link w:val="Otsikko2"/>
+  <w:style w:type="character" w:customStyle="1" w:styleId="Heading2Char">
+    <w:name w:val="Heading 2 Char"/>
+    <w:link w:val="Heading2"/>
     <w:uiPriority w:val="99"/>
     <w:locked/>
     <w:rPr>
@@ -14364,9 +14439,9 @@
       <w:lang w:val="fi-FI" w:eastAsia="x-none"/>
     </w:rPr>
   </w:style>
-  <w:style w:type="character" w:customStyle="1" w:styleId="Otsikko3Char">
-    <w:name w:val="Otsikko 3 Char"/>
-    <w:link w:val="Otsikko3"/>
+  <w:style w:type="character" w:customStyle="1" w:styleId="Heading3Char">
+    <w:name w:val="Heading 3 Char"/>
+    <w:link w:val="Heading3"/>
     <w:uiPriority w:val="9"/>
     <w:semiHidden/>
     <w:locked/>
@@ -14379,9 +14454,9 @@
       <w:lang w:val="fi-FI" w:eastAsia="x-none"/>
     </w:rPr>
   </w:style>
-  <w:style w:type="character" w:customStyle="1" w:styleId="Otsikko4Char">
-    <w:name w:val="Otsikko 4 Char"/>
-    <w:link w:val="Otsikko4"/>
+  <w:style w:type="character" w:customStyle="1" w:styleId="Heading4Char">
+    <w:name w:val="Heading 4 Char"/>
+    <w:link w:val="Heading4"/>
     <w:uiPriority w:val="9"/>
     <w:semiHidden/>
     <w:locked/>
@@ -14394,9 +14469,9 @@
       <w:lang w:val="fi-FI" w:eastAsia="x-none"/>
     </w:rPr>
   </w:style>
-  <w:style w:type="character" w:customStyle="1" w:styleId="Otsikko5Char">
-    <w:name w:val="Otsikko 5 Char"/>
-    <w:link w:val="Otsikko5"/>
+  <w:style w:type="character" w:customStyle="1" w:styleId="Heading5Char">
+    <w:name w:val="Heading 5 Char"/>
+    <w:link w:val="Heading5"/>
     <w:uiPriority w:val="9"/>
     <w:semiHidden/>
     <w:locked/>
@@ -14411,9 +14486,9 @@
       <w:lang w:val="fi-FI" w:eastAsia="x-none"/>
     </w:rPr>
   </w:style>
-  <w:style w:type="character" w:customStyle="1" w:styleId="Otsikko6Char">
-    <w:name w:val="Otsikko 6 Char"/>
-    <w:link w:val="Otsikko6"/>
+  <w:style w:type="character" w:customStyle="1" w:styleId="Heading6Char">
+    <w:name w:val="Heading 6 Char"/>
+    <w:link w:val="Heading6"/>
     <w:uiPriority w:val="9"/>
     <w:semiHidden/>
     <w:locked/>
@@ -14424,9 +14499,9 @@
       <w:lang w:val="fi-FI" w:eastAsia="x-none"/>
     </w:rPr>
   </w:style>
-  <w:style w:type="character" w:customStyle="1" w:styleId="Otsikko7Char">
-    <w:name w:val="Otsikko 7 Char"/>
-    <w:link w:val="Otsikko7"/>
+  <w:style w:type="character" w:customStyle="1" w:styleId="Heading7Char">
+    <w:name w:val="Heading 7 Char"/>
+    <w:link w:val="Heading7"/>
     <w:uiPriority w:val="9"/>
     <w:semiHidden/>
     <w:locked/>
@@ -14437,9 +14512,9 @@
       <w:lang w:val="fi-FI" w:eastAsia="x-none"/>
     </w:rPr>
   </w:style>
-  <w:style w:type="character" w:customStyle="1" w:styleId="Otsikko8Char">
-    <w:name w:val="Otsikko 8 Char"/>
-    <w:link w:val="Otsikko8"/>
+  <w:style w:type="character" w:customStyle="1" w:styleId="Heading8Char">
+    <w:name w:val="Heading 8 Char"/>
+    <w:link w:val="Heading8"/>
     <w:uiPriority w:val="9"/>
     <w:semiHidden/>
     <w:locked/>
@@ -14452,9 +14527,9 @@
       <w:lang w:val="fi-FI" w:eastAsia="x-none"/>
     </w:rPr>
   </w:style>
-  <w:style w:type="character" w:customStyle="1" w:styleId="Otsikko9Char">
-    <w:name w:val="Otsikko 9 Char"/>
-    <w:link w:val="Otsikko9"/>
+  <w:style w:type="character" w:customStyle="1" w:styleId="Heading9Char">
+    <w:name w:val="Heading 9 Char"/>
+    <w:link w:val="Heading9"/>
     <w:uiPriority w:val="9"/>
     <w:semiHidden/>
     <w:locked/>
@@ -14463,10 +14538,10 @@
       <w:lang w:val="fi-FI" w:eastAsia="x-none"/>
     </w:rPr>
   </w:style>
-  <w:style w:type="paragraph" w:styleId="Yltunniste">
+  <w:style w:type="paragraph" w:styleId="Header">
     <w:name w:val="header"/>
-    <w:basedOn w:val="Normaali"/>
-    <w:link w:val="YltunnisteChar"/>
+    <w:basedOn w:val="Normal"/>
+    <w:link w:val="HeaderChar"/>
     <w:uiPriority w:val="99"/>
     <w:pPr>
       <w:tabs>
@@ -14475,9 +14550,9 @@
       </w:tabs>
     </w:pPr>
   </w:style>
-  <w:style w:type="character" w:customStyle="1" w:styleId="YltunnisteChar">
-    <w:name w:val="Ylätunniste Char"/>
-    <w:link w:val="Yltunniste"/>
+  <w:style w:type="character" w:customStyle="1" w:styleId="HeaderChar">
+    <w:name w:val="Header Char"/>
+    <w:link w:val="Header"/>
     <w:uiPriority w:val="99"/>
     <w:locked/>
     <w:rPr>
@@ -14487,10 +14562,10 @@
       <w:lang w:val="fi-FI" w:eastAsia="x-none"/>
     </w:rPr>
   </w:style>
-  <w:style w:type="paragraph" w:styleId="Alatunniste">
+  <w:style w:type="paragraph" w:styleId="Footer">
     <w:name w:val="footer"/>
-    <w:basedOn w:val="Normaali"/>
-    <w:link w:val="AlatunnisteChar"/>
+    <w:basedOn w:val="Normal"/>
+    <w:link w:val="FooterChar"/>
     <w:uiPriority w:val="99"/>
     <w:pPr>
       <w:tabs>
@@ -14499,9 +14574,9 @@
       </w:tabs>
     </w:pPr>
   </w:style>
-  <w:style w:type="character" w:customStyle="1" w:styleId="AlatunnisteChar">
-    <w:name w:val="Alatunniste Char"/>
-    <w:link w:val="Alatunniste"/>
+  <w:style w:type="character" w:customStyle="1" w:styleId="FooterChar">
+    <w:name w:val="Footer Char"/>
+    <w:link w:val="Footer"/>
     <w:uiPriority w:val="99"/>
     <w:semiHidden/>
     <w:locked/>
@@ -14512,17 +14587,17 @@
       <w:lang w:val="fi-FI" w:eastAsia="x-none"/>
     </w:rPr>
   </w:style>
-  <w:style w:type="character" w:styleId="Sivunumero">
+  <w:style w:type="character" w:styleId="PageNumber">
     <w:name w:val="page number"/>
     <w:uiPriority w:val="99"/>
     <w:rPr>
       <w:rFonts w:cs="Times New Roman"/>
     </w:rPr>
   </w:style>
-  <w:style w:type="paragraph" w:styleId="Sisluet1">
+  <w:style w:type="paragraph" w:styleId="TOC1">
     <w:name w:val="toc 1"/>
-    <w:basedOn w:val="Normaali"/>
-    <w:next w:val="Normaali"/>
+    <w:basedOn w:val="Normal"/>
+    <w:next w:val="Normal"/>
     <w:autoRedefine/>
     <w:uiPriority w:val="39"/>
     <w:pPr>
@@ -14536,10 +14611,10 @@
       <w:szCs w:val="20"/>
     </w:rPr>
   </w:style>
-  <w:style w:type="paragraph" w:styleId="Sisluet2">
+  <w:style w:type="paragraph" w:styleId="TOC2">
     <w:name w:val="toc 2"/>
-    <w:basedOn w:val="Normaali"/>
-    <w:next w:val="Normaali"/>
+    <w:basedOn w:val="Normal"/>
+    <w:next w:val="Normal"/>
     <w:autoRedefine/>
     <w:uiPriority w:val="39"/>
     <w:pPr>
@@ -14551,10 +14626,10 @@
       <w:szCs w:val="20"/>
     </w:rPr>
   </w:style>
-  <w:style w:type="paragraph" w:styleId="Sisluet3">
+  <w:style w:type="paragraph" w:styleId="TOC3">
     <w:name w:val="toc 3"/>
-    <w:basedOn w:val="Normaali"/>
-    <w:next w:val="Normaali"/>
+    <w:basedOn w:val="Normal"/>
+    <w:next w:val="Normal"/>
     <w:autoRedefine/>
     <w:uiPriority w:val="99"/>
     <w:semiHidden/>
@@ -14568,10 +14643,10 @@
       <w:szCs w:val="20"/>
     </w:rPr>
   </w:style>
-  <w:style w:type="paragraph" w:styleId="Sisluet4">
+  <w:style w:type="paragraph" w:styleId="TOC4">
     <w:name w:val="toc 4"/>
-    <w:basedOn w:val="Normaali"/>
-    <w:next w:val="Normaali"/>
+    <w:basedOn w:val="Normal"/>
+    <w:next w:val="Normal"/>
     <w:autoRedefine/>
     <w:uiPriority w:val="99"/>
     <w:semiHidden/>
@@ -14583,10 +14658,10 @@
       <w:szCs w:val="18"/>
     </w:rPr>
   </w:style>
-  <w:style w:type="paragraph" w:styleId="Sisluet5">
+  <w:style w:type="paragraph" w:styleId="TOC5">
     <w:name w:val="toc 5"/>
-    <w:basedOn w:val="Normaali"/>
-    <w:next w:val="Normaali"/>
+    <w:basedOn w:val="Normal"/>
+    <w:next w:val="Normal"/>
     <w:autoRedefine/>
     <w:uiPriority w:val="99"/>
     <w:semiHidden/>
@@ -14598,10 +14673,10 @@
       <w:szCs w:val="18"/>
     </w:rPr>
   </w:style>
-  <w:style w:type="paragraph" w:styleId="Sisluet6">
+  <w:style w:type="paragraph" w:styleId="TOC6">
     <w:name w:val="toc 6"/>
-    <w:basedOn w:val="Normaali"/>
-    <w:next w:val="Normaali"/>
+    <w:basedOn w:val="Normal"/>
+    <w:next w:val="Normal"/>
     <w:autoRedefine/>
     <w:uiPriority w:val="99"/>
     <w:semiHidden/>
@@ -14613,10 +14688,10 @@
       <w:szCs w:val="18"/>
     </w:rPr>
   </w:style>
-  <w:style w:type="paragraph" w:styleId="Sisluet7">
+  <w:style w:type="paragraph" w:styleId="TOC7">
     <w:name w:val="toc 7"/>
-    <w:basedOn w:val="Normaali"/>
-    <w:next w:val="Normaali"/>
+    <w:basedOn w:val="Normal"/>
+    <w:next w:val="Normal"/>
     <w:autoRedefine/>
     <w:uiPriority w:val="99"/>
     <w:semiHidden/>
@@ -14628,10 +14703,10 @@
       <w:szCs w:val="18"/>
     </w:rPr>
   </w:style>
-  <w:style w:type="paragraph" w:styleId="Sisluet8">
+  <w:style w:type="paragraph" w:styleId="TOC8">
     <w:name w:val="toc 8"/>
-    <w:basedOn w:val="Normaali"/>
-    <w:next w:val="Normaali"/>
+    <w:basedOn w:val="Normal"/>
+    <w:next w:val="Normal"/>
     <w:autoRedefine/>
     <w:uiPriority w:val="99"/>
     <w:semiHidden/>
@@ -14643,10 +14718,10 @@
       <w:szCs w:val="18"/>
     </w:rPr>
   </w:style>
-  <w:style w:type="paragraph" w:styleId="Sisluet9">
+  <w:style w:type="paragraph" w:styleId="TOC9">
     <w:name w:val="toc 9"/>
-    <w:basedOn w:val="Normaali"/>
-    <w:next w:val="Normaali"/>
+    <w:basedOn w:val="Normal"/>
+    <w:next w:val="Normal"/>
     <w:autoRedefine/>
     <w:uiPriority w:val="99"/>
     <w:semiHidden/>
@@ -14658,7 +14733,7 @@
       <w:szCs w:val="18"/>
     </w:rPr>
   </w:style>
-  <w:style w:type="character" w:styleId="Hyperlinkki">
+  <w:style w:type="character" w:styleId="Hyperlink">
     <w:name w:val="Hyperlink"/>
     <w:uiPriority w:val="99"/>
     <w:rPr>
@@ -14667,10 +14742,10 @@
       <w:u w:val="single"/>
     </w:rPr>
   </w:style>
-  <w:style w:type="paragraph" w:styleId="Leipteksti2">
+  <w:style w:type="paragraph" w:styleId="BodyText2">
     <w:name w:val="Body Text 2"/>
-    <w:basedOn w:val="Normaali"/>
-    <w:link w:val="Leipteksti2Char"/>
+    <w:basedOn w:val="Normal"/>
+    <w:link w:val="BodyText2Char"/>
     <w:uiPriority w:val="99"/>
     <w:pPr>
       <w:spacing w:after="120" w:line="360" w:lineRule="auto"/>
@@ -14682,9 +14757,9 @@
       <w:szCs w:val="22"/>
     </w:rPr>
   </w:style>
-  <w:style w:type="character" w:customStyle="1" w:styleId="Leipteksti2Char">
-    <w:name w:val="Leipäteksti 2 Char"/>
-    <w:link w:val="Leipteksti2"/>
+  <w:style w:type="character" w:customStyle="1" w:styleId="BodyText2Char">
+    <w:name w:val="Body Text 2 Char"/>
+    <w:link w:val="BodyText2"/>
     <w:uiPriority w:val="99"/>
     <w:semiHidden/>
     <w:locked/>
@@ -14695,10 +14770,10 @@
       <w:lang w:val="fi-FI" w:eastAsia="x-none"/>
     </w:rPr>
   </w:style>
-  <w:style w:type="paragraph" w:styleId="Sisennettyleipteksti2">
+  <w:style w:type="paragraph" w:styleId="BodyTextIndent2">
     <w:name w:val="Body Text Indent 2"/>
-    <w:basedOn w:val="Normaali"/>
-    <w:link w:val="Sisennettyleipteksti2Char"/>
+    <w:basedOn w:val="Normal"/>
+    <w:link w:val="BodyTextIndent2Char"/>
     <w:uiPriority w:val="99"/>
     <w:pPr>
       <w:spacing w:line="360" w:lineRule="auto"/>
@@ -14711,9 +14786,9 @@
       <w:szCs w:val="22"/>
     </w:rPr>
   </w:style>
-  <w:style w:type="character" w:customStyle="1" w:styleId="Sisennettyleipteksti2Char">
-    <w:name w:val="Sisennetty leipäteksti 2 Char"/>
-    <w:link w:val="Sisennettyleipteksti2"/>
+  <w:style w:type="character" w:customStyle="1" w:styleId="BodyTextIndent2Char">
+    <w:name w:val="Body Text Indent 2 Char"/>
+    <w:link w:val="BodyTextIndent2"/>
     <w:uiPriority w:val="99"/>
     <w:semiHidden/>
     <w:locked/>
@@ -14724,10 +14799,10 @@
       <w:lang w:val="fi-FI" w:eastAsia="x-none"/>
     </w:rPr>
   </w:style>
-  <w:style w:type="paragraph" w:styleId="Sisennettyleipteksti3">
+  <w:style w:type="paragraph" w:styleId="BodyTextIndent3">
     <w:name w:val="Body Text Indent 3"/>
-    <w:basedOn w:val="Normaali"/>
-    <w:link w:val="Sisennettyleipteksti3Char"/>
+    <w:basedOn w:val="Normal"/>
+    <w:link w:val="BodyTextIndent3Char"/>
     <w:uiPriority w:val="99"/>
     <w:pPr>
       <w:ind w:left="1080"/>
@@ -14738,9 +14813,9 @@
       <w:szCs w:val="20"/>
     </w:rPr>
   </w:style>
-  <w:style w:type="character" w:customStyle="1" w:styleId="Sisennettyleipteksti3Char">
-    <w:name w:val="Sisennetty leipäteksti 3 Char"/>
-    <w:link w:val="Sisennettyleipteksti3"/>
+  <w:style w:type="character" w:customStyle="1" w:styleId="BodyTextIndent3Char">
+    <w:name w:val="Body Text Indent 3 Char"/>
+    <w:link w:val="BodyTextIndent3"/>
     <w:uiPriority w:val="99"/>
     <w:semiHidden/>
     <w:locked/>
@@ -14751,10 +14826,10 @@
       <w:lang w:val="fi-FI" w:eastAsia="x-none"/>
     </w:rPr>
   </w:style>
-  <w:style w:type="paragraph" w:styleId="Alaviitteenteksti">
+  <w:style w:type="paragraph" w:styleId="FootnoteText">
     <w:name w:val="footnote text"/>
-    <w:basedOn w:val="Normaali"/>
-    <w:link w:val="AlaviitteentekstiChar"/>
+    <w:basedOn w:val="Normal"/>
+    <w:link w:val="FootnoteTextChar"/>
     <w:uiPriority w:val="99"/>
     <w:semiHidden/>
     <w:rPr>
@@ -14762,9 +14837,9 @@
       <w:szCs w:val="20"/>
     </w:rPr>
   </w:style>
-  <w:style w:type="character" w:customStyle="1" w:styleId="AlaviitteentekstiChar">
-    <w:name w:val="Alaviitteen teksti Char"/>
-    <w:link w:val="Alaviitteenteksti"/>
+  <w:style w:type="character" w:customStyle="1" w:styleId="FootnoteTextChar">
+    <w:name w:val="Footnote Text Char"/>
+    <w:link w:val="FootnoteText"/>
     <w:uiPriority w:val="99"/>
     <w:semiHidden/>
     <w:locked/>
@@ -14775,7 +14850,7 @@
       <w:lang w:val="fi-FI" w:eastAsia="x-none"/>
     </w:rPr>
   </w:style>
-  <w:style w:type="character" w:styleId="Alaviitteenviite">
+  <w:style w:type="character" w:styleId="FootnoteReference">
     <w:name w:val="footnote reference"/>
     <w:uiPriority w:val="99"/>
     <w:semiHidden/>
@@ -14784,7 +14859,7 @@
       <w:vertAlign w:val="superscript"/>
     </w:rPr>
   </w:style>
-  <w:style w:type="character" w:styleId="AvattuHyperlinkki">
+  <w:style w:type="character" w:styleId="FollowedHyperlink">
     <w:name w:val="FollowedHyperlink"/>
     <w:uiPriority w:val="99"/>
     <w:rPr>
@@ -14793,10 +14868,10 @@
       <w:u w:val="single"/>
     </w:rPr>
   </w:style>
-  <w:style w:type="paragraph" w:styleId="Leipteksti">
+  <w:style w:type="paragraph" w:styleId="BodyText">
     <w:name w:val="Body Text"/>
-    <w:basedOn w:val="Normaali"/>
-    <w:link w:val="LeiptekstiChar"/>
+    <w:basedOn w:val="Normal"/>
+    <w:link w:val="BodyTextChar"/>
     <w:uiPriority w:val="99"/>
     <w:rPr>
       <w:rFonts w:ascii="Verdana" w:hAnsi="Verdana" w:cs="Verdana"/>
@@ -14804,9 +14879,9 @@
       <w:szCs w:val="22"/>
     </w:rPr>
   </w:style>
-  <w:style w:type="character" w:customStyle="1" w:styleId="LeiptekstiChar">
-    <w:name w:val="Leipäteksti Char"/>
-    <w:link w:val="Leipteksti"/>
+  <w:style w:type="character" w:customStyle="1" w:styleId="BodyTextChar">
+    <w:name w:val="Body Text Char"/>
+    <w:link w:val="BodyText"/>
     <w:uiPriority w:val="99"/>
     <w:semiHidden/>
     <w:locked/>
@@ -14817,10 +14892,10 @@
       <w:lang w:val="fi-FI" w:eastAsia="x-none"/>
     </w:rPr>
   </w:style>
-  <w:style w:type="paragraph" w:styleId="Leipteksti3">
+  <w:style w:type="paragraph" w:styleId="BodyText3">
     <w:name w:val="Body Text 3"/>
-    <w:basedOn w:val="Normaali"/>
-    <w:link w:val="Leipteksti3Char"/>
+    <w:basedOn w:val="Normal"/>
+    <w:link w:val="BodyText3Char"/>
     <w:uiPriority w:val="99"/>
     <w:rPr>
       <w:rFonts w:ascii="Verdana" w:hAnsi="Verdana" w:cs="Verdana"/>
@@ -14828,9 +14903,9 @@
       <w:szCs w:val="20"/>
     </w:rPr>
   </w:style>
-  <w:style w:type="character" w:customStyle="1" w:styleId="Leipteksti3Char">
-    <w:name w:val="Leipäteksti 3 Char"/>
-    <w:link w:val="Leipteksti3"/>
+  <w:style w:type="character" w:customStyle="1" w:styleId="BodyText3Char">
+    <w:name w:val="Body Text 3 Char"/>
+    <w:link w:val="BodyText3"/>
     <w:uiPriority w:val="99"/>
     <w:semiHidden/>
     <w:locked/>
@@ -14841,10 +14916,10 @@
       <w:lang w:val="fi-FI" w:eastAsia="x-none"/>
     </w:rPr>
   </w:style>
-  <w:style w:type="paragraph" w:styleId="Asiakirjanrakenneruutu">
+  <w:style w:type="paragraph" w:styleId="DocumentMap">
     <w:name w:val="Document Map"/>
-    <w:basedOn w:val="Normaali"/>
-    <w:link w:val="AsiakirjanrakenneruutuChar"/>
+    <w:basedOn w:val="Normal"/>
+    <w:link w:val="DocumentMapChar"/>
     <w:uiPriority w:val="99"/>
     <w:semiHidden/>
     <w:pPr>
@@ -14854,9 +14929,9 @@
       <w:rFonts w:ascii="Tahoma" w:hAnsi="Tahoma" w:cs="Tahoma"/>
     </w:rPr>
   </w:style>
-  <w:style w:type="character" w:customStyle="1" w:styleId="AsiakirjanrakenneruutuChar">
-    <w:name w:val="Asiakirjan rakenneruutu Char"/>
-    <w:link w:val="Asiakirjanrakenneruutu"/>
+  <w:style w:type="character" w:customStyle="1" w:styleId="DocumentMapChar">
+    <w:name w:val="Document Map Char"/>
+    <w:link w:val="DocumentMap"/>
     <w:uiPriority w:val="99"/>
     <w:semiHidden/>
     <w:locked/>
@@ -14867,9 +14942,9 @@
       <w:lang w:val="fi-FI" w:eastAsia="x-none"/>
     </w:rPr>
   </w:style>
-  <w:style w:type="paragraph" w:styleId="NormaaliWWW">
+  <w:style w:type="paragraph" w:styleId="NormalWeb">
     <w:name w:val="Normal (Web)"/>
-    <w:basedOn w:val="Normaali"/>
+    <w:basedOn w:val="Normal"/>
     <w:uiPriority w:val="99"/>
     <w:pPr>
       <w:spacing w:before="100" w:after="100"/>
@@ -14877,7 +14952,7 @@
   </w:style>
   <w:style w:type="paragraph" w:customStyle="1" w:styleId="RunkoTeksti">
     <w:name w:val="RunkoTeksti"/>
-    <w:basedOn w:val="Normaali"/>
+    <w:basedOn w:val="Normal"/>
     <w:uiPriority w:val="99"/>
     <w:pPr>
       <w:spacing w:before="120" w:line="360" w:lineRule="auto"/>
@@ -14892,8 +14967,8 @@
   </w:style>
   <w:style w:type="paragraph" w:customStyle="1" w:styleId="HeaderText">
     <w:name w:val="Header Text"/>
-    <w:basedOn w:val="Yltunniste"/>
-    <w:next w:val="Yltunniste"/>
+    <w:basedOn w:val="Header"/>
+    <w:next w:val="Header"/>
     <w:uiPriority w:val="99"/>
     <w:pPr>
       <w:keepLines/>
@@ -14915,7 +14990,7 @@
   </w:style>
   <w:style w:type="paragraph" w:customStyle="1" w:styleId="HeaderText2">
     <w:name w:val="Header Text2"/>
-    <w:basedOn w:val="Yltunniste"/>
+    <w:basedOn w:val="Header"/>
     <w:uiPriority w:val="99"/>
     <w:pPr>
       <w:keepLines/>
@@ -14938,7 +15013,7 @@
   </w:style>
   <w:style w:type="paragraph" w:customStyle="1" w:styleId="Taulukko">
     <w:name w:val="Taulukko"/>
-    <w:basedOn w:val="Normaali"/>
+    <w:basedOn w:val="Normal"/>
     <w:uiPriority w:val="99"/>
     <w:rPr>
       <w:rFonts w:ascii="Arial" w:hAnsi="Arial" w:cs="Arial"/>
@@ -14947,7 +15022,7 @@
       <w:lang w:val="en-GB"/>
     </w:rPr>
   </w:style>
-  <w:style w:type="character" w:styleId="Korostus">
+  <w:style w:type="character" w:styleId="Emphasis">
     <w:name w:val="Emphasis"/>
     <w:uiPriority w:val="99"/>
     <w:qFormat/>
@@ -14957,7 +15032,7 @@
       <w:iCs/>
     </w:rPr>
   </w:style>
-  <w:style w:type="character" w:styleId="Kommentinviite">
+  <w:style w:type="character" w:styleId="CommentReference">
     <w:name w:val="annotation reference"/>
     <w:uiPriority w:val="99"/>
     <w:semiHidden/>
@@ -14968,10 +15043,10 @@
       <w:szCs w:val="16"/>
     </w:rPr>
   </w:style>
-  <w:style w:type="paragraph" w:styleId="Kommentinteksti">
+  <w:style w:type="paragraph" w:styleId="CommentText">
     <w:name w:val="annotation text"/>
-    <w:basedOn w:val="Normaali"/>
-    <w:link w:val="KommentintekstiChar"/>
+    <w:basedOn w:val="Normal"/>
+    <w:link w:val="CommentTextChar"/>
     <w:uiPriority w:val="99"/>
     <w:semiHidden/>
     <w:rsid w:val="00C40E57"/>
@@ -14980,9 +15055,9 @@
       <w:szCs w:val="20"/>
     </w:rPr>
   </w:style>
-  <w:style w:type="character" w:customStyle="1" w:styleId="KommentintekstiChar">
-    <w:name w:val="Kommentin teksti Char"/>
-    <w:link w:val="Kommentinteksti"/>
+  <w:style w:type="character" w:customStyle="1" w:styleId="CommentTextChar">
+    <w:name w:val="Comment Text Char"/>
+    <w:link w:val="CommentText"/>
     <w:uiPriority w:val="99"/>
     <w:semiHidden/>
     <w:locked/>
@@ -14993,11 +15068,11 @@
       <w:lang w:val="fi-FI" w:eastAsia="x-none"/>
     </w:rPr>
   </w:style>
-  <w:style w:type="paragraph" w:styleId="Kommentinotsikko">
+  <w:style w:type="paragraph" w:styleId="CommentSubject">
     <w:name w:val="annotation subject"/>
-    <w:basedOn w:val="Kommentinteksti"/>
-    <w:next w:val="Kommentinteksti"/>
-    <w:link w:val="KommentinotsikkoChar"/>
+    <w:basedOn w:val="CommentText"/>
+    <w:next w:val="CommentText"/>
+    <w:link w:val="CommentSubjectChar"/>
     <w:uiPriority w:val="99"/>
     <w:semiHidden/>
     <w:rsid w:val="00C40E57"/>
@@ -15006,9 +15081,9 @@
       <w:bCs/>
     </w:rPr>
   </w:style>
-  <w:style w:type="character" w:customStyle="1" w:styleId="KommentinotsikkoChar">
-    <w:name w:val="Kommentin otsikko Char"/>
-    <w:link w:val="Kommentinotsikko"/>
+  <w:style w:type="character" w:customStyle="1" w:styleId="CommentSubjectChar">
+    <w:name w:val="Comment Subject Char"/>
+    <w:link w:val="CommentSubject"/>
     <w:uiPriority w:val="99"/>
     <w:semiHidden/>
     <w:locked/>
@@ -15021,10 +15096,10 @@
       <w:lang w:val="fi-FI" w:eastAsia="x-none"/>
     </w:rPr>
   </w:style>
-  <w:style w:type="paragraph" w:styleId="Seliteteksti">
+  <w:style w:type="paragraph" w:styleId="BalloonText">
     <w:name w:val="Balloon Text"/>
-    <w:basedOn w:val="Normaali"/>
-    <w:link w:val="SelitetekstiChar"/>
+    <w:basedOn w:val="Normal"/>
+    <w:link w:val="BalloonTextChar"/>
     <w:uiPriority w:val="99"/>
     <w:semiHidden/>
     <w:rsid w:val="00C40E57"/>
@@ -15034,9 +15109,9 @@
       <w:szCs w:val="16"/>
     </w:rPr>
   </w:style>
-  <w:style w:type="character" w:customStyle="1" w:styleId="SelitetekstiChar">
-    <w:name w:val="Seliteteksti Char"/>
-    <w:link w:val="Seliteteksti"/>
+  <w:style w:type="character" w:customStyle="1" w:styleId="BalloonTextChar">
+    <w:name w:val="Balloon Text Char"/>
+    <w:link w:val="BalloonText"/>
     <w:uiPriority w:val="99"/>
     <w:semiHidden/>
     <w:locked/>
@@ -15055,7 +15130,7 @@
       <w:rFonts w:cs="Times New Roman"/>
     </w:rPr>
   </w:style>
-  <w:style w:type="paragraph" w:styleId="Eivli">
+  <w:style w:type="paragraph" w:styleId="NoSpacing">
     <w:name w:val="No Spacing"/>
     <w:uiPriority w:val="1"/>
     <w:qFormat/>
@@ -15070,9 +15145,9 @@
       <w:lang w:eastAsia="en-US"/>
     </w:rPr>
   </w:style>
-  <w:style w:type="table" w:styleId="TaulukkoRuudukko">
+  <w:style w:type="table" w:styleId="TableGrid">
     <w:name w:val="Table Grid"/>
-    <w:basedOn w:val="Normaalitaulukko"/>
+    <w:basedOn w:val="TableNormal"/>
     <w:uiPriority w:val="59"/>
     <w:rsid w:val="00A36F0B"/>
     <w:tblPr>
@@ -15086,9 +15161,9 @@
       </w:tblBorders>
     </w:tblPr>
   </w:style>
-  <w:style w:type="paragraph" w:styleId="Luettelokappale">
+  <w:style w:type="paragraph" w:styleId="ListParagraph">
     <w:name w:val="List Paragraph"/>
-    <w:basedOn w:val="Normaali"/>
+    <w:basedOn w:val="Normal"/>
     <w:uiPriority w:val="34"/>
     <w:qFormat/>
     <w:rsid w:val="002B190C"/>
@@ -15096,9 +15171,9 @@
       <w:ind w:left="1304"/>
     </w:pPr>
   </w:style>
-  <w:style w:type="character" w:styleId="Ratkaisematonmaininta">
+  <w:style w:type="character" w:styleId="UnresolvedMention">
     <w:name w:val="Unresolved Mention"/>
-    <w:basedOn w:val="Kappaleenoletusfontti"/>
+    <w:basedOn w:val="DefaultParagraphFont"/>
     <w:uiPriority w:val="99"/>
     <w:semiHidden/>
     <w:unhideWhenUsed/>
@@ -15393,17 +15468,6 @@
 </file>
 
 <file path=customXml/item1.xml><?xml version="1.0" encoding="utf-8"?>
-<p:properties xmlns:p="http://schemas.microsoft.com/office/2006/metadata/properties" xmlns:xsi="http://www.w3.org/2001/XMLSchema-instance" xmlns:pc="http://schemas.microsoft.com/office/infopath/2007/PartnerControls">
-  <documentManagement>
-    <lcf76f155ced4ddcb4097134ff3c332f xmlns="d3831626-fde5-4fc8-acc5-9526b66ab2bb">
-      <Terms xmlns="http://schemas.microsoft.com/office/infopath/2007/PartnerControls"/>
-    </lcf76f155ced4ddcb4097134ff3c332f>
-    <TaxCatchAll xmlns="b5314b1c-0f5c-4851-9378-7099df4806ca" xsi:nil="true"/>
-  </documentManagement>
-</p:properties>
-</file>
-
-<file path=customXml/item2.xml><?xml version="1.0" encoding="utf-8"?>
 <ct:contentTypeSchema xmlns:ct="http://schemas.microsoft.com/office/2006/metadata/contentType" xmlns:ma="http://schemas.microsoft.com/office/2006/metadata/properties/metaAttributes" ct:_="" ma:_="" ma:contentTypeName="Document" ma:contentTypeID="0x0101009C12936ABBAE164AB3E3B1E737DB3796" ma:contentTypeVersion="12" ma:contentTypeDescription="Create a new document." ma:contentTypeScope="" ma:versionID="a3c7e968aca90f61141995ffe44e8398">
   <xsd:schema xmlns:xsd="http://www.w3.org/2001/XMLSchema" xmlns:xs="http://www.w3.org/2001/XMLSchema" xmlns:p="http://schemas.microsoft.com/office/2006/metadata/properties" xmlns:ns2="d3831626-fde5-4fc8-acc5-9526b66ab2bb" xmlns:ns3="b5314b1c-0f5c-4851-9378-7099df4806ca" targetNamespace="http://schemas.microsoft.com/office/2006/metadata/properties" ma:root="true" ma:fieldsID="87450be8a9b396dcd3e7509fc153b825" ns2:_="" ns3:_="">
     <xsd:import namespace="d3831626-fde5-4fc8-acc5-9526b66ab2bb"/>
@@ -15604,11 +15668,18 @@
 </ct:contentTypeSchema>
 </file>
 
-<file path=customXml/item3.xml><?xml version="1.0" encoding="utf-8"?>
-<b:Sources xmlns:b="http://schemas.openxmlformats.org/officeDocument/2006/bibliography" xmlns="http://schemas.openxmlformats.org/officeDocument/2006/bibliography" SelectedStyle="\APA.XSL" StyleName="APA"/>
+<file path=customXml/item2.xml><?xml version="1.0" encoding="utf-8"?>
+<p:properties xmlns:p="http://schemas.microsoft.com/office/2006/metadata/properties" xmlns:xsi="http://www.w3.org/2001/XMLSchema-instance" xmlns:pc="http://schemas.microsoft.com/office/infopath/2007/PartnerControls">
+  <documentManagement>
+    <lcf76f155ced4ddcb4097134ff3c332f xmlns="d3831626-fde5-4fc8-acc5-9526b66ab2bb">
+      <Terms xmlns="http://schemas.microsoft.com/office/infopath/2007/PartnerControls"/>
+    </lcf76f155ced4ddcb4097134ff3c332f>
+    <TaxCatchAll xmlns="b5314b1c-0f5c-4851-9378-7099df4806ca" xsi:nil="true"/>
+  </documentManagement>
+</p:properties>
 </file>
 
-<file path=customXml/item4.xml><?xml version="1.0" encoding="utf-8"?>
+<file path=customXml/item3.xml><?xml version="1.0" encoding="utf-8"?>
 <?mso-contentType ?>
 <FormTemplates xmlns="http://schemas.microsoft.com/sharepoint/v3/contenttype/forms">
   <Display>DocumentLibraryForm</Display>
@@ -15617,18 +15688,11 @@
 </FormTemplates>
 </file>
 
-<file path=customXml/itemProps1.xml><?xml version="1.0" encoding="utf-8"?>
-<ds:datastoreItem xmlns:ds="http://schemas.openxmlformats.org/officeDocument/2006/customXml" ds:itemID="{EE41A236-5C73-4451-B1B7-A171E48F7377}">
-  <ds:schemaRefs>
-    <ds:schemaRef ds:uri="http://schemas.microsoft.com/office/2006/metadata/properties"/>
-    <ds:schemaRef ds:uri="http://schemas.microsoft.com/office/infopath/2007/PartnerControls"/>
-    <ds:schemaRef ds:uri="d3831626-fde5-4fc8-acc5-9526b66ab2bb"/>
-    <ds:schemaRef ds:uri="b5314b1c-0f5c-4851-9378-7099df4806ca"/>
-  </ds:schemaRefs>
-</ds:datastoreItem>
+<file path=customXml/item4.xml><?xml version="1.0" encoding="utf-8"?>
+<b:Sources xmlns:b="http://schemas.openxmlformats.org/officeDocument/2006/bibliography" xmlns="http://schemas.openxmlformats.org/officeDocument/2006/bibliography" SelectedStyle="\APA.XSL" StyleName="APA"/>
 </file>
 
-<file path=customXml/itemProps2.xml><?xml version="1.0" encoding="utf-8"?>
+<file path=customXml/itemProps1.xml><?xml version="1.0" encoding="utf-8"?>
 <ds:datastoreItem xmlns:ds="http://schemas.openxmlformats.org/officeDocument/2006/customXml" ds:itemID="{3BB198E8-0F36-4C71-8940-04215BB7641E}">
   <ds:schemaRefs>
     <ds:schemaRef ds:uri="http://schemas.microsoft.com/office/2006/metadata/contentType"/>
@@ -15647,18 +15711,29 @@
 </ds:datastoreItem>
 </file>
 
+<file path=customXml/itemProps2.xml><?xml version="1.0" encoding="utf-8"?>
+<ds:datastoreItem xmlns:ds="http://schemas.openxmlformats.org/officeDocument/2006/customXml" ds:itemID="{EE41A236-5C73-4451-B1B7-A171E48F7377}">
+  <ds:schemaRefs>
+    <ds:schemaRef ds:uri="http://schemas.microsoft.com/office/2006/metadata/properties"/>
+    <ds:schemaRef ds:uri="http://schemas.microsoft.com/office/infopath/2007/PartnerControls"/>
+    <ds:schemaRef ds:uri="d3831626-fde5-4fc8-acc5-9526b66ab2bb"/>
+    <ds:schemaRef ds:uri="b5314b1c-0f5c-4851-9378-7099df4806ca"/>
+  </ds:schemaRefs>
+</ds:datastoreItem>
+</file>
+
 <file path=customXml/itemProps3.xml><?xml version="1.0" encoding="utf-8"?>
+<ds:datastoreItem xmlns:ds="http://schemas.openxmlformats.org/officeDocument/2006/customXml" ds:itemID="{13DB4B30-73AF-4FCD-BA9E-CA11CB4B5807}">
+  <ds:schemaRefs>
+    <ds:schemaRef ds:uri="http://schemas.microsoft.com/sharepoint/v3/contenttype/forms"/>
+  </ds:schemaRefs>
+</ds:datastoreItem>
+</file>
+
+<file path=customXml/itemProps4.xml><?xml version="1.0" encoding="utf-8"?>
 <ds:datastoreItem xmlns:ds="http://schemas.openxmlformats.org/officeDocument/2006/customXml" ds:itemID="{2BA0B919-FBBB-4BB8-90D2-33E6A0B69F94}">
   <ds:schemaRefs>
     <ds:schemaRef ds:uri="http://schemas.openxmlformats.org/officeDocument/2006/bibliography"/>
   </ds:schemaRefs>
 </ds:datastoreItem>
-</file>
-
-<file path=customXml/itemProps4.xml><?xml version="1.0" encoding="utf-8"?>
-<ds:datastoreItem xmlns:ds="http://schemas.openxmlformats.org/officeDocument/2006/customXml" ds:itemID="{13DB4B30-73AF-4FCD-BA9E-CA11CB4B5807}">
-  <ds:schemaRefs>
-    <ds:schemaRef ds:uri="http://schemas.microsoft.com/sharepoint/v3/contenttype/forms"/>
-  </ds:schemaRefs>
-</ds:datastoreItem>
 </file>
</xml_diff>

<commit_message>
Lisätty Sisäänkirjautuminen tekniseen määrittelyyn
</commit_message>
<xml_diff>
--- a/Documents/tekninen_maarittely.docx
+++ b/Documents/tekninen_maarittely.docx
@@ -548,18 +548,8 @@
                 <w:sz w:val="20"/>
                 <w:szCs w:val="20"/>
               </w:rPr>
-              <w:t xml:space="preserve">Riku </w:t>
-            </w:r>
-            <w:proofErr w:type="spellStart"/>
-            <w:r>
-              <w:rPr>
-                <w:rFonts w:ascii="Verdana" w:hAnsi="Verdana" w:cs="Verdana"/>
-                <w:sz w:val="20"/>
-                <w:szCs w:val="20"/>
-              </w:rPr>
-              <w:t>Ängeslevä</w:t>
-            </w:r>
-            <w:proofErr w:type="spellEnd"/>
+              <w:t>Riku Ängeslevä</w:t>
+            </w:r>
           </w:p>
         </w:tc>
       </w:tr>
@@ -829,21 +819,7 @@
         <w:rPr>
           <w:rFonts w:ascii="Verdana" w:hAnsi="Verdana" w:cs="Verdana"/>
         </w:rPr>
-        <w:t xml:space="preserve"> Dokumentin tulee sisältää kuvaukset seuraavista: pankkiautomaattisovellus, mahdolliset </w:t>
-      </w:r>
-      <w:proofErr w:type="spellStart"/>
-      <w:r>
-        <w:rPr>
-          <w:rFonts w:ascii="Verdana" w:hAnsi="Verdana" w:cs="Verdana"/>
-        </w:rPr>
-        <w:t>DLL:t</w:t>
-      </w:r>
-      <w:proofErr w:type="spellEnd"/>
-      <w:r>
-        <w:rPr>
-          <w:rFonts w:ascii="Verdana" w:hAnsi="Verdana" w:cs="Verdana"/>
-        </w:rPr>
-        <w:t xml:space="preserve">, REST API, tietokanta </w:t>
+        <w:t xml:space="preserve"> Dokumentin tulee sisältää kuvaukset seuraavista: pankkiautomaattisovellus, mahdolliset DLL:t, REST API, tietokanta </w:t>
       </w:r>
       <w:r>
         <w:rPr>
@@ -1254,16 +1230,8 @@
         <w:rPr>
           <w:rFonts w:ascii="Verdana" w:hAnsi="Verdana"/>
         </w:rPr>
-        <w:t xml:space="preserve">Windows </w:t>
-      </w:r>
-      <w:proofErr w:type="spellStart"/>
-      <w:r>
-        <w:rPr>
-          <w:rFonts w:ascii="Verdana" w:hAnsi="Verdana"/>
-        </w:rPr>
-        <w:t>Defender</w:t>
-      </w:r>
-      <w:proofErr w:type="spellEnd"/>
+        <w:t>Windows Defender</w:t>
+      </w:r>
       <w:r>
         <w:rPr>
           <w:rFonts w:ascii="Verdana" w:hAnsi="Verdana"/>
@@ -1361,109 +1329,79 @@
         <w:rPr>
           <w:rFonts w:ascii="Verdana" w:hAnsi="Verdana"/>
         </w:rPr>
-        <w:t xml:space="preserve">pohjaisesta </w:t>
-      </w:r>
-      <w:proofErr w:type="gramStart"/>
+        <w:t>pohjaisesta pankkiautomaatti</w:t>
+      </w:r>
       <w:r>
         <w:rPr>
           <w:rFonts w:ascii="Verdana" w:hAnsi="Verdana"/>
         </w:rPr>
-        <w:t>pankkiautomaatti</w:t>
+        <w:t>-</w:t>
       </w:r>
       <w:r>
         <w:rPr>
           <w:rFonts w:ascii="Verdana" w:hAnsi="Verdana"/>
         </w:rPr>
-        <w:t>-</w:t>
+        <w:t>sovelluksesta</w:t>
       </w:r>
       <w:r>
         <w:rPr>
           <w:rFonts w:ascii="Verdana" w:hAnsi="Verdana"/>
         </w:rPr>
-        <w:t>sovelluksesta</w:t>
-      </w:r>
-      <w:proofErr w:type="gramEnd"/>
+        <w:t xml:space="preserve"> (</w:t>
+      </w:r>
       <w:r>
         <w:rPr>
           <w:rFonts w:ascii="Verdana" w:hAnsi="Verdana"/>
         </w:rPr>
-        <w:t xml:space="preserve"> (</w:t>
+        <w:t>ns. EXE</w:t>
       </w:r>
       <w:r>
         <w:rPr>
           <w:rFonts w:ascii="Verdana" w:hAnsi="Verdana"/>
         </w:rPr>
-        <w:t>ns. EXE</w:t>
+        <w:t>-komponent</w:t>
       </w:r>
       <w:r>
         <w:rPr>
           <w:rFonts w:ascii="Verdana" w:hAnsi="Verdana"/>
         </w:rPr>
-        <w:t>-komponent</w:t>
+        <w:t>ti)</w:t>
       </w:r>
       <w:r>
         <w:rPr>
           <w:rFonts w:ascii="Verdana" w:hAnsi="Verdana"/>
         </w:rPr>
-        <w:t>ti)</w:t>
+        <w:t>,</w:t>
       </w:r>
       <w:r>
         <w:rPr>
           <w:rFonts w:ascii="Verdana" w:hAnsi="Verdana"/>
         </w:rPr>
-        <w:t>,</w:t>
+        <w:t xml:space="preserve"> j</w:t>
       </w:r>
       <w:r>
         <w:rPr>
           <w:rFonts w:ascii="Verdana" w:hAnsi="Verdana"/>
         </w:rPr>
-        <w:t xml:space="preserve"> j</w:t>
+        <w:t xml:space="preserve">oka hyödyntää osassa toiminnallisuuksia ajonaikaisesti ladattavia kirjastokomponentteja (DLL-komponentit). Nämä </w:t>
       </w:r>
       <w:r>
         <w:rPr>
           <w:rFonts w:ascii="Verdana" w:hAnsi="Verdana"/>
         </w:rPr>
-        <w:t xml:space="preserve">oka hyödyntää osassa toiminnallisuuksia ajonaikaisesti ladattavia kirjastokomponentteja (DLL-komponentit). Nämä </w:t>
+        <w:t>ohjelmisto</w:t>
       </w:r>
       <w:r>
         <w:rPr>
           <w:rFonts w:ascii="Verdana" w:hAnsi="Verdana"/>
         </w:rPr>
-        <w:t>ohjelmisto</w:t>
+        <w:t xml:space="preserve">komponentit toteutaaan </w:t>
       </w:r>
       <w:r>
         <w:rPr>
           <w:rFonts w:ascii="Verdana" w:hAnsi="Verdana"/>
         </w:rPr>
-        <w:t xml:space="preserve">komponentit </w:t>
-      </w:r>
-      <w:proofErr w:type="spellStart"/>
-      <w:r>
-        <w:rPr>
-          <w:rFonts w:ascii="Verdana" w:hAnsi="Verdana"/>
-        </w:rPr>
-        <w:t>toteutaaan</w:t>
-      </w:r>
-      <w:proofErr w:type="spellEnd"/>
-      <w:r>
-        <w:rPr>
-          <w:rFonts w:ascii="Verdana" w:hAnsi="Verdana"/>
-        </w:rPr>
-        <w:t xml:space="preserve"> </w:t>
-      </w:r>
-      <w:proofErr w:type="spellStart"/>
-      <w:r>
-        <w:rPr>
-          <w:rFonts w:ascii="Verdana" w:hAnsi="Verdana"/>
-        </w:rPr>
-        <w:t>Qt</w:t>
-      </w:r>
-      <w:proofErr w:type="spellEnd"/>
-      <w:r>
-        <w:rPr>
-          <w:rFonts w:ascii="Verdana" w:hAnsi="Verdana"/>
-        </w:rPr>
-        <w:t>-</w:t>
+        <w:t>Qt-</w:t>
       </w:r>
       <w:r>
         <w:rPr>
@@ -1488,21 +1426,7 @@
         <w:rPr>
           <w:rFonts w:ascii="Verdana" w:hAnsi="Verdana"/>
         </w:rPr>
-        <w:t xml:space="preserve">hyödyntäen </w:t>
-      </w:r>
-      <w:proofErr w:type="spellStart"/>
-      <w:r>
-        <w:rPr>
-          <w:rFonts w:ascii="Verdana" w:hAnsi="Verdana"/>
-        </w:rPr>
-        <w:t>Qt</w:t>
-      </w:r>
-      <w:proofErr w:type="spellEnd"/>
-      <w:r>
-        <w:rPr>
-          <w:rFonts w:ascii="Verdana" w:hAnsi="Verdana"/>
-        </w:rPr>
-        <w:t xml:space="preserve">-luokkakirjaston </w:t>
+        <w:t xml:space="preserve">hyödyntäen Qt-luokkakirjaston </w:t>
       </w:r>
       <w:r>
         <w:rPr>
@@ -1635,14 +1559,12 @@
         </w:rPr>
         <w:t xml:space="preserve">Tietokannan vaatima palvelinohjelma perustuu </w:t>
       </w:r>
-      <w:proofErr w:type="spellStart"/>
       <w:r>
         <w:rPr>
           <w:rFonts w:ascii="Verdana" w:hAnsi="Verdana"/>
         </w:rPr>
         <w:t>MariaDB</w:t>
       </w:r>
-      <w:proofErr w:type="spellEnd"/>
       <w:r>
         <w:rPr>
           <w:rFonts w:ascii="Verdana" w:hAnsi="Verdana"/>
@@ -1718,23 +1640,7 @@
           <w:rFonts w:ascii="Verdana" w:hAnsi="Verdana" w:cs="Verdana"/>
           <w:szCs w:val="20"/>
         </w:rPr>
-        <w:t xml:space="preserve"> toteutuksessa voidaan </w:t>
-      </w:r>
-      <w:proofErr w:type="gramStart"/>
-      <w:r>
-        <w:rPr>
-          <w:rFonts w:ascii="Verdana" w:hAnsi="Verdana" w:cs="Verdana"/>
-          <w:szCs w:val="20"/>
-        </w:rPr>
-        <w:t>vaatimuksista riippuen</w:t>
-      </w:r>
-      <w:proofErr w:type="gramEnd"/>
-      <w:r>
-        <w:rPr>
-          <w:rFonts w:ascii="Verdana" w:hAnsi="Verdana" w:cs="Verdana"/>
-          <w:szCs w:val="20"/>
-        </w:rPr>
-        <w:t xml:space="preserve"> myös käyttää </w:t>
+        <w:t xml:space="preserve"> toteutuksessa voidaan vaatimuksista riippuen myös käyttää </w:t>
       </w:r>
       <w:r>
         <w:rPr>
@@ -2656,16 +2562,12 @@
         </w:rPr>
         <w:t xml:space="preserve">pauskaavio on </w:t>
       </w:r>
-      <w:proofErr w:type="spellStart"/>
-      <w:proofErr w:type="gramStart"/>
       <w:r>
         <w:rPr>
           <w:rFonts w:ascii="Verdana" w:hAnsi="Verdana" w:cs="Verdana"/>
         </w:rPr>
         <w:t>allaolevan</w:t>
       </w:r>
-      <w:proofErr w:type="spellEnd"/>
-      <w:proofErr w:type="gramEnd"/>
       <w:r>
         <w:rPr>
           <w:rFonts w:ascii="Verdana" w:hAnsi="Verdana" w:cs="Verdana"/>
@@ -4780,25 +4682,7 @@
                 <w:sz w:val="20"/>
                 <w:szCs w:val="20"/>
               </w:rPr>
-              <w:t xml:space="preserve">Kirjauduttu pankkiautomaatin </w:t>
-            </w:r>
-            <w:proofErr w:type="gramStart"/>
-            <w:r>
-              <w:rPr>
-                <w:rFonts w:ascii="Verdana" w:hAnsi="Verdana" w:cs="Verdana"/>
-                <w:sz w:val="20"/>
-                <w:szCs w:val="20"/>
-              </w:rPr>
-              <w:t>käyttäjäksi,  yhteys</w:t>
-            </w:r>
-            <w:proofErr w:type="gramEnd"/>
-            <w:r>
-              <w:rPr>
-                <w:rFonts w:ascii="Verdana" w:hAnsi="Verdana" w:cs="Verdana"/>
-                <w:sz w:val="20"/>
-                <w:szCs w:val="20"/>
-              </w:rPr>
-              <w:t xml:space="preserve"> </w:t>
+              <w:t xml:space="preserve">Kirjauduttu pankkiautomaatin käyttäjäksi,  yhteys </w:t>
             </w:r>
             <w:r>
               <w:rPr>
@@ -5122,25 +5006,7 @@
                 <w:sz w:val="20"/>
                 <w:szCs w:val="20"/>
               </w:rPr>
-              <w:t xml:space="preserve"> on näytetty oikein, </w:t>
-            </w:r>
-            <w:proofErr w:type="gramStart"/>
-            <w:r>
-              <w:rPr>
-                <w:rFonts w:ascii="Verdana" w:hAnsi="Verdana" w:cs="Verdana"/>
-                <w:sz w:val="20"/>
-                <w:szCs w:val="20"/>
-              </w:rPr>
-              <w:t>ja  tilitapahtumia</w:t>
-            </w:r>
-            <w:proofErr w:type="gramEnd"/>
-            <w:r>
-              <w:rPr>
-                <w:rFonts w:ascii="Verdana" w:hAnsi="Verdana" w:cs="Verdana"/>
-                <w:sz w:val="20"/>
-                <w:szCs w:val="20"/>
-              </w:rPr>
-              <w:t xml:space="preserve"> voidaan selata.</w:t>
+              <w:t xml:space="preserve"> on näytetty oikein, ja  tilitapahtumia voidaan selata.</w:t>
             </w:r>
           </w:p>
         </w:tc>
@@ -5758,25 +5624,7 @@
                 <w:sz w:val="20"/>
                 <w:szCs w:val="20"/>
               </w:rPr>
-              <w:t xml:space="preserve">Käyttäjä on saanut nostetuksi haluamansa summan </w:t>
-            </w:r>
-            <w:proofErr w:type="gramStart"/>
-            <w:r>
-              <w:rPr>
-                <w:rFonts w:ascii="Verdana" w:hAnsi="Verdana" w:cs="Verdana"/>
-                <w:sz w:val="20"/>
-                <w:szCs w:val="20"/>
-              </w:rPr>
-              <w:t>rahaa</w:t>
-            </w:r>
-            <w:proofErr w:type="gramEnd"/>
-            <w:r>
-              <w:rPr>
-                <w:rFonts w:ascii="Verdana" w:hAnsi="Verdana" w:cs="Verdana"/>
-                <w:sz w:val="20"/>
-                <w:szCs w:val="20"/>
-              </w:rPr>
-              <w:t xml:space="preserve"> ja rahamäärä on veloitettu käyttäjän tilitä.</w:t>
+              <w:t>Käyttäjä on saanut nostetuksi haluamansa summan rahaa ja rahamäärä on veloitettu käyttäjän tilitä.</w:t>
             </w:r>
           </w:p>
         </w:tc>
@@ -6086,25 +5934,7 @@
                 <w:sz w:val="20"/>
                 <w:szCs w:val="20"/>
               </w:rPr>
-              <w:t xml:space="preserve">Kirjauduttu pankkiautomaatin </w:t>
-            </w:r>
-            <w:proofErr w:type="gramStart"/>
-            <w:r>
-              <w:rPr>
-                <w:rFonts w:ascii="Verdana" w:hAnsi="Verdana" w:cs="Verdana"/>
-                <w:sz w:val="20"/>
-                <w:szCs w:val="20"/>
-              </w:rPr>
-              <w:t>käyttäjäksi,  yhteys</w:t>
-            </w:r>
-            <w:proofErr w:type="gramEnd"/>
-            <w:r>
-              <w:rPr>
-                <w:rFonts w:ascii="Verdana" w:hAnsi="Verdana" w:cs="Verdana"/>
-                <w:sz w:val="20"/>
-                <w:szCs w:val="20"/>
-              </w:rPr>
-              <w:t xml:space="preserve"> </w:t>
+              <w:t xml:space="preserve">Kirjauduttu pankkiautomaatin käyttäjäksi,  yhteys </w:t>
             </w:r>
             <w:r>
               <w:rPr>
@@ -6881,7 +6711,6 @@
         </w:rPr>
         <w:t xml:space="preserve">Tässä kuvataan </w:t>
       </w:r>
-      <w:proofErr w:type="spellStart"/>
       <w:r>
         <w:rPr>
           <w:rFonts w:ascii="Verdana" w:hAnsi="Verdana"/>
@@ -6896,7 +6725,6 @@
         </w:rPr>
         <w:t>ohjelman</w:t>
       </w:r>
-      <w:proofErr w:type="spellEnd"/>
       <w:r>
         <w:rPr>
           <w:rFonts w:ascii="Verdana" w:hAnsi="Verdana"/>
@@ -7044,30 +6872,8 @@
         <w:rPr>
           <w:rFonts w:ascii="Verdana" w:hAnsi="Verdana" w:cs="Verdana"/>
         </w:rPr>
-        <w:t xml:space="preserve">Asiakkaalla voi olla monta tiliä tyyppiä </w:t>
-      </w:r>
-      <w:proofErr w:type="spellStart"/>
-      <w:r>
-        <w:rPr>
-          <w:rFonts w:ascii="Verdana" w:hAnsi="Verdana" w:cs="Verdana"/>
-        </w:rPr>
-        <w:t>debit</w:t>
-      </w:r>
-      <w:proofErr w:type="spellEnd"/>
-      <w:r>
-        <w:rPr>
-          <w:rFonts w:ascii="Verdana" w:hAnsi="Verdana" w:cs="Verdana"/>
-        </w:rPr>
-        <w:t xml:space="preserve"> tai </w:t>
-      </w:r>
-      <w:proofErr w:type="spellStart"/>
-      <w:r>
-        <w:rPr>
-          <w:rFonts w:ascii="Verdana" w:hAnsi="Verdana" w:cs="Verdana"/>
-        </w:rPr>
-        <w:t>credit</w:t>
-      </w:r>
-      <w:proofErr w:type="spellEnd"/>
+        <w:t>Asiakkaalla voi olla monta tiliä tyyppiä debit tai credit</w:t>
+      </w:r>
     </w:p>
     <w:p>
       <w:pPr>
@@ -7120,35 +6926,7 @@
         <w:rPr>
           <w:rFonts w:ascii="Verdana" w:hAnsi="Verdana" w:cs="Verdana"/>
         </w:rPr>
-        <w:t xml:space="preserve">Kortin tyyppejä on kolme: </w:t>
-      </w:r>
-      <w:proofErr w:type="spellStart"/>
-      <w:r>
-        <w:rPr>
-          <w:rFonts w:ascii="Verdana" w:hAnsi="Verdana" w:cs="Verdana"/>
-        </w:rPr>
-        <w:t>debit</w:t>
-      </w:r>
-      <w:proofErr w:type="spellEnd"/>
-      <w:r>
-        <w:rPr>
-          <w:rFonts w:ascii="Verdana" w:hAnsi="Verdana" w:cs="Verdana"/>
-        </w:rPr>
-        <w:t xml:space="preserve">, </w:t>
-      </w:r>
-      <w:proofErr w:type="spellStart"/>
-      <w:r>
-        <w:rPr>
-          <w:rFonts w:ascii="Verdana" w:hAnsi="Verdana" w:cs="Verdana"/>
-        </w:rPr>
-        <w:t>credit</w:t>
-      </w:r>
-      <w:proofErr w:type="spellEnd"/>
-      <w:r>
-        <w:rPr>
-          <w:rFonts w:ascii="Verdana" w:hAnsi="Verdana" w:cs="Verdana"/>
-        </w:rPr>
-        <w:t>, kaksoiskortti</w:t>
+        <w:t>Kortin tyyppejä on kolme: debit, credit, kaksoiskortti</w:t>
       </w:r>
     </w:p>
     <w:p>
@@ -7166,35 +6944,7 @@
         <w:rPr>
           <w:rFonts w:ascii="Verdana" w:hAnsi="Verdana" w:cs="Verdana"/>
         </w:rPr>
-        <w:t xml:space="preserve">Yksi kortti voidaan liittää useaan tiliin (tämä tarkoittaa käytännössä, että kaksoiskortti voidaan liittää yhteen </w:t>
-      </w:r>
-      <w:proofErr w:type="spellStart"/>
-      <w:r>
-        <w:rPr>
-          <w:rFonts w:ascii="Verdana" w:hAnsi="Verdana" w:cs="Verdana"/>
-        </w:rPr>
-        <w:t>debit</w:t>
-      </w:r>
-      <w:proofErr w:type="spellEnd"/>
-      <w:r>
-        <w:rPr>
-          <w:rFonts w:ascii="Verdana" w:hAnsi="Verdana" w:cs="Verdana"/>
-        </w:rPr>
-        <w:t xml:space="preserve">-tiliin ja yhteen </w:t>
-      </w:r>
-      <w:proofErr w:type="spellStart"/>
-      <w:r>
-        <w:rPr>
-          <w:rFonts w:ascii="Verdana" w:hAnsi="Verdana" w:cs="Verdana"/>
-        </w:rPr>
-        <w:t>credit</w:t>
-      </w:r>
-      <w:proofErr w:type="spellEnd"/>
-      <w:r>
-        <w:rPr>
-          <w:rFonts w:ascii="Verdana" w:hAnsi="Verdana" w:cs="Verdana"/>
-        </w:rPr>
-        <w:t>-tiliin)</w:t>
+        <w:t>Yksi kortti voidaan liittää useaan tiliin (tämä tarkoittaa käytännössä, että kaksoiskortti voidaan liittää yhteen debit-tiliin ja yhteen credit-tiliin)</w:t>
       </w:r>
     </w:p>
     <w:p>
@@ -8129,23 +7879,7 @@
           <w:rFonts w:ascii="Verdana" w:hAnsi="Verdana" w:cs="Verdana"/>
           <w:szCs w:val="20"/>
         </w:rPr>
-        <w:t xml:space="preserve"> </w:t>
-      </w:r>
-      <w:proofErr w:type="gramStart"/>
-      <w:r>
-        <w:rPr>
-          <w:rFonts w:ascii="Verdana" w:hAnsi="Verdana" w:cs="Verdana"/>
-          <w:szCs w:val="20"/>
-        </w:rPr>
-        <w:t>kuvataan miten järjestelmäkomponentit toteutetaan</w:t>
-      </w:r>
-      <w:proofErr w:type="gramEnd"/>
-      <w:r>
-        <w:rPr>
-          <w:rFonts w:ascii="Verdana" w:hAnsi="Verdana" w:cs="Verdana"/>
-          <w:szCs w:val="20"/>
-        </w:rPr>
-        <w:t xml:space="preserve"> ohjelmistokomponentt</w:t>
+        <w:t xml:space="preserve"> kuvataan miten järjestelmäkomponentit toteutetaan ohjelmistokomponentt</w:t>
       </w:r>
       <w:r>
         <w:rPr>
@@ -8478,9 +8212,8 @@
                 <w:sz w:val="20"/>
                 <w:szCs w:val="20"/>
               </w:rPr>
-              <w:t xml:space="preserve">Käyttöliittymä komponentti, joka kommunikoi REST API </w:t>
-            </w:r>
-            <w:proofErr w:type="spellStart"/>
+              <w:t xml:space="preserve">Käyttöliittymä komponentti, joka kommunikoi REST API backendin kanssa. Tämä komponentti toimii osana </w:t>
+            </w:r>
             <w:r>
               <w:rPr>
                 <w:rFonts w:ascii="Verdana" w:hAnsi="Verdana" w:cs="Verdana"/>
@@ -8490,9 +8223,8 @@
                 <w:sz w:val="20"/>
                 <w:szCs w:val="20"/>
               </w:rPr>
-              <w:t>backendin</w:t>
-            </w:r>
-            <w:proofErr w:type="spellEnd"/>
+              <w:t xml:space="preserve">pankkiautomaatti </w:t>
+            </w:r>
             <w:r>
               <w:rPr>
                 <w:rFonts w:ascii="Verdana" w:hAnsi="Verdana" w:cs="Verdana"/>
@@ -8502,53 +8234,7 @@
                 <w:sz w:val="20"/>
                 <w:szCs w:val="20"/>
               </w:rPr>
-              <w:t xml:space="preserve"> kanssa. Tämä komponentti toimii osana </w:t>
-            </w:r>
-            <w:r>
-              <w:rPr>
-                <w:rFonts w:ascii="Verdana" w:hAnsi="Verdana" w:cs="Verdana"/>
-                <w:i/>
-                <w:iCs/>
-                <w:color w:val="000000" w:themeColor="text1"/>
-                <w:sz w:val="20"/>
-                <w:szCs w:val="20"/>
-              </w:rPr>
-              <w:t xml:space="preserve">pankkiautomaatti </w:t>
-            </w:r>
-            <w:r>
-              <w:rPr>
-                <w:rFonts w:ascii="Verdana" w:hAnsi="Verdana" w:cs="Verdana"/>
-                <w:i/>
-                <w:iCs/>
-                <w:color w:val="000000" w:themeColor="text1"/>
-                <w:sz w:val="20"/>
-                <w:szCs w:val="20"/>
-              </w:rPr>
-              <w:t xml:space="preserve">asiakassovellusta. Komponentti on </w:t>
-            </w:r>
-            <w:proofErr w:type="spellStart"/>
-            <w:r>
-              <w:rPr>
-                <w:rFonts w:ascii="Verdana" w:hAnsi="Verdana" w:cs="Verdana"/>
-                <w:i/>
-                <w:iCs/>
-                <w:color w:val="000000" w:themeColor="text1"/>
-                <w:sz w:val="20"/>
-                <w:szCs w:val="20"/>
-              </w:rPr>
-              <w:t>Qt</w:t>
-            </w:r>
-            <w:proofErr w:type="spellEnd"/>
-            <w:r>
-              <w:rPr>
-                <w:rFonts w:ascii="Verdana" w:hAnsi="Verdana" w:cs="Verdana"/>
-                <w:i/>
-                <w:iCs/>
-                <w:color w:val="000000" w:themeColor="text1"/>
-                <w:sz w:val="20"/>
-                <w:szCs w:val="20"/>
-              </w:rPr>
-              <w:t>-pohjainen.</w:t>
+              <w:t>asiakassovellusta. Komponentti on Qt-pohjainen.</w:t>
             </w:r>
             <w:r>
               <w:rPr>
@@ -8596,7 +8282,7 @@
                 <w:szCs w:val="20"/>
               </w:rPr>
               <w:drawing>
-                <wp:anchor distT="0" distB="0" distL="114300" distR="114300" simplePos="0" relativeHeight="251660288" behindDoc="1" locked="0" layoutInCell="1" allowOverlap="1" wp14:anchorId="1F6B7FD6" wp14:editId="0CF4C37B">
+                <wp:anchor distT="0" distB="0" distL="114300" distR="114300" simplePos="0" relativeHeight="251660288" behindDoc="1" locked="0" layoutInCell="1" allowOverlap="1" wp14:anchorId="1F6B7FD6" wp14:editId="057688DF">
                   <wp:simplePos x="0" y="0"/>
                   <wp:positionH relativeFrom="column">
                     <wp:posOffset>1665605</wp:posOffset>
@@ -8732,31 +8418,7 @@
                 <w:sz w:val="20"/>
                 <w:szCs w:val="20"/>
               </w:rPr>
-              <w:t xml:space="preserve">Funktiot mitä tarjoaa muille / signaalit mitä komponentti vastaanottaa tai lähettää muille. (ryhmän itse toteuttamat, ei </w:t>
-            </w:r>
-            <w:proofErr w:type="spellStart"/>
-            <w:r>
-              <w:rPr>
-                <w:rFonts w:ascii="Verdana" w:hAnsi="Verdana" w:cs="Verdana"/>
-                <w:i/>
-                <w:iCs/>
-                <w:color w:val="000000" w:themeColor="text1"/>
-                <w:sz w:val="20"/>
-                <w:szCs w:val="20"/>
-              </w:rPr>
-              <w:t>Qt:n</w:t>
-            </w:r>
-            <w:proofErr w:type="spellEnd"/>
-            <w:r>
-              <w:rPr>
-                <w:rFonts w:ascii="Verdana" w:hAnsi="Verdana" w:cs="Verdana"/>
-                <w:i/>
-                <w:iCs/>
-                <w:color w:val="000000" w:themeColor="text1"/>
-                <w:sz w:val="20"/>
-                <w:szCs w:val="20"/>
-              </w:rPr>
-              <w:t xml:space="preserve"> sisäisiä.)</w:t>
+              <w:t>Funktiot mitä tarjoaa muille / signaalit mitä komponentti vastaanottaa tai lähettää muille. (ryhmän itse toteuttamat, ei Qt:n sisäisiä.)</w:t>
             </w:r>
           </w:p>
           <w:tbl>
@@ -8847,79 +8509,13 @@
                       <w:szCs w:val="20"/>
                     </w:rPr>
                   </w:pPr>
-                  <w:proofErr w:type="spellStart"/>
-                  <w:proofErr w:type="gramStart"/>
                   <w:r>
                     <w:rPr>
                       <w:rFonts w:ascii="Verdana" w:hAnsi="Verdana" w:cs="Verdana"/>
                       <w:sz w:val="20"/>
                       <w:szCs w:val="20"/>
                     </w:rPr>
-                    <w:t>setToken</w:t>
-                  </w:r>
-                  <w:proofErr w:type="spellEnd"/>
-                  <w:r>
-                    <w:rPr>
-                      <w:rFonts w:ascii="Verdana" w:hAnsi="Verdana" w:cs="Verdana"/>
-                      <w:sz w:val="20"/>
-                      <w:szCs w:val="20"/>
-                    </w:rPr>
-                    <w:t>(</w:t>
-                  </w:r>
-                  <w:proofErr w:type="spellStart"/>
-                  <w:proofErr w:type="gramEnd"/>
-                  <w:r>
-                    <w:rPr>
-                      <w:rFonts w:ascii="Verdana" w:hAnsi="Verdana" w:cs="Verdana"/>
-                      <w:sz w:val="20"/>
-                      <w:szCs w:val="20"/>
-                    </w:rPr>
-                    <w:t>const</w:t>
-                  </w:r>
-                  <w:proofErr w:type="spellEnd"/>
-                  <w:r>
-                    <w:rPr>
-                      <w:rFonts w:ascii="Verdana" w:hAnsi="Verdana" w:cs="Verdana"/>
-                      <w:sz w:val="20"/>
-                      <w:szCs w:val="20"/>
-                    </w:rPr>
-                    <w:t xml:space="preserve"> </w:t>
-                  </w:r>
-                  <w:proofErr w:type="spellStart"/>
-                  <w:r>
-                    <w:rPr>
-                      <w:rFonts w:ascii="Verdana" w:hAnsi="Verdana" w:cs="Verdana"/>
-                      <w:sz w:val="20"/>
-                      <w:szCs w:val="20"/>
-                    </w:rPr>
-                    <w:t>QString</w:t>
-                  </w:r>
-                  <w:proofErr w:type="spellEnd"/>
-                  <w:r>
-                    <w:rPr>
-                      <w:rFonts w:ascii="Verdana" w:hAnsi="Verdana" w:cs="Verdana"/>
-                      <w:sz w:val="20"/>
-                      <w:szCs w:val="20"/>
-                    </w:rPr>
-                    <w:t xml:space="preserve"> &amp;</w:t>
-                  </w:r>
-                  <w:proofErr w:type="spellStart"/>
-                  <w:r>
-                    <w:rPr>
-                      <w:rFonts w:ascii="Verdana" w:hAnsi="Verdana" w:cs="Verdana"/>
-                      <w:sz w:val="20"/>
-                      <w:szCs w:val="20"/>
-                    </w:rPr>
-                    <w:t>newToken</w:t>
-                  </w:r>
-                  <w:proofErr w:type="spellEnd"/>
-                  <w:r>
-                    <w:rPr>
-                      <w:rFonts w:ascii="Verdana" w:hAnsi="Verdana" w:cs="Verdana"/>
-                      <w:sz w:val="20"/>
-                      <w:szCs w:val="20"/>
-                    </w:rPr>
-                    <w:t>)</w:t>
+                    <w:t>setToken(const QString &amp;newToken)</w:t>
                   </w:r>
                 </w:p>
               </w:tc>
@@ -8966,8 +8562,6 @@
                       <w:szCs w:val="20"/>
                     </w:rPr>
                   </w:pPr>
-                  <w:proofErr w:type="spellStart"/>
-                  <w:proofErr w:type="gramStart"/>
                   <w:r>
                     <w:rPr>
                       <w:rFonts w:ascii="Verdana" w:hAnsi="Verdana" w:cs="Verdana"/>
@@ -8975,58 +8569,7 @@
                       <w:sz w:val="20"/>
                       <w:szCs w:val="20"/>
                     </w:rPr>
-                    <w:t>setIdtili</w:t>
-                  </w:r>
-                  <w:proofErr w:type="spellEnd"/>
-                  <w:r>
-                    <w:rPr>
-                      <w:rFonts w:ascii="Verdana" w:hAnsi="Verdana" w:cs="Verdana"/>
-                      <w:color w:val="000000" w:themeColor="text1"/>
-                      <w:sz w:val="20"/>
-                      <w:szCs w:val="20"/>
-                    </w:rPr>
-                    <w:t>(</w:t>
-                  </w:r>
-                  <w:proofErr w:type="spellStart"/>
-                  <w:proofErr w:type="gramEnd"/>
-                  <w:r>
-                    <w:rPr>
-                      <w:rFonts w:ascii="Verdana" w:hAnsi="Verdana" w:cs="Verdana"/>
-                      <w:color w:val="000000" w:themeColor="text1"/>
-                      <w:sz w:val="20"/>
-                      <w:szCs w:val="20"/>
-                    </w:rPr>
-                    <w:t>int</w:t>
-                  </w:r>
-                  <w:proofErr w:type="spellEnd"/>
-                  <w:r>
-                    <w:rPr>
-                      <w:rFonts w:ascii="Verdana" w:hAnsi="Verdana" w:cs="Verdana"/>
-                      <w:color w:val="000000" w:themeColor="text1"/>
-                      <w:sz w:val="20"/>
-                      <w:szCs w:val="20"/>
-                    </w:rPr>
-                    <w:t xml:space="preserve"> </w:t>
-                  </w:r>
-                  <w:proofErr w:type="spellStart"/>
-                  <w:r>
-                    <w:rPr>
-                      <w:rFonts w:ascii="Verdana" w:hAnsi="Verdana" w:cs="Verdana"/>
-                      <w:color w:val="000000" w:themeColor="text1"/>
-                      <w:sz w:val="20"/>
-                      <w:szCs w:val="20"/>
-                    </w:rPr>
-                    <w:t>newIdTili</w:t>
-                  </w:r>
-                  <w:proofErr w:type="spellEnd"/>
-                  <w:r>
-                    <w:rPr>
-                      <w:rFonts w:ascii="Verdana" w:hAnsi="Verdana" w:cs="Verdana"/>
-                      <w:color w:val="000000" w:themeColor="text1"/>
-                      <w:sz w:val="20"/>
-                      <w:szCs w:val="20"/>
-                    </w:rPr>
-                    <w:t>)</w:t>
+                    <w:t>setIdtili(int newIdTili)</w:t>
                   </w:r>
                 </w:p>
               </w:tc>
@@ -9075,8 +8618,6 @@
                       <w:szCs w:val="20"/>
                     </w:rPr>
                   </w:pPr>
-                  <w:proofErr w:type="spellStart"/>
-                  <w:proofErr w:type="gramStart"/>
                   <w:r>
                     <w:rPr>
                       <w:rFonts w:ascii="Verdana" w:hAnsi="Verdana" w:cs="Verdana"/>
@@ -9084,39 +8625,8 @@
                       <w:sz w:val="20"/>
                       <w:szCs w:val="20"/>
                     </w:rPr>
-                    <w:t>getIdtili</w:t>
+                    <w:t>getIdtili() const</w:t>
                   </w:r>
-                  <w:proofErr w:type="spellEnd"/>
-                  <w:r>
-                    <w:rPr>
-                      <w:rFonts w:ascii="Verdana" w:hAnsi="Verdana" w:cs="Verdana"/>
-                      <w:color w:val="000000" w:themeColor="text1"/>
-                      <w:sz w:val="20"/>
-                      <w:szCs w:val="20"/>
-                    </w:rPr>
-                    <w:t>(</w:t>
-                  </w:r>
-                  <w:proofErr w:type="gramEnd"/>
-                  <w:r>
-                    <w:rPr>
-                      <w:rFonts w:ascii="Verdana" w:hAnsi="Verdana" w:cs="Verdana"/>
-                      <w:color w:val="000000" w:themeColor="text1"/>
-                      <w:sz w:val="20"/>
-                      <w:szCs w:val="20"/>
-                    </w:rPr>
-                    <w:t xml:space="preserve">) </w:t>
-                  </w:r>
-                  <w:proofErr w:type="spellStart"/>
-                  <w:r>
-                    <w:rPr>
-                      <w:rFonts w:ascii="Verdana" w:hAnsi="Verdana" w:cs="Verdana"/>
-                      <w:color w:val="000000" w:themeColor="text1"/>
-                      <w:sz w:val="20"/>
-                      <w:szCs w:val="20"/>
-                    </w:rPr>
-                    <w:t>const</w:t>
-                  </w:r>
-                  <w:proofErr w:type="spellEnd"/>
                 </w:p>
               </w:tc>
               <w:tc>
@@ -9142,27 +8652,7 @@
                       <w:sz w:val="20"/>
                       <w:szCs w:val="20"/>
                     </w:rPr>
-                    <w:t xml:space="preserve">Asetetun tilin </w:t>
-                  </w:r>
-                  <w:proofErr w:type="spellStart"/>
-                  <w:r>
-                    <w:rPr>
-                      <w:rFonts w:ascii="Verdana" w:hAnsi="Verdana" w:cs="Verdana"/>
-                      <w:color w:val="000000" w:themeColor="text1"/>
-                      <w:sz w:val="20"/>
-                      <w:szCs w:val="20"/>
-                    </w:rPr>
-                    <w:t>ID:n</w:t>
-                  </w:r>
-                  <w:proofErr w:type="spellEnd"/>
-                  <w:r>
-                    <w:rPr>
-                      <w:rFonts w:ascii="Verdana" w:hAnsi="Verdana" w:cs="Verdana"/>
-                      <w:color w:val="000000" w:themeColor="text1"/>
-                      <w:sz w:val="20"/>
-                      <w:szCs w:val="20"/>
-                    </w:rPr>
-                    <w:t xml:space="preserve"> palauttaminen.</w:t>
+                    <w:t>Asetetun tilin ID:n palauttaminen.</w:t>
                   </w:r>
                 </w:p>
               </w:tc>
@@ -9251,7 +8741,1319 @@
           </w:p>
         </w:tc>
       </w:tr>
-      <w:bookmarkEnd w:id="8"/>
+    </w:tbl>
+    <w:bookmarkEnd w:id="8"/>
+    <w:p>
+      <w:pPr>
+        <w:autoSpaceDE/>
+        <w:autoSpaceDN/>
+        <w:spacing w:after="200" w:line="276" w:lineRule="auto"/>
+        <w:rPr>
+          <w:rFonts w:ascii="Verdana" w:hAnsi="Verdana" w:cs="Verdana"/>
+          <w:b/>
+          <w:bCs/>
+          <w:i/>
+          <w:iCs/>
+          <w:color w:val="000000" w:themeColor="text1"/>
+          <w:sz w:val="36"/>
+          <w:szCs w:val="36"/>
+        </w:rPr>
+      </w:pPr>
+      <w:r>
+        <w:rPr>
+          <w:rFonts w:ascii="Verdana" w:hAnsi="Verdana" w:cs="Verdana"/>
+          <w:b/>
+          <w:bCs/>
+          <w:i/>
+          <w:iCs/>
+          <w:color w:val="000000" w:themeColor="text1"/>
+          <w:sz w:val="36"/>
+          <w:szCs w:val="36"/>
+        </w:rPr>
+        <w:lastRenderedPageBreak/>
+        <w:t>Sisäänkirjautuminen</w:t>
+      </w:r>
+    </w:p>
+    <w:tbl>
+      <w:tblPr>
+        <w:tblStyle w:val="TableGrid"/>
+        <w:tblW w:w="10343" w:type="dxa"/>
+        <w:tblLook w:val="04A0" w:firstRow="1" w:lastRow="0" w:firstColumn="1" w:lastColumn="0" w:noHBand="0" w:noVBand="1"/>
+      </w:tblPr>
+      <w:tblGrid>
+        <w:gridCol w:w="2425"/>
+        <w:gridCol w:w="630"/>
+        <w:gridCol w:w="7288"/>
+      </w:tblGrid>
+      <w:tr>
+        <w:trPr>
+          <w:trHeight w:val="1448"/>
+        </w:trPr>
+        <w:tc>
+          <w:tcPr>
+            <w:tcW w:w="3055" w:type="dxa"/>
+            <w:gridSpan w:val="2"/>
+          </w:tcPr>
+          <w:p>
+            <w:pPr>
+              <w:autoSpaceDE/>
+              <w:autoSpaceDN/>
+              <w:spacing w:line="276" w:lineRule="auto"/>
+              <w:rPr>
+                <w:rFonts w:ascii="Verdana" w:hAnsi="Verdana" w:cs="Verdana"/>
+                <w:b/>
+                <w:bCs/>
+                <w:color w:val="000000" w:themeColor="text1"/>
+                <w:sz w:val="20"/>
+                <w:szCs w:val="20"/>
+              </w:rPr>
+            </w:pPr>
+            <w:r>
+              <w:rPr>
+                <w:rFonts w:ascii="Verdana" w:hAnsi="Verdana" w:cs="Verdana"/>
+                <w:b/>
+                <w:bCs/>
+                <w:color w:val="000000" w:themeColor="text1"/>
+                <w:sz w:val="20"/>
+                <w:szCs w:val="20"/>
+              </w:rPr>
+              <w:t>Tarkoitus ja toiminta</w:t>
+            </w:r>
+          </w:p>
+        </w:tc>
+        <w:tc>
+          <w:tcPr>
+            <w:tcW w:w="7288" w:type="dxa"/>
+          </w:tcPr>
+          <w:p>
+            <w:pPr>
+              <w:autoSpaceDE/>
+              <w:autoSpaceDN/>
+              <w:spacing w:line="276" w:lineRule="auto"/>
+              <w:rPr>
+                <w:rFonts w:ascii="Verdana" w:hAnsi="Verdana" w:cs="Verdana"/>
+                <w:i/>
+                <w:iCs/>
+                <w:color w:val="000000" w:themeColor="text1"/>
+                <w:sz w:val="20"/>
+                <w:szCs w:val="20"/>
+              </w:rPr>
+            </w:pPr>
+            <w:r>
+              <w:rPr>
+                <w:rFonts w:ascii="Verdana" w:hAnsi="Verdana" w:cs="Verdana"/>
+                <w:i/>
+                <w:iCs/>
+                <w:color w:val="000000" w:themeColor="text1"/>
+                <w:sz w:val="20"/>
+                <w:szCs w:val="20"/>
+              </w:rPr>
+              <w:t>Komponentin tarkoituksena on</w:t>
+            </w:r>
+            <w:r>
+              <w:rPr>
+                <w:rFonts w:ascii="Verdana" w:hAnsi="Verdana" w:cs="Verdana"/>
+                <w:i/>
+                <w:iCs/>
+                <w:color w:val="000000" w:themeColor="text1"/>
+                <w:sz w:val="20"/>
+                <w:szCs w:val="20"/>
+              </w:rPr>
+              <w:t xml:space="preserve">, että asiakas syöttää </w:t>
+            </w:r>
+            <w:r>
+              <w:rPr>
+                <w:rFonts w:ascii="Verdana" w:hAnsi="Verdana" w:cs="Verdana"/>
+                <w:i/>
+                <w:iCs/>
+                <w:color w:val="000000" w:themeColor="text1"/>
+                <w:sz w:val="20"/>
+                <w:szCs w:val="20"/>
+              </w:rPr>
+              <w:t xml:space="preserve">ensin </w:t>
+            </w:r>
+            <w:r>
+              <w:rPr>
+                <w:rFonts w:ascii="Verdana" w:hAnsi="Verdana" w:cs="Verdana"/>
+                <w:i/>
+                <w:iCs/>
+                <w:color w:val="000000" w:themeColor="text1"/>
+                <w:sz w:val="20"/>
+                <w:szCs w:val="20"/>
+              </w:rPr>
+              <w:t>pankkitiliin liitetyn tunnistekoodin</w:t>
+            </w:r>
+            <w:r>
+              <w:rPr>
+                <w:rFonts w:ascii="Verdana" w:hAnsi="Verdana" w:cs="Verdana"/>
+                <w:i/>
+                <w:iCs/>
+                <w:color w:val="000000" w:themeColor="text1"/>
+                <w:sz w:val="20"/>
+                <w:szCs w:val="20"/>
+              </w:rPr>
+              <w:t xml:space="preserve"> ja painaa ”Jatka” -</w:t>
+            </w:r>
+            <w:r>
+              <w:rPr>
+                <w:rFonts w:ascii="Verdana" w:hAnsi="Verdana" w:cs="Verdana"/>
+                <w:i/>
+                <w:iCs/>
+                <w:color w:val="000000" w:themeColor="text1"/>
+                <w:sz w:val="20"/>
+                <w:szCs w:val="20"/>
+              </w:rPr>
+              <w:t>painiketta,</w:t>
+            </w:r>
+            <w:r>
+              <w:rPr>
+                <w:rFonts w:ascii="Verdana" w:hAnsi="Verdana" w:cs="Verdana"/>
+                <w:i/>
+                <w:iCs/>
+                <w:color w:val="000000" w:themeColor="text1"/>
+                <w:sz w:val="20"/>
+                <w:szCs w:val="20"/>
+              </w:rPr>
+              <w:t xml:space="preserve"> jonka jälkeen avautuu PIN-koodin syöttöikkuna. PIN-koodin syöttöikkunalla asiakkaalla on 10 sekuntia aikaa </w:t>
+            </w:r>
+            <w:r>
+              <w:rPr>
+                <w:rFonts w:ascii="Verdana" w:hAnsi="Verdana" w:cs="Verdana"/>
+                <w:i/>
+                <w:iCs/>
+                <w:color w:val="000000" w:themeColor="text1"/>
+                <w:sz w:val="20"/>
+                <w:szCs w:val="20"/>
+              </w:rPr>
+              <w:t>kirjautua</w:t>
+            </w:r>
+            <w:r>
+              <w:rPr>
+                <w:rFonts w:ascii="Verdana" w:hAnsi="Verdana" w:cs="Verdana"/>
+                <w:i/>
+                <w:iCs/>
+                <w:color w:val="000000" w:themeColor="text1"/>
+                <w:sz w:val="20"/>
+                <w:szCs w:val="20"/>
+              </w:rPr>
+              <w:t xml:space="preserve"> painamalla painiketta ”Kirjaudu”</w:t>
+            </w:r>
+            <w:r>
+              <w:rPr>
+                <w:rFonts w:ascii="Verdana" w:hAnsi="Verdana" w:cs="Verdana"/>
+                <w:i/>
+                <w:iCs/>
+                <w:color w:val="000000" w:themeColor="text1"/>
+                <w:sz w:val="20"/>
+                <w:szCs w:val="20"/>
+              </w:rPr>
+              <w:t>.</w:t>
+            </w:r>
+            <w:r>
+              <w:rPr>
+                <w:rFonts w:ascii="Verdana" w:hAnsi="Verdana" w:cs="Verdana"/>
+                <w:i/>
+                <w:iCs/>
+                <w:color w:val="000000" w:themeColor="text1"/>
+                <w:sz w:val="20"/>
+                <w:szCs w:val="20"/>
+              </w:rPr>
+              <w:t xml:space="preserve"> Jos asiakas jättää 10 sekunnin aikana kirjautumatta, palataan aloitusruutuun. </w:t>
+            </w:r>
+            <w:r>
+              <w:rPr>
+                <w:rFonts w:ascii="Verdana" w:hAnsi="Verdana" w:cs="Verdana"/>
+                <w:i/>
+                <w:iCs/>
+                <w:color w:val="000000" w:themeColor="text1"/>
+                <w:sz w:val="20"/>
+                <w:szCs w:val="20"/>
+              </w:rPr>
+              <w:t xml:space="preserve">Käyttöliittymä antaa syöttökentän alle </w:t>
+            </w:r>
+            <w:r>
+              <w:rPr>
+                <w:rFonts w:ascii="Verdana" w:hAnsi="Verdana" w:cs="Verdana"/>
+                <w:i/>
+                <w:iCs/>
+                <w:color w:val="000000" w:themeColor="text1"/>
+                <w:sz w:val="20"/>
+                <w:szCs w:val="20"/>
+              </w:rPr>
+              <w:t>virheilmoitustekstin,</w:t>
+            </w:r>
+            <w:r>
+              <w:rPr>
+                <w:rFonts w:ascii="Verdana" w:hAnsi="Verdana" w:cs="Verdana"/>
+                <w:i/>
+                <w:iCs/>
+                <w:color w:val="000000" w:themeColor="text1"/>
+                <w:sz w:val="20"/>
+                <w:szCs w:val="20"/>
+              </w:rPr>
+              <w:t xml:space="preserve"> mikäli syöttökenttä on tyhjä, tai PIN koodin pituus on alle 4. </w:t>
+            </w:r>
+            <w:r>
+              <w:rPr>
+                <w:rFonts w:ascii="Verdana" w:hAnsi="Verdana" w:cs="Verdana"/>
+                <w:i/>
+                <w:iCs/>
+                <w:color w:val="000000" w:themeColor="text1"/>
+                <w:sz w:val="20"/>
+                <w:szCs w:val="20"/>
+              </w:rPr>
+              <w:t xml:space="preserve">Jos </w:t>
+            </w:r>
+            <w:r>
+              <w:rPr>
+                <w:rFonts w:ascii="Verdana" w:hAnsi="Verdana" w:cs="Verdana"/>
+                <w:i/>
+                <w:iCs/>
+                <w:color w:val="000000" w:themeColor="text1"/>
+                <w:sz w:val="20"/>
+                <w:szCs w:val="20"/>
+              </w:rPr>
+              <w:t>tunnistekoodi löytyy rekisteristä, ja PIN-koodi vastaa rekisteriin salattua PIN-koodia, asiakas pääsee pankkiautomaatin pääkäyttöliittymään.</w:t>
+            </w:r>
+            <w:r>
+              <w:rPr>
+                <w:rFonts w:ascii="Verdana" w:hAnsi="Verdana" w:cs="Verdana"/>
+                <w:i/>
+                <w:iCs/>
+                <w:color w:val="000000" w:themeColor="text1"/>
+                <w:sz w:val="20"/>
+                <w:szCs w:val="20"/>
+              </w:rPr>
+              <w:t xml:space="preserve"> Mikäli tunnistekoodi ja/tai PIN-koodi ei täsmää, annetaan </w:t>
+            </w:r>
+            <w:r>
+              <w:rPr>
+                <w:rFonts w:ascii="Verdana" w:hAnsi="Verdana" w:cs="Verdana"/>
+                <w:i/>
+                <w:iCs/>
+                <w:color w:val="000000" w:themeColor="text1"/>
+                <w:sz w:val="20"/>
+                <w:szCs w:val="20"/>
+              </w:rPr>
+              <w:t>erillinen virheilmoitusikkuna, ja palataan aloitusruutuun.</w:t>
+            </w:r>
+            <w:r>
+              <w:rPr>
+                <w:rFonts w:ascii="Verdana" w:hAnsi="Verdana" w:cs="Verdana"/>
+                <w:i/>
+                <w:iCs/>
+                <w:color w:val="000000" w:themeColor="text1"/>
+                <w:sz w:val="20"/>
+                <w:szCs w:val="20"/>
+              </w:rPr>
+              <w:t xml:space="preserve"> Mikäli ohjelma havaitsee yhteysongelman REST API palvelimen kanssa, annetaan siitä erillinen </w:t>
+            </w:r>
+            <w:r>
+              <w:rPr>
+                <w:rFonts w:ascii="Verdana" w:hAnsi="Verdana" w:cs="Verdana"/>
+                <w:i/>
+                <w:iCs/>
+                <w:color w:val="000000" w:themeColor="text1"/>
+                <w:sz w:val="20"/>
+                <w:szCs w:val="20"/>
+              </w:rPr>
+              <w:t>virheilmoitusikkuna.</w:t>
+            </w:r>
+          </w:p>
+        </w:tc>
+      </w:tr>
+      <w:tr>
+        <w:trPr>
+          <w:trHeight w:val="758"/>
+        </w:trPr>
+        <w:tc>
+          <w:tcPr>
+            <w:tcW w:w="3055" w:type="dxa"/>
+            <w:gridSpan w:val="2"/>
+          </w:tcPr>
+          <w:p>
+            <w:pPr>
+              <w:autoSpaceDE/>
+              <w:autoSpaceDN/>
+              <w:spacing w:line="276" w:lineRule="auto"/>
+              <w:rPr>
+                <w:rFonts w:ascii="Verdana" w:hAnsi="Verdana" w:cs="Verdana"/>
+                <w:sz w:val="20"/>
+                <w:szCs w:val="20"/>
+              </w:rPr>
+            </w:pPr>
+            <w:r>
+              <w:rPr>
+                <w:rFonts w:ascii="Verdana" w:hAnsi="Verdana" w:cs="Verdana"/>
+                <w:b/>
+                <w:bCs/>
+                <w:sz w:val="20"/>
+                <w:szCs w:val="20"/>
+              </w:rPr>
+              <w:t>Järjestelmäkomponentti</w:t>
+            </w:r>
+          </w:p>
+        </w:tc>
+        <w:tc>
+          <w:tcPr>
+            <w:tcW w:w="7288" w:type="dxa"/>
+          </w:tcPr>
+          <w:p>
+            <w:pPr>
+              <w:autoSpaceDE/>
+              <w:autoSpaceDN/>
+              <w:spacing w:line="276" w:lineRule="auto"/>
+              <w:rPr>
+                <w:rFonts w:ascii="Verdana" w:hAnsi="Verdana" w:cs="Verdana"/>
+                <w:i/>
+                <w:iCs/>
+                <w:color w:val="FF0000"/>
+                <w:sz w:val="20"/>
+                <w:szCs w:val="20"/>
+              </w:rPr>
+            </w:pPr>
+            <w:r>
+              <w:rPr>
+                <w:rFonts w:ascii="Verdana" w:hAnsi="Verdana" w:cs="Verdana"/>
+                <w:i/>
+                <w:iCs/>
+                <w:color w:val="000000" w:themeColor="text1"/>
+                <w:sz w:val="20"/>
+                <w:szCs w:val="20"/>
+              </w:rPr>
+              <w:t>Käyttöliittymä komponentti, joka kommunikoi REST API backendin kanssa. Tämä komponentti toimii osana pankkiautomaatti asiakassovellusta. Komponentti on Qt-pohjainen.</w:t>
+            </w:r>
+          </w:p>
+        </w:tc>
+      </w:tr>
+      <w:tr>
+        <w:trPr>
+          <w:trHeight w:val="3308"/>
+        </w:trPr>
+        <w:tc>
+          <w:tcPr>
+            <w:tcW w:w="10343" w:type="dxa"/>
+            <w:gridSpan w:val="3"/>
+          </w:tcPr>
+          <w:p>
+            <w:pPr>
+              <w:autoSpaceDE/>
+              <w:autoSpaceDN/>
+              <w:spacing w:line="276" w:lineRule="auto"/>
+              <w:rPr>
+                <w:rFonts w:ascii="Verdana" w:hAnsi="Verdana" w:cs="Verdana"/>
+                <w:b/>
+                <w:bCs/>
+                <w:sz w:val="20"/>
+                <w:szCs w:val="20"/>
+              </w:rPr>
+            </w:pPr>
+            <w:r>
+              <w:rPr>
+                <w:rFonts w:ascii="Verdana" w:hAnsi="Verdana" w:cs="Verdana"/>
+                <w:b/>
+                <w:bCs/>
+                <w:noProof/>
+                <w:sz w:val="20"/>
+                <w:szCs w:val="20"/>
+              </w:rPr>
+              <w:drawing>
+                <wp:anchor distT="0" distB="0" distL="114300" distR="114300" simplePos="0" relativeHeight="251662336" behindDoc="1" locked="0" layoutInCell="1" allowOverlap="1" wp14:anchorId="7B9D98CE" wp14:editId="3827E1C9">
+                  <wp:simplePos x="0" y="0"/>
+                  <wp:positionH relativeFrom="column">
+                    <wp:posOffset>1813560</wp:posOffset>
+                  </wp:positionH>
+                  <wp:positionV relativeFrom="paragraph">
+                    <wp:posOffset>29845</wp:posOffset>
+                  </wp:positionV>
+                  <wp:extent cx="3750945" cy="1965325"/>
+                  <wp:effectExtent l="0" t="0" r="1905" b="0"/>
+                  <wp:wrapTight wrapText="bothSides">
+                    <wp:wrapPolygon edited="0">
+                      <wp:start x="0" y="0"/>
+                      <wp:lineTo x="0" y="21356"/>
+                      <wp:lineTo x="21501" y="21356"/>
+                      <wp:lineTo x="21501" y="0"/>
+                      <wp:lineTo x="0" y="0"/>
+                    </wp:wrapPolygon>
+                  </wp:wrapTight>
+                  <wp:docPr id="1028599485" name="Kuva 1"/>
+                  <wp:cNvGraphicFramePr>
+                    <a:graphicFrameLocks xmlns:a="http://schemas.openxmlformats.org/drawingml/2006/main" noChangeAspect="1"/>
+                  </wp:cNvGraphicFramePr>
+                  <a:graphic xmlns:a="http://schemas.openxmlformats.org/drawingml/2006/main">
+                    <a:graphicData uri="http://schemas.openxmlformats.org/drawingml/2006/picture">
+                      <pic:pic xmlns:pic="http://schemas.openxmlformats.org/drawingml/2006/picture">
+                        <pic:nvPicPr>
+                          <pic:cNvPr id="1028599485" name="Kuva 1"/>
+                          <pic:cNvPicPr/>
+                        </pic:nvPicPr>
+                        <pic:blipFill>
+                          <a:blip r:embed="rId18"/>
+                          <a:stretch>
+                            <a:fillRect/>
+                          </a:stretch>
+                        </pic:blipFill>
+                        <pic:spPr>
+                          <a:xfrm>
+                            <a:off x="0" y="0"/>
+                            <a:ext cx="3750945" cy="1965325"/>
+                          </a:xfrm>
+                          <a:prstGeom prst="rect">
+                            <a:avLst/>
+                          </a:prstGeom>
+                        </pic:spPr>
+                      </pic:pic>
+                    </a:graphicData>
+                  </a:graphic>
+                  <wp14:sizeRelH relativeFrom="margin">
+                    <wp14:pctWidth>0</wp14:pctWidth>
+                  </wp14:sizeRelH>
+                  <wp14:sizeRelV relativeFrom="margin">
+                    <wp14:pctHeight>0</wp14:pctHeight>
+                  </wp14:sizeRelV>
+                </wp:anchor>
+              </w:drawing>
+            </w:r>
+            <w:r>
+              <w:rPr>
+                <w:rFonts w:ascii="Verdana" w:hAnsi="Verdana" w:cs="Verdana"/>
+                <w:b/>
+                <w:bCs/>
+                <w:sz w:val="20"/>
+                <w:szCs w:val="20"/>
+              </w:rPr>
+              <w:t>Luokkakaavio (UML)</w:t>
+            </w:r>
+          </w:p>
+          <w:p>
+            <w:pPr>
+              <w:autoSpaceDE/>
+              <w:autoSpaceDN/>
+              <w:spacing w:line="276" w:lineRule="auto"/>
+              <w:rPr>
+                <w:rFonts w:ascii="Verdana" w:hAnsi="Verdana" w:cs="Verdana"/>
+                <w:b/>
+                <w:bCs/>
+                <w:sz w:val="20"/>
+                <w:szCs w:val="20"/>
+              </w:rPr>
+            </w:pPr>
+          </w:p>
+        </w:tc>
+      </w:tr>
+      <w:tr>
+        <w:trPr>
+          <w:trHeight w:val="2543"/>
+        </w:trPr>
+        <w:tc>
+          <w:tcPr>
+            <w:tcW w:w="10343" w:type="dxa"/>
+            <w:gridSpan w:val="3"/>
+          </w:tcPr>
+          <w:p>
+            <w:pPr>
+              <w:autoSpaceDE/>
+              <w:autoSpaceDN/>
+              <w:spacing w:line="276" w:lineRule="auto"/>
+              <w:rPr>
+                <w:rFonts w:ascii="Verdana" w:hAnsi="Verdana" w:cs="Verdana"/>
+                <w:i/>
+                <w:iCs/>
+                <w:color w:val="FF0000"/>
+                <w:sz w:val="20"/>
+                <w:szCs w:val="20"/>
+              </w:rPr>
+            </w:pPr>
+            <w:r>
+              <w:rPr>
+                <w:rFonts w:ascii="Verdana" w:hAnsi="Verdana" w:cs="Verdana"/>
+                <w:b/>
+                <w:bCs/>
+                <w:sz w:val="20"/>
+                <w:szCs w:val="20"/>
+              </w:rPr>
+              <w:t xml:space="preserve">Rajapinnat </w:t>
+            </w:r>
+            <w:r>
+              <w:rPr>
+                <w:rFonts w:ascii="Verdana" w:hAnsi="Verdana" w:cs="Verdana"/>
+                <w:b/>
+                <w:bCs/>
+                <w:sz w:val="20"/>
+                <w:szCs w:val="20"/>
+              </w:rPr>
+              <w:br/>
+            </w:r>
+            <w:r>
+              <w:rPr>
+                <w:rFonts w:ascii="Verdana" w:hAnsi="Verdana" w:cs="Verdana"/>
+                <w:i/>
+                <w:iCs/>
+                <w:color w:val="000000" w:themeColor="text1"/>
+                <w:sz w:val="20"/>
+                <w:szCs w:val="20"/>
+              </w:rPr>
+              <w:t>Funktiot mitä tarjoaa muille / signaalit mitä komponentti vastaanottaa tai lähettää muille. (ryhmän itse toteuttamat, ei Qt:n sisäisiä.)</w:t>
+            </w:r>
+          </w:p>
+          <w:tbl>
+            <w:tblPr>
+              <w:tblStyle w:val="TableGrid"/>
+              <w:tblW w:w="0" w:type="auto"/>
+              <w:tblLook w:val="04A0" w:firstRow="1" w:lastRow="0" w:firstColumn="1" w:lastColumn="0" w:noHBand="0" w:noVBand="1"/>
+            </w:tblPr>
+            <w:tblGrid>
+              <w:gridCol w:w="3422"/>
+              <w:gridCol w:w="6662"/>
+            </w:tblGrid>
+            <w:tr>
+              <w:tc>
+                <w:tcPr>
+                  <w:tcW w:w="3422" w:type="dxa"/>
+                </w:tcPr>
+                <w:p>
+                  <w:pPr>
+                    <w:autoSpaceDE/>
+                    <w:autoSpaceDN/>
+                    <w:spacing w:line="276" w:lineRule="auto"/>
+                    <w:rPr>
+                      <w:rFonts w:ascii="Verdana" w:hAnsi="Verdana" w:cs="Verdana"/>
+                      <w:b/>
+                      <w:bCs/>
+                      <w:color w:val="FF0000"/>
+                      <w:sz w:val="20"/>
+                      <w:szCs w:val="20"/>
+                    </w:rPr>
+                  </w:pPr>
+                  <w:r>
+                    <w:rPr>
+                      <w:rFonts w:ascii="Verdana" w:hAnsi="Verdana" w:cs="Verdana"/>
+                      <w:b/>
+                      <w:bCs/>
+                      <w:sz w:val="20"/>
+                      <w:szCs w:val="20"/>
+                    </w:rPr>
+                    <w:t>Funktio / Signaali</w:t>
+                  </w:r>
+                </w:p>
+              </w:tc>
+              <w:tc>
+                <w:tcPr>
+                  <w:tcW w:w="6662" w:type="dxa"/>
+                </w:tcPr>
+                <w:p>
+                  <w:pPr>
+                    <w:autoSpaceDE/>
+                    <w:autoSpaceDN/>
+                    <w:spacing w:line="276" w:lineRule="auto"/>
+                    <w:rPr>
+                      <w:rFonts w:ascii="Verdana" w:hAnsi="Verdana" w:cs="Verdana"/>
+                      <w:b/>
+                      <w:bCs/>
+                      <w:color w:val="FF0000"/>
+                      <w:sz w:val="20"/>
+                      <w:szCs w:val="20"/>
+                    </w:rPr>
+                  </w:pPr>
+                  <w:r>
+                    <w:rPr>
+                      <w:rFonts w:ascii="Verdana" w:hAnsi="Verdana" w:cs="Verdana"/>
+                      <w:b/>
+                      <w:bCs/>
+                      <w:sz w:val="20"/>
+                      <w:szCs w:val="20"/>
+                    </w:rPr>
+                    <w:t>Tarkoitus</w:t>
+                  </w:r>
+                </w:p>
+              </w:tc>
+            </w:tr>
+            <w:tr>
+              <w:tc>
+                <w:tcPr>
+                  <w:tcW w:w="3422" w:type="dxa"/>
+                </w:tcPr>
+                <w:p>
+                  <w:pPr>
+                    <w:autoSpaceDE/>
+                    <w:autoSpaceDN/>
+                    <w:spacing w:line="276" w:lineRule="auto"/>
+                    <w:rPr>
+                      <w:rFonts w:ascii="Verdana" w:hAnsi="Verdana" w:cs="Verdana"/>
+                      <w:sz w:val="20"/>
+                      <w:szCs w:val="20"/>
+                    </w:rPr>
+                  </w:pPr>
+                  <w:r>
+                    <w:rPr>
+                      <w:rFonts w:ascii="Verdana" w:hAnsi="Verdana" w:cs="Verdana"/>
+                      <w:sz w:val="20"/>
+                      <w:szCs w:val="20"/>
+                    </w:rPr>
+                    <w:t>setTunniste(QString): void</w:t>
+                  </w:r>
+                </w:p>
+              </w:tc>
+              <w:tc>
+                <w:tcPr>
+                  <w:tcW w:w="6662" w:type="dxa"/>
+                </w:tcPr>
+                <w:p>
+                  <w:pPr>
+                    <w:autoSpaceDE/>
+                    <w:autoSpaceDN/>
+                    <w:spacing w:line="276" w:lineRule="auto"/>
+                    <w:rPr>
+                      <w:rFonts w:ascii="Verdana" w:hAnsi="Verdana" w:cs="Verdana"/>
+                      <w:sz w:val="20"/>
+                      <w:szCs w:val="20"/>
+                    </w:rPr>
+                  </w:pPr>
+                  <w:r>
+                    <w:rPr>
+                      <w:rFonts w:ascii="Verdana" w:hAnsi="Verdana" w:cs="Verdana"/>
+                      <w:sz w:val="20"/>
+                      <w:szCs w:val="20"/>
+                    </w:rPr>
+                    <w:t xml:space="preserve">Asettaa asiakkaan syöttämän tunnistekoodin </w:t>
+                  </w:r>
+                  <w:r>
+                    <w:rPr>
+                      <w:rFonts w:ascii="Verdana" w:hAnsi="Verdana" w:cs="Verdana"/>
+                      <w:sz w:val="20"/>
+                      <w:szCs w:val="20"/>
+                    </w:rPr>
+                    <w:t>muuttujaan,</w:t>
+                  </w:r>
+                  <w:r>
+                    <w:rPr>
+                      <w:rFonts w:ascii="Verdana" w:hAnsi="Verdana" w:cs="Verdana"/>
+                      <w:sz w:val="20"/>
+                      <w:szCs w:val="20"/>
+                    </w:rPr>
+                    <w:t xml:space="preserve"> jota verrataan </w:t>
+                  </w:r>
+                  <w:r>
+                    <w:rPr>
+                      <w:rFonts w:ascii="Verdana" w:hAnsi="Verdana" w:cs="Verdana"/>
+                      <w:sz w:val="20"/>
+                      <w:szCs w:val="20"/>
+                    </w:rPr>
+                    <w:t>REST API kutsussa.</w:t>
+                  </w:r>
+                </w:p>
+              </w:tc>
+            </w:tr>
+            <w:tr>
+              <w:tc>
+                <w:tcPr>
+                  <w:tcW w:w="3422" w:type="dxa"/>
+                </w:tcPr>
+                <w:p>
+                  <w:pPr>
+                    <w:autoSpaceDE/>
+                    <w:autoSpaceDN/>
+                    <w:spacing w:line="276" w:lineRule="auto"/>
+                    <w:rPr>
+                      <w:rFonts w:ascii="Verdana" w:hAnsi="Verdana" w:cs="Verdana"/>
+                      <w:color w:val="FF0000"/>
+                      <w:sz w:val="20"/>
+                      <w:szCs w:val="20"/>
+                    </w:rPr>
+                  </w:pPr>
+                  <w:r>
+                    <w:rPr>
+                      <w:rFonts w:ascii="Verdana" w:hAnsi="Verdana" w:cs="Verdana"/>
+                      <w:color w:val="000000" w:themeColor="text1"/>
+                      <w:sz w:val="20"/>
+                      <w:szCs w:val="20"/>
+                    </w:rPr>
+                    <w:t>set</w:t>
+                  </w:r>
+                  <w:r>
+                    <w:rPr>
+                      <w:rFonts w:ascii="Verdana" w:hAnsi="Verdana" w:cs="Verdana"/>
+                      <w:color w:val="000000" w:themeColor="text1"/>
+                      <w:sz w:val="20"/>
+                      <w:szCs w:val="20"/>
+                    </w:rPr>
+                    <w:t>Pin(QString): void</w:t>
+                  </w:r>
+                  <w:r>
+                    <w:rPr>
+                      <w:rFonts w:ascii="Verdana" w:hAnsi="Verdana" w:cs="Verdana"/>
+                      <w:color w:val="000000" w:themeColor="text1"/>
+                      <w:sz w:val="20"/>
+                      <w:szCs w:val="20"/>
+                    </w:rPr>
+                    <w:t xml:space="preserve"> </w:t>
+                  </w:r>
+                </w:p>
+              </w:tc>
+              <w:tc>
+                <w:tcPr>
+                  <w:tcW w:w="6662" w:type="dxa"/>
+                </w:tcPr>
+                <w:p>
+                  <w:pPr>
+                    <w:autoSpaceDE/>
+                    <w:autoSpaceDN/>
+                    <w:spacing w:line="276" w:lineRule="auto"/>
+                    <w:rPr>
+                      <w:rFonts w:ascii="Verdana" w:hAnsi="Verdana" w:cs="Verdana"/>
+                      <w:color w:val="000000" w:themeColor="text1"/>
+                      <w:sz w:val="20"/>
+                      <w:szCs w:val="20"/>
+                    </w:rPr>
+                  </w:pPr>
+                  <w:r>
+                    <w:rPr>
+                      <w:rFonts w:ascii="Verdana" w:hAnsi="Verdana" w:cs="Verdana"/>
+                      <w:color w:val="000000" w:themeColor="text1"/>
+                      <w:sz w:val="20"/>
+                      <w:szCs w:val="20"/>
+                    </w:rPr>
+                    <w:t>Asettaa asiakkaan syöttämän PIN</w:t>
+                  </w:r>
+                  <w:r>
+                    <w:rPr>
+                      <w:rFonts w:ascii="Verdana" w:hAnsi="Verdana" w:cs="Verdana"/>
+                      <w:color w:val="000000" w:themeColor="text1"/>
+                      <w:sz w:val="20"/>
+                      <w:szCs w:val="20"/>
+                    </w:rPr>
+                    <w:t>-</w:t>
+                  </w:r>
+                  <w:r>
+                    <w:rPr>
+                      <w:rFonts w:ascii="Verdana" w:hAnsi="Verdana" w:cs="Verdana"/>
+                      <w:color w:val="000000" w:themeColor="text1"/>
+                      <w:sz w:val="20"/>
+                      <w:szCs w:val="20"/>
+                    </w:rPr>
+                    <w:t xml:space="preserve">koodin </w:t>
+                  </w:r>
+                  <w:r>
+                    <w:rPr>
+                      <w:rFonts w:ascii="Verdana" w:hAnsi="Verdana" w:cs="Verdana"/>
+                      <w:color w:val="000000" w:themeColor="text1"/>
+                      <w:sz w:val="20"/>
+                      <w:szCs w:val="20"/>
+                    </w:rPr>
+                    <w:t>muuttujaan,</w:t>
+                  </w:r>
+                  <w:r>
+                    <w:rPr>
+                      <w:rFonts w:ascii="Verdana" w:hAnsi="Verdana" w:cs="Verdana"/>
+                      <w:color w:val="000000" w:themeColor="text1"/>
+                      <w:sz w:val="20"/>
+                      <w:szCs w:val="20"/>
+                    </w:rPr>
+                    <w:t xml:space="preserve"> jota verrataan REST API kutsussa.</w:t>
+                  </w:r>
+                </w:p>
+              </w:tc>
+            </w:tr>
+            <w:tr>
+              <w:tc>
+                <w:tcPr>
+                  <w:tcW w:w="3422" w:type="dxa"/>
+                </w:tcPr>
+                <w:p>
+                  <w:pPr>
+                    <w:autoSpaceDE/>
+                    <w:autoSpaceDN/>
+                    <w:spacing w:line="276" w:lineRule="auto"/>
+                    <w:rPr>
+                      <w:rFonts w:ascii="Verdana" w:hAnsi="Verdana" w:cs="Verdana"/>
+                      <w:color w:val="000000" w:themeColor="text1"/>
+                      <w:sz w:val="20"/>
+                      <w:szCs w:val="20"/>
+                    </w:rPr>
+                  </w:pPr>
+                  <w:r>
+                    <w:rPr>
+                      <w:rFonts w:ascii="Verdana" w:hAnsi="Verdana" w:cs="Verdana"/>
+                      <w:color w:val="000000" w:themeColor="text1"/>
+                      <w:sz w:val="20"/>
+                      <w:szCs w:val="20"/>
+                    </w:rPr>
+                    <w:t>getTunniste(): QString</w:t>
+                  </w:r>
+                </w:p>
+              </w:tc>
+              <w:tc>
+                <w:tcPr>
+                  <w:tcW w:w="6662" w:type="dxa"/>
+                </w:tcPr>
+                <w:p>
+                  <w:pPr>
+                    <w:autoSpaceDE/>
+                    <w:autoSpaceDN/>
+                    <w:spacing w:line="276" w:lineRule="auto"/>
+                    <w:rPr>
+                      <w:rFonts w:ascii="Verdana" w:hAnsi="Verdana" w:cs="Verdana"/>
+                      <w:color w:val="000000" w:themeColor="text1"/>
+                      <w:sz w:val="20"/>
+                      <w:szCs w:val="20"/>
+                    </w:rPr>
+                  </w:pPr>
+                  <w:r>
+                    <w:rPr>
+                      <w:rFonts w:ascii="Verdana" w:hAnsi="Verdana" w:cs="Verdana"/>
+                      <w:color w:val="000000" w:themeColor="text1"/>
+                      <w:sz w:val="20"/>
+                      <w:szCs w:val="20"/>
+                    </w:rPr>
+                    <w:t>Asetetun tunnistekoodin palauttaminen.</w:t>
+                  </w:r>
+                </w:p>
+              </w:tc>
+            </w:tr>
+            <w:tr>
+              <w:tc>
+                <w:tcPr>
+                  <w:tcW w:w="3422" w:type="dxa"/>
+                </w:tcPr>
+                <w:p>
+                  <w:pPr>
+                    <w:autoSpaceDE/>
+                    <w:autoSpaceDN/>
+                    <w:spacing w:line="276" w:lineRule="auto"/>
+                    <w:rPr>
+                      <w:rFonts w:ascii="Verdana" w:hAnsi="Verdana" w:cs="Verdana"/>
+                      <w:color w:val="000000" w:themeColor="text1"/>
+                      <w:sz w:val="20"/>
+                      <w:szCs w:val="20"/>
+                    </w:rPr>
+                  </w:pPr>
+                  <w:r>
+                    <w:rPr>
+                      <w:rFonts w:ascii="Verdana" w:hAnsi="Verdana" w:cs="Verdana"/>
+                      <w:color w:val="000000" w:themeColor="text1"/>
+                      <w:sz w:val="20"/>
+                      <w:szCs w:val="20"/>
+                    </w:rPr>
+                    <w:t>get</w:t>
+                  </w:r>
+                  <w:r>
+                    <w:rPr>
+                      <w:rFonts w:ascii="Verdana" w:hAnsi="Verdana" w:cs="Verdana"/>
+                      <w:color w:val="000000" w:themeColor="text1"/>
+                      <w:sz w:val="20"/>
+                      <w:szCs w:val="20"/>
+                    </w:rPr>
+                    <w:t>Pin(): QString</w:t>
+                  </w:r>
+                </w:p>
+              </w:tc>
+              <w:tc>
+                <w:tcPr>
+                  <w:tcW w:w="6662" w:type="dxa"/>
+                </w:tcPr>
+                <w:p>
+                  <w:pPr>
+                    <w:autoSpaceDE/>
+                    <w:autoSpaceDN/>
+                    <w:spacing w:line="276" w:lineRule="auto"/>
+                    <w:rPr>
+                      <w:rFonts w:ascii="Verdana" w:hAnsi="Verdana" w:cs="Verdana"/>
+                      <w:color w:val="000000" w:themeColor="text1"/>
+                      <w:sz w:val="20"/>
+                      <w:szCs w:val="20"/>
+                    </w:rPr>
+                  </w:pPr>
+                  <w:r>
+                    <w:rPr>
+                      <w:rFonts w:ascii="Verdana" w:hAnsi="Verdana" w:cs="Verdana"/>
+                      <w:color w:val="000000" w:themeColor="text1"/>
+                      <w:sz w:val="20"/>
+                      <w:szCs w:val="20"/>
+                    </w:rPr>
+                    <w:t xml:space="preserve">Asetetun </w:t>
+                  </w:r>
+                  <w:r>
+                    <w:rPr>
+                      <w:rFonts w:ascii="Verdana" w:hAnsi="Verdana" w:cs="Verdana"/>
+                      <w:color w:val="000000" w:themeColor="text1"/>
+                      <w:sz w:val="20"/>
+                      <w:szCs w:val="20"/>
+                    </w:rPr>
+                    <w:t>PIN</w:t>
+                  </w:r>
+                  <w:r>
+                    <w:rPr>
+                      <w:rFonts w:ascii="Verdana" w:hAnsi="Verdana" w:cs="Verdana"/>
+                      <w:color w:val="000000" w:themeColor="text1"/>
+                      <w:sz w:val="20"/>
+                      <w:szCs w:val="20"/>
+                    </w:rPr>
+                    <w:t>-</w:t>
+                  </w:r>
+                  <w:r>
+                    <w:rPr>
+                      <w:rFonts w:ascii="Verdana" w:hAnsi="Verdana" w:cs="Verdana"/>
+                      <w:color w:val="000000" w:themeColor="text1"/>
+                      <w:sz w:val="20"/>
+                      <w:szCs w:val="20"/>
+                    </w:rPr>
+                    <w:t>koodi</w:t>
+                  </w:r>
+                  <w:r>
+                    <w:rPr>
+                      <w:rFonts w:ascii="Verdana" w:hAnsi="Verdana" w:cs="Verdana"/>
+                      <w:color w:val="000000" w:themeColor="text1"/>
+                      <w:sz w:val="20"/>
+                      <w:szCs w:val="20"/>
+                    </w:rPr>
+                    <w:t>n palauttaminen.</w:t>
+                  </w:r>
+                </w:p>
+              </w:tc>
+            </w:tr>
+            <w:tr>
+              <w:tc>
+                <w:tcPr>
+                  <w:tcW w:w="3422" w:type="dxa"/>
+                </w:tcPr>
+                <w:p>
+                  <w:pPr>
+                    <w:autoSpaceDE/>
+                    <w:autoSpaceDN/>
+                    <w:spacing w:line="276" w:lineRule="auto"/>
+                    <w:rPr>
+                      <w:rFonts w:ascii="Verdana" w:hAnsi="Verdana" w:cs="Verdana"/>
+                      <w:color w:val="000000" w:themeColor="text1"/>
+                      <w:sz w:val="20"/>
+                      <w:szCs w:val="20"/>
+                    </w:rPr>
+                  </w:pPr>
+                  <w:r>
+                    <w:rPr>
+                      <w:rFonts w:ascii="Verdana" w:hAnsi="Verdana" w:cs="Verdana"/>
+                      <w:color w:val="000000" w:themeColor="text1"/>
+                      <w:sz w:val="20"/>
+                      <w:szCs w:val="20"/>
+                    </w:rPr>
+                    <w:t>checkPINFormat(QString): bool</w:t>
+                  </w:r>
+                </w:p>
+              </w:tc>
+              <w:tc>
+                <w:tcPr>
+                  <w:tcW w:w="6662" w:type="dxa"/>
+                </w:tcPr>
+                <w:p>
+                  <w:pPr>
+                    <w:autoSpaceDE/>
+                    <w:autoSpaceDN/>
+                    <w:spacing w:line="276" w:lineRule="auto"/>
+                    <w:rPr>
+                      <w:rFonts w:ascii="Verdana" w:hAnsi="Verdana" w:cs="Verdana"/>
+                      <w:color w:val="000000" w:themeColor="text1"/>
+                      <w:sz w:val="20"/>
+                      <w:szCs w:val="20"/>
+                    </w:rPr>
+                  </w:pPr>
+                  <w:r>
+                    <w:rPr>
+                      <w:rFonts w:ascii="Verdana" w:hAnsi="Verdana" w:cs="Verdana"/>
+                      <w:color w:val="000000" w:themeColor="text1"/>
+                      <w:sz w:val="20"/>
+                      <w:szCs w:val="20"/>
+                    </w:rPr>
+                    <w:t>Palauttaa onko</w:t>
+                  </w:r>
+                  <w:r>
+                    <w:rPr>
+                      <w:rFonts w:ascii="Verdana" w:hAnsi="Verdana" w:cs="Verdana"/>
+                      <w:color w:val="000000" w:themeColor="text1"/>
+                      <w:sz w:val="20"/>
+                      <w:szCs w:val="20"/>
+                    </w:rPr>
+                    <w:t xml:space="preserve"> syöte</w:t>
+                  </w:r>
+                  <w:r>
+                    <w:rPr>
+                      <w:rFonts w:ascii="Verdana" w:hAnsi="Verdana" w:cs="Verdana"/>
+                      <w:color w:val="000000" w:themeColor="text1"/>
+                      <w:sz w:val="20"/>
+                      <w:szCs w:val="20"/>
+                    </w:rPr>
+                    <w:t>t</w:t>
+                  </w:r>
+                  <w:r>
+                    <w:rPr>
+                      <w:rFonts w:ascii="Verdana" w:hAnsi="Verdana" w:cs="Verdana"/>
+                      <w:color w:val="000000" w:themeColor="text1"/>
+                      <w:sz w:val="20"/>
+                      <w:szCs w:val="20"/>
+                    </w:rPr>
+                    <w:t>yn</w:t>
+                  </w:r>
+                  <w:r>
+                    <w:rPr>
+                      <w:rFonts w:ascii="Verdana" w:hAnsi="Verdana" w:cs="Verdana"/>
+                      <w:color w:val="000000" w:themeColor="text1"/>
+                      <w:sz w:val="20"/>
+                      <w:szCs w:val="20"/>
+                    </w:rPr>
+                    <w:t xml:space="preserve"> PIN-koodi</w:t>
+                  </w:r>
+                  <w:r>
+                    <w:rPr>
+                      <w:rFonts w:ascii="Verdana" w:hAnsi="Verdana" w:cs="Verdana"/>
+                      <w:color w:val="000000" w:themeColor="text1"/>
+                      <w:sz w:val="20"/>
+                      <w:szCs w:val="20"/>
+                    </w:rPr>
+                    <w:t>n pituus 4</w:t>
+                  </w:r>
+                  <w:r>
+                    <w:rPr>
+                      <w:rFonts w:ascii="Verdana" w:hAnsi="Verdana" w:cs="Verdana"/>
+                      <w:color w:val="000000" w:themeColor="text1"/>
+                      <w:sz w:val="20"/>
+                      <w:szCs w:val="20"/>
+                    </w:rPr>
+                    <w:t>.</w:t>
+                  </w:r>
+                </w:p>
+              </w:tc>
+            </w:tr>
+            <w:tr>
+              <w:tc>
+                <w:tcPr>
+                  <w:tcW w:w="3422" w:type="dxa"/>
+                </w:tcPr>
+                <w:p>
+                  <w:pPr>
+                    <w:autoSpaceDE/>
+                    <w:autoSpaceDN/>
+                    <w:spacing w:line="276" w:lineRule="auto"/>
+                    <w:rPr>
+                      <w:rFonts w:ascii="Verdana" w:hAnsi="Verdana" w:cs="Verdana"/>
+                      <w:color w:val="000000" w:themeColor="text1"/>
+                      <w:sz w:val="20"/>
+                      <w:szCs w:val="20"/>
+                    </w:rPr>
+                  </w:pPr>
+                  <w:r>
+                    <w:rPr>
+                      <w:rFonts w:ascii="Verdana" w:hAnsi="Verdana" w:cs="Verdana"/>
+                      <w:color w:val="000000" w:themeColor="text1"/>
+                      <w:sz w:val="20"/>
+                      <w:szCs w:val="20"/>
+                    </w:rPr>
+                    <w:t>btnContinueSlot(): void</w:t>
+                  </w:r>
+                </w:p>
+              </w:tc>
+              <w:tc>
+                <w:tcPr>
+                  <w:tcW w:w="6662" w:type="dxa"/>
+                </w:tcPr>
+                <w:p>
+                  <w:pPr>
+                    <w:autoSpaceDE/>
+                    <w:autoSpaceDN/>
+                    <w:spacing w:line="276" w:lineRule="auto"/>
+                    <w:rPr>
+                      <w:rFonts w:ascii="Verdana" w:hAnsi="Verdana" w:cs="Verdana"/>
+                      <w:color w:val="000000" w:themeColor="text1"/>
+                      <w:sz w:val="20"/>
+                      <w:szCs w:val="20"/>
+                    </w:rPr>
+                  </w:pPr>
+                  <w:r>
+                    <w:rPr>
+                      <w:rFonts w:ascii="Verdana" w:hAnsi="Verdana" w:cs="Verdana"/>
+                      <w:color w:val="000000" w:themeColor="text1"/>
+                      <w:sz w:val="20"/>
+                      <w:szCs w:val="20"/>
+                    </w:rPr>
+                    <w:t>Luodaan PINWindow olio, asetetaan tunniste talteen setTunniste(QString) -funktiolla</w:t>
+                  </w:r>
+                  <w:r>
+                    <w:rPr>
+                      <w:rFonts w:ascii="Verdana" w:hAnsi="Verdana" w:cs="Verdana"/>
+                      <w:color w:val="000000" w:themeColor="text1"/>
+                      <w:sz w:val="20"/>
+                      <w:szCs w:val="20"/>
+                    </w:rPr>
+                    <w:t>, ja piilotetaan Login ikkuna</w:t>
+                  </w:r>
+                  <w:r>
+                    <w:rPr>
+                      <w:rFonts w:ascii="Verdana" w:hAnsi="Verdana" w:cs="Verdana"/>
+                      <w:color w:val="000000" w:themeColor="text1"/>
+                      <w:sz w:val="20"/>
+                      <w:szCs w:val="20"/>
+                    </w:rPr>
+                    <w:t>, ja käynnistetään PINWindow olio.</w:t>
+                  </w:r>
+                  <w:r>
+                    <w:rPr>
+                      <w:rFonts w:ascii="Verdana" w:hAnsi="Verdana" w:cs="Verdana"/>
+                      <w:color w:val="000000" w:themeColor="text1"/>
+                      <w:sz w:val="20"/>
+                      <w:szCs w:val="20"/>
+                    </w:rPr>
+                    <w:t xml:space="preserve"> Samalla käynnistyy ajastin</w:t>
+                  </w:r>
+                  <w:r>
+                    <w:rPr>
+                      <w:rFonts w:ascii="Verdana" w:hAnsi="Verdana" w:cs="Verdana"/>
+                      <w:color w:val="000000" w:themeColor="text1"/>
+                      <w:sz w:val="20"/>
+                      <w:szCs w:val="20"/>
+                    </w:rPr>
+                    <w:t>.</w:t>
+                  </w:r>
+                </w:p>
+              </w:tc>
+            </w:tr>
+            <w:tr>
+              <w:tc>
+                <w:tcPr>
+                  <w:tcW w:w="3422" w:type="dxa"/>
+                </w:tcPr>
+                <w:p>
+                  <w:pPr>
+                    <w:autoSpaceDE/>
+                    <w:autoSpaceDN/>
+                    <w:spacing w:line="276" w:lineRule="auto"/>
+                    <w:rPr>
+                      <w:rFonts w:ascii="Verdana" w:hAnsi="Verdana" w:cs="Verdana"/>
+                      <w:color w:val="000000" w:themeColor="text1"/>
+                      <w:sz w:val="20"/>
+                      <w:szCs w:val="20"/>
+                    </w:rPr>
+                  </w:pPr>
+                  <w:r>
+                    <w:rPr>
+                      <w:rFonts w:ascii="Verdana" w:hAnsi="Verdana" w:cs="Verdana"/>
+                      <w:color w:val="000000" w:themeColor="text1"/>
+                      <w:sz w:val="20"/>
+                      <w:szCs w:val="20"/>
+                    </w:rPr>
+                    <w:t>btnSignInSlot(): void</w:t>
+                  </w:r>
+                </w:p>
+              </w:tc>
+              <w:tc>
+                <w:tcPr>
+                  <w:tcW w:w="6662" w:type="dxa"/>
+                </w:tcPr>
+                <w:p>
+                  <w:pPr>
+                    <w:autoSpaceDE/>
+                    <w:autoSpaceDN/>
+                    <w:spacing w:line="276" w:lineRule="auto"/>
+                    <w:rPr>
+                      <w:rFonts w:ascii="Verdana" w:hAnsi="Verdana" w:cs="Verdana"/>
+                      <w:color w:val="000000" w:themeColor="text1"/>
+                      <w:sz w:val="20"/>
+                      <w:szCs w:val="20"/>
+                    </w:rPr>
+                  </w:pPr>
+                  <w:r>
+                    <w:rPr>
+                      <w:rFonts w:ascii="Verdana" w:hAnsi="Verdana" w:cs="Verdana"/>
+                      <w:color w:val="000000" w:themeColor="text1"/>
+                      <w:sz w:val="20"/>
+                      <w:szCs w:val="20"/>
+                    </w:rPr>
+                    <w:t>Mikäli PIN-koodi on 4 numeroinen, ajastin pysäytetään, asetetaan PIN-koodi talteen setPin(QString)-funktiolla ja lähetetään HTTP pyyntö REST API palvelimelle.</w:t>
+                  </w:r>
+                </w:p>
+              </w:tc>
+            </w:tr>
+          </w:tbl>
+          <w:p>
+            <w:pPr>
+              <w:autoSpaceDE/>
+              <w:autoSpaceDN/>
+              <w:spacing w:line="276" w:lineRule="auto"/>
+              <w:rPr>
+                <w:rFonts w:ascii="Verdana" w:hAnsi="Verdana" w:cs="Verdana"/>
+                <w:i/>
+                <w:iCs/>
+                <w:color w:val="FF0000"/>
+                <w:sz w:val="20"/>
+                <w:szCs w:val="20"/>
+              </w:rPr>
+            </w:pPr>
+          </w:p>
+        </w:tc>
+      </w:tr>
+      <w:tr>
+        <w:trPr>
+          <w:trHeight w:val="243"/>
+        </w:trPr>
+        <w:tc>
+          <w:tcPr>
+            <w:tcW w:w="2425" w:type="dxa"/>
+          </w:tcPr>
+          <w:p>
+            <w:pPr>
+              <w:autoSpaceDE/>
+              <w:autoSpaceDN/>
+              <w:spacing w:line="276" w:lineRule="auto"/>
+              <w:rPr>
+                <w:rFonts w:ascii="Verdana" w:hAnsi="Verdana" w:cs="Verdana"/>
+                <w:b/>
+                <w:bCs/>
+                <w:sz w:val="20"/>
+                <w:szCs w:val="20"/>
+              </w:rPr>
+            </w:pPr>
+            <w:r>
+              <w:rPr>
+                <w:rFonts w:ascii="Verdana" w:hAnsi="Verdana" w:cs="Verdana"/>
+                <w:b/>
+                <w:bCs/>
+                <w:sz w:val="20"/>
+                <w:szCs w:val="20"/>
+              </w:rPr>
+              <w:t>Vastuuhenkilö(t)</w:t>
+            </w:r>
+          </w:p>
+        </w:tc>
+        <w:tc>
+          <w:tcPr>
+            <w:tcW w:w="7918" w:type="dxa"/>
+            <w:gridSpan w:val="2"/>
+          </w:tcPr>
+          <w:p>
+            <w:pPr>
+              <w:autoSpaceDE/>
+              <w:autoSpaceDN/>
+              <w:spacing w:line="276" w:lineRule="auto"/>
+              <w:rPr>
+                <w:rFonts w:ascii="Verdana" w:hAnsi="Verdana" w:cs="Verdana"/>
+                <w:i/>
+                <w:iCs/>
+                <w:color w:val="000000" w:themeColor="text1"/>
+                <w:sz w:val="20"/>
+                <w:szCs w:val="20"/>
+              </w:rPr>
+            </w:pPr>
+            <w:r>
+              <w:rPr>
+                <w:rFonts w:ascii="Verdana" w:hAnsi="Verdana" w:cs="Verdana"/>
+                <w:i/>
+                <w:iCs/>
+                <w:color w:val="000000" w:themeColor="text1"/>
+                <w:sz w:val="20"/>
+                <w:szCs w:val="20"/>
+              </w:rPr>
+              <w:t>Matti Rundelin</w:t>
+            </w:r>
+          </w:p>
+        </w:tc>
+      </w:tr>
     </w:tbl>
     <w:p>
       <w:pPr>
@@ -9275,7 +10077,6 @@
           <w:color w:val="FF0000"/>
         </w:rPr>
       </w:pPr>
-      <w:proofErr w:type="gramStart"/>
       <w:r>
         <w:rPr>
           <w:rFonts w:ascii="Verdana" w:hAnsi="Verdana"/>
@@ -9283,17 +10084,7 @@
           <w:iCs/>
           <w:color w:val="FF0000"/>
         </w:rPr>
-        <w:t>..</w:t>
-      </w:r>
-      <w:proofErr w:type="gramEnd"/>
-      <w:r>
-        <w:rPr>
-          <w:rFonts w:ascii="Verdana" w:hAnsi="Verdana"/>
-          <w:i/>
-          <w:iCs/>
-          <w:color w:val="FF0000"/>
-        </w:rPr>
-        <w:t>s</w:t>
+        <w:t>..s</w:t>
       </w:r>
       <w:r>
         <w:rPr>
@@ -9719,7 +10510,7 @@
                           <pic:cNvPicPr/>
                         </pic:nvPicPr>
                         <pic:blipFill>
-                          <a:blip r:embed="rId18"/>
+                          <a:blip r:embed="rId19"/>
                           <a:stretch>
                             <a:fillRect/>
                           </a:stretch>
@@ -9934,7 +10725,7 @@
                     </pic:cNvPicPr>
                   </pic:nvPicPr>
                   <pic:blipFill>
-                    <a:blip r:embed="rId19">
+                    <a:blip r:embed="rId20">
                       <a:extLst>
                         <a:ext uri="{28A0092B-C50C-407E-A947-70E740481C1C}">
                           <a14:useLocalDpi xmlns:a14="http://schemas.microsoft.com/office/drawing/2010/main" val="0"/>
@@ -10011,7 +10802,7 @@
                     </pic:cNvPicPr>
                   </pic:nvPicPr>
                   <pic:blipFill>
-                    <a:blip r:embed="rId20">
+                    <a:blip r:embed="rId21">
                       <a:extLst>
                         <a:ext uri="{28A0092B-C50C-407E-A947-70E740481C1C}">
                           <a14:useLocalDpi xmlns:a14="http://schemas.microsoft.com/office/drawing/2010/main" val="0"/>

</xml_diff>

<commit_message>
Käyttötapauskaavio päivitetty tekniseen määrittelyyn.
</commit_message>
<xml_diff>
--- a/Documents/tekninen_maarittely.docx
+++ b/Documents/tekninen_maarittely.docx
@@ -514,14 +514,34 @@
                 <w:szCs w:val="20"/>
               </w:rPr>
             </w:pPr>
-            <w:r>
-              <w:rPr>
-                <w:rFonts w:ascii="Verdana" w:hAnsi="Verdana" w:cs="Verdana"/>
-                <w:sz w:val="20"/>
-                <w:szCs w:val="20"/>
-              </w:rPr>
-              <w:t>Sander Vassel</w:t>
-            </w:r>
+            <w:proofErr w:type="spellStart"/>
+            <w:r>
+              <w:rPr>
+                <w:rFonts w:ascii="Verdana" w:hAnsi="Verdana" w:cs="Verdana"/>
+                <w:sz w:val="20"/>
+                <w:szCs w:val="20"/>
+              </w:rPr>
+              <w:t>Sander</w:t>
+            </w:r>
+            <w:proofErr w:type="spellEnd"/>
+            <w:r>
+              <w:rPr>
+                <w:rFonts w:ascii="Verdana" w:hAnsi="Verdana" w:cs="Verdana"/>
+                <w:sz w:val="20"/>
+                <w:szCs w:val="20"/>
+              </w:rPr>
+              <w:t xml:space="preserve"> </w:t>
+            </w:r>
+            <w:proofErr w:type="spellStart"/>
+            <w:r>
+              <w:rPr>
+                <w:rFonts w:ascii="Verdana" w:hAnsi="Verdana" w:cs="Verdana"/>
+                <w:sz w:val="20"/>
+                <w:szCs w:val="20"/>
+              </w:rPr>
+              <w:t>Vassel</w:t>
+            </w:r>
+            <w:proofErr w:type="spellEnd"/>
           </w:p>
         </w:tc>
       </w:tr>
@@ -548,8 +568,18 @@
                 <w:sz w:val="20"/>
                 <w:szCs w:val="20"/>
               </w:rPr>
-              <w:t>Riku Ängeslevä</w:t>
-            </w:r>
+              <w:t xml:space="preserve">Riku </w:t>
+            </w:r>
+            <w:proofErr w:type="spellStart"/>
+            <w:r>
+              <w:rPr>
+                <w:rFonts w:ascii="Verdana" w:hAnsi="Verdana" w:cs="Verdana"/>
+                <w:sz w:val="20"/>
+                <w:szCs w:val="20"/>
+              </w:rPr>
+              <w:t>Ängeslevä</w:t>
+            </w:r>
+            <w:proofErr w:type="spellEnd"/>
           </w:p>
         </w:tc>
       </w:tr>
@@ -819,7 +849,21 @@
         <w:rPr>
           <w:rFonts w:ascii="Verdana" w:hAnsi="Verdana" w:cs="Verdana"/>
         </w:rPr>
-        <w:t xml:space="preserve"> Dokumentin tulee sisältää kuvaukset seuraavista: pankkiautomaattisovellus, mahdolliset DLL:t, REST API, tietokanta </w:t>
+        <w:t xml:space="preserve"> Dokumentin tulee sisältää kuvaukset seuraavista: pankkiautomaattisovellus, mahdolliset </w:t>
+      </w:r>
+      <w:proofErr w:type="spellStart"/>
+      <w:r>
+        <w:rPr>
+          <w:rFonts w:ascii="Verdana" w:hAnsi="Verdana" w:cs="Verdana"/>
+        </w:rPr>
+        <w:t>DLL:t</w:t>
+      </w:r>
+      <w:proofErr w:type="spellEnd"/>
+      <w:r>
+        <w:rPr>
+          <w:rFonts w:ascii="Verdana" w:hAnsi="Verdana" w:cs="Verdana"/>
+        </w:rPr>
+        <w:t xml:space="preserve">, REST API, tietokanta </w:t>
       </w:r>
       <w:r>
         <w:rPr>
@@ -1230,8 +1274,16 @@
         <w:rPr>
           <w:rFonts w:ascii="Verdana" w:hAnsi="Verdana"/>
         </w:rPr>
-        <w:t>Windows Defender</w:t>
-      </w:r>
+        <w:t xml:space="preserve">Windows </w:t>
+      </w:r>
+      <w:proofErr w:type="spellStart"/>
+      <w:r>
+        <w:rPr>
+          <w:rFonts w:ascii="Verdana" w:hAnsi="Verdana"/>
+        </w:rPr>
+        <w:t>Defender</w:t>
+      </w:r>
+      <w:proofErr w:type="spellEnd"/>
       <w:r>
         <w:rPr>
           <w:rFonts w:ascii="Verdana" w:hAnsi="Verdana"/>
@@ -1329,12 +1381,19 @@
         <w:rPr>
           <w:rFonts w:ascii="Verdana" w:hAnsi="Verdana"/>
         </w:rPr>
-        <w:t>pohjaisesta pankkiautomaatti</w:t>
-      </w:r>
+        <w:t xml:space="preserve">pohjaisesta </w:t>
+      </w:r>
+      <w:proofErr w:type="gramStart"/>
       <w:r>
         <w:rPr>
           <w:rFonts w:ascii="Verdana" w:hAnsi="Verdana"/>
         </w:rPr>
+        <w:t>pankkiautomaatti</w:t>
+      </w:r>
+      <w:r>
+        <w:rPr>
+          <w:rFonts w:ascii="Verdana" w:hAnsi="Verdana"/>
+        </w:rPr>
         <w:t>-</w:t>
       </w:r>
       <w:r>
@@ -1343,6 +1402,7 @@
         </w:rPr>
         <w:t>sovelluksesta</w:t>
       </w:r>
+      <w:proofErr w:type="gramEnd"/>
       <w:r>
         <w:rPr>
           <w:rFonts w:ascii="Verdana" w:hAnsi="Verdana"/>
@@ -1395,13 +1455,35 @@
         <w:rPr>
           <w:rFonts w:ascii="Verdana" w:hAnsi="Verdana"/>
         </w:rPr>
-        <w:t xml:space="preserve">komponentit toteutaaan </w:t>
-      </w:r>
+        <w:t xml:space="preserve">komponentit </w:t>
+      </w:r>
+      <w:proofErr w:type="spellStart"/>
       <w:r>
         <w:rPr>
           <w:rFonts w:ascii="Verdana" w:hAnsi="Verdana"/>
         </w:rPr>
-        <w:t>Qt-</w:t>
+        <w:t>toteutaaan</w:t>
+      </w:r>
+      <w:proofErr w:type="spellEnd"/>
+      <w:r>
+        <w:rPr>
+          <w:rFonts w:ascii="Verdana" w:hAnsi="Verdana"/>
+        </w:rPr>
+        <w:t xml:space="preserve"> </w:t>
+      </w:r>
+      <w:proofErr w:type="spellStart"/>
+      <w:r>
+        <w:rPr>
+          <w:rFonts w:ascii="Verdana" w:hAnsi="Verdana"/>
+        </w:rPr>
+        <w:t>Qt</w:t>
+      </w:r>
+      <w:proofErr w:type="spellEnd"/>
+      <w:r>
+        <w:rPr>
+          <w:rFonts w:ascii="Verdana" w:hAnsi="Verdana"/>
+        </w:rPr>
+        <w:t>-</w:t>
       </w:r>
       <w:r>
         <w:rPr>
@@ -1426,7 +1508,21 @@
         <w:rPr>
           <w:rFonts w:ascii="Verdana" w:hAnsi="Verdana"/>
         </w:rPr>
-        <w:t xml:space="preserve">hyödyntäen Qt-luokkakirjaston </w:t>
+        <w:t xml:space="preserve">hyödyntäen </w:t>
+      </w:r>
+      <w:proofErr w:type="spellStart"/>
+      <w:r>
+        <w:rPr>
+          <w:rFonts w:ascii="Verdana" w:hAnsi="Verdana"/>
+        </w:rPr>
+        <w:t>Qt</w:t>
+      </w:r>
+      <w:proofErr w:type="spellEnd"/>
+      <w:r>
+        <w:rPr>
+          <w:rFonts w:ascii="Verdana" w:hAnsi="Verdana"/>
+        </w:rPr>
+        <w:t xml:space="preserve">-luokkakirjaston </w:t>
       </w:r>
       <w:r>
         <w:rPr>
@@ -1559,12 +1655,14 @@
         </w:rPr>
         <w:t xml:space="preserve">Tietokannan vaatima palvelinohjelma perustuu </w:t>
       </w:r>
+      <w:proofErr w:type="spellStart"/>
       <w:r>
         <w:rPr>
           <w:rFonts w:ascii="Verdana" w:hAnsi="Verdana"/>
         </w:rPr>
         <w:t>MariaDB</w:t>
       </w:r>
+      <w:proofErr w:type="spellEnd"/>
       <w:r>
         <w:rPr>
           <w:rFonts w:ascii="Verdana" w:hAnsi="Verdana"/>
@@ -1640,7 +1738,23 @@
           <w:rFonts w:ascii="Verdana" w:hAnsi="Verdana" w:cs="Verdana"/>
           <w:szCs w:val="20"/>
         </w:rPr>
-        <w:t xml:space="preserve"> toteutuksessa voidaan vaatimuksista riippuen myös käyttää </w:t>
+        <w:t xml:space="preserve"> toteutuksessa voidaan </w:t>
+      </w:r>
+      <w:proofErr w:type="gramStart"/>
+      <w:r>
+        <w:rPr>
+          <w:rFonts w:ascii="Verdana" w:hAnsi="Verdana" w:cs="Verdana"/>
+          <w:szCs w:val="20"/>
+        </w:rPr>
+        <w:t>vaatimuksista riippuen</w:t>
+      </w:r>
+      <w:proofErr w:type="gramEnd"/>
+      <w:r>
+        <w:rPr>
+          <w:rFonts w:ascii="Verdana" w:hAnsi="Verdana" w:cs="Verdana"/>
+          <w:szCs w:val="20"/>
+        </w:rPr>
+        <w:t xml:space="preserve"> myös käyttää </w:t>
       </w:r>
       <w:r>
         <w:rPr>
@@ -2562,12 +2676,16 @@
         </w:rPr>
         <w:t xml:space="preserve">pauskaavio on </w:t>
       </w:r>
+      <w:proofErr w:type="spellStart"/>
+      <w:proofErr w:type="gramStart"/>
       <w:r>
         <w:rPr>
           <w:rFonts w:ascii="Verdana" w:hAnsi="Verdana" w:cs="Verdana"/>
         </w:rPr>
         <w:t>allaolevan</w:t>
       </w:r>
+      <w:proofErr w:type="spellEnd"/>
+      <w:proofErr w:type="gramEnd"/>
       <w:r>
         <w:rPr>
           <w:rFonts w:ascii="Verdana" w:hAnsi="Verdana" w:cs="Verdana"/>
@@ -2636,7 +2754,7 @@
         <w:tblLook w:val="04A0" w:firstRow="1" w:lastRow="0" w:firstColumn="1" w:lastColumn="0" w:noHBand="0" w:noVBand="1"/>
       </w:tblPr>
       <w:tblGrid>
-        <w:gridCol w:w="10596"/>
+        <w:gridCol w:w="10550"/>
       </w:tblGrid>
       <w:tr>
         <w:trPr>
@@ -2660,10 +2778,18 @@
                 <w:sz w:val="22"/>
               </w:rPr>
               <w:drawing>
-                <wp:inline distT="0" distB="0" distL="0" distR="0" wp14:anchorId="14066E6D" wp14:editId="0C769E08">
-                  <wp:extent cx="6590805" cy="3989705"/>
-                  <wp:effectExtent l="0" t="0" r="635" b="0"/>
-                  <wp:docPr id="965868373" name="Kuva 2" descr="Kuva, joka sisältää kohteen diagrammi, teksti, ympyrä, luonnos"/>
+                <wp:anchor distT="0" distB="0" distL="114300" distR="114300" simplePos="0" relativeHeight="251663360" behindDoc="0" locked="0" layoutInCell="1" allowOverlap="1" wp14:anchorId="14066E6D" wp14:editId="15D69D6D">
+                  <wp:simplePos x="0" y="0"/>
+                  <wp:positionH relativeFrom="column">
+                    <wp:posOffset>732155</wp:posOffset>
+                  </wp:positionH>
+                  <wp:positionV relativeFrom="paragraph">
+                    <wp:posOffset>-635</wp:posOffset>
+                  </wp:positionV>
+                  <wp:extent cx="4817756" cy="3989705"/>
+                  <wp:effectExtent l="0" t="0" r="1905" b="0"/>
+                  <wp:wrapNone/>
+                  <wp:docPr id="965868373" name="Kuva 2"/>
                   <wp:cNvGraphicFramePr>
                     <a:graphicFrameLocks xmlns:a="http://schemas.openxmlformats.org/drawingml/2006/main" noChangeAspect="1"/>
                   </wp:cNvGraphicFramePr>
@@ -2671,7 +2797,7 @@
                     <a:graphicData uri="http://schemas.openxmlformats.org/drawingml/2006/picture">
                       <pic:pic xmlns:pic="http://schemas.openxmlformats.org/drawingml/2006/picture">
                         <pic:nvPicPr>
-                          <pic:cNvPr id="965868373" name="Kuva 2" descr="Kuva, joka sisältää kohteen diagrammi, teksti, ympyrä, luonnos"/>
+                          <pic:cNvPr id="965868373" name="Kuva 2"/>
                           <pic:cNvPicPr/>
                         </pic:nvPicPr>
                         <pic:blipFill>
@@ -2683,7 +2809,7 @@
                         <pic:spPr>
                           <a:xfrm>
                             <a:off x="0" y="0"/>
-                            <a:ext cx="6590805" cy="3989705"/>
+                            <a:ext cx="4817756" cy="3989705"/>
                           </a:xfrm>
                           <a:prstGeom prst="rect">
                             <a:avLst/>
@@ -2692,7 +2818,7 @@
                       </pic:pic>
                     </a:graphicData>
                   </a:graphic>
-                </wp:inline>
+                </wp:anchor>
               </w:drawing>
             </w:r>
           </w:p>
@@ -4682,7 +4808,25 @@
                 <w:sz w:val="20"/>
                 <w:szCs w:val="20"/>
               </w:rPr>
-              <w:t xml:space="preserve">Kirjauduttu pankkiautomaatin käyttäjäksi,  yhteys </w:t>
+              <w:t xml:space="preserve">Kirjauduttu pankkiautomaatin </w:t>
+            </w:r>
+            <w:proofErr w:type="gramStart"/>
+            <w:r>
+              <w:rPr>
+                <w:rFonts w:ascii="Verdana" w:hAnsi="Verdana" w:cs="Verdana"/>
+                <w:sz w:val="20"/>
+                <w:szCs w:val="20"/>
+              </w:rPr>
+              <w:t>käyttäjäksi,  yhteys</w:t>
+            </w:r>
+            <w:proofErr w:type="gramEnd"/>
+            <w:r>
+              <w:rPr>
+                <w:rFonts w:ascii="Verdana" w:hAnsi="Verdana" w:cs="Verdana"/>
+                <w:sz w:val="20"/>
+                <w:szCs w:val="20"/>
+              </w:rPr>
+              <w:t xml:space="preserve"> </w:t>
             </w:r>
             <w:r>
               <w:rPr>
@@ -5006,7 +5150,25 @@
                 <w:sz w:val="20"/>
                 <w:szCs w:val="20"/>
               </w:rPr>
-              <w:t xml:space="preserve"> on näytetty oikein, ja  tilitapahtumia voidaan selata.</w:t>
+              <w:t xml:space="preserve"> on näytetty oikein, </w:t>
+            </w:r>
+            <w:proofErr w:type="gramStart"/>
+            <w:r>
+              <w:rPr>
+                <w:rFonts w:ascii="Verdana" w:hAnsi="Verdana" w:cs="Verdana"/>
+                <w:sz w:val="20"/>
+                <w:szCs w:val="20"/>
+              </w:rPr>
+              <w:t>ja  tilitapahtumia</w:t>
+            </w:r>
+            <w:proofErr w:type="gramEnd"/>
+            <w:r>
+              <w:rPr>
+                <w:rFonts w:ascii="Verdana" w:hAnsi="Verdana" w:cs="Verdana"/>
+                <w:sz w:val="20"/>
+                <w:szCs w:val="20"/>
+              </w:rPr>
+              <w:t xml:space="preserve"> voidaan selata.</w:t>
             </w:r>
           </w:p>
         </w:tc>
@@ -5624,7 +5786,25 @@
                 <w:sz w:val="20"/>
                 <w:szCs w:val="20"/>
               </w:rPr>
-              <w:t>Käyttäjä on saanut nostetuksi haluamansa summan rahaa ja rahamäärä on veloitettu käyttäjän tilitä.</w:t>
+              <w:t xml:space="preserve">Käyttäjä on saanut nostetuksi haluamansa summan </w:t>
+            </w:r>
+            <w:proofErr w:type="gramStart"/>
+            <w:r>
+              <w:rPr>
+                <w:rFonts w:ascii="Verdana" w:hAnsi="Verdana" w:cs="Verdana"/>
+                <w:sz w:val="20"/>
+                <w:szCs w:val="20"/>
+              </w:rPr>
+              <w:t>rahaa</w:t>
+            </w:r>
+            <w:proofErr w:type="gramEnd"/>
+            <w:r>
+              <w:rPr>
+                <w:rFonts w:ascii="Verdana" w:hAnsi="Verdana" w:cs="Verdana"/>
+                <w:sz w:val="20"/>
+                <w:szCs w:val="20"/>
+              </w:rPr>
+              <w:t xml:space="preserve"> ja rahamäärä on veloitettu käyttäjän tilitä.</w:t>
             </w:r>
           </w:p>
         </w:tc>
@@ -5934,7 +6114,25 @@
                 <w:sz w:val="20"/>
                 <w:szCs w:val="20"/>
               </w:rPr>
-              <w:t xml:space="preserve">Kirjauduttu pankkiautomaatin käyttäjäksi,  yhteys </w:t>
+              <w:t xml:space="preserve">Kirjauduttu pankkiautomaatin </w:t>
+            </w:r>
+            <w:proofErr w:type="gramStart"/>
+            <w:r>
+              <w:rPr>
+                <w:rFonts w:ascii="Verdana" w:hAnsi="Verdana" w:cs="Verdana"/>
+                <w:sz w:val="20"/>
+                <w:szCs w:val="20"/>
+              </w:rPr>
+              <w:t>käyttäjäksi,  yhteys</w:t>
+            </w:r>
+            <w:proofErr w:type="gramEnd"/>
+            <w:r>
+              <w:rPr>
+                <w:rFonts w:ascii="Verdana" w:hAnsi="Verdana" w:cs="Verdana"/>
+                <w:sz w:val="20"/>
+                <w:szCs w:val="20"/>
+              </w:rPr>
+              <w:t xml:space="preserve"> </w:t>
             </w:r>
             <w:r>
               <w:rPr>
@@ -6711,6 +6909,7 @@
         </w:rPr>
         <w:t xml:space="preserve">Tässä kuvataan </w:t>
       </w:r>
+      <w:proofErr w:type="spellStart"/>
       <w:r>
         <w:rPr>
           <w:rFonts w:ascii="Verdana" w:hAnsi="Verdana"/>
@@ -6725,6 +6924,7 @@
         </w:rPr>
         <w:t>ohjelman</w:t>
       </w:r>
+      <w:proofErr w:type="spellEnd"/>
       <w:r>
         <w:rPr>
           <w:rFonts w:ascii="Verdana" w:hAnsi="Verdana"/>
@@ -6872,8 +7072,30 @@
         <w:rPr>
           <w:rFonts w:ascii="Verdana" w:hAnsi="Verdana" w:cs="Verdana"/>
         </w:rPr>
-        <w:t>Asiakkaalla voi olla monta tiliä tyyppiä debit tai credit</w:t>
-      </w:r>
+        <w:t xml:space="preserve">Asiakkaalla voi olla monta tiliä tyyppiä </w:t>
+      </w:r>
+      <w:proofErr w:type="spellStart"/>
+      <w:r>
+        <w:rPr>
+          <w:rFonts w:ascii="Verdana" w:hAnsi="Verdana" w:cs="Verdana"/>
+        </w:rPr>
+        <w:t>debit</w:t>
+      </w:r>
+      <w:proofErr w:type="spellEnd"/>
+      <w:r>
+        <w:rPr>
+          <w:rFonts w:ascii="Verdana" w:hAnsi="Verdana" w:cs="Verdana"/>
+        </w:rPr>
+        <w:t xml:space="preserve"> tai </w:t>
+      </w:r>
+      <w:proofErr w:type="spellStart"/>
+      <w:r>
+        <w:rPr>
+          <w:rFonts w:ascii="Verdana" w:hAnsi="Verdana" w:cs="Verdana"/>
+        </w:rPr>
+        <w:t>credit</w:t>
+      </w:r>
+      <w:proofErr w:type="spellEnd"/>
     </w:p>
     <w:p>
       <w:pPr>
@@ -6926,7 +7148,35 @@
         <w:rPr>
           <w:rFonts w:ascii="Verdana" w:hAnsi="Verdana" w:cs="Verdana"/>
         </w:rPr>
-        <w:t>Kortin tyyppejä on kolme: debit, credit, kaksoiskortti</w:t>
+        <w:t xml:space="preserve">Kortin tyyppejä on kolme: </w:t>
+      </w:r>
+      <w:proofErr w:type="spellStart"/>
+      <w:r>
+        <w:rPr>
+          <w:rFonts w:ascii="Verdana" w:hAnsi="Verdana" w:cs="Verdana"/>
+        </w:rPr>
+        <w:t>debit</w:t>
+      </w:r>
+      <w:proofErr w:type="spellEnd"/>
+      <w:r>
+        <w:rPr>
+          <w:rFonts w:ascii="Verdana" w:hAnsi="Verdana" w:cs="Verdana"/>
+        </w:rPr>
+        <w:t xml:space="preserve">, </w:t>
+      </w:r>
+      <w:proofErr w:type="spellStart"/>
+      <w:r>
+        <w:rPr>
+          <w:rFonts w:ascii="Verdana" w:hAnsi="Verdana" w:cs="Verdana"/>
+        </w:rPr>
+        <w:t>credit</w:t>
+      </w:r>
+      <w:proofErr w:type="spellEnd"/>
+      <w:r>
+        <w:rPr>
+          <w:rFonts w:ascii="Verdana" w:hAnsi="Verdana" w:cs="Verdana"/>
+        </w:rPr>
+        <w:t>, kaksoiskortti</w:t>
       </w:r>
     </w:p>
     <w:p>
@@ -6944,7 +7194,35 @@
         <w:rPr>
           <w:rFonts w:ascii="Verdana" w:hAnsi="Verdana" w:cs="Verdana"/>
         </w:rPr>
-        <w:t>Yksi kortti voidaan liittää useaan tiliin (tämä tarkoittaa käytännössä, että kaksoiskortti voidaan liittää yhteen debit-tiliin ja yhteen credit-tiliin)</w:t>
+        <w:t xml:space="preserve">Yksi kortti voidaan liittää useaan tiliin (tämä tarkoittaa käytännössä, että kaksoiskortti voidaan liittää yhteen </w:t>
+      </w:r>
+      <w:proofErr w:type="spellStart"/>
+      <w:r>
+        <w:rPr>
+          <w:rFonts w:ascii="Verdana" w:hAnsi="Verdana" w:cs="Verdana"/>
+        </w:rPr>
+        <w:t>debit</w:t>
+      </w:r>
+      <w:proofErr w:type="spellEnd"/>
+      <w:r>
+        <w:rPr>
+          <w:rFonts w:ascii="Verdana" w:hAnsi="Verdana" w:cs="Verdana"/>
+        </w:rPr>
+        <w:t xml:space="preserve">-tiliin ja yhteen </w:t>
+      </w:r>
+      <w:proofErr w:type="spellStart"/>
+      <w:r>
+        <w:rPr>
+          <w:rFonts w:ascii="Verdana" w:hAnsi="Verdana" w:cs="Verdana"/>
+        </w:rPr>
+        <w:t>credit</w:t>
+      </w:r>
+      <w:proofErr w:type="spellEnd"/>
+      <w:r>
+        <w:rPr>
+          <w:rFonts w:ascii="Verdana" w:hAnsi="Verdana" w:cs="Verdana"/>
+        </w:rPr>
+        <w:t>-tiliin)</w:t>
       </w:r>
     </w:p>
     <w:p>
@@ -7879,7 +8157,23 @@
           <w:rFonts w:ascii="Verdana" w:hAnsi="Verdana" w:cs="Verdana"/>
           <w:szCs w:val="20"/>
         </w:rPr>
-        <w:t xml:space="preserve"> kuvataan miten järjestelmäkomponentit toteutetaan ohjelmistokomponentt</w:t>
+        <w:t xml:space="preserve"> </w:t>
+      </w:r>
+      <w:proofErr w:type="gramStart"/>
+      <w:r>
+        <w:rPr>
+          <w:rFonts w:ascii="Verdana" w:hAnsi="Verdana" w:cs="Verdana"/>
+          <w:szCs w:val="20"/>
+        </w:rPr>
+        <w:t>kuvataan miten järjestelmäkomponentit toteutetaan</w:t>
+      </w:r>
+      <w:proofErr w:type="gramEnd"/>
+      <w:r>
+        <w:rPr>
+          <w:rFonts w:ascii="Verdana" w:hAnsi="Verdana" w:cs="Verdana"/>
+          <w:szCs w:val="20"/>
+        </w:rPr>
+        <w:t xml:space="preserve"> ohjelmistokomponentt</w:t>
       </w:r>
       <w:r>
         <w:rPr>
@@ -8212,8 +8506,9 @@
                 <w:sz w:val="20"/>
                 <w:szCs w:val="20"/>
               </w:rPr>
-              <w:t xml:space="preserve">Käyttöliittymä komponentti, joka kommunikoi REST API backendin kanssa. Tämä komponentti toimii osana </w:t>
-            </w:r>
+              <w:t xml:space="preserve">Käyttöliittymä komponentti, joka kommunikoi REST API </w:t>
+            </w:r>
+            <w:proofErr w:type="spellStart"/>
             <w:r>
               <w:rPr>
                 <w:rFonts w:ascii="Verdana" w:hAnsi="Verdana" w:cs="Verdana"/>
@@ -8223,8 +8518,9 @@
                 <w:sz w:val="20"/>
                 <w:szCs w:val="20"/>
               </w:rPr>
-              <w:t xml:space="preserve">pankkiautomaatti </w:t>
-            </w:r>
+              <w:t>backendin</w:t>
+            </w:r>
+            <w:proofErr w:type="spellEnd"/>
             <w:r>
               <w:rPr>
                 <w:rFonts w:ascii="Verdana" w:hAnsi="Verdana" w:cs="Verdana"/>
@@ -8234,7 +8530,53 @@
                 <w:sz w:val="20"/>
                 <w:szCs w:val="20"/>
               </w:rPr>
-              <w:t>asiakassovellusta. Komponentti on Qt-pohjainen.</w:t>
+              <w:t xml:space="preserve"> kanssa. Tämä komponentti toimii osana </w:t>
+            </w:r>
+            <w:r>
+              <w:rPr>
+                <w:rFonts w:ascii="Verdana" w:hAnsi="Verdana" w:cs="Verdana"/>
+                <w:i/>
+                <w:iCs/>
+                <w:color w:val="000000" w:themeColor="text1"/>
+                <w:sz w:val="20"/>
+                <w:szCs w:val="20"/>
+              </w:rPr>
+              <w:t xml:space="preserve">pankkiautomaatti </w:t>
+            </w:r>
+            <w:r>
+              <w:rPr>
+                <w:rFonts w:ascii="Verdana" w:hAnsi="Verdana" w:cs="Verdana"/>
+                <w:i/>
+                <w:iCs/>
+                <w:color w:val="000000" w:themeColor="text1"/>
+                <w:sz w:val="20"/>
+                <w:szCs w:val="20"/>
+              </w:rPr>
+              <w:t xml:space="preserve">asiakassovellusta. Komponentti on </w:t>
+            </w:r>
+            <w:proofErr w:type="spellStart"/>
+            <w:r>
+              <w:rPr>
+                <w:rFonts w:ascii="Verdana" w:hAnsi="Verdana" w:cs="Verdana"/>
+                <w:i/>
+                <w:iCs/>
+                <w:color w:val="000000" w:themeColor="text1"/>
+                <w:sz w:val="20"/>
+                <w:szCs w:val="20"/>
+              </w:rPr>
+              <w:t>Qt</w:t>
+            </w:r>
+            <w:proofErr w:type="spellEnd"/>
+            <w:r>
+              <w:rPr>
+                <w:rFonts w:ascii="Verdana" w:hAnsi="Verdana" w:cs="Verdana"/>
+                <w:i/>
+                <w:iCs/>
+                <w:color w:val="000000" w:themeColor="text1"/>
+                <w:sz w:val="20"/>
+                <w:szCs w:val="20"/>
+              </w:rPr>
+              <w:t>-pohjainen.</w:t>
             </w:r>
             <w:r>
               <w:rPr>
@@ -8418,7 +8760,31 @@
                 <w:sz w:val="20"/>
                 <w:szCs w:val="20"/>
               </w:rPr>
-              <w:t>Funktiot mitä tarjoaa muille / signaalit mitä komponentti vastaanottaa tai lähettää muille. (ryhmän itse toteuttamat, ei Qt:n sisäisiä.)</w:t>
+              <w:t xml:space="preserve">Funktiot mitä tarjoaa muille / signaalit mitä komponentti vastaanottaa tai lähettää muille. (ryhmän itse toteuttamat, ei </w:t>
+            </w:r>
+            <w:proofErr w:type="spellStart"/>
+            <w:r>
+              <w:rPr>
+                <w:rFonts w:ascii="Verdana" w:hAnsi="Verdana" w:cs="Verdana"/>
+                <w:i/>
+                <w:iCs/>
+                <w:color w:val="000000" w:themeColor="text1"/>
+                <w:sz w:val="20"/>
+                <w:szCs w:val="20"/>
+              </w:rPr>
+              <w:t>Qt:n</w:t>
+            </w:r>
+            <w:proofErr w:type="spellEnd"/>
+            <w:r>
+              <w:rPr>
+                <w:rFonts w:ascii="Verdana" w:hAnsi="Verdana" w:cs="Verdana"/>
+                <w:i/>
+                <w:iCs/>
+                <w:color w:val="000000" w:themeColor="text1"/>
+                <w:sz w:val="20"/>
+                <w:szCs w:val="20"/>
+              </w:rPr>
+              <w:t xml:space="preserve"> sisäisiä.)</w:t>
             </w:r>
           </w:p>
           <w:tbl>
@@ -8509,13 +8875,79 @@
                       <w:szCs w:val="20"/>
                     </w:rPr>
                   </w:pPr>
+                  <w:proofErr w:type="spellStart"/>
+                  <w:proofErr w:type="gramStart"/>
                   <w:r>
                     <w:rPr>
                       <w:rFonts w:ascii="Verdana" w:hAnsi="Verdana" w:cs="Verdana"/>
                       <w:sz w:val="20"/>
                       <w:szCs w:val="20"/>
                     </w:rPr>
-                    <w:t>setToken(const QString &amp;newToken)</w:t>
+                    <w:t>setToken</w:t>
+                  </w:r>
+                  <w:proofErr w:type="spellEnd"/>
+                  <w:r>
+                    <w:rPr>
+                      <w:rFonts w:ascii="Verdana" w:hAnsi="Verdana" w:cs="Verdana"/>
+                      <w:sz w:val="20"/>
+                      <w:szCs w:val="20"/>
+                    </w:rPr>
+                    <w:t>(</w:t>
+                  </w:r>
+                  <w:proofErr w:type="spellStart"/>
+                  <w:proofErr w:type="gramEnd"/>
+                  <w:r>
+                    <w:rPr>
+                      <w:rFonts w:ascii="Verdana" w:hAnsi="Verdana" w:cs="Verdana"/>
+                      <w:sz w:val="20"/>
+                      <w:szCs w:val="20"/>
+                    </w:rPr>
+                    <w:t>const</w:t>
+                  </w:r>
+                  <w:proofErr w:type="spellEnd"/>
+                  <w:r>
+                    <w:rPr>
+                      <w:rFonts w:ascii="Verdana" w:hAnsi="Verdana" w:cs="Verdana"/>
+                      <w:sz w:val="20"/>
+                      <w:szCs w:val="20"/>
+                    </w:rPr>
+                    <w:t xml:space="preserve"> </w:t>
+                  </w:r>
+                  <w:proofErr w:type="spellStart"/>
+                  <w:r>
+                    <w:rPr>
+                      <w:rFonts w:ascii="Verdana" w:hAnsi="Verdana" w:cs="Verdana"/>
+                      <w:sz w:val="20"/>
+                      <w:szCs w:val="20"/>
+                    </w:rPr>
+                    <w:t>QString</w:t>
+                  </w:r>
+                  <w:proofErr w:type="spellEnd"/>
+                  <w:r>
+                    <w:rPr>
+                      <w:rFonts w:ascii="Verdana" w:hAnsi="Verdana" w:cs="Verdana"/>
+                      <w:sz w:val="20"/>
+                      <w:szCs w:val="20"/>
+                    </w:rPr>
+                    <w:t xml:space="preserve"> &amp;</w:t>
+                  </w:r>
+                  <w:proofErr w:type="spellStart"/>
+                  <w:r>
+                    <w:rPr>
+                      <w:rFonts w:ascii="Verdana" w:hAnsi="Verdana" w:cs="Verdana"/>
+                      <w:sz w:val="20"/>
+                      <w:szCs w:val="20"/>
+                    </w:rPr>
+                    <w:t>newToken</w:t>
+                  </w:r>
+                  <w:proofErr w:type="spellEnd"/>
+                  <w:r>
+                    <w:rPr>
+                      <w:rFonts w:ascii="Verdana" w:hAnsi="Verdana" w:cs="Verdana"/>
+                      <w:sz w:val="20"/>
+                      <w:szCs w:val="20"/>
+                    </w:rPr>
+                    <w:t>)</w:t>
                   </w:r>
                 </w:p>
               </w:tc>
@@ -8562,6 +8994,8 @@
                       <w:szCs w:val="20"/>
                     </w:rPr>
                   </w:pPr>
+                  <w:proofErr w:type="spellStart"/>
+                  <w:proofErr w:type="gramStart"/>
                   <w:r>
                     <w:rPr>
                       <w:rFonts w:ascii="Verdana" w:hAnsi="Verdana" w:cs="Verdana"/>
@@ -8569,7 +9003,58 @@
                       <w:sz w:val="20"/>
                       <w:szCs w:val="20"/>
                     </w:rPr>
-                    <w:t>setIdtili(int newIdTili)</w:t>
+                    <w:t>setIdtili</w:t>
+                  </w:r>
+                  <w:proofErr w:type="spellEnd"/>
+                  <w:r>
+                    <w:rPr>
+                      <w:rFonts w:ascii="Verdana" w:hAnsi="Verdana" w:cs="Verdana"/>
+                      <w:color w:val="000000" w:themeColor="text1"/>
+                      <w:sz w:val="20"/>
+                      <w:szCs w:val="20"/>
+                    </w:rPr>
+                    <w:t>(</w:t>
+                  </w:r>
+                  <w:proofErr w:type="spellStart"/>
+                  <w:proofErr w:type="gramEnd"/>
+                  <w:r>
+                    <w:rPr>
+                      <w:rFonts w:ascii="Verdana" w:hAnsi="Verdana" w:cs="Verdana"/>
+                      <w:color w:val="000000" w:themeColor="text1"/>
+                      <w:sz w:val="20"/>
+                      <w:szCs w:val="20"/>
+                    </w:rPr>
+                    <w:t>int</w:t>
+                  </w:r>
+                  <w:proofErr w:type="spellEnd"/>
+                  <w:r>
+                    <w:rPr>
+                      <w:rFonts w:ascii="Verdana" w:hAnsi="Verdana" w:cs="Verdana"/>
+                      <w:color w:val="000000" w:themeColor="text1"/>
+                      <w:sz w:val="20"/>
+                      <w:szCs w:val="20"/>
+                    </w:rPr>
+                    <w:t xml:space="preserve"> </w:t>
+                  </w:r>
+                  <w:proofErr w:type="spellStart"/>
+                  <w:r>
+                    <w:rPr>
+                      <w:rFonts w:ascii="Verdana" w:hAnsi="Verdana" w:cs="Verdana"/>
+                      <w:color w:val="000000" w:themeColor="text1"/>
+                      <w:sz w:val="20"/>
+                      <w:szCs w:val="20"/>
+                    </w:rPr>
+                    <w:t>newIdTili</w:t>
+                  </w:r>
+                  <w:proofErr w:type="spellEnd"/>
+                  <w:r>
+                    <w:rPr>
+                      <w:rFonts w:ascii="Verdana" w:hAnsi="Verdana" w:cs="Verdana"/>
+                      <w:color w:val="000000" w:themeColor="text1"/>
+                      <w:sz w:val="20"/>
+                      <w:szCs w:val="20"/>
+                    </w:rPr>
+                    <w:t>)</w:t>
                   </w:r>
                 </w:p>
               </w:tc>
@@ -8618,6 +9103,8 @@
                       <w:szCs w:val="20"/>
                     </w:rPr>
                   </w:pPr>
+                  <w:proofErr w:type="spellStart"/>
+                  <w:proofErr w:type="gramStart"/>
                   <w:r>
                     <w:rPr>
                       <w:rFonts w:ascii="Verdana" w:hAnsi="Verdana" w:cs="Verdana"/>
@@ -8625,8 +9112,39 @@
                       <w:sz w:val="20"/>
                       <w:szCs w:val="20"/>
                     </w:rPr>
-                    <w:t>getIdtili() const</w:t>
+                    <w:t>getIdtili</w:t>
                   </w:r>
+                  <w:proofErr w:type="spellEnd"/>
+                  <w:r>
+                    <w:rPr>
+                      <w:rFonts w:ascii="Verdana" w:hAnsi="Verdana" w:cs="Verdana"/>
+                      <w:color w:val="000000" w:themeColor="text1"/>
+                      <w:sz w:val="20"/>
+                      <w:szCs w:val="20"/>
+                    </w:rPr>
+                    <w:t>(</w:t>
+                  </w:r>
+                  <w:proofErr w:type="gramEnd"/>
+                  <w:r>
+                    <w:rPr>
+                      <w:rFonts w:ascii="Verdana" w:hAnsi="Verdana" w:cs="Verdana"/>
+                      <w:color w:val="000000" w:themeColor="text1"/>
+                      <w:sz w:val="20"/>
+                      <w:szCs w:val="20"/>
+                    </w:rPr>
+                    <w:t xml:space="preserve">) </w:t>
+                  </w:r>
+                  <w:proofErr w:type="spellStart"/>
+                  <w:r>
+                    <w:rPr>
+                      <w:rFonts w:ascii="Verdana" w:hAnsi="Verdana" w:cs="Verdana"/>
+                      <w:color w:val="000000" w:themeColor="text1"/>
+                      <w:sz w:val="20"/>
+                      <w:szCs w:val="20"/>
+                    </w:rPr>
+                    <w:t>const</w:t>
+                  </w:r>
+                  <w:proofErr w:type="spellEnd"/>
                 </w:p>
               </w:tc>
               <w:tc>
@@ -8652,7 +9170,27 @@
                       <w:sz w:val="20"/>
                       <w:szCs w:val="20"/>
                     </w:rPr>
-                    <w:t>Asetetun tilin ID:n palauttaminen.</w:t>
+                    <w:t xml:space="preserve">Asetetun tilin </w:t>
+                  </w:r>
+                  <w:proofErr w:type="spellStart"/>
+                  <w:r>
+                    <w:rPr>
+                      <w:rFonts w:ascii="Verdana" w:hAnsi="Verdana" w:cs="Verdana"/>
+                      <w:color w:val="000000" w:themeColor="text1"/>
+                      <w:sz w:val="20"/>
+                      <w:szCs w:val="20"/>
+                    </w:rPr>
+                    <w:t>ID:n</w:t>
+                  </w:r>
+                  <w:proofErr w:type="spellEnd"/>
+                  <w:r>
+                    <w:rPr>
+                      <w:rFonts w:ascii="Verdana" w:hAnsi="Verdana" w:cs="Verdana"/>
+                      <w:color w:val="000000" w:themeColor="text1"/>
+                      <w:sz w:val="20"/>
+                      <w:szCs w:val="20"/>
+                    </w:rPr>
+                    <w:t xml:space="preserve"> palauttaminen.</w:t>
                   </w:r>
                 </w:p>
               </w:tc>
@@ -8727,6 +9265,7 @@
                 <w:szCs w:val="20"/>
               </w:rPr>
             </w:pPr>
+            <w:proofErr w:type="spellStart"/>
             <w:r>
               <w:rPr>
                 <w:rFonts w:ascii="Verdana" w:hAnsi="Verdana" w:cs="Verdana"/>
@@ -8736,8 +9275,33 @@
                 <w:sz w:val="20"/>
                 <w:szCs w:val="20"/>
               </w:rPr>
-              <w:t>Sander Vassel</w:t>
-            </w:r>
+              <w:t>Sander</w:t>
+            </w:r>
+            <w:proofErr w:type="spellEnd"/>
+            <w:r>
+              <w:rPr>
+                <w:rFonts w:ascii="Verdana" w:hAnsi="Verdana" w:cs="Verdana"/>
+                <w:i/>
+                <w:iCs/>
+                <w:color w:val="000000" w:themeColor="text1"/>
+                <w:sz w:val="20"/>
+                <w:szCs w:val="20"/>
+              </w:rPr>
+              <w:t xml:space="preserve"> </w:t>
+            </w:r>
+            <w:proofErr w:type="spellStart"/>
+            <w:r>
+              <w:rPr>
+                <w:rFonts w:ascii="Verdana" w:hAnsi="Verdana" w:cs="Verdana"/>
+                <w:i/>
+                <w:iCs/>
+                <w:color w:val="000000" w:themeColor="text1"/>
+                <w:sz w:val="20"/>
+                <w:szCs w:val="20"/>
+              </w:rPr>
+              <w:t>Vassel</w:t>
+            </w:r>
+            <w:proofErr w:type="spellEnd"/>
           </w:p>
         </w:tc>
       </w:tr>
@@ -9121,7 +9685,55 @@
                 <w:sz w:val="20"/>
                 <w:szCs w:val="20"/>
               </w:rPr>
-              <w:t>Käyttöliittymä komponentti, joka kommunikoi REST API backendin kanssa. Tämä komponentti toimii osana pankkiautomaatti asiakassovellusta. Komponentti on Qt-pohjainen.</w:t>
+              <w:t xml:space="preserve">Käyttöliittymä komponentti, joka kommunikoi REST API </w:t>
+            </w:r>
+            <w:proofErr w:type="spellStart"/>
+            <w:r>
+              <w:rPr>
+                <w:rFonts w:ascii="Verdana" w:hAnsi="Verdana" w:cs="Verdana"/>
+                <w:i/>
+                <w:iCs/>
+                <w:color w:val="000000" w:themeColor="text1"/>
+                <w:sz w:val="20"/>
+                <w:szCs w:val="20"/>
+              </w:rPr>
+              <w:t>backendin</w:t>
+            </w:r>
+            <w:proofErr w:type="spellEnd"/>
+            <w:r>
+              <w:rPr>
+                <w:rFonts w:ascii="Verdana" w:hAnsi="Verdana" w:cs="Verdana"/>
+                <w:i/>
+                <w:iCs/>
+                <w:color w:val="000000" w:themeColor="text1"/>
+                <w:sz w:val="20"/>
+                <w:szCs w:val="20"/>
+              </w:rPr>
+              <w:t xml:space="preserve"> kanssa. Tämä komponentti toimii osana pankkiautomaatti asiakassovellusta. Komponentti on </w:t>
+            </w:r>
+            <w:proofErr w:type="spellStart"/>
+            <w:r>
+              <w:rPr>
+                <w:rFonts w:ascii="Verdana" w:hAnsi="Verdana" w:cs="Verdana"/>
+                <w:i/>
+                <w:iCs/>
+                <w:color w:val="000000" w:themeColor="text1"/>
+                <w:sz w:val="20"/>
+                <w:szCs w:val="20"/>
+              </w:rPr>
+              <w:t>Qt</w:t>
+            </w:r>
+            <w:proofErr w:type="spellEnd"/>
+            <w:r>
+              <w:rPr>
+                <w:rFonts w:ascii="Verdana" w:hAnsi="Verdana" w:cs="Verdana"/>
+                <w:i/>
+                <w:iCs/>
+                <w:color w:val="000000" w:themeColor="text1"/>
+                <w:sz w:val="20"/>
+                <w:szCs w:val="20"/>
+              </w:rPr>
+              <w:t>-pohjainen.</w:t>
             </w:r>
           </w:p>
         </w:tc>
@@ -9294,7 +9906,31 @@
                 <w:sz w:val="20"/>
                 <w:szCs w:val="20"/>
               </w:rPr>
-              <w:t>Funktiot mitä tarjoaa muille / signaalit mitä komponentti vastaanottaa tai lähettää muille. (ryhmän itse toteuttamat, ei Qt:n sisäisiä.)</w:t>
+              <w:t xml:space="preserve">Funktiot mitä tarjoaa muille / signaalit mitä komponentti vastaanottaa tai lähettää muille. (ryhmän itse toteuttamat, ei </w:t>
+            </w:r>
+            <w:proofErr w:type="spellStart"/>
+            <w:r>
+              <w:rPr>
+                <w:rFonts w:ascii="Verdana" w:hAnsi="Verdana" w:cs="Verdana"/>
+                <w:i/>
+                <w:iCs/>
+                <w:color w:val="000000" w:themeColor="text1"/>
+                <w:sz w:val="20"/>
+                <w:szCs w:val="20"/>
+              </w:rPr>
+              <w:t>Qt:n</w:t>
+            </w:r>
+            <w:proofErr w:type="spellEnd"/>
+            <w:r>
+              <w:rPr>
+                <w:rFonts w:ascii="Verdana" w:hAnsi="Verdana" w:cs="Verdana"/>
+                <w:i/>
+                <w:iCs/>
+                <w:color w:val="000000" w:themeColor="text1"/>
+                <w:sz w:val="20"/>
+                <w:szCs w:val="20"/>
+              </w:rPr>
+              <w:t xml:space="preserve"> sisäisiä.)</w:t>
             </w:r>
           </w:p>
           <w:tbl>
@@ -9385,14 +10021,54 @@
                       <w:szCs w:val="20"/>
                     </w:rPr>
                   </w:pPr>
+                  <w:proofErr w:type="spellStart"/>
+                  <w:proofErr w:type="gramStart"/>
                   <w:r>
                     <w:rPr>
                       <w:rFonts w:ascii="Verdana" w:hAnsi="Verdana" w:cs="Verdana"/>
                       <w:sz w:val="20"/>
                       <w:szCs w:val="20"/>
                     </w:rPr>
-                    <w:t>setTunniste(QString): void</w:t>
+                    <w:t>setTunniste</w:t>
                   </w:r>
+                  <w:proofErr w:type="spellEnd"/>
+                  <w:r>
+                    <w:rPr>
+                      <w:rFonts w:ascii="Verdana" w:hAnsi="Verdana" w:cs="Verdana"/>
+                      <w:sz w:val="20"/>
+                      <w:szCs w:val="20"/>
+                    </w:rPr>
+                    <w:t>(</w:t>
+                  </w:r>
+                  <w:proofErr w:type="spellStart"/>
+                  <w:proofErr w:type="gramEnd"/>
+                  <w:r>
+                    <w:rPr>
+                      <w:rFonts w:ascii="Verdana" w:hAnsi="Verdana" w:cs="Verdana"/>
+                      <w:sz w:val="20"/>
+                      <w:szCs w:val="20"/>
+                    </w:rPr>
+                    <w:t>QString</w:t>
+                  </w:r>
+                  <w:proofErr w:type="spellEnd"/>
+                  <w:r>
+                    <w:rPr>
+                      <w:rFonts w:ascii="Verdana" w:hAnsi="Verdana" w:cs="Verdana"/>
+                      <w:sz w:val="20"/>
+                      <w:szCs w:val="20"/>
+                    </w:rPr>
+                    <w:t xml:space="preserve">): </w:t>
+                  </w:r>
+                  <w:proofErr w:type="spellStart"/>
+                  <w:r>
+                    <w:rPr>
+                      <w:rFonts w:ascii="Verdana" w:hAnsi="Verdana" w:cs="Verdana"/>
+                      <w:sz w:val="20"/>
+                      <w:szCs w:val="20"/>
+                    </w:rPr>
+                    <w:t>void</w:t>
+                  </w:r>
+                  <w:proofErr w:type="spellEnd"/>
                 </w:p>
               </w:tc>
               <w:tc>
@@ -9462,6 +10138,8 @@
                       <w:szCs w:val="20"/>
                     </w:rPr>
                   </w:pPr>
+                  <w:proofErr w:type="spellStart"/>
+                  <w:proofErr w:type="gramStart"/>
                   <w:r>
                     <w:rPr>
                       <w:rFonts w:ascii="Verdana" w:hAnsi="Verdana" w:cs="Verdana"/>
@@ -9478,8 +10156,50 @@
                       <w:sz w:val="20"/>
                       <w:szCs w:val="20"/>
                     </w:rPr>
-                    <w:t>Pin(QString): void</w:t>
+                    <w:t>Pin</w:t>
                   </w:r>
+                  <w:proofErr w:type="spellEnd"/>
+                  <w:r>
+                    <w:rPr>
+                      <w:rFonts w:ascii="Verdana" w:hAnsi="Verdana" w:cs="Verdana"/>
+                      <w:color w:val="000000" w:themeColor="text1"/>
+                      <w:sz w:val="20"/>
+                      <w:szCs w:val="20"/>
+                    </w:rPr>
+                    <w:t>(</w:t>
+                  </w:r>
+                  <w:proofErr w:type="spellStart"/>
+                  <w:proofErr w:type="gramEnd"/>
+                  <w:r>
+                    <w:rPr>
+                      <w:rFonts w:ascii="Verdana" w:hAnsi="Verdana" w:cs="Verdana"/>
+                      <w:color w:val="000000" w:themeColor="text1"/>
+                      <w:sz w:val="20"/>
+                      <w:szCs w:val="20"/>
+                    </w:rPr>
+                    <w:t>QString</w:t>
+                  </w:r>
+                  <w:proofErr w:type="spellEnd"/>
+                  <w:r>
+                    <w:rPr>
+                      <w:rFonts w:ascii="Verdana" w:hAnsi="Verdana" w:cs="Verdana"/>
+                      <w:color w:val="000000" w:themeColor="text1"/>
+                      <w:sz w:val="20"/>
+                      <w:szCs w:val="20"/>
+                    </w:rPr>
+                    <w:t xml:space="preserve">): </w:t>
+                  </w:r>
+                  <w:proofErr w:type="spellStart"/>
+                  <w:r>
+                    <w:rPr>
+                      <w:rFonts w:ascii="Verdana" w:hAnsi="Verdana" w:cs="Verdana"/>
+                      <w:color w:val="000000" w:themeColor="text1"/>
+                      <w:sz w:val="20"/>
+                      <w:szCs w:val="20"/>
+                    </w:rPr>
+                    <w:t>void</w:t>
+                  </w:r>
+                  <w:proofErr w:type="spellEnd"/>
                   <w:r>
                     <w:rPr>
                       <w:rFonts w:ascii="Verdana" w:hAnsi="Verdana" w:cs="Verdana"/>
@@ -9572,6 +10292,8 @@
                       <w:szCs w:val="20"/>
                     </w:rPr>
                   </w:pPr>
+                  <w:proofErr w:type="spellStart"/>
+                  <w:proofErr w:type="gramStart"/>
                   <w:r>
                     <w:rPr>
                       <w:rFonts w:ascii="Verdana" w:hAnsi="Verdana" w:cs="Verdana"/>
@@ -9579,8 +10301,39 @@
                       <w:sz w:val="20"/>
                       <w:szCs w:val="20"/>
                     </w:rPr>
-                    <w:t>getTunniste(): QString</w:t>
+                    <w:t>getTunniste</w:t>
                   </w:r>
+                  <w:proofErr w:type="spellEnd"/>
+                  <w:r>
+                    <w:rPr>
+                      <w:rFonts w:ascii="Verdana" w:hAnsi="Verdana" w:cs="Verdana"/>
+                      <w:color w:val="000000" w:themeColor="text1"/>
+                      <w:sz w:val="20"/>
+                      <w:szCs w:val="20"/>
+                    </w:rPr>
+                    <w:t>(</w:t>
+                  </w:r>
+                  <w:proofErr w:type="gramEnd"/>
+                  <w:r>
+                    <w:rPr>
+                      <w:rFonts w:ascii="Verdana" w:hAnsi="Verdana" w:cs="Verdana"/>
+                      <w:color w:val="000000" w:themeColor="text1"/>
+                      <w:sz w:val="20"/>
+                      <w:szCs w:val="20"/>
+                    </w:rPr>
+                    <w:t xml:space="preserve">): </w:t>
+                  </w:r>
+                  <w:proofErr w:type="spellStart"/>
+                  <w:r>
+                    <w:rPr>
+                      <w:rFonts w:ascii="Verdana" w:hAnsi="Verdana" w:cs="Verdana"/>
+                      <w:color w:val="000000" w:themeColor="text1"/>
+                      <w:sz w:val="20"/>
+                      <w:szCs w:val="20"/>
+                    </w:rPr>
+                    <w:t>QString</w:t>
+                  </w:r>
+                  <w:proofErr w:type="spellEnd"/>
                 </w:p>
               </w:tc>
               <w:tc>
@@ -9628,6 +10381,8 @@
                       <w:szCs w:val="20"/>
                     </w:rPr>
                   </w:pPr>
+                  <w:proofErr w:type="spellStart"/>
+                  <w:proofErr w:type="gramStart"/>
                   <w:r>
                     <w:rPr>
                       <w:rFonts w:ascii="Verdana" w:hAnsi="Verdana" w:cs="Verdana"/>
@@ -9644,8 +10399,39 @@
                       <w:sz w:val="20"/>
                       <w:szCs w:val="20"/>
                     </w:rPr>
-                    <w:t>Pin(): QString</w:t>
+                    <w:t>Pin</w:t>
                   </w:r>
+                  <w:proofErr w:type="spellEnd"/>
+                  <w:r>
+                    <w:rPr>
+                      <w:rFonts w:ascii="Verdana" w:hAnsi="Verdana" w:cs="Verdana"/>
+                      <w:color w:val="000000" w:themeColor="text1"/>
+                      <w:sz w:val="20"/>
+                      <w:szCs w:val="20"/>
+                    </w:rPr>
+                    <w:t>(</w:t>
+                  </w:r>
+                  <w:proofErr w:type="gramEnd"/>
+                  <w:r>
+                    <w:rPr>
+                      <w:rFonts w:ascii="Verdana" w:hAnsi="Verdana" w:cs="Verdana"/>
+                      <w:color w:val="000000" w:themeColor="text1"/>
+                      <w:sz w:val="20"/>
+                      <w:szCs w:val="20"/>
+                    </w:rPr>
+                    <w:t xml:space="preserve">): </w:t>
+                  </w:r>
+                  <w:proofErr w:type="spellStart"/>
+                  <w:r>
+                    <w:rPr>
+                      <w:rFonts w:ascii="Verdana" w:hAnsi="Verdana" w:cs="Verdana"/>
+                      <w:color w:val="000000" w:themeColor="text1"/>
+                      <w:sz w:val="20"/>
+                      <w:szCs w:val="20"/>
+                    </w:rPr>
+                    <w:t>QString</w:t>
+                  </w:r>
+                  <w:proofErr w:type="spellEnd"/>
                 </w:p>
               </w:tc>
               <w:tc>
@@ -9729,6 +10515,8 @@
                       <w:szCs w:val="20"/>
                     </w:rPr>
                   </w:pPr>
+                  <w:proofErr w:type="spellStart"/>
+                  <w:proofErr w:type="gramStart"/>
                   <w:r>
                     <w:rPr>
                       <w:rFonts w:ascii="Verdana" w:hAnsi="Verdana" w:cs="Verdana"/>
@@ -9736,8 +10524,50 @@
                       <w:sz w:val="20"/>
                       <w:szCs w:val="20"/>
                     </w:rPr>
-                    <w:t>checkPINFormat(QString): bool</w:t>
+                    <w:t>checkPINFormat</w:t>
                   </w:r>
+                  <w:proofErr w:type="spellEnd"/>
+                  <w:r>
+                    <w:rPr>
+                      <w:rFonts w:ascii="Verdana" w:hAnsi="Verdana" w:cs="Verdana"/>
+                      <w:color w:val="000000" w:themeColor="text1"/>
+                      <w:sz w:val="20"/>
+                      <w:szCs w:val="20"/>
+                    </w:rPr>
+                    <w:t>(</w:t>
+                  </w:r>
+                  <w:proofErr w:type="spellStart"/>
+                  <w:proofErr w:type="gramEnd"/>
+                  <w:r>
+                    <w:rPr>
+                      <w:rFonts w:ascii="Verdana" w:hAnsi="Verdana" w:cs="Verdana"/>
+                      <w:color w:val="000000" w:themeColor="text1"/>
+                      <w:sz w:val="20"/>
+                      <w:szCs w:val="20"/>
+                    </w:rPr>
+                    <w:t>QString</w:t>
+                  </w:r>
+                  <w:proofErr w:type="spellEnd"/>
+                  <w:r>
+                    <w:rPr>
+                      <w:rFonts w:ascii="Verdana" w:hAnsi="Verdana" w:cs="Verdana"/>
+                      <w:color w:val="000000" w:themeColor="text1"/>
+                      <w:sz w:val="20"/>
+                      <w:szCs w:val="20"/>
+                    </w:rPr>
+                    <w:t xml:space="preserve">): </w:t>
+                  </w:r>
+                  <w:proofErr w:type="spellStart"/>
+                  <w:r>
+                    <w:rPr>
+                      <w:rFonts w:ascii="Verdana" w:hAnsi="Verdana" w:cs="Verdana"/>
+                      <w:color w:val="000000" w:themeColor="text1"/>
+                      <w:sz w:val="20"/>
+                      <w:szCs w:val="20"/>
+                    </w:rPr>
+                    <w:t>bool</w:t>
+                  </w:r>
+                  <w:proofErr w:type="spellEnd"/>
                 </w:p>
               </w:tc>
               <w:tc>
@@ -9839,6 +10669,8 @@
                       <w:szCs w:val="20"/>
                     </w:rPr>
                   </w:pPr>
+                  <w:proofErr w:type="spellStart"/>
+                  <w:proofErr w:type="gramStart"/>
                   <w:r>
                     <w:rPr>
                       <w:rFonts w:ascii="Verdana" w:hAnsi="Verdana" w:cs="Verdana"/>
@@ -9846,8 +10678,39 @@
                       <w:sz w:val="20"/>
                       <w:szCs w:val="20"/>
                     </w:rPr>
-                    <w:t>btnContinueSlot(): void</w:t>
+                    <w:t>btnContinueSlot</w:t>
                   </w:r>
+                  <w:proofErr w:type="spellEnd"/>
+                  <w:r>
+                    <w:rPr>
+                      <w:rFonts w:ascii="Verdana" w:hAnsi="Verdana" w:cs="Verdana"/>
+                      <w:color w:val="000000" w:themeColor="text1"/>
+                      <w:sz w:val="20"/>
+                      <w:szCs w:val="20"/>
+                    </w:rPr>
+                    <w:t>(</w:t>
+                  </w:r>
+                  <w:proofErr w:type="gramEnd"/>
+                  <w:r>
+                    <w:rPr>
+                      <w:rFonts w:ascii="Verdana" w:hAnsi="Verdana" w:cs="Verdana"/>
+                      <w:color w:val="000000" w:themeColor="text1"/>
+                      <w:sz w:val="20"/>
+                      <w:szCs w:val="20"/>
+                    </w:rPr>
+                    <w:t xml:space="preserve">): </w:t>
+                  </w:r>
+                  <w:proofErr w:type="spellStart"/>
+                  <w:r>
+                    <w:rPr>
+                      <w:rFonts w:ascii="Verdana" w:hAnsi="Verdana" w:cs="Verdana"/>
+                      <w:color w:val="000000" w:themeColor="text1"/>
+                      <w:sz w:val="20"/>
+                      <w:szCs w:val="20"/>
+                    </w:rPr>
+                    <w:t>void</w:t>
+                  </w:r>
+                  <w:proofErr w:type="spellEnd"/>
                 </w:p>
               </w:tc>
               <w:tc>
@@ -9873,7 +10736,69 @@
                       <w:sz w:val="20"/>
                       <w:szCs w:val="20"/>
                     </w:rPr>
-                    <w:t>Luodaan PINWindow olio, asetetaan tunniste talteen setTunniste(QString) -funktiolla</w:t>
+                    <w:t xml:space="preserve">Luodaan </w:t>
+                  </w:r>
+                  <w:proofErr w:type="spellStart"/>
+                  <w:r>
+                    <w:rPr>
+                      <w:rFonts w:ascii="Verdana" w:hAnsi="Verdana" w:cs="Verdana"/>
+                      <w:color w:val="000000" w:themeColor="text1"/>
+                      <w:sz w:val="20"/>
+                      <w:szCs w:val="20"/>
+                    </w:rPr>
+                    <w:t>PINWindow</w:t>
+                  </w:r>
+                  <w:proofErr w:type="spellEnd"/>
+                  <w:r>
+                    <w:rPr>
+                      <w:rFonts w:ascii="Verdana" w:hAnsi="Verdana" w:cs="Verdana"/>
+                      <w:color w:val="000000" w:themeColor="text1"/>
+                      <w:sz w:val="20"/>
+                      <w:szCs w:val="20"/>
+                    </w:rPr>
+                    <w:t xml:space="preserve"> olio, asetetaan tunniste talteen </w:t>
+                  </w:r>
+                  <w:proofErr w:type="spellStart"/>
+                  <w:proofErr w:type="gramStart"/>
+                  <w:r>
+                    <w:rPr>
+                      <w:rFonts w:ascii="Verdana" w:hAnsi="Verdana" w:cs="Verdana"/>
+                      <w:color w:val="000000" w:themeColor="text1"/>
+                      <w:sz w:val="20"/>
+                      <w:szCs w:val="20"/>
+                    </w:rPr>
+                    <w:t>setTunniste</w:t>
+                  </w:r>
+                  <w:proofErr w:type="spellEnd"/>
+                  <w:r>
+                    <w:rPr>
+                      <w:rFonts w:ascii="Verdana" w:hAnsi="Verdana" w:cs="Verdana"/>
+                      <w:color w:val="000000" w:themeColor="text1"/>
+                      <w:sz w:val="20"/>
+                      <w:szCs w:val="20"/>
+                    </w:rPr>
+                    <w:t>(</w:t>
+                  </w:r>
+                  <w:proofErr w:type="spellStart"/>
+                  <w:proofErr w:type="gramEnd"/>
+                  <w:r>
+                    <w:rPr>
+                      <w:rFonts w:ascii="Verdana" w:hAnsi="Verdana" w:cs="Verdana"/>
+                      <w:color w:val="000000" w:themeColor="text1"/>
+                      <w:sz w:val="20"/>
+                      <w:szCs w:val="20"/>
+                    </w:rPr>
+                    <w:t>QString</w:t>
+                  </w:r>
+                  <w:proofErr w:type="spellEnd"/>
+                  <w:r>
+                    <w:rPr>
+                      <w:rFonts w:ascii="Verdana" w:hAnsi="Verdana" w:cs="Verdana"/>
+                      <w:color w:val="000000" w:themeColor="text1"/>
+                      <w:sz w:val="20"/>
+                      <w:szCs w:val="20"/>
+                    </w:rPr>
+                    <w:t>) -funktiolla</w:t>
                   </w:r>
                   <w:r>
                     <w:rPr>
@@ -9882,7 +10807,27 @@
                       <w:sz w:val="20"/>
                       <w:szCs w:val="20"/>
                     </w:rPr>
-                    <w:t>, ja piilotetaan Login ikkuna</w:t>
+                    <w:t xml:space="preserve">, ja piilotetaan </w:t>
+                  </w:r>
+                  <w:proofErr w:type="spellStart"/>
+                  <w:r>
+                    <w:rPr>
+                      <w:rFonts w:ascii="Verdana" w:hAnsi="Verdana" w:cs="Verdana"/>
+                      <w:color w:val="000000" w:themeColor="text1"/>
+                      <w:sz w:val="20"/>
+                      <w:szCs w:val="20"/>
+                    </w:rPr>
+                    <w:t>Login</w:t>
+                  </w:r>
+                  <w:proofErr w:type="spellEnd"/>
+                  <w:r>
+                    <w:rPr>
+                      <w:rFonts w:ascii="Verdana" w:hAnsi="Verdana" w:cs="Verdana"/>
+                      <w:color w:val="000000" w:themeColor="text1"/>
+                      <w:sz w:val="20"/>
+                      <w:szCs w:val="20"/>
+                    </w:rPr>
+                    <w:t xml:space="preserve"> ikkuna</w:t>
                   </w:r>
                   <w:r>
                     <w:rPr>
@@ -9891,7 +10836,27 @@
                       <w:sz w:val="20"/>
                       <w:szCs w:val="20"/>
                     </w:rPr>
-                    <w:t>, ja käynnistetään PINWindow olio.</w:t>
+                    <w:t xml:space="preserve">, ja käynnistetään </w:t>
+                  </w:r>
+                  <w:proofErr w:type="spellStart"/>
+                  <w:r>
+                    <w:rPr>
+                      <w:rFonts w:ascii="Verdana" w:hAnsi="Verdana" w:cs="Verdana"/>
+                      <w:color w:val="000000" w:themeColor="text1"/>
+                      <w:sz w:val="20"/>
+                      <w:szCs w:val="20"/>
+                    </w:rPr>
+                    <w:t>PINWindow</w:t>
+                  </w:r>
+                  <w:proofErr w:type="spellEnd"/>
+                  <w:r>
+                    <w:rPr>
+                      <w:rFonts w:ascii="Verdana" w:hAnsi="Verdana" w:cs="Verdana"/>
+                      <w:color w:val="000000" w:themeColor="text1"/>
+                      <w:sz w:val="20"/>
+                      <w:szCs w:val="20"/>
+                    </w:rPr>
+                    <w:t xml:space="preserve"> olio.</w:t>
                   </w:r>
                   <w:r>
                     <w:rPr>
@@ -9931,6 +10896,8 @@
                       <w:szCs w:val="20"/>
                     </w:rPr>
                   </w:pPr>
+                  <w:proofErr w:type="spellStart"/>
+                  <w:proofErr w:type="gramStart"/>
                   <w:r>
                     <w:rPr>
                       <w:rFonts w:ascii="Verdana" w:hAnsi="Verdana" w:cs="Verdana"/>
@@ -9938,8 +10905,39 @@
                       <w:sz w:val="20"/>
                       <w:szCs w:val="20"/>
                     </w:rPr>
-                    <w:t>btnSignInSlot(): void</w:t>
+                    <w:t>btnSignInSlot</w:t>
                   </w:r>
+                  <w:proofErr w:type="spellEnd"/>
+                  <w:r>
+                    <w:rPr>
+                      <w:rFonts w:ascii="Verdana" w:hAnsi="Verdana" w:cs="Verdana"/>
+                      <w:color w:val="000000" w:themeColor="text1"/>
+                      <w:sz w:val="20"/>
+                      <w:szCs w:val="20"/>
+                    </w:rPr>
+                    <w:t>(</w:t>
+                  </w:r>
+                  <w:proofErr w:type="gramEnd"/>
+                  <w:r>
+                    <w:rPr>
+                      <w:rFonts w:ascii="Verdana" w:hAnsi="Verdana" w:cs="Verdana"/>
+                      <w:color w:val="000000" w:themeColor="text1"/>
+                      <w:sz w:val="20"/>
+                      <w:szCs w:val="20"/>
+                    </w:rPr>
+                    <w:t xml:space="preserve">): </w:t>
+                  </w:r>
+                  <w:proofErr w:type="spellStart"/>
+                  <w:r>
+                    <w:rPr>
+                      <w:rFonts w:ascii="Verdana" w:hAnsi="Verdana" w:cs="Verdana"/>
+                      <w:color w:val="000000" w:themeColor="text1"/>
+                      <w:sz w:val="20"/>
+                      <w:szCs w:val="20"/>
+                    </w:rPr>
+                    <w:t>void</w:t>
+                  </w:r>
+                  <w:proofErr w:type="spellEnd"/>
                 </w:p>
               </w:tc>
               <w:tc>
@@ -9965,7 +10963,49 @@
                       <w:sz w:val="20"/>
                       <w:szCs w:val="20"/>
                     </w:rPr>
-                    <w:t>Mikäli PIN-koodi on 4 numeroinen, ajastin pysäytetään, asetetaan PIN-koodi talteen setPin(QString)-funktiolla ja lähetetään HTTP pyyntö REST API palvelimelle.</w:t>
+                    <w:t xml:space="preserve">Mikäli PIN-koodi on 4 numeroinen, ajastin pysäytetään, asetetaan PIN-koodi talteen </w:t>
+                  </w:r>
+                  <w:proofErr w:type="spellStart"/>
+                  <w:proofErr w:type="gramStart"/>
+                  <w:r>
+                    <w:rPr>
+                      <w:rFonts w:ascii="Verdana" w:hAnsi="Verdana" w:cs="Verdana"/>
+                      <w:color w:val="000000" w:themeColor="text1"/>
+                      <w:sz w:val="20"/>
+                      <w:szCs w:val="20"/>
+                    </w:rPr>
+                    <w:t>setPin</w:t>
+                  </w:r>
+                  <w:proofErr w:type="spellEnd"/>
+                  <w:r>
+                    <w:rPr>
+                      <w:rFonts w:ascii="Verdana" w:hAnsi="Verdana" w:cs="Verdana"/>
+                      <w:color w:val="000000" w:themeColor="text1"/>
+                      <w:sz w:val="20"/>
+                      <w:szCs w:val="20"/>
+                    </w:rPr>
+                    <w:t>(</w:t>
+                  </w:r>
+                  <w:proofErr w:type="spellStart"/>
+                  <w:proofErr w:type="gramEnd"/>
+                  <w:r>
+                    <w:rPr>
+                      <w:rFonts w:ascii="Verdana" w:hAnsi="Verdana" w:cs="Verdana"/>
+                      <w:color w:val="000000" w:themeColor="text1"/>
+                      <w:sz w:val="20"/>
+                      <w:szCs w:val="20"/>
+                    </w:rPr>
+                    <w:t>QString</w:t>
+                  </w:r>
+                  <w:proofErr w:type="spellEnd"/>
+                  <w:r>
+                    <w:rPr>
+                      <w:rFonts w:ascii="Verdana" w:hAnsi="Verdana" w:cs="Verdana"/>
+                      <w:color w:val="000000" w:themeColor="text1"/>
+                      <w:sz w:val="20"/>
+                      <w:szCs w:val="20"/>
+                    </w:rPr>
+                    <w:t>)-funktiolla ja lähetetään HTTP pyyntö REST API palvelimelle.</w:t>
                   </w:r>
                 </w:p>
               </w:tc>
@@ -10077,6 +11117,7 @@
           <w:color w:val="FF0000"/>
         </w:rPr>
       </w:pPr>
+      <w:proofErr w:type="gramStart"/>
       <w:r>
         <w:rPr>
           <w:rFonts w:ascii="Verdana" w:hAnsi="Verdana"/>
@@ -10084,7 +11125,17 @@
           <w:iCs/>
           <w:color w:val="FF0000"/>
         </w:rPr>
-        <w:t>..s</w:t>
+        <w:t>..</w:t>
+      </w:r>
+      <w:proofErr w:type="gramEnd"/>
+      <w:r>
+        <w:rPr>
+          <w:rFonts w:ascii="Verdana" w:hAnsi="Verdana"/>
+          <w:i/>
+          <w:iCs/>
+          <w:color w:val="FF0000"/>
+        </w:rPr>
+        <w:t>s</w:t>
       </w:r>
       <w:r>
         <w:rPr>
@@ -16259,6 +17310,17 @@
 </file>
 
 <file path=customXml/item1.xml><?xml version="1.0" encoding="utf-8"?>
+<p:properties xmlns:p="http://schemas.microsoft.com/office/2006/metadata/properties" xmlns:xsi="http://www.w3.org/2001/XMLSchema-instance" xmlns:pc="http://schemas.microsoft.com/office/infopath/2007/PartnerControls">
+  <documentManagement>
+    <lcf76f155ced4ddcb4097134ff3c332f xmlns="d3831626-fde5-4fc8-acc5-9526b66ab2bb">
+      <Terms xmlns="http://schemas.microsoft.com/office/infopath/2007/PartnerControls"/>
+    </lcf76f155ced4ddcb4097134ff3c332f>
+    <TaxCatchAll xmlns="b5314b1c-0f5c-4851-9378-7099df4806ca" xsi:nil="true"/>
+  </documentManagement>
+</p:properties>
+</file>
+
+<file path=customXml/item2.xml><?xml version="1.0" encoding="utf-8"?>
 <ct:contentTypeSchema xmlns:ct="http://schemas.microsoft.com/office/2006/metadata/contentType" xmlns:ma="http://schemas.microsoft.com/office/2006/metadata/properties/metaAttributes" ct:_="" ma:_="" ma:contentTypeName="Document" ma:contentTypeID="0x0101009C12936ABBAE164AB3E3B1E737DB3796" ma:contentTypeVersion="12" ma:contentTypeDescription="Create a new document." ma:contentTypeScope="" ma:versionID="a3c7e968aca90f61141995ffe44e8398">
   <xsd:schema xmlns:xsd="http://www.w3.org/2001/XMLSchema" xmlns:xs="http://www.w3.org/2001/XMLSchema" xmlns:p="http://schemas.microsoft.com/office/2006/metadata/properties" xmlns:ns2="d3831626-fde5-4fc8-acc5-9526b66ab2bb" xmlns:ns3="b5314b1c-0f5c-4851-9378-7099df4806ca" targetNamespace="http://schemas.microsoft.com/office/2006/metadata/properties" ma:root="true" ma:fieldsID="87450be8a9b396dcd3e7509fc153b825" ns2:_="" ns3:_="">
     <xsd:import namespace="d3831626-fde5-4fc8-acc5-9526b66ab2bb"/>
@@ -16459,18 +17521,11 @@
 </ct:contentTypeSchema>
 </file>
 
-<file path=customXml/item2.xml><?xml version="1.0" encoding="utf-8"?>
-<p:properties xmlns:p="http://schemas.microsoft.com/office/2006/metadata/properties" xmlns:xsi="http://www.w3.org/2001/XMLSchema-instance" xmlns:pc="http://schemas.microsoft.com/office/infopath/2007/PartnerControls">
-  <documentManagement>
-    <lcf76f155ced4ddcb4097134ff3c332f xmlns="d3831626-fde5-4fc8-acc5-9526b66ab2bb">
-      <Terms xmlns="http://schemas.microsoft.com/office/infopath/2007/PartnerControls"/>
-    </lcf76f155ced4ddcb4097134ff3c332f>
-    <TaxCatchAll xmlns="b5314b1c-0f5c-4851-9378-7099df4806ca" xsi:nil="true"/>
-  </documentManagement>
-</p:properties>
+<file path=customXml/item3.xml><?xml version="1.0" encoding="utf-8"?>
+<b:Sources xmlns:b="http://schemas.openxmlformats.org/officeDocument/2006/bibliography" xmlns="http://schemas.openxmlformats.org/officeDocument/2006/bibliography" SelectedStyle="\APA.XSL" StyleName="APA"/>
 </file>
 
-<file path=customXml/item3.xml><?xml version="1.0" encoding="utf-8"?>
+<file path=customXml/item4.xml><?xml version="1.0" encoding="utf-8"?>
 <?mso-contentType ?>
 <FormTemplates xmlns="http://schemas.microsoft.com/sharepoint/v3/contenttype/forms">
   <Display>DocumentLibraryForm</Display>
@@ -16479,11 +17534,18 @@
 </FormTemplates>
 </file>
 
-<file path=customXml/item4.xml><?xml version="1.0" encoding="utf-8"?>
-<b:Sources xmlns:b="http://schemas.openxmlformats.org/officeDocument/2006/bibliography" xmlns="http://schemas.openxmlformats.org/officeDocument/2006/bibliography" SelectedStyle="\APA.XSL" StyleName="APA"/>
+<file path=customXml/itemProps1.xml><?xml version="1.0" encoding="utf-8"?>
+<ds:datastoreItem xmlns:ds="http://schemas.openxmlformats.org/officeDocument/2006/customXml" ds:itemID="{EE41A236-5C73-4451-B1B7-A171E48F7377}">
+  <ds:schemaRefs>
+    <ds:schemaRef ds:uri="http://schemas.microsoft.com/office/2006/metadata/properties"/>
+    <ds:schemaRef ds:uri="http://schemas.microsoft.com/office/infopath/2007/PartnerControls"/>
+    <ds:schemaRef ds:uri="d3831626-fde5-4fc8-acc5-9526b66ab2bb"/>
+    <ds:schemaRef ds:uri="b5314b1c-0f5c-4851-9378-7099df4806ca"/>
+  </ds:schemaRefs>
+</ds:datastoreItem>
 </file>
 
-<file path=customXml/itemProps1.xml><?xml version="1.0" encoding="utf-8"?>
+<file path=customXml/itemProps2.xml><?xml version="1.0" encoding="utf-8"?>
 <ds:datastoreItem xmlns:ds="http://schemas.openxmlformats.org/officeDocument/2006/customXml" ds:itemID="{3BB198E8-0F36-4C71-8940-04215BB7641E}">
   <ds:schemaRefs>
     <ds:schemaRef ds:uri="http://schemas.microsoft.com/office/2006/metadata/contentType"/>
@@ -16502,29 +17564,18 @@
 </ds:datastoreItem>
 </file>
 
-<file path=customXml/itemProps2.xml><?xml version="1.0" encoding="utf-8"?>
-<ds:datastoreItem xmlns:ds="http://schemas.openxmlformats.org/officeDocument/2006/customXml" ds:itemID="{EE41A236-5C73-4451-B1B7-A171E48F7377}">
+<file path=customXml/itemProps3.xml><?xml version="1.0" encoding="utf-8"?>
+<ds:datastoreItem xmlns:ds="http://schemas.openxmlformats.org/officeDocument/2006/customXml" ds:itemID="{2BA0B919-FBBB-4BB8-90D2-33E6A0B69F94}">
   <ds:schemaRefs>
-    <ds:schemaRef ds:uri="http://schemas.microsoft.com/office/2006/metadata/properties"/>
-    <ds:schemaRef ds:uri="http://schemas.microsoft.com/office/infopath/2007/PartnerControls"/>
-    <ds:schemaRef ds:uri="d3831626-fde5-4fc8-acc5-9526b66ab2bb"/>
-    <ds:schemaRef ds:uri="b5314b1c-0f5c-4851-9378-7099df4806ca"/>
+    <ds:schemaRef ds:uri="http://schemas.openxmlformats.org/officeDocument/2006/bibliography"/>
   </ds:schemaRefs>
 </ds:datastoreItem>
 </file>
 
-<file path=customXml/itemProps3.xml><?xml version="1.0" encoding="utf-8"?>
+<file path=customXml/itemProps4.xml><?xml version="1.0" encoding="utf-8"?>
 <ds:datastoreItem xmlns:ds="http://schemas.openxmlformats.org/officeDocument/2006/customXml" ds:itemID="{13DB4B30-73AF-4FCD-BA9E-CA11CB4B5807}">
   <ds:schemaRefs>
     <ds:schemaRef ds:uri="http://schemas.microsoft.com/sharepoint/v3/contenttype/forms"/>
   </ds:schemaRefs>
 </ds:datastoreItem>
-</file>
-
-<file path=customXml/itemProps4.xml><?xml version="1.0" encoding="utf-8"?>
-<ds:datastoreItem xmlns:ds="http://schemas.openxmlformats.org/officeDocument/2006/customXml" ds:itemID="{2BA0B919-FBBB-4BB8-90D2-33E6A0B69F94}">
-  <ds:schemaRefs>
-    <ds:schemaRef ds:uri="http://schemas.openxmlformats.org/officeDocument/2006/bibliography"/>
-  </ds:schemaRefs>
-</ds:datastoreItem>
 </file>
</xml_diff>

<commit_message>
Tekninen määrittely päivitetty ja PINWindowiin laitettu lineEdittiin password echomode.
</commit_message>
<xml_diff>
--- a/Documents/tekninen_maarittely.docx
+++ b/Documents/tekninen_maarittely.docx
@@ -321,7 +321,7 @@
                 <w:sz w:val="20"/>
                 <w:szCs w:val="20"/>
               </w:rPr>
-              <w:t>3</w:t>
+              <w:t>5</w:t>
             </w:r>
           </w:p>
         </w:tc>
@@ -514,34 +514,14 @@
                 <w:szCs w:val="20"/>
               </w:rPr>
             </w:pPr>
-            <w:proofErr w:type="spellStart"/>
-            <w:r>
-              <w:rPr>
-                <w:rFonts w:ascii="Verdana" w:hAnsi="Verdana" w:cs="Verdana"/>
-                <w:sz w:val="20"/>
-                <w:szCs w:val="20"/>
-              </w:rPr>
-              <w:t>Sander</w:t>
-            </w:r>
-            <w:proofErr w:type="spellEnd"/>
-            <w:r>
-              <w:rPr>
-                <w:rFonts w:ascii="Verdana" w:hAnsi="Verdana" w:cs="Verdana"/>
-                <w:sz w:val="20"/>
-                <w:szCs w:val="20"/>
-              </w:rPr>
-              <w:t xml:space="preserve"> </w:t>
-            </w:r>
-            <w:proofErr w:type="spellStart"/>
-            <w:r>
-              <w:rPr>
-                <w:rFonts w:ascii="Verdana" w:hAnsi="Verdana" w:cs="Verdana"/>
-                <w:sz w:val="20"/>
-                <w:szCs w:val="20"/>
-              </w:rPr>
-              <w:t>Vassel</w:t>
-            </w:r>
-            <w:proofErr w:type="spellEnd"/>
+            <w:r>
+              <w:rPr>
+                <w:rFonts w:ascii="Verdana" w:hAnsi="Verdana" w:cs="Verdana"/>
+                <w:sz w:val="20"/>
+                <w:szCs w:val="20"/>
+              </w:rPr>
+              <w:t>Sander Vassel</w:t>
+            </w:r>
           </w:p>
         </w:tc>
       </w:tr>
@@ -568,18 +548,8 @@
                 <w:sz w:val="20"/>
                 <w:szCs w:val="20"/>
               </w:rPr>
-              <w:t xml:space="preserve">Riku </w:t>
-            </w:r>
-            <w:proofErr w:type="spellStart"/>
-            <w:r>
-              <w:rPr>
-                <w:rFonts w:ascii="Verdana" w:hAnsi="Verdana" w:cs="Verdana"/>
-                <w:sz w:val="20"/>
-                <w:szCs w:val="20"/>
-              </w:rPr>
-              <w:t>Ängeslevä</w:t>
-            </w:r>
-            <w:proofErr w:type="spellEnd"/>
+              <w:t>Riku Ängeslevä</w:t>
+            </w:r>
           </w:p>
         </w:tc>
       </w:tr>
@@ -849,21 +819,7 @@
         <w:rPr>
           <w:rFonts w:ascii="Verdana" w:hAnsi="Verdana" w:cs="Verdana"/>
         </w:rPr>
-        <w:t xml:space="preserve"> Dokumentin tulee sisältää kuvaukset seuraavista: pankkiautomaattisovellus, mahdolliset </w:t>
-      </w:r>
-      <w:proofErr w:type="spellStart"/>
-      <w:r>
-        <w:rPr>
-          <w:rFonts w:ascii="Verdana" w:hAnsi="Verdana" w:cs="Verdana"/>
-        </w:rPr>
-        <w:t>DLL:t</w:t>
-      </w:r>
-      <w:proofErr w:type="spellEnd"/>
-      <w:r>
-        <w:rPr>
-          <w:rFonts w:ascii="Verdana" w:hAnsi="Verdana" w:cs="Verdana"/>
-        </w:rPr>
-        <w:t xml:space="preserve">, REST API, tietokanta </w:t>
+        <w:t xml:space="preserve"> Dokumentin tulee sisältää kuvaukset seuraavista: pankkiautomaattisovellus, mahdolliset DLL:t, REST API, tietokanta </w:t>
       </w:r>
       <w:r>
         <w:rPr>
@@ -1274,16 +1230,8 @@
         <w:rPr>
           <w:rFonts w:ascii="Verdana" w:hAnsi="Verdana"/>
         </w:rPr>
-        <w:t xml:space="preserve">Windows </w:t>
-      </w:r>
-      <w:proofErr w:type="spellStart"/>
-      <w:r>
-        <w:rPr>
-          <w:rFonts w:ascii="Verdana" w:hAnsi="Verdana"/>
-        </w:rPr>
-        <w:t>Defender</w:t>
-      </w:r>
-      <w:proofErr w:type="spellEnd"/>
+        <w:t>Windows Defender</w:t>
+      </w:r>
       <w:r>
         <w:rPr>
           <w:rFonts w:ascii="Verdana" w:hAnsi="Verdana"/>
@@ -1381,109 +1329,79 @@
         <w:rPr>
           <w:rFonts w:ascii="Verdana" w:hAnsi="Verdana"/>
         </w:rPr>
-        <w:t xml:space="preserve">pohjaisesta </w:t>
-      </w:r>
-      <w:proofErr w:type="gramStart"/>
+        <w:t>pohjaisesta pankkiautomaatti</w:t>
+      </w:r>
       <w:r>
         <w:rPr>
           <w:rFonts w:ascii="Verdana" w:hAnsi="Verdana"/>
         </w:rPr>
-        <w:t>pankkiautomaatti</w:t>
+        <w:t>-</w:t>
       </w:r>
       <w:r>
         <w:rPr>
           <w:rFonts w:ascii="Verdana" w:hAnsi="Verdana"/>
         </w:rPr>
-        <w:t>-</w:t>
+        <w:t>sovelluksesta</w:t>
       </w:r>
       <w:r>
         <w:rPr>
           <w:rFonts w:ascii="Verdana" w:hAnsi="Verdana"/>
         </w:rPr>
-        <w:t>sovelluksesta</w:t>
-      </w:r>
-      <w:proofErr w:type="gramEnd"/>
+        <w:t xml:space="preserve"> (</w:t>
+      </w:r>
       <w:r>
         <w:rPr>
           <w:rFonts w:ascii="Verdana" w:hAnsi="Verdana"/>
         </w:rPr>
-        <w:t xml:space="preserve"> (</w:t>
+        <w:t>ns. EXE</w:t>
       </w:r>
       <w:r>
         <w:rPr>
           <w:rFonts w:ascii="Verdana" w:hAnsi="Verdana"/>
         </w:rPr>
-        <w:t>ns. EXE</w:t>
+        <w:t>-komponent</w:t>
       </w:r>
       <w:r>
         <w:rPr>
           <w:rFonts w:ascii="Verdana" w:hAnsi="Verdana"/>
         </w:rPr>
-        <w:t>-komponent</w:t>
+        <w:t>ti)</w:t>
       </w:r>
       <w:r>
         <w:rPr>
           <w:rFonts w:ascii="Verdana" w:hAnsi="Verdana"/>
         </w:rPr>
-        <w:t>ti)</w:t>
+        <w:t>,</w:t>
       </w:r>
       <w:r>
         <w:rPr>
           <w:rFonts w:ascii="Verdana" w:hAnsi="Verdana"/>
         </w:rPr>
-        <w:t>,</w:t>
+        <w:t xml:space="preserve"> j</w:t>
       </w:r>
       <w:r>
         <w:rPr>
           <w:rFonts w:ascii="Verdana" w:hAnsi="Verdana"/>
         </w:rPr>
-        <w:t xml:space="preserve"> j</w:t>
+        <w:t xml:space="preserve">oka hyödyntää osassa toiminnallisuuksia ajonaikaisesti ladattavia kirjastokomponentteja (DLL-komponentit). Nämä </w:t>
       </w:r>
       <w:r>
         <w:rPr>
           <w:rFonts w:ascii="Verdana" w:hAnsi="Verdana"/>
         </w:rPr>
-        <w:t xml:space="preserve">oka hyödyntää osassa toiminnallisuuksia ajonaikaisesti ladattavia kirjastokomponentteja (DLL-komponentit). Nämä </w:t>
+        <w:t>ohjelmisto</w:t>
       </w:r>
       <w:r>
         <w:rPr>
           <w:rFonts w:ascii="Verdana" w:hAnsi="Verdana"/>
         </w:rPr>
-        <w:t>ohjelmisto</w:t>
+        <w:t xml:space="preserve">komponentit toteutaaan </w:t>
       </w:r>
       <w:r>
         <w:rPr>
           <w:rFonts w:ascii="Verdana" w:hAnsi="Verdana"/>
         </w:rPr>
-        <w:t xml:space="preserve">komponentit </w:t>
-      </w:r>
-      <w:proofErr w:type="spellStart"/>
-      <w:r>
-        <w:rPr>
-          <w:rFonts w:ascii="Verdana" w:hAnsi="Verdana"/>
-        </w:rPr>
-        <w:t>toteutaaan</w:t>
-      </w:r>
-      <w:proofErr w:type="spellEnd"/>
-      <w:r>
-        <w:rPr>
-          <w:rFonts w:ascii="Verdana" w:hAnsi="Verdana"/>
-        </w:rPr>
-        <w:t xml:space="preserve"> </w:t>
-      </w:r>
-      <w:proofErr w:type="spellStart"/>
-      <w:r>
-        <w:rPr>
-          <w:rFonts w:ascii="Verdana" w:hAnsi="Verdana"/>
-        </w:rPr>
-        <w:t>Qt</w:t>
-      </w:r>
-      <w:proofErr w:type="spellEnd"/>
-      <w:r>
-        <w:rPr>
-          <w:rFonts w:ascii="Verdana" w:hAnsi="Verdana"/>
-        </w:rPr>
-        <w:t>-</w:t>
+        <w:t>Qt-</w:t>
       </w:r>
       <w:r>
         <w:rPr>
@@ -1508,21 +1426,7 @@
         <w:rPr>
           <w:rFonts w:ascii="Verdana" w:hAnsi="Verdana"/>
         </w:rPr>
-        <w:t xml:space="preserve">hyödyntäen </w:t>
-      </w:r>
-      <w:proofErr w:type="spellStart"/>
-      <w:r>
-        <w:rPr>
-          <w:rFonts w:ascii="Verdana" w:hAnsi="Verdana"/>
-        </w:rPr>
-        <w:t>Qt</w:t>
-      </w:r>
-      <w:proofErr w:type="spellEnd"/>
-      <w:r>
-        <w:rPr>
-          <w:rFonts w:ascii="Verdana" w:hAnsi="Verdana"/>
-        </w:rPr>
-        <w:t xml:space="preserve">-luokkakirjaston </w:t>
+        <w:t xml:space="preserve">hyödyntäen Qt-luokkakirjaston </w:t>
       </w:r>
       <w:r>
         <w:rPr>
@@ -1655,14 +1559,12 @@
         </w:rPr>
         <w:t xml:space="preserve">Tietokannan vaatima palvelinohjelma perustuu </w:t>
       </w:r>
-      <w:proofErr w:type="spellStart"/>
       <w:r>
         <w:rPr>
           <w:rFonts w:ascii="Verdana" w:hAnsi="Verdana"/>
         </w:rPr>
         <w:t>MariaDB</w:t>
       </w:r>
-      <w:proofErr w:type="spellEnd"/>
       <w:r>
         <w:rPr>
           <w:rFonts w:ascii="Verdana" w:hAnsi="Verdana"/>
@@ -1738,23 +1640,7 @@
           <w:rFonts w:ascii="Verdana" w:hAnsi="Verdana" w:cs="Verdana"/>
           <w:szCs w:val="20"/>
         </w:rPr>
-        <w:t xml:space="preserve"> toteutuksessa voidaan </w:t>
-      </w:r>
-      <w:proofErr w:type="gramStart"/>
-      <w:r>
-        <w:rPr>
-          <w:rFonts w:ascii="Verdana" w:hAnsi="Verdana" w:cs="Verdana"/>
-          <w:szCs w:val="20"/>
-        </w:rPr>
-        <w:t>vaatimuksista riippuen</w:t>
-      </w:r>
-      <w:proofErr w:type="gramEnd"/>
-      <w:r>
-        <w:rPr>
-          <w:rFonts w:ascii="Verdana" w:hAnsi="Verdana" w:cs="Verdana"/>
-          <w:szCs w:val="20"/>
-        </w:rPr>
-        <w:t xml:space="preserve"> myös käyttää </w:t>
+        <w:t xml:space="preserve"> toteutuksessa voidaan vaatimuksista riippuen myös käyttää </w:t>
       </w:r>
       <w:r>
         <w:rPr>
@@ -2676,16 +2562,12 @@
         </w:rPr>
         <w:t xml:space="preserve">pauskaavio on </w:t>
       </w:r>
-      <w:proofErr w:type="spellStart"/>
-      <w:proofErr w:type="gramStart"/>
       <w:r>
         <w:rPr>
           <w:rFonts w:ascii="Verdana" w:hAnsi="Verdana" w:cs="Verdana"/>
         </w:rPr>
         <w:t>allaolevan</w:t>
       </w:r>
-      <w:proofErr w:type="spellEnd"/>
-      <w:proofErr w:type="gramEnd"/>
       <w:r>
         <w:rPr>
           <w:rFonts w:ascii="Verdana" w:hAnsi="Verdana" w:cs="Verdana"/>
@@ -4808,25 +4690,7 @@
                 <w:sz w:val="20"/>
                 <w:szCs w:val="20"/>
               </w:rPr>
-              <w:t xml:space="preserve">Kirjauduttu pankkiautomaatin </w:t>
-            </w:r>
-            <w:proofErr w:type="gramStart"/>
-            <w:r>
-              <w:rPr>
-                <w:rFonts w:ascii="Verdana" w:hAnsi="Verdana" w:cs="Verdana"/>
-                <w:sz w:val="20"/>
-                <w:szCs w:val="20"/>
-              </w:rPr>
-              <w:t>käyttäjäksi,  yhteys</w:t>
-            </w:r>
-            <w:proofErr w:type="gramEnd"/>
-            <w:r>
-              <w:rPr>
-                <w:rFonts w:ascii="Verdana" w:hAnsi="Verdana" w:cs="Verdana"/>
-                <w:sz w:val="20"/>
-                <w:szCs w:val="20"/>
-              </w:rPr>
-              <w:t xml:space="preserve"> </w:t>
+              <w:t xml:space="preserve">Kirjauduttu pankkiautomaatin käyttäjäksi,  yhteys </w:t>
             </w:r>
             <w:r>
               <w:rPr>
@@ -5150,25 +5014,7 @@
                 <w:sz w:val="20"/>
                 <w:szCs w:val="20"/>
               </w:rPr>
-              <w:t xml:space="preserve"> on näytetty oikein, </w:t>
-            </w:r>
-            <w:proofErr w:type="gramStart"/>
-            <w:r>
-              <w:rPr>
-                <w:rFonts w:ascii="Verdana" w:hAnsi="Verdana" w:cs="Verdana"/>
-                <w:sz w:val="20"/>
-                <w:szCs w:val="20"/>
-              </w:rPr>
-              <w:t>ja  tilitapahtumia</w:t>
-            </w:r>
-            <w:proofErr w:type="gramEnd"/>
-            <w:r>
-              <w:rPr>
-                <w:rFonts w:ascii="Verdana" w:hAnsi="Verdana" w:cs="Verdana"/>
-                <w:sz w:val="20"/>
-                <w:szCs w:val="20"/>
-              </w:rPr>
-              <w:t xml:space="preserve"> voidaan selata.</w:t>
+              <w:t xml:space="preserve"> on näytetty oikein, ja  tilitapahtumia voidaan selata.</w:t>
             </w:r>
           </w:p>
         </w:tc>
@@ -5786,25 +5632,7 @@
                 <w:sz w:val="20"/>
                 <w:szCs w:val="20"/>
               </w:rPr>
-              <w:t xml:space="preserve">Käyttäjä on saanut nostetuksi haluamansa summan </w:t>
-            </w:r>
-            <w:proofErr w:type="gramStart"/>
-            <w:r>
-              <w:rPr>
-                <w:rFonts w:ascii="Verdana" w:hAnsi="Verdana" w:cs="Verdana"/>
-                <w:sz w:val="20"/>
-                <w:szCs w:val="20"/>
-              </w:rPr>
-              <w:t>rahaa</w:t>
-            </w:r>
-            <w:proofErr w:type="gramEnd"/>
-            <w:r>
-              <w:rPr>
-                <w:rFonts w:ascii="Verdana" w:hAnsi="Verdana" w:cs="Verdana"/>
-                <w:sz w:val="20"/>
-                <w:szCs w:val="20"/>
-              </w:rPr>
-              <w:t xml:space="preserve"> ja rahamäärä on veloitettu käyttäjän tilitä.</w:t>
+              <w:t>Käyttäjä on saanut nostetuksi haluamansa summan rahaa ja rahamäärä on veloitettu käyttäjän tilitä.</w:t>
             </w:r>
           </w:p>
         </w:tc>
@@ -6114,25 +5942,7 @@
                 <w:sz w:val="20"/>
                 <w:szCs w:val="20"/>
               </w:rPr>
-              <w:t xml:space="preserve">Kirjauduttu pankkiautomaatin </w:t>
-            </w:r>
-            <w:proofErr w:type="gramStart"/>
-            <w:r>
-              <w:rPr>
-                <w:rFonts w:ascii="Verdana" w:hAnsi="Verdana" w:cs="Verdana"/>
-                <w:sz w:val="20"/>
-                <w:szCs w:val="20"/>
-              </w:rPr>
-              <w:t>käyttäjäksi,  yhteys</w:t>
-            </w:r>
-            <w:proofErr w:type="gramEnd"/>
-            <w:r>
-              <w:rPr>
-                <w:rFonts w:ascii="Verdana" w:hAnsi="Verdana" w:cs="Verdana"/>
-                <w:sz w:val="20"/>
-                <w:szCs w:val="20"/>
-              </w:rPr>
-              <w:t xml:space="preserve"> </w:t>
+              <w:t xml:space="preserve">Kirjauduttu pankkiautomaatin käyttäjäksi,  yhteys </w:t>
             </w:r>
             <w:r>
               <w:rPr>
@@ -6909,7 +6719,6 @@
         </w:rPr>
         <w:t xml:space="preserve">Tässä kuvataan </w:t>
       </w:r>
-      <w:proofErr w:type="spellStart"/>
       <w:r>
         <w:rPr>
           <w:rFonts w:ascii="Verdana" w:hAnsi="Verdana"/>
@@ -6924,7 +6733,6 @@
         </w:rPr>
         <w:t>ohjelman</w:t>
       </w:r>
-      <w:proofErr w:type="spellEnd"/>
       <w:r>
         <w:rPr>
           <w:rFonts w:ascii="Verdana" w:hAnsi="Verdana"/>
@@ -7072,30 +6880,8 @@
         <w:rPr>
           <w:rFonts w:ascii="Verdana" w:hAnsi="Verdana" w:cs="Verdana"/>
         </w:rPr>
-        <w:t xml:space="preserve">Asiakkaalla voi olla monta tiliä tyyppiä </w:t>
-      </w:r>
-      <w:proofErr w:type="spellStart"/>
-      <w:r>
-        <w:rPr>
-          <w:rFonts w:ascii="Verdana" w:hAnsi="Verdana" w:cs="Verdana"/>
-        </w:rPr>
-        <w:t>debit</w:t>
-      </w:r>
-      <w:proofErr w:type="spellEnd"/>
-      <w:r>
-        <w:rPr>
-          <w:rFonts w:ascii="Verdana" w:hAnsi="Verdana" w:cs="Verdana"/>
-        </w:rPr>
-        <w:t xml:space="preserve"> tai </w:t>
-      </w:r>
-      <w:proofErr w:type="spellStart"/>
-      <w:r>
-        <w:rPr>
-          <w:rFonts w:ascii="Verdana" w:hAnsi="Verdana" w:cs="Verdana"/>
-        </w:rPr>
-        <w:t>credit</w:t>
-      </w:r>
-      <w:proofErr w:type="spellEnd"/>
+        <w:t>Asiakkaalla voi olla monta tiliä tyyppiä debit tai credit</w:t>
+      </w:r>
     </w:p>
     <w:p>
       <w:pPr>
@@ -7148,35 +6934,7 @@
         <w:rPr>
           <w:rFonts w:ascii="Verdana" w:hAnsi="Verdana" w:cs="Verdana"/>
         </w:rPr>
-        <w:t xml:space="preserve">Kortin tyyppejä on kolme: </w:t>
-      </w:r>
-      <w:proofErr w:type="spellStart"/>
-      <w:r>
-        <w:rPr>
-          <w:rFonts w:ascii="Verdana" w:hAnsi="Verdana" w:cs="Verdana"/>
-        </w:rPr>
-        <w:t>debit</w:t>
-      </w:r>
-      <w:proofErr w:type="spellEnd"/>
-      <w:r>
-        <w:rPr>
-          <w:rFonts w:ascii="Verdana" w:hAnsi="Verdana" w:cs="Verdana"/>
-        </w:rPr>
-        <w:t xml:space="preserve">, </w:t>
-      </w:r>
-      <w:proofErr w:type="spellStart"/>
-      <w:r>
-        <w:rPr>
-          <w:rFonts w:ascii="Verdana" w:hAnsi="Verdana" w:cs="Verdana"/>
-        </w:rPr>
-        <w:t>credit</w:t>
-      </w:r>
-      <w:proofErr w:type="spellEnd"/>
-      <w:r>
-        <w:rPr>
-          <w:rFonts w:ascii="Verdana" w:hAnsi="Verdana" w:cs="Verdana"/>
-        </w:rPr>
-        <w:t>, kaksoiskortti</w:t>
+        <w:t>Kortin tyyppejä on kolme: debit, credit, kaksoiskortti</w:t>
       </w:r>
     </w:p>
     <w:p>
@@ -7194,35 +6952,7 @@
         <w:rPr>
           <w:rFonts w:ascii="Verdana" w:hAnsi="Verdana" w:cs="Verdana"/>
         </w:rPr>
-        <w:t xml:space="preserve">Yksi kortti voidaan liittää useaan tiliin (tämä tarkoittaa käytännössä, että kaksoiskortti voidaan liittää yhteen </w:t>
-      </w:r>
-      <w:proofErr w:type="spellStart"/>
-      <w:r>
-        <w:rPr>
-          <w:rFonts w:ascii="Verdana" w:hAnsi="Verdana" w:cs="Verdana"/>
-        </w:rPr>
-        <w:t>debit</w:t>
-      </w:r>
-      <w:proofErr w:type="spellEnd"/>
-      <w:r>
-        <w:rPr>
-          <w:rFonts w:ascii="Verdana" w:hAnsi="Verdana" w:cs="Verdana"/>
-        </w:rPr>
-        <w:t xml:space="preserve">-tiliin ja yhteen </w:t>
-      </w:r>
-      <w:proofErr w:type="spellStart"/>
-      <w:r>
-        <w:rPr>
-          <w:rFonts w:ascii="Verdana" w:hAnsi="Verdana" w:cs="Verdana"/>
-        </w:rPr>
-        <w:t>credit</w:t>
-      </w:r>
-      <w:proofErr w:type="spellEnd"/>
-      <w:r>
-        <w:rPr>
-          <w:rFonts w:ascii="Verdana" w:hAnsi="Verdana" w:cs="Verdana"/>
-        </w:rPr>
-        <w:t>-tiliin)</w:t>
+        <w:t>Yksi kortti voidaan liittää useaan tiliin (tämä tarkoittaa käytännössä, että kaksoiskortti voidaan liittää yhteen debit-tiliin ja yhteen credit-tiliin)</w:t>
       </w:r>
     </w:p>
     <w:p>
@@ -8157,23 +7887,7 @@
           <w:rFonts w:ascii="Verdana" w:hAnsi="Verdana" w:cs="Verdana"/>
           <w:szCs w:val="20"/>
         </w:rPr>
-        <w:t xml:space="preserve"> </w:t>
-      </w:r>
-      <w:proofErr w:type="gramStart"/>
-      <w:r>
-        <w:rPr>
-          <w:rFonts w:ascii="Verdana" w:hAnsi="Verdana" w:cs="Verdana"/>
-          <w:szCs w:val="20"/>
-        </w:rPr>
-        <w:t>kuvataan miten järjestelmäkomponentit toteutetaan</w:t>
-      </w:r>
-      <w:proofErr w:type="gramEnd"/>
-      <w:r>
-        <w:rPr>
-          <w:rFonts w:ascii="Verdana" w:hAnsi="Verdana" w:cs="Verdana"/>
-          <w:szCs w:val="20"/>
-        </w:rPr>
-        <w:t xml:space="preserve"> ohjelmistokomponentt</w:t>
+        <w:t xml:space="preserve"> kuvataan miten järjestelmäkomponentit toteutetaan ohjelmistokomponentt</w:t>
       </w:r>
       <w:r>
         <w:rPr>
@@ -8506,9 +8220,8 @@
                 <w:sz w:val="20"/>
                 <w:szCs w:val="20"/>
               </w:rPr>
-              <w:t xml:space="preserve">Käyttöliittymä komponentti, joka kommunikoi REST API </w:t>
-            </w:r>
-            <w:proofErr w:type="spellStart"/>
+              <w:t xml:space="preserve">Käyttöliittymä komponentti, joka kommunikoi REST API backendin kanssa. Tämä komponentti toimii osana </w:t>
+            </w:r>
             <w:r>
               <w:rPr>
                 <w:rFonts w:ascii="Verdana" w:hAnsi="Verdana" w:cs="Verdana"/>
@@ -8518,9 +8231,8 @@
                 <w:sz w:val="20"/>
                 <w:szCs w:val="20"/>
               </w:rPr>
-              <w:t>backendin</w:t>
-            </w:r>
-            <w:proofErr w:type="spellEnd"/>
+              <w:t xml:space="preserve">pankkiautomaatti </w:t>
+            </w:r>
             <w:r>
               <w:rPr>
                 <w:rFonts w:ascii="Verdana" w:hAnsi="Verdana" w:cs="Verdana"/>
@@ -8530,53 +8242,7 @@
                 <w:sz w:val="20"/>
                 <w:szCs w:val="20"/>
               </w:rPr>
-              <w:t xml:space="preserve"> kanssa. Tämä komponentti toimii osana </w:t>
-            </w:r>
-            <w:r>
-              <w:rPr>
-                <w:rFonts w:ascii="Verdana" w:hAnsi="Verdana" w:cs="Verdana"/>
-                <w:i/>
-                <w:iCs/>
-                <w:color w:val="000000" w:themeColor="text1"/>
-                <w:sz w:val="20"/>
-                <w:szCs w:val="20"/>
-              </w:rPr>
-              <w:t xml:space="preserve">pankkiautomaatti </w:t>
-            </w:r>
-            <w:r>
-              <w:rPr>
-                <w:rFonts w:ascii="Verdana" w:hAnsi="Verdana" w:cs="Verdana"/>
-                <w:i/>
-                <w:iCs/>
-                <w:color w:val="000000" w:themeColor="text1"/>
-                <w:sz w:val="20"/>
-                <w:szCs w:val="20"/>
-              </w:rPr>
-              <w:t xml:space="preserve">asiakassovellusta. Komponentti on </w:t>
-            </w:r>
-            <w:proofErr w:type="spellStart"/>
-            <w:r>
-              <w:rPr>
-                <w:rFonts w:ascii="Verdana" w:hAnsi="Verdana" w:cs="Verdana"/>
-                <w:i/>
-                <w:iCs/>
-                <w:color w:val="000000" w:themeColor="text1"/>
-                <w:sz w:val="20"/>
-                <w:szCs w:val="20"/>
-              </w:rPr>
-              <w:t>Qt</w:t>
-            </w:r>
-            <w:proofErr w:type="spellEnd"/>
-            <w:r>
-              <w:rPr>
-                <w:rFonts w:ascii="Verdana" w:hAnsi="Verdana" w:cs="Verdana"/>
-                <w:i/>
-                <w:iCs/>
-                <w:color w:val="000000" w:themeColor="text1"/>
-                <w:sz w:val="20"/>
-                <w:szCs w:val="20"/>
-              </w:rPr>
-              <w:t>-pohjainen.</w:t>
+              <w:t>asiakassovellusta. Komponentti on Qt-pohjainen.</w:t>
             </w:r>
             <w:r>
               <w:rPr>
@@ -8760,31 +8426,7 @@
                 <w:sz w:val="20"/>
                 <w:szCs w:val="20"/>
               </w:rPr>
-              <w:t xml:space="preserve">Funktiot mitä tarjoaa muille / signaalit mitä komponentti vastaanottaa tai lähettää muille. (ryhmän itse toteuttamat, ei </w:t>
-            </w:r>
-            <w:proofErr w:type="spellStart"/>
-            <w:r>
-              <w:rPr>
-                <w:rFonts w:ascii="Verdana" w:hAnsi="Verdana" w:cs="Verdana"/>
-                <w:i/>
-                <w:iCs/>
-                <w:color w:val="000000" w:themeColor="text1"/>
-                <w:sz w:val="20"/>
-                <w:szCs w:val="20"/>
-              </w:rPr>
-              <w:t>Qt:n</w:t>
-            </w:r>
-            <w:proofErr w:type="spellEnd"/>
-            <w:r>
-              <w:rPr>
-                <w:rFonts w:ascii="Verdana" w:hAnsi="Verdana" w:cs="Verdana"/>
-                <w:i/>
-                <w:iCs/>
-                <w:color w:val="000000" w:themeColor="text1"/>
-                <w:sz w:val="20"/>
-                <w:szCs w:val="20"/>
-              </w:rPr>
-              <w:t xml:space="preserve"> sisäisiä.)</w:t>
+              <w:t>Funktiot mitä tarjoaa muille / signaalit mitä komponentti vastaanottaa tai lähettää muille. (ryhmän itse toteuttamat, ei Qt:n sisäisiä.)</w:t>
             </w:r>
           </w:p>
           <w:tbl>
@@ -8875,79 +8517,13 @@
                       <w:szCs w:val="20"/>
                     </w:rPr>
                   </w:pPr>
-                  <w:proofErr w:type="spellStart"/>
-                  <w:proofErr w:type="gramStart"/>
                   <w:r>
                     <w:rPr>
                       <w:rFonts w:ascii="Verdana" w:hAnsi="Verdana" w:cs="Verdana"/>
                       <w:sz w:val="20"/>
                       <w:szCs w:val="20"/>
                     </w:rPr>
-                    <w:t>setToken</w:t>
-                  </w:r>
-                  <w:proofErr w:type="spellEnd"/>
-                  <w:r>
-                    <w:rPr>
-                      <w:rFonts w:ascii="Verdana" w:hAnsi="Verdana" w:cs="Verdana"/>
-                      <w:sz w:val="20"/>
-                      <w:szCs w:val="20"/>
-                    </w:rPr>
-                    <w:t>(</w:t>
-                  </w:r>
-                  <w:proofErr w:type="spellStart"/>
-                  <w:proofErr w:type="gramEnd"/>
-                  <w:r>
-                    <w:rPr>
-                      <w:rFonts w:ascii="Verdana" w:hAnsi="Verdana" w:cs="Verdana"/>
-                      <w:sz w:val="20"/>
-                      <w:szCs w:val="20"/>
-                    </w:rPr>
-                    <w:t>const</w:t>
-                  </w:r>
-                  <w:proofErr w:type="spellEnd"/>
-                  <w:r>
-                    <w:rPr>
-                      <w:rFonts w:ascii="Verdana" w:hAnsi="Verdana" w:cs="Verdana"/>
-                      <w:sz w:val="20"/>
-                      <w:szCs w:val="20"/>
-                    </w:rPr>
-                    <w:t xml:space="preserve"> </w:t>
-                  </w:r>
-                  <w:proofErr w:type="spellStart"/>
-                  <w:r>
-                    <w:rPr>
-                      <w:rFonts w:ascii="Verdana" w:hAnsi="Verdana" w:cs="Verdana"/>
-                      <w:sz w:val="20"/>
-                      <w:szCs w:val="20"/>
-                    </w:rPr>
-                    <w:t>QString</w:t>
-                  </w:r>
-                  <w:proofErr w:type="spellEnd"/>
-                  <w:r>
-                    <w:rPr>
-                      <w:rFonts w:ascii="Verdana" w:hAnsi="Verdana" w:cs="Verdana"/>
-                      <w:sz w:val="20"/>
-                      <w:szCs w:val="20"/>
-                    </w:rPr>
-                    <w:t xml:space="preserve"> &amp;</w:t>
-                  </w:r>
-                  <w:proofErr w:type="spellStart"/>
-                  <w:r>
-                    <w:rPr>
-                      <w:rFonts w:ascii="Verdana" w:hAnsi="Verdana" w:cs="Verdana"/>
-                      <w:sz w:val="20"/>
-                      <w:szCs w:val="20"/>
-                    </w:rPr>
-                    <w:t>newToken</w:t>
-                  </w:r>
-                  <w:proofErr w:type="spellEnd"/>
-                  <w:r>
-                    <w:rPr>
-                      <w:rFonts w:ascii="Verdana" w:hAnsi="Verdana" w:cs="Verdana"/>
-                      <w:sz w:val="20"/>
-                      <w:szCs w:val="20"/>
-                    </w:rPr>
-                    <w:t>)</w:t>
+                    <w:t>setToken(const QString &amp;newToken)</w:t>
                   </w:r>
                 </w:p>
               </w:tc>
@@ -8994,8 +8570,6 @@
                       <w:szCs w:val="20"/>
                     </w:rPr>
                   </w:pPr>
-                  <w:proofErr w:type="spellStart"/>
-                  <w:proofErr w:type="gramStart"/>
                   <w:r>
                     <w:rPr>
                       <w:rFonts w:ascii="Verdana" w:hAnsi="Verdana" w:cs="Verdana"/>
@@ -9003,58 +8577,7 @@
                       <w:sz w:val="20"/>
                       <w:szCs w:val="20"/>
                     </w:rPr>
-                    <w:t>setIdtili</w:t>
-                  </w:r>
-                  <w:proofErr w:type="spellEnd"/>
-                  <w:r>
-                    <w:rPr>
-                      <w:rFonts w:ascii="Verdana" w:hAnsi="Verdana" w:cs="Verdana"/>
-                      <w:color w:val="000000" w:themeColor="text1"/>
-                      <w:sz w:val="20"/>
-                      <w:szCs w:val="20"/>
-                    </w:rPr>
-                    <w:t>(</w:t>
-                  </w:r>
-                  <w:proofErr w:type="spellStart"/>
-                  <w:proofErr w:type="gramEnd"/>
-                  <w:r>
-                    <w:rPr>
-                      <w:rFonts w:ascii="Verdana" w:hAnsi="Verdana" w:cs="Verdana"/>
-                      <w:color w:val="000000" w:themeColor="text1"/>
-                      <w:sz w:val="20"/>
-                      <w:szCs w:val="20"/>
-                    </w:rPr>
-                    <w:t>int</w:t>
-                  </w:r>
-                  <w:proofErr w:type="spellEnd"/>
-                  <w:r>
-                    <w:rPr>
-                      <w:rFonts w:ascii="Verdana" w:hAnsi="Verdana" w:cs="Verdana"/>
-                      <w:color w:val="000000" w:themeColor="text1"/>
-                      <w:sz w:val="20"/>
-                      <w:szCs w:val="20"/>
-                    </w:rPr>
-                    <w:t xml:space="preserve"> </w:t>
-                  </w:r>
-                  <w:proofErr w:type="spellStart"/>
-                  <w:r>
-                    <w:rPr>
-                      <w:rFonts w:ascii="Verdana" w:hAnsi="Verdana" w:cs="Verdana"/>
-                      <w:color w:val="000000" w:themeColor="text1"/>
-                      <w:sz w:val="20"/>
-                      <w:szCs w:val="20"/>
-                    </w:rPr>
-                    <w:t>newIdTili</w:t>
-                  </w:r>
-                  <w:proofErr w:type="spellEnd"/>
-                  <w:r>
-                    <w:rPr>
-                      <w:rFonts w:ascii="Verdana" w:hAnsi="Verdana" w:cs="Verdana"/>
-                      <w:color w:val="000000" w:themeColor="text1"/>
-                      <w:sz w:val="20"/>
-                      <w:szCs w:val="20"/>
-                    </w:rPr>
-                    <w:t>)</w:t>
+                    <w:t>setIdtili(int newIdTili)</w:t>
                   </w:r>
                 </w:p>
               </w:tc>
@@ -9103,8 +8626,6 @@
                       <w:szCs w:val="20"/>
                     </w:rPr>
                   </w:pPr>
-                  <w:proofErr w:type="spellStart"/>
-                  <w:proofErr w:type="gramStart"/>
                   <w:r>
                     <w:rPr>
                       <w:rFonts w:ascii="Verdana" w:hAnsi="Verdana" w:cs="Verdana"/>
@@ -9112,39 +8633,8 @@
                       <w:sz w:val="20"/>
                       <w:szCs w:val="20"/>
                     </w:rPr>
-                    <w:t>getIdtili</w:t>
+                    <w:t>getIdtili() const</w:t>
                   </w:r>
-                  <w:proofErr w:type="spellEnd"/>
-                  <w:r>
-                    <w:rPr>
-                      <w:rFonts w:ascii="Verdana" w:hAnsi="Verdana" w:cs="Verdana"/>
-                      <w:color w:val="000000" w:themeColor="text1"/>
-                      <w:sz w:val="20"/>
-                      <w:szCs w:val="20"/>
-                    </w:rPr>
-                    <w:t>(</w:t>
-                  </w:r>
-                  <w:proofErr w:type="gramEnd"/>
-                  <w:r>
-                    <w:rPr>
-                      <w:rFonts w:ascii="Verdana" w:hAnsi="Verdana" w:cs="Verdana"/>
-                      <w:color w:val="000000" w:themeColor="text1"/>
-                      <w:sz w:val="20"/>
-                      <w:szCs w:val="20"/>
-                    </w:rPr>
-                    <w:t xml:space="preserve">) </w:t>
-                  </w:r>
-                  <w:proofErr w:type="spellStart"/>
-                  <w:r>
-                    <w:rPr>
-                      <w:rFonts w:ascii="Verdana" w:hAnsi="Verdana" w:cs="Verdana"/>
-                      <w:color w:val="000000" w:themeColor="text1"/>
-                      <w:sz w:val="20"/>
-                      <w:szCs w:val="20"/>
-                    </w:rPr>
-                    <w:t>const</w:t>
-                  </w:r>
-                  <w:proofErr w:type="spellEnd"/>
                 </w:p>
               </w:tc>
               <w:tc>
@@ -9170,27 +8660,7 @@
                       <w:sz w:val="20"/>
                       <w:szCs w:val="20"/>
                     </w:rPr>
-                    <w:t xml:space="preserve">Asetetun tilin </w:t>
-                  </w:r>
-                  <w:proofErr w:type="spellStart"/>
-                  <w:r>
-                    <w:rPr>
-                      <w:rFonts w:ascii="Verdana" w:hAnsi="Verdana" w:cs="Verdana"/>
-                      <w:color w:val="000000" w:themeColor="text1"/>
-                      <w:sz w:val="20"/>
-                      <w:szCs w:val="20"/>
-                    </w:rPr>
-                    <w:t>ID:n</w:t>
-                  </w:r>
-                  <w:proofErr w:type="spellEnd"/>
-                  <w:r>
-                    <w:rPr>
-                      <w:rFonts w:ascii="Verdana" w:hAnsi="Verdana" w:cs="Verdana"/>
-                      <w:color w:val="000000" w:themeColor="text1"/>
-                      <w:sz w:val="20"/>
-                      <w:szCs w:val="20"/>
-                    </w:rPr>
-                    <w:t xml:space="preserve"> palauttaminen.</w:t>
+                    <w:t>Asetetun tilin ID:n palauttaminen.</w:t>
                   </w:r>
                 </w:p>
               </w:tc>
@@ -9265,7 +8735,6 @@
                 <w:szCs w:val="20"/>
               </w:rPr>
             </w:pPr>
-            <w:proofErr w:type="spellStart"/>
             <w:r>
               <w:rPr>
                 <w:rFonts w:ascii="Verdana" w:hAnsi="Verdana" w:cs="Verdana"/>
@@ -9275,33 +8744,8 @@
                 <w:sz w:val="20"/>
                 <w:szCs w:val="20"/>
               </w:rPr>
-              <w:t>Sander</w:t>
-            </w:r>
-            <w:proofErr w:type="spellEnd"/>
-            <w:r>
-              <w:rPr>
-                <w:rFonts w:ascii="Verdana" w:hAnsi="Verdana" w:cs="Verdana"/>
-                <w:i/>
-                <w:iCs/>
-                <w:color w:val="000000" w:themeColor="text1"/>
-                <w:sz w:val="20"/>
-                <w:szCs w:val="20"/>
-              </w:rPr>
-              <w:t xml:space="preserve"> </w:t>
-            </w:r>
-            <w:proofErr w:type="spellStart"/>
-            <w:r>
-              <w:rPr>
-                <w:rFonts w:ascii="Verdana" w:hAnsi="Verdana" w:cs="Verdana"/>
-                <w:i/>
-                <w:iCs/>
-                <w:color w:val="000000" w:themeColor="text1"/>
-                <w:sz w:val="20"/>
-                <w:szCs w:val="20"/>
-              </w:rPr>
-              <w:t>Vassel</w:t>
-            </w:r>
-            <w:proofErr w:type="spellEnd"/>
+              <w:t>Sander Vassel</w:t>
+            </w:r>
           </w:p>
         </w:tc>
       </w:tr>
@@ -9685,55 +9129,7 @@
                 <w:sz w:val="20"/>
                 <w:szCs w:val="20"/>
               </w:rPr>
-              <w:t xml:space="preserve">Käyttöliittymä komponentti, joka kommunikoi REST API </w:t>
-            </w:r>
-            <w:proofErr w:type="spellStart"/>
-            <w:r>
-              <w:rPr>
-                <w:rFonts w:ascii="Verdana" w:hAnsi="Verdana" w:cs="Verdana"/>
-                <w:i/>
-                <w:iCs/>
-                <w:color w:val="000000" w:themeColor="text1"/>
-                <w:sz w:val="20"/>
-                <w:szCs w:val="20"/>
-              </w:rPr>
-              <w:t>backendin</w:t>
-            </w:r>
-            <w:proofErr w:type="spellEnd"/>
-            <w:r>
-              <w:rPr>
-                <w:rFonts w:ascii="Verdana" w:hAnsi="Verdana" w:cs="Verdana"/>
-                <w:i/>
-                <w:iCs/>
-                <w:color w:val="000000" w:themeColor="text1"/>
-                <w:sz w:val="20"/>
-                <w:szCs w:val="20"/>
-              </w:rPr>
-              <w:t xml:space="preserve"> kanssa. Tämä komponentti toimii osana pankkiautomaatti asiakassovellusta. Komponentti on </w:t>
-            </w:r>
-            <w:proofErr w:type="spellStart"/>
-            <w:r>
-              <w:rPr>
-                <w:rFonts w:ascii="Verdana" w:hAnsi="Verdana" w:cs="Verdana"/>
-                <w:i/>
-                <w:iCs/>
-                <w:color w:val="000000" w:themeColor="text1"/>
-                <w:sz w:val="20"/>
-                <w:szCs w:val="20"/>
-              </w:rPr>
-              <w:t>Qt</w:t>
-            </w:r>
-            <w:proofErr w:type="spellEnd"/>
-            <w:r>
-              <w:rPr>
-                <w:rFonts w:ascii="Verdana" w:hAnsi="Verdana" w:cs="Verdana"/>
-                <w:i/>
-                <w:iCs/>
-                <w:color w:val="000000" w:themeColor="text1"/>
-                <w:sz w:val="20"/>
-                <w:szCs w:val="20"/>
-              </w:rPr>
-              <w:t>-pohjainen.</w:t>
+              <w:t>Käyttöliittymä komponentti, joka kommunikoi REST API backendin kanssa. Tämä komponentti toimii osana pankkiautomaatti asiakassovellusta. Komponentti on Qt-pohjainen.</w:t>
             </w:r>
           </w:p>
         </w:tc>
@@ -9906,31 +9302,7 @@
                 <w:sz w:val="20"/>
                 <w:szCs w:val="20"/>
               </w:rPr>
-              <w:t xml:space="preserve">Funktiot mitä tarjoaa muille / signaalit mitä komponentti vastaanottaa tai lähettää muille. (ryhmän itse toteuttamat, ei </w:t>
-            </w:r>
-            <w:proofErr w:type="spellStart"/>
-            <w:r>
-              <w:rPr>
-                <w:rFonts w:ascii="Verdana" w:hAnsi="Verdana" w:cs="Verdana"/>
-                <w:i/>
-                <w:iCs/>
-                <w:color w:val="000000" w:themeColor="text1"/>
-                <w:sz w:val="20"/>
-                <w:szCs w:val="20"/>
-              </w:rPr>
-              <w:t>Qt:n</w:t>
-            </w:r>
-            <w:proofErr w:type="spellEnd"/>
-            <w:r>
-              <w:rPr>
-                <w:rFonts w:ascii="Verdana" w:hAnsi="Verdana" w:cs="Verdana"/>
-                <w:i/>
-                <w:iCs/>
-                <w:color w:val="000000" w:themeColor="text1"/>
-                <w:sz w:val="20"/>
-                <w:szCs w:val="20"/>
-              </w:rPr>
-              <w:t xml:space="preserve"> sisäisiä.)</w:t>
+              <w:t>Funktiot mitä tarjoaa muille / signaalit mitä komponentti vastaanottaa tai lähettää muille. (ryhmän itse toteuttamat, ei Qt:n sisäisiä.)</w:t>
             </w:r>
           </w:p>
           <w:tbl>
@@ -10021,54 +9393,14 @@
                       <w:szCs w:val="20"/>
                     </w:rPr>
                   </w:pPr>
-                  <w:proofErr w:type="spellStart"/>
-                  <w:proofErr w:type="gramStart"/>
                   <w:r>
                     <w:rPr>
                       <w:rFonts w:ascii="Verdana" w:hAnsi="Verdana" w:cs="Verdana"/>
                       <w:sz w:val="20"/>
                       <w:szCs w:val="20"/>
                     </w:rPr>
-                    <w:t>setTunniste</w:t>
+                    <w:t>setTunniste(QString): void</w:t>
                   </w:r>
-                  <w:proofErr w:type="spellEnd"/>
-                  <w:r>
-                    <w:rPr>
-                      <w:rFonts w:ascii="Verdana" w:hAnsi="Verdana" w:cs="Verdana"/>
-                      <w:sz w:val="20"/>
-                      <w:szCs w:val="20"/>
-                    </w:rPr>
-                    <w:t>(</w:t>
-                  </w:r>
-                  <w:proofErr w:type="spellStart"/>
-                  <w:proofErr w:type="gramEnd"/>
-                  <w:r>
-                    <w:rPr>
-                      <w:rFonts w:ascii="Verdana" w:hAnsi="Verdana" w:cs="Verdana"/>
-                      <w:sz w:val="20"/>
-                      <w:szCs w:val="20"/>
-                    </w:rPr>
-                    <w:t>QString</w:t>
-                  </w:r>
-                  <w:proofErr w:type="spellEnd"/>
-                  <w:r>
-                    <w:rPr>
-                      <w:rFonts w:ascii="Verdana" w:hAnsi="Verdana" w:cs="Verdana"/>
-                      <w:sz w:val="20"/>
-                      <w:szCs w:val="20"/>
-                    </w:rPr>
-                    <w:t xml:space="preserve">): </w:t>
-                  </w:r>
-                  <w:proofErr w:type="spellStart"/>
-                  <w:r>
-                    <w:rPr>
-                      <w:rFonts w:ascii="Verdana" w:hAnsi="Verdana" w:cs="Verdana"/>
-                      <w:sz w:val="20"/>
-                      <w:szCs w:val="20"/>
-                    </w:rPr>
-                    <w:t>void</w:t>
-                  </w:r>
-                  <w:proofErr w:type="spellEnd"/>
                 </w:p>
               </w:tc>
               <w:tc>
@@ -10138,8 +9470,6 @@
                       <w:szCs w:val="20"/>
                     </w:rPr>
                   </w:pPr>
-                  <w:proofErr w:type="spellStart"/>
-                  <w:proofErr w:type="gramStart"/>
                   <w:r>
                     <w:rPr>
                       <w:rFonts w:ascii="Verdana" w:hAnsi="Verdana" w:cs="Verdana"/>
@@ -10156,50 +9486,8 @@
                       <w:sz w:val="20"/>
                       <w:szCs w:val="20"/>
                     </w:rPr>
-                    <w:t>Pin</w:t>
+                    <w:t>Pin(QString): void</w:t>
                   </w:r>
-                  <w:proofErr w:type="spellEnd"/>
-                  <w:r>
-                    <w:rPr>
-                      <w:rFonts w:ascii="Verdana" w:hAnsi="Verdana" w:cs="Verdana"/>
-                      <w:color w:val="000000" w:themeColor="text1"/>
-                      <w:sz w:val="20"/>
-                      <w:szCs w:val="20"/>
-                    </w:rPr>
-                    <w:t>(</w:t>
-                  </w:r>
-                  <w:proofErr w:type="spellStart"/>
-                  <w:proofErr w:type="gramEnd"/>
-                  <w:r>
-                    <w:rPr>
-                      <w:rFonts w:ascii="Verdana" w:hAnsi="Verdana" w:cs="Verdana"/>
-                      <w:color w:val="000000" w:themeColor="text1"/>
-                      <w:sz w:val="20"/>
-                      <w:szCs w:val="20"/>
-                    </w:rPr>
-                    <w:t>QString</w:t>
-                  </w:r>
-                  <w:proofErr w:type="spellEnd"/>
-                  <w:r>
-                    <w:rPr>
-                      <w:rFonts w:ascii="Verdana" w:hAnsi="Verdana" w:cs="Verdana"/>
-                      <w:color w:val="000000" w:themeColor="text1"/>
-                      <w:sz w:val="20"/>
-                      <w:szCs w:val="20"/>
-                    </w:rPr>
-                    <w:t xml:space="preserve">): </w:t>
-                  </w:r>
-                  <w:proofErr w:type="spellStart"/>
-                  <w:r>
-                    <w:rPr>
-                      <w:rFonts w:ascii="Verdana" w:hAnsi="Verdana" w:cs="Verdana"/>
-                      <w:color w:val="000000" w:themeColor="text1"/>
-                      <w:sz w:val="20"/>
-                      <w:szCs w:val="20"/>
-                    </w:rPr>
-                    <w:t>void</w:t>
-                  </w:r>
-                  <w:proofErr w:type="spellEnd"/>
                   <w:r>
                     <w:rPr>
                       <w:rFonts w:ascii="Verdana" w:hAnsi="Verdana" w:cs="Verdana"/>
@@ -10292,8 +9580,6 @@
                       <w:szCs w:val="20"/>
                     </w:rPr>
                   </w:pPr>
-                  <w:proofErr w:type="spellStart"/>
-                  <w:proofErr w:type="gramStart"/>
                   <w:r>
                     <w:rPr>
                       <w:rFonts w:ascii="Verdana" w:hAnsi="Verdana" w:cs="Verdana"/>
@@ -10301,39 +9587,8 @@
                       <w:sz w:val="20"/>
                       <w:szCs w:val="20"/>
                     </w:rPr>
-                    <w:t>getTunniste</w:t>
+                    <w:t>getTunniste(): QString</w:t>
                   </w:r>
-                  <w:proofErr w:type="spellEnd"/>
-                  <w:r>
-                    <w:rPr>
-                      <w:rFonts w:ascii="Verdana" w:hAnsi="Verdana" w:cs="Verdana"/>
-                      <w:color w:val="000000" w:themeColor="text1"/>
-                      <w:sz w:val="20"/>
-                      <w:szCs w:val="20"/>
-                    </w:rPr>
-                    <w:t>(</w:t>
-                  </w:r>
-                  <w:proofErr w:type="gramEnd"/>
-                  <w:r>
-                    <w:rPr>
-                      <w:rFonts w:ascii="Verdana" w:hAnsi="Verdana" w:cs="Verdana"/>
-                      <w:color w:val="000000" w:themeColor="text1"/>
-                      <w:sz w:val="20"/>
-                      <w:szCs w:val="20"/>
-                    </w:rPr>
-                    <w:t xml:space="preserve">): </w:t>
-                  </w:r>
-                  <w:proofErr w:type="spellStart"/>
-                  <w:r>
-                    <w:rPr>
-                      <w:rFonts w:ascii="Verdana" w:hAnsi="Verdana" w:cs="Verdana"/>
-                      <w:color w:val="000000" w:themeColor="text1"/>
-                      <w:sz w:val="20"/>
-                      <w:szCs w:val="20"/>
-                    </w:rPr>
-                    <w:t>QString</w:t>
-                  </w:r>
-                  <w:proofErr w:type="spellEnd"/>
                 </w:p>
               </w:tc>
               <w:tc>
@@ -10381,8 +9636,6 @@
                       <w:szCs w:val="20"/>
                     </w:rPr>
                   </w:pPr>
-                  <w:proofErr w:type="spellStart"/>
-                  <w:proofErr w:type="gramStart"/>
                   <w:r>
                     <w:rPr>
                       <w:rFonts w:ascii="Verdana" w:hAnsi="Verdana" w:cs="Verdana"/>
@@ -10399,39 +9652,8 @@
                       <w:sz w:val="20"/>
                       <w:szCs w:val="20"/>
                     </w:rPr>
-                    <w:t>Pin</w:t>
+                    <w:t>Pin(): QString</w:t>
                   </w:r>
-                  <w:proofErr w:type="spellEnd"/>
-                  <w:r>
-                    <w:rPr>
-                      <w:rFonts w:ascii="Verdana" w:hAnsi="Verdana" w:cs="Verdana"/>
-                      <w:color w:val="000000" w:themeColor="text1"/>
-                      <w:sz w:val="20"/>
-                      <w:szCs w:val="20"/>
-                    </w:rPr>
-                    <w:t>(</w:t>
-                  </w:r>
-                  <w:proofErr w:type="gramEnd"/>
-                  <w:r>
-                    <w:rPr>
-                      <w:rFonts w:ascii="Verdana" w:hAnsi="Verdana" w:cs="Verdana"/>
-                      <w:color w:val="000000" w:themeColor="text1"/>
-                      <w:sz w:val="20"/>
-                      <w:szCs w:val="20"/>
-                    </w:rPr>
-                    <w:t xml:space="preserve">): </w:t>
-                  </w:r>
-                  <w:proofErr w:type="spellStart"/>
-                  <w:r>
-                    <w:rPr>
-                      <w:rFonts w:ascii="Verdana" w:hAnsi="Verdana" w:cs="Verdana"/>
-                      <w:color w:val="000000" w:themeColor="text1"/>
-                      <w:sz w:val="20"/>
-                      <w:szCs w:val="20"/>
-                    </w:rPr>
-                    <w:t>QString</w:t>
-                  </w:r>
-                  <w:proofErr w:type="spellEnd"/>
                 </w:p>
               </w:tc>
               <w:tc>
@@ -10515,8 +9737,6 @@
                       <w:szCs w:val="20"/>
                     </w:rPr>
                   </w:pPr>
-                  <w:proofErr w:type="spellStart"/>
-                  <w:proofErr w:type="gramStart"/>
                   <w:r>
                     <w:rPr>
                       <w:rFonts w:ascii="Verdana" w:hAnsi="Verdana" w:cs="Verdana"/>
@@ -10524,50 +9744,8 @@
                       <w:sz w:val="20"/>
                       <w:szCs w:val="20"/>
                     </w:rPr>
-                    <w:t>checkPINFormat</w:t>
+                    <w:t>checkPINFormat(QString): bool</w:t>
                   </w:r>
-                  <w:proofErr w:type="spellEnd"/>
-                  <w:r>
-                    <w:rPr>
-                      <w:rFonts w:ascii="Verdana" w:hAnsi="Verdana" w:cs="Verdana"/>
-                      <w:color w:val="000000" w:themeColor="text1"/>
-                      <w:sz w:val="20"/>
-                      <w:szCs w:val="20"/>
-                    </w:rPr>
-                    <w:t>(</w:t>
-                  </w:r>
-                  <w:proofErr w:type="spellStart"/>
-                  <w:proofErr w:type="gramEnd"/>
-                  <w:r>
-                    <w:rPr>
-                      <w:rFonts w:ascii="Verdana" w:hAnsi="Verdana" w:cs="Verdana"/>
-                      <w:color w:val="000000" w:themeColor="text1"/>
-                      <w:sz w:val="20"/>
-                      <w:szCs w:val="20"/>
-                    </w:rPr>
-                    <w:t>QString</w:t>
-                  </w:r>
-                  <w:proofErr w:type="spellEnd"/>
-                  <w:r>
-                    <w:rPr>
-                      <w:rFonts w:ascii="Verdana" w:hAnsi="Verdana" w:cs="Verdana"/>
-                      <w:color w:val="000000" w:themeColor="text1"/>
-                      <w:sz w:val="20"/>
-                      <w:szCs w:val="20"/>
-                    </w:rPr>
-                    <w:t xml:space="preserve">): </w:t>
-                  </w:r>
-                  <w:proofErr w:type="spellStart"/>
-                  <w:r>
-                    <w:rPr>
-                      <w:rFonts w:ascii="Verdana" w:hAnsi="Verdana" w:cs="Verdana"/>
-                      <w:color w:val="000000" w:themeColor="text1"/>
-                      <w:sz w:val="20"/>
-                      <w:szCs w:val="20"/>
-                    </w:rPr>
-                    <w:t>bool</w:t>
-                  </w:r>
-                  <w:proofErr w:type="spellEnd"/>
                 </w:p>
               </w:tc>
               <w:tc>
@@ -10669,8 +9847,6 @@
                       <w:szCs w:val="20"/>
                     </w:rPr>
                   </w:pPr>
-                  <w:proofErr w:type="spellStart"/>
-                  <w:proofErr w:type="gramStart"/>
                   <w:r>
                     <w:rPr>
                       <w:rFonts w:ascii="Verdana" w:hAnsi="Verdana" w:cs="Verdana"/>
@@ -10678,39 +9854,8 @@
                       <w:sz w:val="20"/>
                       <w:szCs w:val="20"/>
                     </w:rPr>
-                    <w:t>btnContinueSlot</w:t>
+                    <w:t>btnContinueSlot(): void</w:t>
                   </w:r>
-                  <w:proofErr w:type="spellEnd"/>
-                  <w:r>
-                    <w:rPr>
-                      <w:rFonts w:ascii="Verdana" w:hAnsi="Verdana" w:cs="Verdana"/>
-                      <w:color w:val="000000" w:themeColor="text1"/>
-                      <w:sz w:val="20"/>
-                      <w:szCs w:val="20"/>
-                    </w:rPr>
-                    <w:t>(</w:t>
-                  </w:r>
-                  <w:proofErr w:type="gramEnd"/>
-                  <w:r>
-                    <w:rPr>
-                      <w:rFonts w:ascii="Verdana" w:hAnsi="Verdana" w:cs="Verdana"/>
-                      <w:color w:val="000000" w:themeColor="text1"/>
-                      <w:sz w:val="20"/>
-                      <w:szCs w:val="20"/>
-                    </w:rPr>
-                    <w:t xml:space="preserve">): </w:t>
-                  </w:r>
-                  <w:proofErr w:type="spellStart"/>
-                  <w:r>
-                    <w:rPr>
-                      <w:rFonts w:ascii="Verdana" w:hAnsi="Verdana" w:cs="Verdana"/>
-                      <w:color w:val="000000" w:themeColor="text1"/>
-                      <w:sz w:val="20"/>
-                      <w:szCs w:val="20"/>
-                    </w:rPr>
-                    <w:t>void</w:t>
-                  </w:r>
-                  <w:proofErr w:type="spellEnd"/>
                 </w:p>
               </w:tc>
               <w:tc>
@@ -10736,69 +9881,7 @@
                       <w:sz w:val="20"/>
                       <w:szCs w:val="20"/>
                     </w:rPr>
-                    <w:t xml:space="preserve">Luodaan </w:t>
-                  </w:r>
-                  <w:proofErr w:type="spellStart"/>
-                  <w:r>
-                    <w:rPr>
-                      <w:rFonts w:ascii="Verdana" w:hAnsi="Verdana" w:cs="Verdana"/>
-                      <w:color w:val="000000" w:themeColor="text1"/>
-                      <w:sz w:val="20"/>
-                      <w:szCs w:val="20"/>
-                    </w:rPr>
-                    <w:t>PINWindow</w:t>
-                  </w:r>
-                  <w:proofErr w:type="spellEnd"/>
-                  <w:r>
-                    <w:rPr>
-                      <w:rFonts w:ascii="Verdana" w:hAnsi="Verdana" w:cs="Verdana"/>
-                      <w:color w:val="000000" w:themeColor="text1"/>
-                      <w:sz w:val="20"/>
-                      <w:szCs w:val="20"/>
-                    </w:rPr>
-                    <w:t xml:space="preserve"> olio, asetetaan tunniste talteen </w:t>
-                  </w:r>
-                  <w:proofErr w:type="spellStart"/>
-                  <w:proofErr w:type="gramStart"/>
-                  <w:r>
-                    <w:rPr>
-                      <w:rFonts w:ascii="Verdana" w:hAnsi="Verdana" w:cs="Verdana"/>
-                      <w:color w:val="000000" w:themeColor="text1"/>
-                      <w:sz w:val="20"/>
-                      <w:szCs w:val="20"/>
-                    </w:rPr>
-                    <w:t>setTunniste</w:t>
-                  </w:r>
-                  <w:proofErr w:type="spellEnd"/>
-                  <w:r>
-                    <w:rPr>
-                      <w:rFonts w:ascii="Verdana" w:hAnsi="Verdana" w:cs="Verdana"/>
-                      <w:color w:val="000000" w:themeColor="text1"/>
-                      <w:sz w:val="20"/>
-                      <w:szCs w:val="20"/>
-                    </w:rPr>
-                    <w:t>(</w:t>
-                  </w:r>
-                  <w:proofErr w:type="spellStart"/>
-                  <w:proofErr w:type="gramEnd"/>
-                  <w:r>
-                    <w:rPr>
-                      <w:rFonts w:ascii="Verdana" w:hAnsi="Verdana" w:cs="Verdana"/>
-                      <w:color w:val="000000" w:themeColor="text1"/>
-                      <w:sz w:val="20"/>
-                      <w:szCs w:val="20"/>
-                    </w:rPr>
-                    <w:t>QString</w:t>
-                  </w:r>
-                  <w:proofErr w:type="spellEnd"/>
-                  <w:r>
-                    <w:rPr>
-                      <w:rFonts w:ascii="Verdana" w:hAnsi="Verdana" w:cs="Verdana"/>
-                      <w:color w:val="000000" w:themeColor="text1"/>
-                      <w:sz w:val="20"/>
-                      <w:szCs w:val="20"/>
-                    </w:rPr>
-                    <w:t>) -funktiolla</w:t>
+                    <w:t>Luodaan PINWindow olio, asetetaan tunniste talteen setTunniste(QString) -funktiolla</w:t>
                   </w:r>
                   <w:r>
                     <w:rPr>
@@ -10807,27 +9890,7 @@
                       <w:sz w:val="20"/>
                       <w:szCs w:val="20"/>
                     </w:rPr>
-                    <w:t xml:space="preserve">, ja piilotetaan </w:t>
-                  </w:r>
-                  <w:proofErr w:type="spellStart"/>
-                  <w:r>
-                    <w:rPr>
-                      <w:rFonts w:ascii="Verdana" w:hAnsi="Verdana" w:cs="Verdana"/>
-                      <w:color w:val="000000" w:themeColor="text1"/>
-                      <w:sz w:val="20"/>
-                      <w:szCs w:val="20"/>
-                    </w:rPr>
-                    <w:t>Login</w:t>
-                  </w:r>
-                  <w:proofErr w:type="spellEnd"/>
-                  <w:r>
-                    <w:rPr>
-                      <w:rFonts w:ascii="Verdana" w:hAnsi="Verdana" w:cs="Verdana"/>
-                      <w:color w:val="000000" w:themeColor="text1"/>
-                      <w:sz w:val="20"/>
-                      <w:szCs w:val="20"/>
-                    </w:rPr>
-                    <w:t xml:space="preserve"> ikkuna</w:t>
+                    <w:t>, ja piilotetaan Login ikkuna</w:t>
                   </w:r>
                   <w:r>
                     <w:rPr>
@@ -10836,27 +9899,7 @@
                       <w:sz w:val="20"/>
                       <w:szCs w:val="20"/>
                     </w:rPr>
-                    <w:t xml:space="preserve">, ja käynnistetään </w:t>
-                  </w:r>
-                  <w:proofErr w:type="spellStart"/>
-                  <w:r>
-                    <w:rPr>
-                      <w:rFonts w:ascii="Verdana" w:hAnsi="Verdana" w:cs="Verdana"/>
-                      <w:color w:val="000000" w:themeColor="text1"/>
-                      <w:sz w:val="20"/>
-                      <w:szCs w:val="20"/>
-                    </w:rPr>
-                    <w:t>PINWindow</w:t>
-                  </w:r>
-                  <w:proofErr w:type="spellEnd"/>
-                  <w:r>
-                    <w:rPr>
-                      <w:rFonts w:ascii="Verdana" w:hAnsi="Verdana" w:cs="Verdana"/>
-                      <w:color w:val="000000" w:themeColor="text1"/>
-                      <w:sz w:val="20"/>
-                      <w:szCs w:val="20"/>
-                    </w:rPr>
-                    <w:t xml:space="preserve"> olio.</w:t>
+                    <w:t>, ja käynnistetään PINWindow olio.</w:t>
                   </w:r>
                   <w:r>
                     <w:rPr>
@@ -10896,8 +9939,6 @@
                       <w:szCs w:val="20"/>
                     </w:rPr>
                   </w:pPr>
-                  <w:proofErr w:type="spellStart"/>
-                  <w:proofErr w:type="gramStart"/>
                   <w:r>
                     <w:rPr>
                       <w:rFonts w:ascii="Verdana" w:hAnsi="Verdana" w:cs="Verdana"/>
@@ -10905,39 +9946,8 @@
                       <w:sz w:val="20"/>
                       <w:szCs w:val="20"/>
                     </w:rPr>
-                    <w:t>btnSignInSlot</w:t>
+                    <w:t>btnSignInSlot(): void</w:t>
                   </w:r>
-                  <w:proofErr w:type="spellEnd"/>
-                  <w:r>
-                    <w:rPr>
-                      <w:rFonts w:ascii="Verdana" w:hAnsi="Verdana" w:cs="Verdana"/>
-                      <w:color w:val="000000" w:themeColor="text1"/>
-                      <w:sz w:val="20"/>
-                      <w:szCs w:val="20"/>
-                    </w:rPr>
-                    <w:t>(</w:t>
-                  </w:r>
-                  <w:proofErr w:type="gramEnd"/>
-                  <w:r>
-                    <w:rPr>
-                      <w:rFonts w:ascii="Verdana" w:hAnsi="Verdana" w:cs="Verdana"/>
-                      <w:color w:val="000000" w:themeColor="text1"/>
-                      <w:sz w:val="20"/>
-                      <w:szCs w:val="20"/>
-                    </w:rPr>
-                    <w:t xml:space="preserve">): </w:t>
-                  </w:r>
-                  <w:proofErr w:type="spellStart"/>
-                  <w:r>
-                    <w:rPr>
-                      <w:rFonts w:ascii="Verdana" w:hAnsi="Verdana" w:cs="Verdana"/>
-                      <w:color w:val="000000" w:themeColor="text1"/>
-                      <w:sz w:val="20"/>
-                      <w:szCs w:val="20"/>
-                    </w:rPr>
-                    <w:t>void</w:t>
-                  </w:r>
-                  <w:proofErr w:type="spellEnd"/>
                 </w:p>
               </w:tc>
               <w:tc>
@@ -10963,49 +9973,7 @@
                       <w:sz w:val="20"/>
                       <w:szCs w:val="20"/>
                     </w:rPr>
-                    <w:t xml:space="preserve">Mikäli PIN-koodi on 4 numeroinen, ajastin pysäytetään, asetetaan PIN-koodi talteen </w:t>
-                  </w:r>
-                  <w:proofErr w:type="spellStart"/>
-                  <w:proofErr w:type="gramStart"/>
-                  <w:r>
-                    <w:rPr>
-                      <w:rFonts w:ascii="Verdana" w:hAnsi="Verdana" w:cs="Verdana"/>
-                      <w:color w:val="000000" w:themeColor="text1"/>
-                      <w:sz w:val="20"/>
-                      <w:szCs w:val="20"/>
-                    </w:rPr>
-                    <w:t>setPin</w:t>
-                  </w:r>
-                  <w:proofErr w:type="spellEnd"/>
-                  <w:r>
-                    <w:rPr>
-                      <w:rFonts w:ascii="Verdana" w:hAnsi="Verdana" w:cs="Verdana"/>
-                      <w:color w:val="000000" w:themeColor="text1"/>
-                      <w:sz w:val="20"/>
-                      <w:szCs w:val="20"/>
-                    </w:rPr>
-                    <w:t>(</w:t>
-                  </w:r>
-                  <w:proofErr w:type="spellStart"/>
-                  <w:proofErr w:type="gramEnd"/>
-                  <w:r>
-                    <w:rPr>
-                      <w:rFonts w:ascii="Verdana" w:hAnsi="Verdana" w:cs="Verdana"/>
-                      <w:color w:val="000000" w:themeColor="text1"/>
-                      <w:sz w:val="20"/>
-                      <w:szCs w:val="20"/>
-                    </w:rPr>
-                    <w:t>QString</w:t>
-                  </w:r>
-                  <w:proofErr w:type="spellEnd"/>
-                  <w:r>
-                    <w:rPr>
-                      <w:rFonts w:ascii="Verdana" w:hAnsi="Verdana" w:cs="Verdana"/>
-                      <w:color w:val="000000" w:themeColor="text1"/>
-                      <w:sz w:val="20"/>
-                      <w:szCs w:val="20"/>
-                    </w:rPr>
-                    <w:t>)-funktiolla ja lähetetään HTTP pyyntö REST API palvelimelle.</w:t>
+                    <w:t>Mikäli PIN-koodi on 4 numeroinen, ajastin pysäytetään, asetetaan PIN-koodi talteen setPin(QString)-funktiolla ja lähetetään HTTP pyyntö REST API palvelimelle.</w:t>
                   </w:r>
                 </w:p>
               </w:tc>
@@ -11117,7 +10085,6 @@
           <w:color w:val="FF0000"/>
         </w:rPr>
       </w:pPr>
-      <w:proofErr w:type="gramStart"/>
       <w:r>
         <w:rPr>
           <w:rFonts w:ascii="Verdana" w:hAnsi="Verdana"/>
@@ -11125,17 +10092,7 @@
           <w:iCs/>
           <w:color w:val="FF0000"/>
         </w:rPr>
-        <w:t>..</w:t>
-      </w:r>
-      <w:proofErr w:type="gramEnd"/>
-      <w:r>
-        <w:rPr>
-          <w:rFonts w:ascii="Verdana" w:hAnsi="Verdana"/>
-          <w:i/>
-          <w:iCs/>
-          <w:color w:val="FF0000"/>
-        </w:rPr>
-        <w:t>s</w:t>
+        <w:t>..s</w:t>
       </w:r>
       <w:r>
         <w:rPr>
@@ -11517,8 +10474,8 @@
         <w:tblLook w:val="04A0" w:firstRow="1" w:lastRow="0" w:firstColumn="1" w:lastColumn="0" w:noHBand="0" w:noVBand="1"/>
       </w:tblPr>
       <w:tblGrid>
-        <w:gridCol w:w="5020"/>
-        <w:gridCol w:w="4878"/>
+        <w:gridCol w:w="5511"/>
+        <w:gridCol w:w="5046"/>
       </w:tblGrid>
       <w:tr>
         <w:trPr>
@@ -11546,9 +10503,9 @@
                 <w:noProof/>
               </w:rPr>
               <w:drawing>
-                <wp:inline distT="0" distB="0" distL="0" distR="0" wp14:anchorId="1E9EBEFA" wp14:editId="546DF01F">
-                  <wp:extent cx="3050993" cy="2028825"/>
-                  <wp:effectExtent l="0" t="0" r="0" b="0"/>
+                <wp:inline distT="0" distB="0" distL="0" distR="0" wp14:anchorId="1E9EBEFA" wp14:editId="27A7E106">
+                  <wp:extent cx="3077406" cy="2041371"/>
+                  <wp:effectExtent l="0" t="0" r="8890" b="0"/>
                   <wp:docPr id="762079431" name="Kuva 1"/>
                   <wp:cNvGraphicFramePr>
                     <a:graphicFrameLocks xmlns:a="http://schemas.openxmlformats.org/drawingml/2006/main" noChangeAspect="1"/>
@@ -11557,7 +10514,7 @@
                     <a:graphicData uri="http://schemas.openxmlformats.org/drawingml/2006/picture">
                       <pic:pic xmlns:pic="http://schemas.openxmlformats.org/drawingml/2006/picture">
                         <pic:nvPicPr>
-                          <pic:cNvPr id="762079431" name=""/>
+                          <pic:cNvPr id="762079431" name="Kuva 1"/>
                           <pic:cNvPicPr/>
                         </pic:nvPicPr>
                         <pic:blipFill>
@@ -11569,7 +10526,7 @@
                         <pic:spPr>
                           <a:xfrm>
                             <a:off x="0" y="0"/>
-                            <a:ext cx="3077406" cy="2046389"/>
+                            <a:ext cx="3077406" cy="2041371"/>
                           </a:xfrm>
                           <a:prstGeom prst="rect">
                             <a:avLst/>
@@ -11595,6 +10552,47 @@
                 <w:rFonts w:ascii="Verdana" w:hAnsi="Verdana" w:cs="Verdana"/>
               </w:rPr>
             </w:pPr>
+            <w:r>
+              <w:rPr>
+                <w:rFonts w:ascii="Verdana" w:hAnsi="Verdana" w:cs="Verdana"/>
+                <w:noProof/>
+              </w:rPr>
+              <w:drawing>
+                <wp:inline distT="0" distB="0" distL="0" distR="0" wp14:anchorId="536FE820" wp14:editId="1974745E">
+                  <wp:extent cx="3062605" cy="2031780"/>
+                  <wp:effectExtent l="0" t="0" r="4445" b="6985"/>
+                  <wp:docPr id="173796939" name="Picture 1"/>
+                  <wp:cNvGraphicFramePr>
+                    <a:graphicFrameLocks xmlns:a="http://schemas.openxmlformats.org/drawingml/2006/main" noChangeAspect="1"/>
+                  </wp:cNvGraphicFramePr>
+                  <a:graphic xmlns:a="http://schemas.openxmlformats.org/drawingml/2006/main">
+                    <a:graphicData uri="http://schemas.openxmlformats.org/drawingml/2006/picture">
+                      <pic:pic xmlns:pic="http://schemas.openxmlformats.org/drawingml/2006/picture">
+                        <pic:nvPicPr>
+                          <pic:cNvPr id="173796939" name="Picture 173796939"/>
+                          <pic:cNvPicPr/>
+                        </pic:nvPicPr>
+                        <pic:blipFill>
+                          <a:blip r:embed="rId20"/>
+                          <a:stretch>
+                            <a:fillRect/>
+                          </a:stretch>
+                        </pic:blipFill>
+                        <pic:spPr>
+                          <a:xfrm>
+                            <a:off x="0" y="0"/>
+                            <a:ext cx="3075134" cy="2040092"/>
+                          </a:xfrm>
+                          <a:prstGeom prst="rect">
+                            <a:avLst/>
+                          </a:prstGeom>
+                        </pic:spPr>
+                      </pic:pic>
+                    </a:graphicData>
+                  </a:graphic>
+                </wp:inline>
+              </w:drawing>
+            </w:r>
           </w:p>
         </w:tc>
       </w:tr>
@@ -11614,6 +10612,63 @@
                 <w:rFonts w:ascii="Verdana" w:hAnsi="Verdana" w:cs="Verdana"/>
               </w:rPr>
             </w:pPr>
+            <w:r>
+              <w:rPr>
+                <w:rFonts w:ascii="Verdana" w:hAnsi="Verdana" w:cs="Verdana"/>
+                <w:noProof/>
+              </w:rPr>
+              <w:drawing>
+                <wp:anchor distT="0" distB="0" distL="114300" distR="114300" simplePos="0" relativeHeight="251665408" behindDoc="1" locked="0" layoutInCell="1" allowOverlap="1" wp14:anchorId="7B318E9F" wp14:editId="0237AA09">
+                  <wp:simplePos x="0" y="0"/>
+                  <wp:positionH relativeFrom="column">
+                    <wp:posOffset>27305</wp:posOffset>
+                  </wp:positionH>
+                  <wp:positionV relativeFrom="paragraph">
+                    <wp:posOffset>76835</wp:posOffset>
+                  </wp:positionV>
+                  <wp:extent cx="3362794" cy="1581371"/>
+                  <wp:effectExtent l="0" t="0" r="0" b="0"/>
+                  <wp:wrapTight wrapText="bothSides">
+                    <wp:wrapPolygon edited="0">
+                      <wp:start x="0" y="0"/>
+                      <wp:lineTo x="0" y="21340"/>
+                      <wp:lineTo x="21416" y="21340"/>
+                      <wp:lineTo x="21416" y="0"/>
+                      <wp:lineTo x="0" y="0"/>
+                    </wp:wrapPolygon>
+                  </wp:wrapTight>
+                  <wp:docPr id="1610889265" name="Picture 2"/>
+                  <wp:cNvGraphicFramePr>
+                    <a:graphicFrameLocks xmlns:a="http://schemas.openxmlformats.org/drawingml/2006/main" noChangeAspect="1"/>
+                  </wp:cNvGraphicFramePr>
+                  <a:graphic xmlns:a="http://schemas.openxmlformats.org/drawingml/2006/main">
+                    <a:graphicData uri="http://schemas.openxmlformats.org/drawingml/2006/picture">
+                      <pic:pic xmlns:pic="http://schemas.openxmlformats.org/drawingml/2006/picture">
+                        <pic:nvPicPr>
+                          <pic:cNvPr id="1610889265" name="Picture 1610889265"/>
+                          <pic:cNvPicPr/>
+                        </pic:nvPicPr>
+                        <pic:blipFill>
+                          <a:blip r:embed="rId21"/>
+                          <a:stretch>
+                            <a:fillRect/>
+                          </a:stretch>
+                        </pic:blipFill>
+                        <pic:spPr>
+                          <a:xfrm>
+                            <a:off x="0" y="0"/>
+                            <a:ext cx="3362794" cy="1581371"/>
+                          </a:xfrm>
+                          <a:prstGeom prst="rect">
+                            <a:avLst/>
+                          </a:prstGeom>
+                        </pic:spPr>
+                      </pic:pic>
+                    </a:graphicData>
+                  </a:graphic>
+                </wp:anchor>
+              </w:drawing>
+            </w:r>
           </w:p>
         </w:tc>
         <w:tc>
@@ -11628,6 +10683,63 @@
                 <w:rFonts w:ascii="Verdana" w:hAnsi="Verdana" w:cs="Verdana"/>
               </w:rPr>
             </w:pPr>
+            <w:r>
+              <w:rPr>
+                <w:rFonts w:ascii="Verdana" w:hAnsi="Verdana" w:cs="Verdana"/>
+                <w:noProof/>
+              </w:rPr>
+              <w:drawing>
+                <wp:anchor distT="0" distB="0" distL="114300" distR="114300" simplePos="0" relativeHeight="251664384" behindDoc="1" locked="0" layoutInCell="1" allowOverlap="1" wp14:anchorId="41E29A7D" wp14:editId="360DFA1B">
+                  <wp:simplePos x="0" y="0"/>
+                  <wp:positionH relativeFrom="column">
+                    <wp:posOffset>509270</wp:posOffset>
+                  </wp:positionH>
+                  <wp:positionV relativeFrom="paragraph">
+                    <wp:posOffset>10160</wp:posOffset>
+                  </wp:positionV>
+                  <wp:extent cx="2038350" cy="1683413"/>
+                  <wp:effectExtent l="0" t="0" r="0" b="0"/>
+                  <wp:wrapTight wrapText="bothSides">
+                    <wp:wrapPolygon edited="0">
+                      <wp:start x="0" y="0"/>
+                      <wp:lineTo x="0" y="21266"/>
+                      <wp:lineTo x="21398" y="21266"/>
+                      <wp:lineTo x="21398" y="0"/>
+                      <wp:lineTo x="0" y="0"/>
+                    </wp:wrapPolygon>
+                  </wp:wrapTight>
+                  <wp:docPr id="1918377330" name="Picture 3"/>
+                  <wp:cNvGraphicFramePr>
+                    <a:graphicFrameLocks xmlns:a="http://schemas.openxmlformats.org/drawingml/2006/main" noChangeAspect="1"/>
+                  </wp:cNvGraphicFramePr>
+                  <a:graphic xmlns:a="http://schemas.openxmlformats.org/drawingml/2006/main">
+                    <a:graphicData uri="http://schemas.openxmlformats.org/drawingml/2006/picture">
+                      <pic:pic xmlns:pic="http://schemas.openxmlformats.org/drawingml/2006/picture">
+                        <pic:nvPicPr>
+                          <pic:cNvPr id="1918377330" name="Picture 1918377330"/>
+                          <pic:cNvPicPr/>
+                        </pic:nvPicPr>
+                        <pic:blipFill>
+                          <a:blip r:embed="rId22"/>
+                          <a:stretch>
+                            <a:fillRect/>
+                          </a:stretch>
+                        </pic:blipFill>
+                        <pic:spPr>
+                          <a:xfrm>
+                            <a:off x="0" y="0"/>
+                            <a:ext cx="2038350" cy="1683413"/>
+                          </a:xfrm>
+                          <a:prstGeom prst="rect">
+                            <a:avLst/>
+                          </a:prstGeom>
+                        </pic:spPr>
+                      </pic:pic>
+                    </a:graphicData>
+                  </a:graphic>
+                </wp:anchor>
+              </w:drawing>
+            </w:r>
           </w:p>
         </w:tc>
       </w:tr>
@@ -11776,7 +10888,7 @@
                     </pic:cNvPicPr>
                   </pic:nvPicPr>
                   <pic:blipFill>
-                    <a:blip r:embed="rId20">
+                    <a:blip r:embed="rId23">
                       <a:extLst>
                         <a:ext uri="{28A0092B-C50C-407E-A947-70E740481C1C}">
                           <a14:useLocalDpi xmlns:a14="http://schemas.microsoft.com/office/drawing/2010/main" val="0"/>
@@ -11853,7 +10965,7 @@
                     </pic:cNvPicPr>
                   </pic:nvPicPr>
                   <pic:blipFill>
-                    <a:blip r:embed="rId21">
+                    <a:blip r:embed="rId24">
                       <a:extLst>
                         <a:ext uri="{28A0092B-C50C-407E-A947-70E740481C1C}">
                           <a14:useLocalDpi xmlns:a14="http://schemas.microsoft.com/office/drawing/2010/main" val="0"/>
@@ -17310,17 +16422,6 @@
 </file>
 
 <file path=customXml/item1.xml><?xml version="1.0" encoding="utf-8"?>
-<p:properties xmlns:p="http://schemas.microsoft.com/office/2006/metadata/properties" xmlns:xsi="http://www.w3.org/2001/XMLSchema-instance" xmlns:pc="http://schemas.microsoft.com/office/infopath/2007/PartnerControls">
-  <documentManagement>
-    <lcf76f155ced4ddcb4097134ff3c332f xmlns="d3831626-fde5-4fc8-acc5-9526b66ab2bb">
-      <Terms xmlns="http://schemas.microsoft.com/office/infopath/2007/PartnerControls"/>
-    </lcf76f155ced4ddcb4097134ff3c332f>
-    <TaxCatchAll xmlns="b5314b1c-0f5c-4851-9378-7099df4806ca" xsi:nil="true"/>
-  </documentManagement>
-</p:properties>
-</file>
-
-<file path=customXml/item2.xml><?xml version="1.0" encoding="utf-8"?>
 <ct:contentTypeSchema xmlns:ct="http://schemas.microsoft.com/office/2006/metadata/contentType" xmlns:ma="http://schemas.microsoft.com/office/2006/metadata/properties/metaAttributes" ct:_="" ma:_="" ma:contentTypeName="Document" ma:contentTypeID="0x0101009C12936ABBAE164AB3E3B1E737DB3796" ma:contentTypeVersion="12" ma:contentTypeDescription="Create a new document." ma:contentTypeScope="" ma:versionID="a3c7e968aca90f61141995ffe44e8398">
   <xsd:schema xmlns:xsd="http://www.w3.org/2001/XMLSchema" xmlns:xs="http://www.w3.org/2001/XMLSchema" xmlns:p="http://schemas.microsoft.com/office/2006/metadata/properties" xmlns:ns2="d3831626-fde5-4fc8-acc5-9526b66ab2bb" xmlns:ns3="b5314b1c-0f5c-4851-9378-7099df4806ca" targetNamespace="http://schemas.microsoft.com/office/2006/metadata/properties" ma:root="true" ma:fieldsID="87450be8a9b396dcd3e7509fc153b825" ns2:_="" ns3:_="">
     <xsd:import namespace="d3831626-fde5-4fc8-acc5-9526b66ab2bb"/>
@@ -17521,11 +16622,18 @@
 </ct:contentTypeSchema>
 </file>
 
-<file path=customXml/item3.xml><?xml version="1.0" encoding="utf-8"?>
-<b:Sources xmlns:b="http://schemas.openxmlformats.org/officeDocument/2006/bibliography" xmlns="http://schemas.openxmlformats.org/officeDocument/2006/bibliography" SelectedStyle="\APA.XSL" StyleName="APA"/>
+<file path=customXml/item2.xml><?xml version="1.0" encoding="utf-8"?>
+<p:properties xmlns:p="http://schemas.microsoft.com/office/2006/metadata/properties" xmlns:xsi="http://www.w3.org/2001/XMLSchema-instance" xmlns:pc="http://schemas.microsoft.com/office/infopath/2007/PartnerControls">
+  <documentManagement>
+    <lcf76f155ced4ddcb4097134ff3c332f xmlns="d3831626-fde5-4fc8-acc5-9526b66ab2bb">
+      <Terms xmlns="http://schemas.microsoft.com/office/infopath/2007/PartnerControls"/>
+    </lcf76f155ced4ddcb4097134ff3c332f>
+    <TaxCatchAll xmlns="b5314b1c-0f5c-4851-9378-7099df4806ca" xsi:nil="true"/>
+  </documentManagement>
+</p:properties>
 </file>
 
-<file path=customXml/item4.xml><?xml version="1.0" encoding="utf-8"?>
+<file path=customXml/item3.xml><?xml version="1.0" encoding="utf-8"?>
 <?mso-contentType ?>
 <FormTemplates xmlns="http://schemas.microsoft.com/sharepoint/v3/contenttype/forms">
   <Display>DocumentLibraryForm</Display>
@@ -17534,18 +16642,11 @@
 </FormTemplates>
 </file>
 
-<file path=customXml/itemProps1.xml><?xml version="1.0" encoding="utf-8"?>
-<ds:datastoreItem xmlns:ds="http://schemas.openxmlformats.org/officeDocument/2006/customXml" ds:itemID="{EE41A236-5C73-4451-B1B7-A171E48F7377}">
-  <ds:schemaRefs>
-    <ds:schemaRef ds:uri="http://schemas.microsoft.com/office/2006/metadata/properties"/>
-    <ds:schemaRef ds:uri="http://schemas.microsoft.com/office/infopath/2007/PartnerControls"/>
-    <ds:schemaRef ds:uri="d3831626-fde5-4fc8-acc5-9526b66ab2bb"/>
-    <ds:schemaRef ds:uri="b5314b1c-0f5c-4851-9378-7099df4806ca"/>
-  </ds:schemaRefs>
-</ds:datastoreItem>
+<file path=customXml/item4.xml><?xml version="1.0" encoding="utf-8"?>
+<b:Sources xmlns:b="http://schemas.openxmlformats.org/officeDocument/2006/bibliography" xmlns="http://schemas.openxmlformats.org/officeDocument/2006/bibliography" SelectedStyle="\APA.XSL" StyleName="APA"/>
 </file>
 
-<file path=customXml/itemProps2.xml><?xml version="1.0" encoding="utf-8"?>
+<file path=customXml/itemProps1.xml><?xml version="1.0" encoding="utf-8"?>
 <ds:datastoreItem xmlns:ds="http://schemas.openxmlformats.org/officeDocument/2006/customXml" ds:itemID="{3BB198E8-0F36-4C71-8940-04215BB7641E}">
   <ds:schemaRefs>
     <ds:schemaRef ds:uri="http://schemas.microsoft.com/office/2006/metadata/contentType"/>
@@ -17564,18 +16665,29 @@
 </ds:datastoreItem>
 </file>
 
+<file path=customXml/itemProps2.xml><?xml version="1.0" encoding="utf-8"?>
+<ds:datastoreItem xmlns:ds="http://schemas.openxmlformats.org/officeDocument/2006/customXml" ds:itemID="{EE41A236-5C73-4451-B1B7-A171E48F7377}">
+  <ds:schemaRefs>
+    <ds:schemaRef ds:uri="http://schemas.microsoft.com/office/2006/metadata/properties"/>
+    <ds:schemaRef ds:uri="http://schemas.microsoft.com/office/infopath/2007/PartnerControls"/>
+    <ds:schemaRef ds:uri="d3831626-fde5-4fc8-acc5-9526b66ab2bb"/>
+    <ds:schemaRef ds:uri="b5314b1c-0f5c-4851-9378-7099df4806ca"/>
+  </ds:schemaRefs>
+</ds:datastoreItem>
+</file>
+
 <file path=customXml/itemProps3.xml><?xml version="1.0" encoding="utf-8"?>
+<ds:datastoreItem xmlns:ds="http://schemas.openxmlformats.org/officeDocument/2006/customXml" ds:itemID="{13DB4B30-73AF-4FCD-BA9E-CA11CB4B5807}">
+  <ds:schemaRefs>
+    <ds:schemaRef ds:uri="http://schemas.microsoft.com/sharepoint/v3/contenttype/forms"/>
+  </ds:schemaRefs>
+</ds:datastoreItem>
+</file>
+
+<file path=customXml/itemProps4.xml><?xml version="1.0" encoding="utf-8"?>
 <ds:datastoreItem xmlns:ds="http://schemas.openxmlformats.org/officeDocument/2006/customXml" ds:itemID="{2BA0B919-FBBB-4BB8-90D2-33E6A0B69F94}">
   <ds:schemaRefs>
     <ds:schemaRef ds:uri="http://schemas.openxmlformats.org/officeDocument/2006/bibliography"/>
   </ds:schemaRefs>
 </ds:datastoreItem>
-</file>
-
-<file path=customXml/itemProps4.xml><?xml version="1.0" encoding="utf-8"?>
-<ds:datastoreItem xmlns:ds="http://schemas.openxmlformats.org/officeDocument/2006/customXml" ds:itemID="{13DB4B30-73AF-4FCD-BA9E-CA11CB4B5807}">
-  <ds:schemaRefs>
-    <ds:schemaRef ds:uri="http://schemas.microsoft.com/sharepoint/v3/contenttype/forms"/>
-  </ds:schemaRefs>
-</ds:datastoreItem>
 </file>
</xml_diff>

<commit_message>
UI Desing: lisätty lisää koiran kuvia jokaiselle valikolle Tekninen määrittely päivitetty
</commit_message>
<xml_diff>
--- a/Documents/tekninen_maarittely.docx
+++ b/Documents/tekninen_maarittely.docx
@@ -321,7 +321,7 @@
                 <w:sz w:val="20"/>
                 <w:szCs w:val="20"/>
               </w:rPr>
-              <w:t>5</w:t>
+              <w:t>6</w:t>
             </w:r>
           </w:p>
         </w:tc>
@@ -10304,8 +10304,8 @@
         <w:tblLook w:val="04A0" w:firstRow="1" w:lastRow="0" w:firstColumn="1" w:lastColumn="0" w:noHBand="0" w:noVBand="1"/>
       </w:tblPr>
       <w:tblGrid>
-        <w:gridCol w:w="9708"/>
-        <w:gridCol w:w="9708"/>
+        <w:gridCol w:w="9854"/>
+        <w:gridCol w:w="9562"/>
       </w:tblGrid>
       <w:tr>
         <w:trPr>
@@ -10327,13 +10327,63 @@
             </w:pPr>
             <w:r>
               <w:rPr>
-                <w:rFonts w:ascii="Verdana" w:hAnsi="Verdana" w:cs="Verdana"/>
+                <w:rFonts w:ascii="Verdana" w:hAnsi="Verdana"/>
                 <w:i/>
                 <w:iCs/>
+                <w:noProof/>
                 <w:color w:val="FF0000"/>
-                <w:szCs w:val="20"/>
-              </w:rPr>
-              <w:t>Kuva tähän.</w:t>
+              </w:rPr>
+              <w:drawing>
+                <wp:anchor distT="0" distB="0" distL="114300" distR="114300" simplePos="0" relativeHeight="251666432" behindDoc="1" locked="0" layoutInCell="1" allowOverlap="1" wp14:anchorId="417B1A9A" wp14:editId="6012FDD4">
+                  <wp:simplePos x="0" y="0"/>
+                  <wp:positionH relativeFrom="column">
+                    <wp:posOffset>-20320</wp:posOffset>
+                  </wp:positionH>
+                  <wp:positionV relativeFrom="paragraph">
+                    <wp:posOffset>51435</wp:posOffset>
+                  </wp:positionV>
+                  <wp:extent cx="6120130" cy="5669915"/>
+                  <wp:effectExtent l="0" t="0" r="0" b="6985"/>
+                  <wp:wrapTight wrapText="bothSides">
+                    <wp:wrapPolygon edited="0">
+                      <wp:start x="0" y="0"/>
+                      <wp:lineTo x="0" y="21554"/>
+                      <wp:lineTo x="21515" y="21554"/>
+                      <wp:lineTo x="21515" y="0"/>
+                      <wp:lineTo x="0" y="0"/>
+                    </wp:wrapPolygon>
+                  </wp:wrapTight>
+                  <wp:docPr id="1768269510" name="Picture 1"/>
+                  <wp:cNvGraphicFramePr>
+                    <a:graphicFrameLocks xmlns:a="http://schemas.openxmlformats.org/drawingml/2006/main" noChangeAspect="1"/>
+                  </wp:cNvGraphicFramePr>
+                  <a:graphic xmlns:a="http://schemas.openxmlformats.org/drawingml/2006/main">
+                    <a:graphicData uri="http://schemas.openxmlformats.org/drawingml/2006/picture">
+                      <pic:pic xmlns:pic="http://schemas.openxmlformats.org/drawingml/2006/picture">
+                        <pic:nvPicPr>
+                          <pic:cNvPr id="1768269510" name="Picture 1768269510"/>
+                          <pic:cNvPicPr/>
+                        </pic:nvPicPr>
+                        <pic:blipFill>
+                          <a:blip r:embed="rId19"/>
+                          <a:stretch>
+                            <a:fillRect/>
+                          </a:stretch>
+                        </pic:blipFill>
+                        <pic:spPr>
+                          <a:xfrm>
+                            <a:off x="0" y="0"/>
+                            <a:ext cx="6120130" cy="5669915"/>
+                          </a:xfrm>
+                          <a:prstGeom prst="rect">
+                            <a:avLst/>
+                          </a:prstGeom>
+                        </pic:spPr>
+                      </pic:pic>
+                    </a:graphicData>
+                  </a:graphic>
+                </wp:anchor>
+              </w:drawing>
             </w:r>
           </w:p>
         </w:tc>
@@ -10518,7 +10568,7 @@
                           <pic:cNvPicPr/>
                         </pic:nvPicPr>
                         <pic:blipFill>
-                          <a:blip r:embed="rId19"/>
+                          <a:blip r:embed="rId20"/>
                           <a:stretch>
                             <a:fillRect/>
                           </a:stretch>
@@ -10573,7 +10623,7 @@
                           <pic:cNvPicPr/>
                         </pic:nvPicPr>
                         <pic:blipFill>
-                          <a:blip r:embed="rId20"/>
+                          <a:blip r:embed="rId21"/>
                           <a:stretch>
                             <a:fillRect/>
                           </a:stretch>
@@ -10649,7 +10699,7 @@
                           <pic:cNvPicPr/>
                         </pic:nvPicPr>
                         <pic:blipFill>
-                          <a:blip r:embed="rId21"/>
+                          <a:blip r:embed="rId22"/>
                           <a:stretch>
                             <a:fillRect/>
                           </a:stretch>
@@ -10720,7 +10770,7 @@
                           <pic:cNvPicPr/>
                         </pic:nvPicPr>
                         <pic:blipFill>
-                          <a:blip r:embed="rId22"/>
+                          <a:blip r:embed="rId23"/>
                           <a:stretch>
                             <a:fillRect/>
                           </a:stretch>
@@ -10888,7 +10938,7 @@
                     </pic:cNvPicPr>
                   </pic:nvPicPr>
                   <pic:blipFill>
-                    <a:blip r:embed="rId23">
+                    <a:blip r:embed="rId24">
                       <a:extLst>
                         <a:ext uri="{28A0092B-C50C-407E-A947-70E740481C1C}">
                           <a14:useLocalDpi xmlns:a14="http://schemas.microsoft.com/office/drawing/2010/main" val="0"/>
@@ -10965,7 +11015,7 @@
                     </pic:cNvPicPr>
                   </pic:nvPicPr>
                   <pic:blipFill>
-                    <a:blip r:embed="rId24">
+                    <a:blip r:embed="rId25">
                       <a:extLst>
                         <a:ext uri="{28A0092B-C50C-407E-A947-70E740481C1C}">
                           <a14:useLocalDpi xmlns:a14="http://schemas.microsoft.com/office/drawing/2010/main" val="0"/>
@@ -16422,6 +16472,17 @@
 </file>
 
 <file path=customXml/item1.xml><?xml version="1.0" encoding="utf-8"?>
+<p:properties xmlns:p="http://schemas.microsoft.com/office/2006/metadata/properties" xmlns:xsi="http://www.w3.org/2001/XMLSchema-instance" xmlns:pc="http://schemas.microsoft.com/office/infopath/2007/PartnerControls">
+  <documentManagement>
+    <lcf76f155ced4ddcb4097134ff3c332f xmlns="d3831626-fde5-4fc8-acc5-9526b66ab2bb">
+      <Terms xmlns="http://schemas.microsoft.com/office/infopath/2007/PartnerControls"/>
+    </lcf76f155ced4ddcb4097134ff3c332f>
+    <TaxCatchAll xmlns="b5314b1c-0f5c-4851-9378-7099df4806ca" xsi:nil="true"/>
+  </documentManagement>
+</p:properties>
+</file>
+
+<file path=customXml/item2.xml><?xml version="1.0" encoding="utf-8"?>
 <ct:contentTypeSchema xmlns:ct="http://schemas.microsoft.com/office/2006/metadata/contentType" xmlns:ma="http://schemas.microsoft.com/office/2006/metadata/properties/metaAttributes" ct:_="" ma:_="" ma:contentTypeName="Document" ma:contentTypeID="0x0101009C12936ABBAE164AB3E3B1E737DB3796" ma:contentTypeVersion="12" ma:contentTypeDescription="Create a new document." ma:contentTypeScope="" ma:versionID="a3c7e968aca90f61141995ffe44e8398">
   <xsd:schema xmlns:xsd="http://www.w3.org/2001/XMLSchema" xmlns:xs="http://www.w3.org/2001/XMLSchema" xmlns:p="http://schemas.microsoft.com/office/2006/metadata/properties" xmlns:ns2="d3831626-fde5-4fc8-acc5-9526b66ab2bb" xmlns:ns3="b5314b1c-0f5c-4851-9378-7099df4806ca" targetNamespace="http://schemas.microsoft.com/office/2006/metadata/properties" ma:root="true" ma:fieldsID="87450be8a9b396dcd3e7509fc153b825" ns2:_="" ns3:_="">
     <xsd:import namespace="d3831626-fde5-4fc8-acc5-9526b66ab2bb"/>
@@ -16622,18 +16683,11 @@
 </ct:contentTypeSchema>
 </file>
 
-<file path=customXml/item2.xml><?xml version="1.0" encoding="utf-8"?>
-<p:properties xmlns:p="http://schemas.microsoft.com/office/2006/metadata/properties" xmlns:xsi="http://www.w3.org/2001/XMLSchema-instance" xmlns:pc="http://schemas.microsoft.com/office/infopath/2007/PartnerControls">
-  <documentManagement>
-    <lcf76f155ced4ddcb4097134ff3c332f xmlns="d3831626-fde5-4fc8-acc5-9526b66ab2bb">
-      <Terms xmlns="http://schemas.microsoft.com/office/infopath/2007/PartnerControls"/>
-    </lcf76f155ced4ddcb4097134ff3c332f>
-    <TaxCatchAll xmlns="b5314b1c-0f5c-4851-9378-7099df4806ca" xsi:nil="true"/>
-  </documentManagement>
-</p:properties>
+<file path=customXml/item3.xml><?xml version="1.0" encoding="utf-8"?>
+<b:Sources xmlns:b="http://schemas.openxmlformats.org/officeDocument/2006/bibliography" xmlns="http://schemas.openxmlformats.org/officeDocument/2006/bibliography" SelectedStyle="\APA.XSL" StyleName="APA"/>
 </file>
 
-<file path=customXml/item3.xml><?xml version="1.0" encoding="utf-8"?>
+<file path=customXml/item4.xml><?xml version="1.0" encoding="utf-8"?>
 <?mso-contentType ?>
 <FormTemplates xmlns="http://schemas.microsoft.com/sharepoint/v3/contenttype/forms">
   <Display>DocumentLibraryForm</Display>
@@ -16642,11 +16696,18 @@
 </FormTemplates>
 </file>
 
-<file path=customXml/item4.xml><?xml version="1.0" encoding="utf-8"?>
-<b:Sources xmlns:b="http://schemas.openxmlformats.org/officeDocument/2006/bibliography" xmlns="http://schemas.openxmlformats.org/officeDocument/2006/bibliography" SelectedStyle="\APA.XSL" StyleName="APA"/>
+<file path=customXml/itemProps1.xml><?xml version="1.0" encoding="utf-8"?>
+<ds:datastoreItem xmlns:ds="http://schemas.openxmlformats.org/officeDocument/2006/customXml" ds:itemID="{EE41A236-5C73-4451-B1B7-A171E48F7377}">
+  <ds:schemaRefs>
+    <ds:schemaRef ds:uri="http://schemas.microsoft.com/office/2006/metadata/properties"/>
+    <ds:schemaRef ds:uri="http://schemas.microsoft.com/office/infopath/2007/PartnerControls"/>
+    <ds:schemaRef ds:uri="d3831626-fde5-4fc8-acc5-9526b66ab2bb"/>
+    <ds:schemaRef ds:uri="b5314b1c-0f5c-4851-9378-7099df4806ca"/>
+  </ds:schemaRefs>
+</ds:datastoreItem>
 </file>
 
-<file path=customXml/itemProps1.xml><?xml version="1.0" encoding="utf-8"?>
+<file path=customXml/itemProps2.xml><?xml version="1.0" encoding="utf-8"?>
 <ds:datastoreItem xmlns:ds="http://schemas.openxmlformats.org/officeDocument/2006/customXml" ds:itemID="{3BB198E8-0F36-4C71-8940-04215BB7641E}">
   <ds:schemaRefs>
     <ds:schemaRef ds:uri="http://schemas.microsoft.com/office/2006/metadata/contentType"/>
@@ -16665,29 +16726,18 @@
 </ds:datastoreItem>
 </file>
 
-<file path=customXml/itemProps2.xml><?xml version="1.0" encoding="utf-8"?>
-<ds:datastoreItem xmlns:ds="http://schemas.openxmlformats.org/officeDocument/2006/customXml" ds:itemID="{EE41A236-5C73-4451-B1B7-A171E48F7377}">
+<file path=customXml/itemProps3.xml><?xml version="1.0" encoding="utf-8"?>
+<ds:datastoreItem xmlns:ds="http://schemas.openxmlformats.org/officeDocument/2006/customXml" ds:itemID="{2BA0B919-FBBB-4BB8-90D2-33E6A0B69F94}">
   <ds:schemaRefs>
-    <ds:schemaRef ds:uri="http://schemas.microsoft.com/office/2006/metadata/properties"/>
-    <ds:schemaRef ds:uri="http://schemas.microsoft.com/office/infopath/2007/PartnerControls"/>
-    <ds:schemaRef ds:uri="d3831626-fde5-4fc8-acc5-9526b66ab2bb"/>
-    <ds:schemaRef ds:uri="b5314b1c-0f5c-4851-9378-7099df4806ca"/>
+    <ds:schemaRef ds:uri="http://schemas.openxmlformats.org/officeDocument/2006/bibliography"/>
   </ds:schemaRefs>
 </ds:datastoreItem>
 </file>
 
-<file path=customXml/itemProps3.xml><?xml version="1.0" encoding="utf-8"?>
+<file path=customXml/itemProps4.xml><?xml version="1.0" encoding="utf-8"?>
 <ds:datastoreItem xmlns:ds="http://schemas.openxmlformats.org/officeDocument/2006/customXml" ds:itemID="{13DB4B30-73AF-4FCD-BA9E-CA11CB4B5807}">
   <ds:schemaRefs>
     <ds:schemaRef ds:uri="http://schemas.microsoft.com/sharepoint/v3/contenttype/forms"/>
   </ds:schemaRefs>
 </ds:datastoreItem>
-</file>
-
-<file path=customXml/itemProps4.xml><?xml version="1.0" encoding="utf-8"?>
-<ds:datastoreItem xmlns:ds="http://schemas.openxmlformats.org/officeDocument/2006/customXml" ds:itemID="{2BA0B919-FBBB-4BB8-90D2-33E6A0B69F94}">
-  <ds:schemaRefs>
-    <ds:schemaRef ds:uri="http://schemas.openxmlformats.org/officeDocument/2006/bibliography"/>
-  </ds:schemaRefs>
-</ds:datastoreItem>
 </file>
</xml_diff>

<commit_message>
Nappien ja tekninen määrittely päivitetty
</commit_message>
<xml_diff>
--- a/Documents/tekninen_maarittely.docx
+++ b/Documents/tekninen_maarittely.docx
@@ -4,7 +4,7 @@
   <w:body>
     <w:p>
       <w:pPr>
-        <w:pStyle w:val="FootnoteText"/>
+        <w:pStyle w:val="Alaviitteenteksti"/>
       </w:pPr>
     </w:p>
     <w:p>
@@ -25,7 +25,7 @@
     </w:p>
     <w:p>
       <w:pPr>
-        <w:pStyle w:val="Header"/>
+        <w:pStyle w:val="Yltunniste"/>
         <w:tabs>
           <w:tab w:val="clear" w:pos="4819"/>
           <w:tab w:val="clear" w:pos="9638"/>
@@ -70,7 +70,7 @@
     </w:p>
     <w:p>
       <w:pPr>
-        <w:pStyle w:val="Heading7"/>
+        <w:pStyle w:val="Otsikko7"/>
         <w:ind w:firstLine="0"/>
         <w:jc w:val="center"/>
       </w:pPr>
@@ -137,7 +137,7 @@
     </w:p>
     <w:p>
       <w:pPr>
-        <w:pStyle w:val="Header"/>
+        <w:pStyle w:val="Yltunniste"/>
         <w:tabs>
           <w:tab w:val="clear" w:pos="4819"/>
           <w:tab w:val="clear" w:pos="9638"/>
@@ -151,7 +151,7 @@
     </w:p>
     <w:p>
       <w:pPr>
-        <w:pStyle w:val="Header"/>
+        <w:pStyle w:val="Yltunniste"/>
         <w:tabs>
           <w:tab w:val="clear" w:pos="4819"/>
           <w:tab w:val="clear" w:pos="9638"/>
@@ -165,7 +165,7 @@
     </w:p>
     <w:p>
       <w:pPr>
-        <w:pStyle w:val="Header"/>
+        <w:pStyle w:val="Yltunniste"/>
         <w:tabs>
           <w:tab w:val="clear" w:pos="4819"/>
           <w:tab w:val="clear" w:pos="9638"/>
@@ -179,7 +179,7 @@
     </w:p>
     <w:p>
       <w:pPr>
-        <w:pStyle w:val="Header"/>
+        <w:pStyle w:val="Yltunniste"/>
         <w:tabs>
           <w:tab w:val="clear" w:pos="4819"/>
           <w:tab w:val="clear" w:pos="9638"/>
@@ -193,7 +193,7 @@
     </w:p>
     <w:p>
       <w:pPr>
-        <w:pStyle w:val="Header"/>
+        <w:pStyle w:val="Yltunniste"/>
         <w:tabs>
           <w:tab w:val="clear" w:pos="4819"/>
           <w:tab w:val="clear" w:pos="9638"/>
@@ -207,7 +207,7 @@
     </w:p>
     <w:p>
       <w:pPr>
-        <w:pStyle w:val="Header"/>
+        <w:pStyle w:val="Yltunniste"/>
         <w:tabs>
           <w:tab w:val="clear" w:pos="4819"/>
           <w:tab w:val="clear" w:pos="9638"/>
@@ -221,7 +221,7 @@
     </w:p>
     <w:p>
       <w:pPr>
-        <w:pStyle w:val="Header"/>
+        <w:pStyle w:val="Yltunniste"/>
         <w:tabs>
           <w:tab w:val="clear" w:pos="4819"/>
           <w:tab w:val="clear" w:pos="9638"/>
@@ -235,7 +235,7 @@
     </w:p>
     <w:tbl>
       <w:tblPr>
-        <w:tblStyle w:val="TableGrid"/>
+        <w:tblStyle w:val="TaulukkoRuudukko"/>
         <w:tblW w:w="0" w:type="auto"/>
         <w:jc w:val="center"/>
         <w:tblLook w:val="04A0" w:firstRow="1" w:lastRow="0" w:firstColumn="1" w:lastColumn="0" w:noHBand="0" w:noVBand="1"/>
@@ -255,7 +255,7 @@
           </w:tcPr>
           <w:p>
             <w:pPr>
-              <w:pStyle w:val="Header"/>
+              <w:pStyle w:val="Yltunniste"/>
               <w:tabs>
                 <w:tab w:val="clear" w:pos="4819"/>
                 <w:tab w:val="clear" w:pos="9638"/>
@@ -287,7 +287,7 @@
           </w:tcPr>
           <w:p>
             <w:pPr>
-              <w:pStyle w:val="Header"/>
+              <w:pStyle w:val="Yltunniste"/>
               <w:tabs>
                 <w:tab w:val="clear" w:pos="4819"/>
                 <w:tab w:val="clear" w:pos="9638"/>
@@ -329,7 +329,7 @@
     </w:tbl>
     <w:p>
       <w:pPr>
-        <w:pStyle w:val="Header"/>
+        <w:pStyle w:val="Yltunniste"/>
         <w:tabs>
           <w:tab w:val="clear" w:pos="4819"/>
           <w:tab w:val="clear" w:pos="9638"/>
@@ -373,7 +373,7 @@
     </w:p>
     <w:tbl>
       <w:tblPr>
-        <w:tblStyle w:val="TableGrid"/>
+        <w:tblStyle w:val="TaulukkoRuudukko"/>
         <w:tblW w:w="0" w:type="auto"/>
         <w:tblLook w:val="04A0" w:firstRow="1" w:lastRow="0" w:firstColumn="1" w:lastColumn="0" w:noHBand="0" w:noVBand="1"/>
       </w:tblPr>
@@ -635,7 +635,7 @@
     </w:p>
     <w:p>
       <w:pPr>
-        <w:pStyle w:val="Heading1"/>
+        <w:pStyle w:val="Otsikko1"/>
         <w:shd w:val="pct10" w:color="auto" w:fill="FFFFFF"/>
         <w:spacing w:after="240"/>
         <w:rPr>
@@ -676,7 +676,7 @@
     </w:p>
     <w:p>
       <w:pPr>
-        <w:pStyle w:val="Header"/>
+        <w:pStyle w:val="Yltunniste"/>
         <w:tabs>
           <w:tab w:val="clear" w:pos="4819"/>
           <w:tab w:val="clear" w:pos="9638"/>
@@ -946,7 +946,7 @@
     </w:p>
     <w:p>
       <w:pPr>
-        <w:pStyle w:val="Heading1"/>
+        <w:pStyle w:val="Otsikko1"/>
         <w:shd w:val="pct10" w:color="auto" w:fill="FFFFFF"/>
         <w:spacing w:after="240"/>
         <w:rPr>
@@ -1079,7 +1079,7 @@
     </w:p>
     <w:tbl>
       <w:tblPr>
-        <w:tblStyle w:val="TableGrid"/>
+        <w:tblStyle w:val="TaulukkoRuudukko"/>
         <w:tblW w:w="9704" w:type="dxa"/>
         <w:tblLook w:val="04A0" w:firstRow="1" w:lastRow="0" w:firstColumn="1" w:lastColumn="0" w:noHBand="0" w:noVBand="1"/>
       </w:tblPr>
@@ -1366,7 +1366,7 @@
     </w:p>
     <w:p>
       <w:pPr>
-        <w:pStyle w:val="ListParagraph"/>
+        <w:pStyle w:val="Luettelokappale"/>
         <w:numPr>
           <w:ilvl w:val="0"/>
           <w:numId w:val="17"/>
@@ -1570,7 +1570,7 @@
     </w:p>
     <w:p>
       <w:pPr>
-        <w:pStyle w:val="ListParagraph"/>
+        <w:pStyle w:val="Luettelokappale"/>
         <w:numPr>
           <w:ilvl w:val="0"/>
           <w:numId w:val="17"/>
@@ -1644,7 +1644,7 @@
     </w:p>
     <w:p>
       <w:pPr>
-        <w:pStyle w:val="ListParagraph"/>
+        <w:pStyle w:val="Luettelokappale"/>
         <w:numPr>
           <w:ilvl w:val="0"/>
           <w:numId w:val="17"/>
@@ -1856,7 +1856,7 @@
       <w:hyperlink r:id="rId12" w:history="1">
         <w:r>
           <w:rPr>
-            <w:rStyle w:val="Hyperlink"/>
+            <w:rStyle w:val="Hyperlinkki"/>
             <w:rFonts w:ascii="Verdana" w:hAnsi="Verdana" w:cs="Verdana"/>
             <w:szCs w:val="20"/>
           </w:rPr>
@@ -1901,7 +1901,7 @@
       <w:hyperlink r:id="rId13" w:history="1">
         <w:r>
           <w:rPr>
-            <w:rStyle w:val="Hyperlink"/>
+            <w:rStyle w:val="Hyperlinkki"/>
             <w:rFonts w:ascii="Verdana" w:hAnsi="Verdana" w:cs="Verdana"/>
             <w:szCs w:val="20"/>
           </w:rPr>
@@ -1942,7 +1942,7 @@
     </w:p>
     <w:p>
       <w:pPr>
-        <w:pStyle w:val="Heading1"/>
+        <w:pStyle w:val="Otsikko1"/>
         <w:shd w:val="pct10" w:color="auto" w:fill="auto"/>
         <w:spacing w:after="240"/>
         <w:rPr>
@@ -2053,7 +2053,7 @@
           </w:tcPr>
           <w:p>
             <w:pPr>
-              <w:pStyle w:val="BodyTextIndent2"/>
+              <w:pStyle w:val="Sisennettyleipteksti2"/>
               <w:spacing w:line="240" w:lineRule="auto"/>
               <w:ind w:left="0"/>
               <w:rPr>
@@ -2084,7 +2084,7 @@
           </w:tcPr>
           <w:p>
             <w:pPr>
-              <w:pStyle w:val="BodyTextIndent2"/>
+              <w:pStyle w:val="Sisennettyleipteksti2"/>
               <w:spacing w:line="240" w:lineRule="auto"/>
               <w:ind w:left="0"/>
               <w:rPr>
@@ -2165,7 +2165,7 @@
           </w:tcPr>
           <w:p>
             <w:pPr>
-              <w:pStyle w:val="BodyText"/>
+              <w:pStyle w:val="Leipteksti"/>
               <w:rPr>
                 <w:color w:val="000000" w:themeColor="text1"/>
                 <w:sz w:val="20"/>
@@ -2188,7 +2188,7 @@
           </w:tcPr>
           <w:p>
             <w:pPr>
-              <w:pStyle w:val="BodyText"/>
+              <w:pStyle w:val="Leipteksti"/>
               <w:rPr>
                 <w:rFonts w:cs="Times New Roman"/>
                 <w:bCs/>
@@ -2271,7 +2271,7 @@
           </w:tcPr>
           <w:p>
             <w:pPr>
-              <w:pStyle w:val="BodyText"/>
+              <w:pStyle w:val="Leipteksti"/>
               <w:rPr>
                 <w:color w:val="000000" w:themeColor="text1"/>
                 <w:sz w:val="20"/>
@@ -2294,7 +2294,7 @@
           </w:tcPr>
           <w:p>
             <w:pPr>
-              <w:pStyle w:val="BodyText"/>
+              <w:pStyle w:val="Leipteksti"/>
               <w:rPr>
                 <w:rFonts w:cs="Times New Roman"/>
                 <w:bCs/>
@@ -2326,7 +2326,7 @@
           </w:tcPr>
           <w:p>
             <w:pPr>
-              <w:pStyle w:val="BodyText"/>
+              <w:pStyle w:val="Leipteksti"/>
               <w:rPr>
                 <w:color w:val="000000" w:themeColor="text1"/>
                 <w:sz w:val="20"/>
@@ -2349,7 +2349,7 @@
           </w:tcPr>
           <w:p>
             <w:pPr>
-              <w:pStyle w:val="BodyText"/>
+              <w:pStyle w:val="Leipteksti"/>
               <w:rPr>
                 <w:rFonts w:cs="Times New Roman"/>
                 <w:bCs/>
@@ -2381,7 +2381,7 @@
           </w:tcPr>
           <w:p>
             <w:pPr>
-              <w:pStyle w:val="BodyText"/>
+              <w:pStyle w:val="Leipteksti"/>
               <w:rPr>
                 <w:color w:val="F2F2F2" w:themeColor="background1" w:themeShade="F2"/>
                 <w:sz w:val="20"/>
@@ -2396,7 +2396,7 @@
           </w:tcPr>
           <w:p>
             <w:pPr>
-              <w:pStyle w:val="BodyText"/>
+              <w:pStyle w:val="Leipteksti"/>
               <w:rPr>
                 <w:rFonts w:cs="Times New Roman"/>
                 <w:bCs/>
@@ -2418,7 +2418,7 @@
           </w:tcPr>
           <w:p>
             <w:pPr>
-              <w:pStyle w:val="BodyText"/>
+              <w:pStyle w:val="Leipteksti"/>
               <w:rPr>
                 <w:color w:val="FF0000"/>
                 <w:sz w:val="20"/>
@@ -2441,7 +2441,7 @@
           </w:tcPr>
           <w:p>
             <w:pPr>
-              <w:pStyle w:val="BodyText"/>
+              <w:pStyle w:val="Leipteksti"/>
               <w:rPr>
                 <w:rFonts w:cs="Times New Roman"/>
                 <w:bCs/>
@@ -2473,7 +2473,7 @@
           </w:tcPr>
           <w:p>
             <w:pPr>
-              <w:pStyle w:val="BodyText"/>
+              <w:pStyle w:val="Leipteksti"/>
               <w:rPr>
                 <w:color w:val="FF0000"/>
                 <w:sz w:val="20"/>
@@ -2496,7 +2496,7 @@
           </w:tcPr>
           <w:p>
             <w:pPr>
-              <w:pStyle w:val="BodyText"/>
+              <w:pStyle w:val="Leipteksti"/>
               <w:rPr>
                 <w:rFonts w:cs="Times New Roman"/>
                 <w:bCs/>
@@ -2755,7 +2755,7 @@
     </w:p>
     <w:tbl>
       <w:tblPr>
-        <w:tblStyle w:val="TableGrid"/>
+        <w:tblStyle w:val="TaulukkoRuudukko"/>
         <w:tblW w:w="10550" w:type="dxa"/>
         <w:tblLook w:val="04A0" w:firstRow="1" w:lastRow="0" w:firstColumn="1" w:lastColumn="0" w:noHBand="0" w:noVBand="1"/>
       </w:tblPr>
@@ -2970,7 +2970,7 @@
           </w:tcPr>
           <w:p>
             <w:pPr>
-              <w:pStyle w:val="Header"/>
+              <w:pStyle w:val="Yltunniste"/>
               <w:tabs>
                 <w:tab w:val="clear" w:pos="4819"/>
                 <w:tab w:val="clear" w:pos="9638"/>
@@ -3001,7 +3001,7 @@
           </w:tcPr>
           <w:p>
             <w:pPr>
-              <w:pStyle w:val="Header"/>
+              <w:pStyle w:val="Yltunniste"/>
               <w:tabs>
                 <w:tab w:val="clear" w:pos="4819"/>
                 <w:tab w:val="clear" w:pos="9638"/>
@@ -3037,7 +3037,7 @@
           </w:tcPr>
           <w:p>
             <w:pPr>
-              <w:pStyle w:val="Header"/>
+              <w:pStyle w:val="Yltunniste"/>
               <w:tabs>
                 <w:tab w:val="clear" w:pos="4819"/>
                 <w:tab w:val="clear" w:pos="9638"/>
@@ -3068,7 +3068,7 @@
           </w:tcPr>
           <w:p>
             <w:pPr>
-              <w:pStyle w:val="Header"/>
+              <w:pStyle w:val="Yltunniste"/>
               <w:tabs>
                 <w:tab w:val="clear" w:pos="4819"/>
                 <w:tab w:val="clear" w:pos="9638"/>
@@ -3124,7 +3124,7 @@
           </w:tcPr>
           <w:p>
             <w:pPr>
-              <w:pStyle w:val="Header"/>
+              <w:pStyle w:val="Yltunniste"/>
               <w:tabs>
                 <w:tab w:val="clear" w:pos="4819"/>
                 <w:tab w:val="clear" w:pos="9638"/>
@@ -3155,7 +3155,7 @@
           </w:tcPr>
           <w:p>
             <w:pPr>
-              <w:pStyle w:val="Header"/>
+              <w:pStyle w:val="Yltunniste"/>
               <w:tabs>
                 <w:tab w:val="clear" w:pos="4819"/>
                 <w:tab w:val="clear" w:pos="9638"/>
@@ -3187,7 +3187,7 @@
           </w:tcPr>
           <w:p>
             <w:pPr>
-              <w:pStyle w:val="Header"/>
+              <w:pStyle w:val="Yltunniste"/>
               <w:tabs>
                 <w:tab w:val="clear" w:pos="4819"/>
                 <w:tab w:val="clear" w:pos="9638"/>
@@ -3218,7 +3218,7 @@
           </w:tcPr>
           <w:p>
             <w:pPr>
-              <w:pStyle w:val="Header"/>
+              <w:pStyle w:val="Yltunniste"/>
               <w:spacing w:line="360" w:lineRule="auto"/>
               <w:jc w:val="both"/>
               <w:rPr>
@@ -3262,7 +3262,7 @@
           </w:tcPr>
           <w:p>
             <w:pPr>
-              <w:pStyle w:val="Header"/>
+              <w:pStyle w:val="Yltunniste"/>
               <w:tabs>
                 <w:tab w:val="clear" w:pos="4819"/>
                 <w:tab w:val="clear" w:pos="9638"/>
@@ -3293,7 +3293,7 @@
           </w:tcPr>
           <w:p>
             <w:pPr>
-              <w:pStyle w:val="Header"/>
+              <w:pStyle w:val="Yltunniste"/>
               <w:numPr>
                 <w:ilvl w:val="0"/>
                 <w:numId w:val="7"/>
@@ -3338,7 +3338,7 @@
           </w:p>
           <w:p>
             <w:pPr>
-              <w:pStyle w:val="Header"/>
+              <w:pStyle w:val="Yltunniste"/>
               <w:numPr>
                 <w:ilvl w:val="0"/>
                 <w:numId w:val="7"/>
@@ -3386,7 +3386,7 @@
           </w:p>
           <w:p>
             <w:pPr>
-              <w:pStyle w:val="Header"/>
+              <w:pStyle w:val="Yltunniste"/>
               <w:numPr>
                 <w:ilvl w:val="0"/>
                 <w:numId w:val="7"/>
@@ -3410,7 +3410,7 @@
           </w:p>
           <w:p>
             <w:pPr>
-              <w:pStyle w:val="Header"/>
+              <w:pStyle w:val="Yltunniste"/>
               <w:spacing w:line="360" w:lineRule="auto"/>
               <w:ind w:left="360"/>
               <w:jc w:val="both"/>
@@ -3462,7 +3462,7 @@
           </w:p>
           <w:p>
             <w:pPr>
-              <w:pStyle w:val="Header"/>
+              <w:pStyle w:val="Yltunniste"/>
               <w:numPr>
                 <w:ilvl w:val="0"/>
                 <w:numId w:val="7"/>
@@ -3510,7 +3510,7 @@
           </w:p>
           <w:p>
             <w:pPr>
-              <w:pStyle w:val="Header"/>
+              <w:pStyle w:val="Yltunniste"/>
               <w:spacing w:line="360" w:lineRule="auto"/>
               <w:ind w:left="360"/>
               <w:jc w:val="both"/>
@@ -3539,7 +3539,7 @@
           </w:p>
           <w:p>
             <w:pPr>
-              <w:pStyle w:val="Header"/>
+              <w:pStyle w:val="Yltunniste"/>
               <w:spacing w:line="360" w:lineRule="auto"/>
               <w:ind w:left="360"/>
               <w:jc w:val="both"/>
@@ -3576,7 +3576,7 @@
           </w:p>
           <w:p>
             <w:pPr>
-              <w:pStyle w:val="Header"/>
+              <w:pStyle w:val="Yltunniste"/>
               <w:numPr>
                 <w:ilvl w:val="0"/>
                 <w:numId w:val="7"/>
@@ -3608,7 +3608,7 @@
           </w:p>
           <w:p>
             <w:pPr>
-              <w:pStyle w:val="Header"/>
+              <w:pStyle w:val="Yltunniste"/>
               <w:numPr>
                 <w:ilvl w:val="0"/>
                 <w:numId w:val="7"/>
@@ -3701,7 +3701,7 @@
           </w:p>
           <w:p>
             <w:pPr>
-              <w:pStyle w:val="Header"/>
+              <w:pStyle w:val="Yltunniste"/>
               <w:numPr>
                 <w:ilvl w:val="0"/>
                 <w:numId w:val="7"/>
@@ -3755,7 +3755,7 @@
           </w:tcPr>
           <w:p>
             <w:pPr>
-              <w:pStyle w:val="Header"/>
+              <w:pStyle w:val="Yltunniste"/>
               <w:tabs>
                 <w:tab w:val="clear" w:pos="4819"/>
                 <w:tab w:val="clear" w:pos="9638"/>
@@ -3786,7 +3786,7 @@
           </w:tcPr>
           <w:p>
             <w:pPr>
-              <w:pStyle w:val="Header"/>
+              <w:pStyle w:val="Yltunniste"/>
               <w:tabs>
                 <w:tab w:val="clear" w:pos="4819"/>
                 <w:tab w:val="clear" w:pos="9638"/>
@@ -3818,7 +3818,7 @@
           </w:tcPr>
           <w:p>
             <w:pPr>
-              <w:pStyle w:val="Header"/>
+              <w:pStyle w:val="Yltunniste"/>
               <w:tabs>
                 <w:tab w:val="clear" w:pos="4819"/>
                 <w:tab w:val="clear" w:pos="9638"/>
@@ -3849,7 +3849,7 @@
           </w:tcPr>
           <w:p>
             <w:pPr>
-              <w:pStyle w:val="Header"/>
+              <w:pStyle w:val="Yltunniste"/>
               <w:tabs>
                 <w:tab w:val="clear" w:pos="4819"/>
                 <w:tab w:val="clear" w:pos="9638"/>
@@ -3901,7 +3901,7 @@
           </w:tcPr>
           <w:p>
             <w:pPr>
-              <w:pStyle w:val="Header"/>
+              <w:pStyle w:val="Yltunniste"/>
               <w:tabs>
                 <w:tab w:val="clear" w:pos="4819"/>
                 <w:tab w:val="clear" w:pos="9638"/>
@@ -3933,7 +3933,7 @@
           </w:tcPr>
           <w:p>
             <w:pPr>
-              <w:pStyle w:val="Header"/>
+              <w:pStyle w:val="Yltunniste"/>
               <w:tabs>
                 <w:tab w:val="clear" w:pos="4819"/>
                 <w:tab w:val="clear" w:pos="9638"/>
@@ -3969,7 +3969,7 @@
           </w:tcPr>
           <w:p>
             <w:pPr>
-              <w:pStyle w:val="Header"/>
+              <w:pStyle w:val="Yltunniste"/>
               <w:tabs>
                 <w:tab w:val="clear" w:pos="4819"/>
                 <w:tab w:val="clear" w:pos="9638"/>
@@ -4000,7 +4000,7 @@
           </w:tcPr>
           <w:p>
             <w:pPr>
-              <w:pStyle w:val="Header"/>
+              <w:pStyle w:val="Yltunniste"/>
               <w:tabs>
                 <w:tab w:val="clear" w:pos="4819"/>
                 <w:tab w:val="clear" w:pos="9638"/>
@@ -4032,7 +4032,7 @@
           </w:tcPr>
           <w:p>
             <w:pPr>
-              <w:pStyle w:val="Header"/>
+              <w:pStyle w:val="Yltunniste"/>
               <w:tabs>
                 <w:tab w:val="clear" w:pos="4819"/>
                 <w:tab w:val="clear" w:pos="9638"/>
@@ -4063,7 +4063,7 @@
           </w:tcPr>
           <w:p>
             <w:pPr>
-              <w:pStyle w:val="Header"/>
+              <w:pStyle w:val="Yltunniste"/>
               <w:tabs>
                 <w:tab w:val="clear" w:pos="4819"/>
                 <w:tab w:val="clear" w:pos="9638"/>
@@ -4111,7 +4111,7 @@
           </w:tcPr>
           <w:p>
             <w:pPr>
-              <w:pStyle w:val="Header"/>
+              <w:pStyle w:val="Yltunniste"/>
               <w:tabs>
                 <w:tab w:val="clear" w:pos="4819"/>
                 <w:tab w:val="clear" w:pos="9638"/>
@@ -4142,7 +4142,7 @@
           </w:tcPr>
           <w:p>
             <w:pPr>
-              <w:pStyle w:val="Header"/>
+              <w:pStyle w:val="Yltunniste"/>
               <w:tabs>
                 <w:tab w:val="clear" w:pos="4819"/>
                 <w:tab w:val="clear" w:pos="9638"/>
@@ -4190,7 +4190,7 @@
           </w:tcPr>
           <w:p>
             <w:pPr>
-              <w:pStyle w:val="Header"/>
+              <w:pStyle w:val="Yltunniste"/>
               <w:tabs>
                 <w:tab w:val="clear" w:pos="4819"/>
                 <w:tab w:val="clear" w:pos="9638"/>
@@ -4221,7 +4221,7 @@
           </w:tcPr>
           <w:p>
             <w:pPr>
-              <w:pStyle w:val="Header"/>
+              <w:pStyle w:val="Yltunniste"/>
               <w:tabs>
                 <w:tab w:val="clear" w:pos="4819"/>
                 <w:tab w:val="clear" w:pos="9638"/>
@@ -4253,7 +4253,7 @@
           </w:p>
           <w:p>
             <w:pPr>
-              <w:pStyle w:val="Header"/>
+              <w:pStyle w:val="Yltunniste"/>
               <w:tabs>
                 <w:tab w:val="clear" w:pos="4819"/>
                 <w:tab w:val="clear" w:pos="9638"/>
@@ -4277,7 +4277,7 @@
           </w:p>
           <w:p>
             <w:pPr>
-              <w:pStyle w:val="Header"/>
+              <w:pStyle w:val="Yltunniste"/>
               <w:tabs>
                 <w:tab w:val="clear" w:pos="4819"/>
                 <w:tab w:val="clear" w:pos="9638"/>
@@ -4317,7 +4317,7 @@
           </w:p>
           <w:p>
             <w:pPr>
-              <w:pStyle w:val="Header"/>
+              <w:pStyle w:val="Yltunniste"/>
               <w:tabs>
                 <w:tab w:val="clear" w:pos="4819"/>
                 <w:tab w:val="clear" w:pos="9638"/>
@@ -4411,7 +4411,7 @@
           </w:tcPr>
           <w:p>
             <w:pPr>
-              <w:pStyle w:val="Header"/>
+              <w:pStyle w:val="Yltunniste"/>
               <w:tabs>
                 <w:tab w:val="clear" w:pos="4819"/>
                 <w:tab w:val="clear" w:pos="9638"/>
@@ -4442,7 +4442,7 @@
           </w:tcPr>
           <w:p>
             <w:pPr>
-              <w:pStyle w:val="Header"/>
+              <w:pStyle w:val="Yltunniste"/>
               <w:tabs>
                 <w:tab w:val="clear" w:pos="4819"/>
                 <w:tab w:val="clear" w:pos="9638"/>
@@ -4469,7 +4469,7 @@
     </w:tbl>
     <w:p>
       <w:pPr>
-        <w:pStyle w:val="Header"/>
+        <w:pStyle w:val="Yltunniste"/>
         <w:tabs>
           <w:tab w:val="clear" w:pos="4819"/>
           <w:tab w:val="clear" w:pos="9638"/>
@@ -4483,7 +4483,7 @@
     </w:p>
     <w:p>
       <w:pPr>
-        <w:pStyle w:val="Header"/>
+        <w:pStyle w:val="Yltunniste"/>
         <w:tabs>
           <w:tab w:val="clear" w:pos="4819"/>
           <w:tab w:val="clear" w:pos="9638"/>
@@ -4499,7 +4499,7 @@
     </w:p>
     <w:p>
       <w:pPr>
-        <w:pStyle w:val="Header"/>
+        <w:pStyle w:val="Yltunniste"/>
         <w:tabs>
           <w:tab w:val="clear" w:pos="4819"/>
           <w:tab w:val="clear" w:pos="9638"/>
@@ -4515,7 +4515,7 @@
     </w:p>
     <w:p>
       <w:pPr>
-        <w:pStyle w:val="Header"/>
+        <w:pStyle w:val="Yltunniste"/>
         <w:tabs>
           <w:tab w:val="clear" w:pos="4819"/>
           <w:tab w:val="clear" w:pos="9638"/>
@@ -4530,7 +4530,7 @@
     </w:p>
     <w:p>
       <w:pPr>
-        <w:pStyle w:val="Header"/>
+        <w:pStyle w:val="Yltunniste"/>
         <w:tabs>
           <w:tab w:val="clear" w:pos="4819"/>
           <w:tab w:val="clear" w:pos="9638"/>
@@ -4576,7 +4576,7 @@
           </w:tcPr>
           <w:p>
             <w:pPr>
-              <w:pStyle w:val="Header"/>
+              <w:pStyle w:val="Yltunniste"/>
               <w:tabs>
                 <w:tab w:val="clear" w:pos="4819"/>
                 <w:tab w:val="clear" w:pos="9638"/>
@@ -4608,7 +4608,7 @@
           </w:tcPr>
           <w:p>
             <w:pPr>
-              <w:pStyle w:val="Header"/>
+              <w:pStyle w:val="Yltunniste"/>
               <w:tabs>
                 <w:tab w:val="clear" w:pos="4819"/>
                 <w:tab w:val="clear" w:pos="9638"/>
@@ -4644,7 +4644,7 @@
           </w:tcPr>
           <w:p>
             <w:pPr>
-              <w:pStyle w:val="Header"/>
+              <w:pStyle w:val="Yltunniste"/>
               <w:tabs>
                 <w:tab w:val="clear" w:pos="4819"/>
                 <w:tab w:val="clear" w:pos="9638"/>
@@ -4675,7 +4675,7 @@
           </w:tcPr>
           <w:p>
             <w:pPr>
-              <w:pStyle w:val="Header"/>
+              <w:pStyle w:val="Yltunniste"/>
               <w:tabs>
                 <w:tab w:val="clear" w:pos="4819"/>
                 <w:tab w:val="clear" w:pos="9638"/>
@@ -4707,7 +4707,7 @@
           </w:tcPr>
           <w:p>
             <w:pPr>
-              <w:pStyle w:val="Header"/>
+              <w:pStyle w:val="Yltunniste"/>
               <w:tabs>
                 <w:tab w:val="clear" w:pos="4819"/>
                 <w:tab w:val="clear" w:pos="9638"/>
@@ -4738,7 +4738,7 @@
           </w:tcPr>
           <w:p>
             <w:pPr>
-              <w:pStyle w:val="Header"/>
+              <w:pStyle w:val="Yltunniste"/>
               <w:tabs>
                 <w:tab w:val="clear" w:pos="4819"/>
                 <w:tab w:val="clear" w:pos="9638"/>
@@ -4770,7 +4770,7 @@
           </w:tcPr>
           <w:p>
             <w:pPr>
-              <w:pStyle w:val="Header"/>
+              <w:pStyle w:val="Yltunniste"/>
               <w:tabs>
                 <w:tab w:val="clear" w:pos="4819"/>
                 <w:tab w:val="clear" w:pos="9638"/>
@@ -4801,7 +4801,7 @@
           </w:tcPr>
           <w:p>
             <w:pPr>
-              <w:pStyle w:val="Header"/>
+              <w:pStyle w:val="Yltunniste"/>
               <w:tabs>
                 <w:tab w:val="clear" w:pos="4819"/>
                 <w:tab w:val="clear" w:pos="9638"/>
@@ -4867,7 +4867,7 @@
           </w:tcPr>
           <w:p>
             <w:pPr>
-              <w:pStyle w:val="Header"/>
+              <w:pStyle w:val="Yltunniste"/>
               <w:tabs>
                 <w:tab w:val="clear" w:pos="4819"/>
                 <w:tab w:val="clear" w:pos="9638"/>
@@ -4898,7 +4898,7 @@
           </w:tcPr>
           <w:p>
             <w:pPr>
-              <w:pStyle w:val="Header"/>
+              <w:pStyle w:val="Yltunniste"/>
               <w:tabs>
                 <w:tab w:val="clear" w:pos="4819"/>
                 <w:tab w:val="clear" w:pos="9638"/>
@@ -4930,7 +4930,7 @@
           </w:p>
           <w:p>
             <w:pPr>
-              <w:pStyle w:val="Header"/>
+              <w:pStyle w:val="Yltunniste"/>
               <w:tabs>
                 <w:tab w:val="clear" w:pos="4819"/>
                 <w:tab w:val="clear" w:pos="9638"/>
@@ -4970,7 +4970,7 @@
           </w:p>
           <w:p>
             <w:pPr>
-              <w:pStyle w:val="Header"/>
+              <w:pStyle w:val="Yltunniste"/>
               <w:tabs>
                 <w:tab w:val="clear" w:pos="4819"/>
                 <w:tab w:val="clear" w:pos="9638"/>
@@ -4994,7 +4994,7 @@
           </w:p>
           <w:p>
             <w:pPr>
-              <w:pStyle w:val="Header"/>
+              <w:pStyle w:val="Yltunniste"/>
               <w:tabs>
                 <w:tab w:val="clear" w:pos="4819"/>
                 <w:tab w:val="clear" w:pos="9638"/>
@@ -5034,7 +5034,7 @@
           </w:p>
           <w:p>
             <w:pPr>
-              <w:pStyle w:val="Header"/>
+              <w:pStyle w:val="Yltunniste"/>
               <w:tabs>
                 <w:tab w:val="clear" w:pos="4819"/>
                 <w:tab w:val="clear" w:pos="9638"/>
@@ -5096,7 +5096,7 @@
           </w:tcPr>
           <w:p>
             <w:pPr>
-              <w:pStyle w:val="Header"/>
+              <w:pStyle w:val="Yltunniste"/>
               <w:tabs>
                 <w:tab w:val="clear" w:pos="4819"/>
                 <w:tab w:val="clear" w:pos="9638"/>
@@ -5127,7 +5127,7 @@
           </w:tcPr>
           <w:p>
             <w:pPr>
-              <w:pStyle w:val="Header"/>
+              <w:pStyle w:val="Yltunniste"/>
               <w:tabs>
                 <w:tab w:val="clear" w:pos="4819"/>
                 <w:tab w:val="clear" w:pos="9638"/>
@@ -5245,7 +5245,7 @@
           </w:tcPr>
           <w:p>
             <w:pPr>
-              <w:pStyle w:val="Header"/>
+              <w:pStyle w:val="Yltunniste"/>
               <w:tabs>
                 <w:tab w:val="clear" w:pos="4819"/>
                 <w:tab w:val="clear" w:pos="9638"/>
@@ -5276,7 +5276,7 @@
           </w:tcPr>
           <w:p>
             <w:pPr>
-              <w:pStyle w:val="Header"/>
+              <w:pStyle w:val="Yltunniste"/>
               <w:tabs>
                 <w:tab w:val="clear" w:pos="4819"/>
                 <w:tab w:val="clear" w:pos="9638"/>
@@ -5312,7 +5312,7 @@
           </w:tcPr>
           <w:p>
             <w:pPr>
-              <w:pStyle w:val="Header"/>
+              <w:pStyle w:val="Yltunniste"/>
               <w:tabs>
                 <w:tab w:val="clear" w:pos="4819"/>
                 <w:tab w:val="clear" w:pos="9638"/>
@@ -5343,7 +5343,7 @@
           </w:tcPr>
           <w:p>
             <w:pPr>
-              <w:pStyle w:val="Header"/>
+              <w:pStyle w:val="Yltunniste"/>
               <w:tabs>
                 <w:tab w:val="clear" w:pos="4819"/>
                 <w:tab w:val="clear" w:pos="9638"/>
@@ -5375,7 +5375,7 @@
           </w:tcPr>
           <w:p>
             <w:pPr>
-              <w:pStyle w:val="Header"/>
+              <w:pStyle w:val="Yltunniste"/>
               <w:tabs>
                 <w:tab w:val="clear" w:pos="4819"/>
                 <w:tab w:val="clear" w:pos="9638"/>
@@ -5406,7 +5406,7 @@
           </w:tcPr>
           <w:p>
             <w:pPr>
-              <w:pStyle w:val="Header"/>
+              <w:pStyle w:val="Yltunniste"/>
               <w:tabs>
                 <w:tab w:val="clear" w:pos="4819"/>
                 <w:tab w:val="clear" w:pos="9638"/>
@@ -5438,7 +5438,7 @@
           </w:tcPr>
           <w:p>
             <w:pPr>
-              <w:pStyle w:val="Header"/>
+              <w:pStyle w:val="Yltunniste"/>
               <w:tabs>
                 <w:tab w:val="clear" w:pos="4819"/>
                 <w:tab w:val="clear" w:pos="9638"/>
@@ -5469,7 +5469,7 @@
           </w:tcPr>
           <w:p>
             <w:pPr>
-              <w:pStyle w:val="Header"/>
+              <w:pStyle w:val="Yltunniste"/>
               <w:tabs>
                 <w:tab w:val="clear" w:pos="4819"/>
                 <w:tab w:val="clear" w:pos="9638"/>
@@ -5517,7 +5517,7 @@
           </w:tcPr>
           <w:p>
             <w:pPr>
-              <w:pStyle w:val="Header"/>
+              <w:pStyle w:val="Yltunniste"/>
               <w:tabs>
                 <w:tab w:val="clear" w:pos="4819"/>
                 <w:tab w:val="clear" w:pos="9638"/>
@@ -5548,7 +5548,7 @@
           </w:tcPr>
           <w:p>
             <w:pPr>
-              <w:pStyle w:val="Header"/>
+              <w:pStyle w:val="Yltunniste"/>
               <w:tabs>
                 <w:tab w:val="clear" w:pos="4819"/>
                 <w:tab w:val="clear" w:pos="9638"/>
@@ -5580,7 +5580,7 @@
           </w:p>
           <w:p>
             <w:pPr>
-              <w:pStyle w:val="Header"/>
+              <w:pStyle w:val="Yltunniste"/>
               <w:tabs>
                 <w:tab w:val="clear" w:pos="4819"/>
                 <w:tab w:val="clear" w:pos="9638"/>
@@ -5652,7 +5652,7 @@
           </w:p>
           <w:p>
             <w:pPr>
-              <w:pStyle w:val="Header"/>
+              <w:pStyle w:val="Yltunniste"/>
               <w:tabs>
                 <w:tab w:val="clear" w:pos="4819"/>
                 <w:tab w:val="clear" w:pos="9638"/>
@@ -5676,7 +5676,7 @@
           </w:p>
           <w:p>
             <w:pPr>
-              <w:pStyle w:val="Header"/>
+              <w:pStyle w:val="Yltunniste"/>
               <w:tabs>
                 <w:tab w:val="clear" w:pos="4819"/>
                 <w:tab w:val="clear" w:pos="9638"/>
@@ -5700,7 +5700,7 @@
           </w:p>
           <w:p>
             <w:pPr>
-              <w:pStyle w:val="Header"/>
+              <w:pStyle w:val="Yltunniste"/>
               <w:tabs>
                 <w:tab w:val="clear" w:pos="4819"/>
                 <w:tab w:val="clear" w:pos="9638"/>
@@ -5748,7 +5748,7 @@
           </w:tcPr>
           <w:p>
             <w:pPr>
-              <w:pStyle w:val="Header"/>
+              <w:pStyle w:val="Yltunniste"/>
               <w:tabs>
                 <w:tab w:val="clear" w:pos="4819"/>
                 <w:tab w:val="clear" w:pos="9638"/>
@@ -5779,7 +5779,7 @@
           </w:tcPr>
           <w:p>
             <w:pPr>
-              <w:pStyle w:val="Header"/>
+              <w:pStyle w:val="Yltunniste"/>
               <w:tabs>
                 <w:tab w:val="clear" w:pos="4819"/>
                 <w:tab w:val="clear" w:pos="9638"/>
@@ -5876,7 +5876,7 @@
           </w:tcPr>
           <w:p>
             <w:pPr>
-              <w:pStyle w:val="Header"/>
+              <w:pStyle w:val="Yltunniste"/>
               <w:tabs>
                 <w:tab w:val="clear" w:pos="4819"/>
                 <w:tab w:val="clear" w:pos="9638"/>
@@ -5914,7 +5914,7 @@
           </w:tcPr>
           <w:p>
             <w:pPr>
-              <w:pStyle w:val="Header"/>
+              <w:pStyle w:val="Yltunniste"/>
               <w:tabs>
                 <w:tab w:val="clear" w:pos="4819"/>
                 <w:tab w:val="clear" w:pos="9638"/>
@@ -5950,7 +5950,7 @@
           </w:tcPr>
           <w:p>
             <w:pPr>
-              <w:pStyle w:val="Header"/>
+              <w:pStyle w:val="Yltunniste"/>
               <w:tabs>
                 <w:tab w:val="clear" w:pos="4819"/>
                 <w:tab w:val="clear" w:pos="9638"/>
@@ -5981,7 +5981,7 @@
           </w:tcPr>
           <w:p>
             <w:pPr>
-              <w:pStyle w:val="Header"/>
+              <w:pStyle w:val="Yltunniste"/>
               <w:tabs>
                 <w:tab w:val="clear" w:pos="4819"/>
                 <w:tab w:val="clear" w:pos="9638"/>
@@ -6013,7 +6013,7 @@
           </w:tcPr>
           <w:p>
             <w:pPr>
-              <w:pStyle w:val="Header"/>
+              <w:pStyle w:val="Yltunniste"/>
               <w:tabs>
                 <w:tab w:val="clear" w:pos="4819"/>
                 <w:tab w:val="clear" w:pos="9638"/>
@@ -6044,7 +6044,7 @@
           </w:tcPr>
           <w:p>
             <w:pPr>
-              <w:pStyle w:val="Header"/>
+              <w:pStyle w:val="Yltunniste"/>
               <w:tabs>
                 <w:tab w:val="clear" w:pos="4819"/>
                 <w:tab w:val="clear" w:pos="9638"/>
@@ -6076,7 +6076,7 @@
           </w:tcPr>
           <w:p>
             <w:pPr>
-              <w:pStyle w:val="Header"/>
+              <w:pStyle w:val="Yltunniste"/>
               <w:tabs>
                 <w:tab w:val="clear" w:pos="4819"/>
                 <w:tab w:val="clear" w:pos="9638"/>
@@ -6107,7 +6107,7 @@
           </w:tcPr>
           <w:p>
             <w:pPr>
-              <w:pStyle w:val="Header"/>
+              <w:pStyle w:val="Yltunniste"/>
               <w:tabs>
                 <w:tab w:val="clear" w:pos="4819"/>
                 <w:tab w:val="clear" w:pos="9638"/>
@@ -6173,7 +6173,7 @@
           </w:tcPr>
           <w:p>
             <w:pPr>
-              <w:pStyle w:val="Header"/>
+              <w:pStyle w:val="Yltunniste"/>
               <w:tabs>
                 <w:tab w:val="clear" w:pos="4819"/>
                 <w:tab w:val="clear" w:pos="9638"/>
@@ -6204,7 +6204,7 @@
           </w:tcPr>
           <w:p>
             <w:pPr>
-              <w:pStyle w:val="Header"/>
+              <w:pStyle w:val="Yltunniste"/>
               <w:tabs>
                 <w:tab w:val="clear" w:pos="4819"/>
                 <w:tab w:val="clear" w:pos="9638"/>
@@ -6236,7 +6236,7 @@
           </w:p>
           <w:p>
             <w:pPr>
-              <w:pStyle w:val="Header"/>
+              <w:pStyle w:val="Yltunniste"/>
               <w:tabs>
                 <w:tab w:val="clear" w:pos="4819"/>
                 <w:tab w:val="clear" w:pos="9638"/>
@@ -6260,7 +6260,7 @@
           </w:p>
           <w:p>
             <w:pPr>
-              <w:pStyle w:val="Header"/>
+              <w:pStyle w:val="Yltunniste"/>
               <w:tabs>
                 <w:tab w:val="clear" w:pos="4819"/>
                 <w:tab w:val="clear" w:pos="9638"/>
@@ -6292,7 +6292,7 @@
           </w:tcPr>
           <w:p>
             <w:pPr>
-              <w:pStyle w:val="Header"/>
+              <w:pStyle w:val="Yltunniste"/>
               <w:tabs>
                 <w:tab w:val="clear" w:pos="4819"/>
                 <w:tab w:val="clear" w:pos="9638"/>
@@ -6323,7 +6323,7 @@
           </w:tcPr>
           <w:p>
             <w:pPr>
-              <w:pStyle w:val="Header"/>
+              <w:pStyle w:val="Yltunniste"/>
               <w:tabs>
                 <w:tab w:val="clear" w:pos="4819"/>
                 <w:tab w:val="clear" w:pos="9638"/>
@@ -6394,7 +6394,7 @@
     </w:p>
     <w:p>
       <w:pPr>
-        <w:pStyle w:val="Header"/>
+        <w:pStyle w:val="Yltunniste"/>
         <w:tabs>
           <w:tab w:val="clear" w:pos="4819"/>
           <w:tab w:val="clear" w:pos="9638"/>
@@ -6433,7 +6433,7 @@
           </w:tcPr>
           <w:p>
             <w:pPr>
-              <w:pStyle w:val="Header"/>
+              <w:pStyle w:val="Yltunniste"/>
               <w:tabs>
                 <w:tab w:val="clear" w:pos="4819"/>
                 <w:tab w:val="clear" w:pos="9638"/>
@@ -6466,7 +6466,7 @@
           </w:tcPr>
           <w:p>
             <w:pPr>
-              <w:pStyle w:val="Header"/>
+              <w:pStyle w:val="Yltunniste"/>
               <w:tabs>
                 <w:tab w:val="clear" w:pos="4819"/>
                 <w:tab w:val="clear" w:pos="9638"/>
@@ -6493,7 +6493,7 @@
           </w:tcPr>
           <w:p>
             <w:pPr>
-              <w:pStyle w:val="Header"/>
+              <w:pStyle w:val="Yltunniste"/>
               <w:tabs>
                 <w:tab w:val="clear" w:pos="4819"/>
                 <w:tab w:val="clear" w:pos="9638"/>
@@ -6525,7 +6525,7 @@
           </w:tcPr>
           <w:p>
             <w:pPr>
-              <w:pStyle w:val="Header"/>
+              <w:pStyle w:val="Yltunniste"/>
               <w:tabs>
                 <w:tab w:val="clear" w:pos="4819"/>
                 <w:tab w:val="clear" w:pos="9638"/>
@@ -6550,7 +6550,7 @@
           </w:tcPr>
           <w:p>
             <w:pPr>
-              <w:pStyle w:val="Header"/>
+              <w:pStyle w:val="Yltunniste"/>
               <w:tabs>
                 <w:tab w:val="clear" w:pos="4819"/>
                 <w:tab w:val="clear" w:pos="9638"/>
@@ -6582,7 +6582,7 @@
           </w:tcPr>
           <w:p>
             <w:pPr>
-              <w:pStyle w:val="Header"/>
+              <w:pStyle w:val="Yltunniste"/>
               <w:tabs>
                 <w:tab w:val="clear" w:pos="4819"/>
                 <w:tab w:val="clear" w:pos="9638"/>
@@ -6607,7 +6607,7 @@
           </w:tcPr>
           <w:p>
             <w:pPr>
-              <w:pStyle w:val="Header"/>
+              <w:pStyle w:val="Yltunniste"/>
               <w:tabs>
                 <w:tab w:val="clear" w:pos="4819"/>
                 <w:tab w:val="clear" w:pos="9638"/>
@@ -6639,7 +6639,7 @@
           </w:tcPr>
           <w:p>
             <w:pPr>
-              <w:pStyle w:val="Header"/>
+              <w:pStyle w:val="Yltunniste"/>
               <w:tabs>
                 <w:tab w:val="clear" w:pos="4819"/>
                 <w:tab w:val="clear" w:pos="9638"/>
@@ -6664,7 +6664,7 @@
           </w:tcPr>
           <w:p>
             <w:pPr>
-              <w:pStyle w:val="Header"/>
+              <w:pStyle w:val="Yltunniste"/>
               <w:tabs>
                 <w:tab w:val="clear" w:pos="4819"/>
                 <w:tab w:val="clear" w:pos="9638"/>
@@ -6696,7 +6696,7 @@
           </w:tcPr>
           <w:p>
             <w:pPr>
-              <w:pStyle w:val="Header"/>
+              <w:pStyle w:val="Yltunniste"/>
               <w:tabs>
                 <w:tab w:val="clear" w:pos="4819"/>
                 <w:tab w:val="clear" w:pos="9638"/>
@@ -6720,7 +6720,7 @@
           </w:tcPr>
           <w:p>
             <w:pPr>
-              <w:pStyle w:val="Header"/>
+              <w:pStyle w:val="Yltunniste"/>
               <w:tabs>
                 <w:tab w:val="clear" w:pos="4819"/>
                 <w:tab w:val="clear" w:pos="9638"/>
@@ -6752,7 +6752,7 @@
           </w:tcPr>
           <w:p>
             <w:pPr>
-              <w:pStyle w:val="Header"/>
+              <w:pStyle w:val="Yltunniste"/>
               <w:tabs>
                 <w:tab w:val="clear" w:pos="4819"/>
                 <w:tab w:val="clear" w:pos="9638"/>
@@ -6777,7 +6777,7 @@
           </w:tcPr>
           <w:p>
             <w:pPr>
-              <w:pStyle w:val="Header"/>
+              <w:pStyle w:val="Yltunniste"/>
               <w:tabs>
                 <w:tab w:val="clear" w:pos="4819"/>
                 <w:tab w:val="clear" w:pos="9638"/>
@@ -6810,7 +6810,7 @@
           </w:tcPr>
           <w:p>
             <w:pPr>
-              <w:pStyle w:val="Header"/>
+              <w:pStyle w:val="Yltunniste"/>
               <w:tabs>
                 <w:tab w:val="clear" w:pos="4819"/>
                 <w:tab w:val="clear" w:pos="9638"/>
@@ -6839,7 +6839,7 @@
     </w:tbl>
     <w:p>
       <w:pPr>
-        <w:pStyle w:val="Header"/>
+        <w:pStyle w:val="Yltunniste"/>
         <w:tabs>
           <w:tab w:val="clear" w:pos="4819"/>
           <w:tab w:val="clear" w:pos="9638"/>
@@ -6854,7 +6854,7 @@
     </w:p>
     <w:p>
       <w:pPr>
-        <w:pStyle w:val="Header"/>
+        <w:pStyle w:val="Yltunniste"/>
         <w:tabs>
           <w:tab w:val="clear" w:pos="4819"/>
           <w:tab w:val="clear" w:pos="9638"/>
@@ -6884,7 +6884,7 @@
     </w:p>
     <w:p>
       <w:pPr>
-        <w:pStyle w:val="Heading1"/>
+        <w:pStyle w:val="Otsikko1"/>
         <w:shd w:val="pct10" w:color="auto" w:fill="auto"/>
         <w:spacing w:after="240"/>
         <w:rPr>
@@ -6989,7 +6989,7 @@
     </w:p>
     <w:p>
       <w:pPr>
-        <w:pStyle w:val="Heading2"/>
+        <w:pStyle w:val="Otsikko2"/>
         <w:spacing w:after="120" w:line="360" w:lineRule="auto"/>
         <w:jc w:val="both"/>
         <w:rPr>
@@ -7388,7 +7388,7 @@
     </w:p>
     <w:tbl>
       <w:tblPr>
-        <w:tblStyle w:val="TableGrid"/>
+        <w:tblStyle w:val="TaulukkoRuudukko"/>
         <w:tblW w:w="0" w:type="auto"/>
         <w:tblLook w:val="04A0" w:firstRow="1" w:lastRow="0" w:firstColumn="1" w:lastColumn="0" w:noHBand="0" w:noVBand="1"/>
       </w:tblPr>
@@ -7423,7 +7423,7 @@
           </w:p>
           <w:p>
             <w:pPr>
-              <w:pStyle w:val="ListParagraph"/>
+              <w:pStyle w:val="Luettelokappale"/>
               <w:numPr>
                 <w:ilvl w:val="1"/>
                 <w:numId w:val="2"/>
@@ -7449,7 +7449,7 @@
           </w:p>
           <w:p>
             <w:pPr>
-              <w:pStyle w:val="ListParagraph"/>
+              <w:pStyle w:val="Luettelokappale"/>
               <w:numPr>
                 <w:ilvl w:val="1"/>
                 <w:numId w:val="2"/>
@@ -7475,7 +7475,7 @@
           </w:p>
           <w:p>
             <w:pPr>
-              <w:pStyle w:val="ListParagraph"/>
+              <w:pStyle w:val="Luettelokappale"/>
               <w:numPr>
                 <w:ilvl w:val="1"/>
                 <w:numId w:val="2"/>
@@ -7501,7 +7501,7 @@
           </w:p>
           <w:p>
             <w:pPr>
-              <w:pStyle w:val="ListParagraph"/>
+              <w:pStyle w:val="Luettelokappale"/>
               <w:numPr>
                 <w:ilvl w:val="1"/>
                 <w:numId w:val="2"/>
@@ -7553,7 +7553,7 @@
           </w:p>
           <w:p>
             <w:pPr>
-              <w:pStyle w:val="ListParagraph"/>
+              <w:pStyle w:val="Luettelokappale"/>
               <w:numPr>
                 <w:ilvl w:val="1"/>
                 <w:numId w:val="2"/>
@@ -7579,7 +7579,7 @@
           </w:p>
           <w:p>
             <w:pPr>
-              <w:pStyle w:val="ListParagraph"/>
+              <w:pStyle w:val="Luettelokappale"/>
               <w:numPr>
                 <w:ilvl w:val="1"/>
                 <w:numId w:val="2"/>
@@ -7643,7 +7643,7 @@
           </w:p>
           <w:p>
             <w:pPr>
-              <w:pStyle w:val="ListParagraph"/>
+              <w:pStyle w:val="Luettelokappale"/>
               <w:numPr>
                 <w:ilvl w:val="1"/>
                 <w:numId w:val="2"/>
@@ -7669,7 +7669,7 @@
           </w:p>
           <w:p>
             <w:pPr>
-              <w:pStyle w:val="ListParagraph"/>
+              <w:pStyle w:val="Luettelokappale"/>
               <w:numPr>
                 <w:ilvl w:val="1"/>
                 <w:numId w:val="2"/>
@@ -7721,7 +7721,7 @@
           </w:p>
           <w:p>
             <w:pPr>
-              <w:pStyle w:val="ListParagraph"/>
+              <w:pStyle w:val="Luettelokappale"/>
               <w:numPr>
                 <w:ilvl w:val="1"/>
                 <w:numId w:val="2"/>
@@ -7747,7 +7747,7 @@
           </w:p>
           <w:p>
             <w:pPr>
-              <w:pStyle w:val="ListParagraph"/>
+              <w:pStyle w:val="Luettelokappale"/>
               <w:numPr>
                 <w:ilvl w:val="1"/>
                 <w:numId w:val="2"/>
@@ -7773,7 +7773,7 @@
           </w:p>
           <w:p>
             <w:pPr>
-              <w:pStyle w:val="ListParagraph"/>
+              <w:pStyle w:val="Luettelokappale"/>
               <w:numPr>
                 <w:ilvl w:val="1"/>
                 <w:numId w:val="2"/>
@@ -7799,7 +7799,7 @@
           </w:p>
           <w:p>
             <w:pPr>
-              <w:pStyle w:val="ListParagraph"/>
+              <w:pStyle w:val="Luettelokappale"/>
               <w:numPr>
                 <w:ilvl w:val="1"/>
                 <w:numId w:val="2"/>
@@ -7825,7 +7825,7 @@
           </w:p>
           <w:p>
             <w:pPr>
-              <w:pStyle w:val="ListParagraph"/>
+              <w:pStyle w:val="Luettelokappale"/>
               <w:numPr>
                 <w:ilvl w:val="1"/>
                 <w:numId w:val="2"/>
@@ -7989,7 +7989,7 @@
     </w:p>
     <w:tbl>
       <w:tblPr>
-        <w:tblStyle w:val="TableGrid"/>
+        <w:tblStyle w:val="TaulukkoRuudukko"/>
         <w:tblW w:w="9842" w:type="dxa"/>
         <w:tblLook w:val="04A0" w:firstRow="1" w:lastRow="0" w:firstColumn="1" w:lastColumn="0" w:noHBand="0" w:noVBand="1"/>
       </w:tblPr>
@@ -8006,7 +8006,7 @@
           </w:tcPr>
           <w:p>
             <w:pPr>
-              <w:pStyle w:val="Header"/>
+              <w:pStyle w:val="Yltunniste"/>
               <w:tabs>
                 <w:tab w:val="clear" w:pos="4819"/>
                 <w:tab w:val="clear" w:pos="9638"/>
@@ -8069,7 +8069,7 @@
     </w:tbl>
     <w:p>
       <w:pPr>
-        <w:pStyle w:val="Header"/>
+        <w:pStyle w:val="Yltunniste"/>
         <w:tabs>
           <w:tab w:val="clear" w:pos="4819"/>
           <w:tab w:val="clear" w:pos="9638"/>
@@ -8097,7 +8097,7 @@
     </w:p>
     <w:p>
       <w:pPr>
-        <w:pStyle w:val="Heading1"/>
+        <w:pStyle w:val="Otsikko1"/>
         <w:shd w:val="pct10" w:color="auto" w:fill="auto"/>
         <w:spacing w:after="240"/>
         <w:rPr>
@@ -8250,7 +8250,7 @@
     </w:p>
     <w:tbl>
       <w:tblPr>
-        <w:tblStyle w:val="TableGrid"/>
+        <w:tblStyle w:val="TaulukkoRuudukko"/>
         <w:tblW w:w="10373" w:type="dxa"/>
         <w:tblLook w:val="04A0" w:firstRow="1" w:lastRow="0" w:firstColumn="1" w:lastColumn="0" w:noHBand="0" w:noVBand="1"/>
       </w:tblPr>
@@ -8345,7 +8345,7 @@
     </w:p>
     <w:p>
       <w:pPr>
-        <w:pStyle w:val="Heading1"/>
+        <w:pStyle w:val="Otsikko1"/>
         <w:shd w:val="pct10" w:color="auto" w:fill="auto"/>
         <w:spacing w:after="240"/>
         <w:rPr>
@@ -8397,7 +8397,7 @@
     </w:p>
     <w:tbl>
       <w:tblPr>
-        <w:tblStyle w:val="TableGrid"/>
+        <w:tblStyle w:val="TaulukkoRuudukko"/>
         <w:tblW w:w="0" w:type="auto"/>
         <w:tblLook w:val="04A0" w:firstRow="1" w:lastRow="0" w:firstColumn="1" w:lastColumn="0" w:noHBand="0" w:noVBand="1"/>
       </w:tblPr>
@@ -8819,7 +8819,7 @@
           </w:p>
           <w:tbl>
             <w:tblPr>
-              <w:tblStyle w:val="TableGrid"/>
+              <w:tblStyle w:val="TaulukkoRuudukko"/>
               <w:tblW w:w="0" w:type="auto"/>
               <w:tblLook w:val="04A0" w:firstRow="1" w:lastRow="0" w:firstColumn="1" w:lastColumn="0" w:noHBand="0" w:noVBand="1"/>
             </w:tblPr>
@@ -9370,7 +9370,7 @@
     </w:p>
     <w:tbl>
       <w:tblPr>
-        <w:tblStyle w:val="TableGrid"/>
+        <w:tblStyle w:val="TaulukkoRuudukko"/>
         <w:tblW w:w="10343" w:type="dxa"/>
         <w:tblLook w:val="04A0" w:firstRow="1" w:lastRow="0" w:firstColumn="1" w:lastColumn="0" w:noHBand="0" w:noVBand="1"/>
       </w:tblPr>
@@ -9971,7 +9971,7 @@
           </w:p>
           <w:tbl>
             <w:tblPr>
-              <w:tblStyle w:val="TableGrid"/>
+              <w:tblStyle w:val="TaulukkoRuudukko"/>
               <w:tblW w:w="0" w:type="auto"/>
               <w:tblLook w:val="04A0" w:firstRow="1" w:lastRow="0" w:firstColumn="1" w:lastColumn="0" w:noHBand="0" w:noVBand="1"/>
             </w:tblPr>
@@ -11162,7 +11162,7 @@
     </w:p>
     <w:tbl>
       <w:tblPr>
-        <w:tblStyle w:val="TableGrid"/>
+        <w:tblStyle w:val="TaulukkoRuudukko"/>
         <w:tblW w:w="0" w:type="auto"/>
         <w:tblLook w:val="04A0" w:firstRow="1" w:lastRow="0" w:firstColumn="1" w:lastColumn="0" w:noHBand="0" w:noVBand="1"/>
       </w:tblPr>
@@ -11434,51 +11434,29 @@
             </w:pPr>
             <w:r>
               <w:rPr>
-                <w:rFonts w:ascii="Verdana" w:hAnsi="Verdana" w:cs="Verdana"/>
-                <w:b/>
-                <w:bCs/>
-                <w:sz w:val="20"/>
-                <w:szCs w:val="20"/>
-              </w:rPr>
-              <w:t>Luokkakaavio (UML)</w:t>
-            </w:r>
-          </w:p>
-          <w:p>
-            <w:pPr>
-              <w:spacing w:line="276" w:lineRule="auto"/>
-              <w:rPr>
-                <w:rFonts w:ascii="Verdana" w:hAnsi="Verdana" w:cs="Verdana"/>
-                <w:b/>
-                <w:bCs/>
-                <w:sz w:val="20"/>
-                <w:szCs w:val="20"/>
-              </w:rPr>
-            </w:pPr>
-            <w:r>
-              <w:rPr>
                 <w:noProof/>
               </w:rPr>
               <w:drawing>
-                <wp:anchor distT="0" distB="0" distL="114300" distR="114300" simplePos="0" relativeHeight="251667456" behindDoc="1" locked="0" layoutInCell="1" allowOverlap="1" wp14:anchorId="12F8471C" wp14:editId="454D4467">
+                <wp:anchor distT="0" distB="0" distL="114300" distR="114300" simplePos="0" relativeHeight="251667456" behindDoc="0" locked="0" layoutInCell="1" allowOverlap="1" wp14:anchorId="71606CEB" wp14:editId="6B079A70">
                   <wp:simplePos x="0" y="0"/>
                   <wp:positionH relativeFrom="column">
-                    <wp:posOffset>1850390</wp:posOffset>
+                    <wp:posOffset>2842895</wp:posOffset>
                   </wp:positionH>
                   <wp:positionV relativeFrom="paragraph">
-                    <wp:posOffset>50165</wp:posOffset>
+                    <wp:posOffset>137160</wp:posOffset>
                   </wp:positionV>
-                  <wp:extent cx="2759710" cy="3216910"/>
-                  <wp:effectExtent l="0" t="0" r="2540" b="2540"/>
-                  <wp:wrapTight wrapText="bothSides">
+                  <wp:extent cx="2813685" cy="3185160"/>
+                  <wp:effectExtent l="0" t="0" r="5715" b="0"/>
+                  <wp:wrapThrough wrapText="bothSides">
                     <wp:wrapPolygon edited="0">
                       <wp:start x="0" y="0"/>
-                      <wp:lineTo x="0" y="21489"/>
-                      <wp:lineTo x="21471" y="21489"/>
-                      <wp:lineTo x="21471" y="0"/>
+                      <wp:lineTo x="0" y="21445"/>
+                      <wp:lineTo x="21498" y="21445"/>
+                      <wp:lineTo x="21498" y="0"/>
                       <wp:lineTo x="0" y="0"/>
                     </wp:wrapPolygon>
-                  </wp:wrapTight>
-                  <wp:docPr id="1767602333" name="drawing"/>
+                  </wp:wrapThrough>
+                  <wp:docPr id="865426976" name="Kuva 1"/>
                   <wp:cNvGraphicFramePr>
                     <a:graphicFrameLocks xmlns:a="http://schemas.openxmlformats.org/drawingml/2006/main" noChangeAspect="1"/>
                   </wp:cNvGraphicFramePr>
@@ -11486,42 +11464,65 @@
                     <a:graphicData uri="http://schemas.openxmlformats.org/drawingml/2006/picture">
                       <pic:pic xmlns:pic="http://schemas.openxmlformats.org/drawingml/2006/picture">
                         <pic:nvPicPr>
-                          <pic:cNvPr id="1767602333" name=""/>
-                          <pic:cNvPicPr/>
+                          <pic:cNvPr id="0" name="Picture 1"/>
+                          <pic:cNvPicPr>
+                            <a:picLocks noChangeAspect="1" noChangeArrowheads="1"/>
+                          </pic:cNvPicPr>
                         </pic:nvPicPr>
                         <pic:blipFill>
                           <a:blip r:embed="rId19">
                             <a:extLst>
                               <a:ext uri="{28A0092B-C50C-407E-A947-70E740481C1C}">
-                                <a14:useLocalDpi xmlns:a14="http://schemas.microsoft.com/office/drawing/2010/main"/>
+                                <a14:useLocalDpi xmlns:a14="http://schemas.microsoft.com/office/drawing/2010/main" val="0"/>
                               </a:ext>
                             </a:extLst>
                           </a:blip>
+                          <a:srcRect/>
                           <a:stretch>
                             <a:fillRect/>
                           </a:stretch>
                         </pic:blipFill>
-                        <pic:spPr>
+                        <pic:spPr bwMode="auto">
                           <a:xfrm>
                             <a:off x="0" y="0"/>
-                            <a:ext cx="2759710" cy="3216910"/>
+                            <a:ext cx="2813685" cy="3185160"/>
                           </a:xfrm>
                           <a:prstGeom prst="rect">
                             <a:avLst/>
                           </a:prstGeom>
+                          <a:noFill/>
+                          <a:ln>
+                            <a:noFill/>
+                          </a:ln>
                         </pic:spPr>
                       </pic:pic>
                     </a:graphicData>
                   </a:graphic>
-                  <wp14:sizeRelH relativeFrom="margin">
-                    <wp14:pctWidth>0</wp14:pctWidth>
-                  </wp14:sizeRelH>
-                  <wp14:sizeRelV relativeFrom="margin">
-                    <wp14:pctHeight>0</wp14:pctHeight>
-                  </wp14:sizeRelV>
                 </wp:anchor>
               </w:drawing>
             </w:r>
+            <w:r>
+              <w:rPr>
+                <w:rFonts w:ascii="Verdana" w:hAnsi="Verdana" w:cs="Verdana"/>
+                <w:b/>
+                <w:bCs/>
+                <w:sz w:val="20"/>
+                <w:szCs w:val="20"/>
+              </w:rPr>
+              <w:t>Luokkakaavio (UML)</w:t>
+            </w:r>
+          </w:p>
+          <w:p>
+            <w:pPr>
+              <w:spacing w:line="276" w:lineRule="auto"/>
+              <w:rPr>
+                <w:rFonts w:ascii="Verdana" w:hAnsi="Verdana" w:cs="Verdana"/>
+                <w:b/>
+                <w:bCs/>
+                <w:sz w:val="20"/>
+                <w:szCs w:val="20"/>
+              </w:rPr>
+            </w:pPr>
           </w:p>
         </w:tc>
       </w:tr>
@@ -11597,13 +11598,13 @@
           </w:p>
           <w:tbl>
             <w:tblPr>
-              <w:tblStyle w:val="TableGrid"/>
+              <w:tblStyle w:val="TaulukkoRuudukko"/>
               <w:tblW w:w="0" w:type="auto"/>
               <w:tblLook w:val="04A0" w:firstRow="1" w:lastRow="0" w:firstColumn="1" w:lastColumn="0" w:noHBand="0" w:noVBand="1"/>
             </w:tblPr>
             <w:tblGrid>
-              <w:gridCol w:w="2905"/>
-              <w:gridCol w:w="6484"/>
+              <w:gridCol w:w="2761"/>
+              <w:gridCol w:w="6628"/>
             </w:tblGrid>
             <w:tr>
               <w:trPr>
@@ -12152,7 +12153,7 @@
                       <w:sz w:val="20"/>
                       <w:szCs w:val="20"/>
                     </w:rPr>
-                    <w:t>PäivitäTapahtumat</w:t>
+                    <w:t>näytäSivu</w:t>
                   </w:r>
                   <w:proofErr w:type="spellEnd"/>
                   <w:r>
@@ -12164,58 +12165,7 @@
                     </w:rPr>
                     <w:t>(</w:t>
                   </w:r>
-                  <w:proofErr w:type="spellStart"/>
                   <w:proofErr w:type="gramEnd"/>
-                  <w:r>
-                    <w:rPr>
-                      <w:rFonts w:ascii="Verdana" w:hAnsi="Verdana" w:cs="Verdana"/>
-                      <w:color w:val="000000" w:themeColor="text1"/>
-                      <w:sz w:val="20"/>
-                      <w:szCs w:val="20"/>
-                    </w:rPr>
-                    <w:t>const</w:t>
-                  </w:r>
-                  <w:proofErr w:type="spellEnd"/>
-                  <w:r>
-                    <w:rPr>
-                      <w:rFonts w:ascii="Verdana" w:hAnsi="Verdana" w:cs="Verdana"/>
-                      <w:color w:val="000000" w:themeColor="text1"/>
-                      <w:sz w:val="20"/>
-                      <w:szCs w:val="20"/>
-                    </w:rPr>
-                    <w:t xml:space="preserve"> </w:t>
-                  </w:r>
-                  <w:proofErr w:type="spellStart"/>
-                  <w:r>
-                    <w:rPr>
-                      <w:rFonts w:ascii="Verdana" w:hAnsi="Verdana" w:cs="Verdana"/>
-                      <w:color w:val="000000" w:themeColor="text1"/>
-                      <w:sz w:val="20"/>
-                      <w:szCs w:val="20"/>
-                    </w:rPr>
-                    <w:t>QVector</w:t>
-                  </w:r>
-                  <w:proofErr w:type="spellEnd"/>
-                  <w:r>
-                    <w:rPr>
-                      <w:rFonts w:ascii="Verdana" w:hAnsi="Verdana" w:cs="Verdana"/>
-                      <w:color w:val="000000" w:themeColor="text1"/>
-                      <w:sz w:val="20"/>
-                      <w:szCs w:val="20"/>
-                    </w:rPr>
-                    <w:t xml:space="preserve">&lt;tilitapahtumat&gt;&amp; </w:t>
-                  </w:r>
-                  <w:proofErr w:type="spellStart"/>
-                  <w:r>
-                    <w:rPr>
-                      <w:rFonts w:ascii="Verdana" w:hAnsi="Verdana" w:cs="Verdana"/>
-                      <w:color w:val="000000" w:themeColor="text1"/>
-                      <w:sz w:val="20"/>
-                      <w:szCs w:val="20"/>
-                    </w:rPr>
-                    <w:t>kaikkitilitapahtumat</w:t>
-                  </w:r>
-                  <w:proofErr w:type="spellEnd"/>
                   <w:r>
                     <w:rPr>
                       <w:rFonts w:ascii="Verdana" w:hAnsi="Verdana" w:cs="Verdana"/>
@@ -12252,7 +12202,6 @@
                       <w:szCs w:val="20"/>
                     </w:rPr>
                   </w:pPr>
-                  <w:proofErr w:type="spellStart"/>
                   <w:r>
                     <w:rPr>
                       <w:rFonts w:ascii="Verdana" w:hAnsi="Verdana" w:cs="Verdana"/>
@@ -12260,9 +12209,8 @@
                       <w:sz w:val="20"/>
                       <w:szCs w:val="20"/>
                     </w:rPr>
-                    <w:t>PäivitäTapahtumat</w:t>
+                    <w:t>P</w:t>
                   </w:r>
-                  <w:proofErr w:type="spellEnd"/>
                   <w:r>
                     <w:rPr>
                       <w:rFonts w:ascii="Verdana" w:hAnsi="Verdana" w:cs="Verdana"/>
@@ -12270,16 +12218,7 @@
                       <w:sz w:val="20"/>
                       <w:szCs w:val="20"/>
                     </w:rPr>
-                    <w:t xml:space="preserve"> </w:t>
-                  </w:r>
-                  <w:r>
-                    <w:rPr>
-                      <w:rFonts w:ascii="Verdana" w:hAnsi="Verdana" w:cs="Verdana"/>
-                      <w:color w:val="000000" w:themeColor="text1"/>
-                      <w:sz w:val="20"/>
-                      <w:szCs w:val="20"/>
-                    </w:rPr>
-                    <w:t>päivittää</w:t>
+                    <w:t>äivittää</w:t>
                   </w:r>
                   <w:r>
                     <w:rPr>
@@ -12431,7 +12370,7 @@
     </w:p>
     <w:tbl>
       <w:tblPr>
-        <w:tblStyle w:val="TableGrid"/>
+        <w:tblStyle w:val="TaulukkoRuudukko"/>
         <w:tblW w:w="0" w:type="auto"/>
         <w:tblLook w:val="04A0" w:firstRow="1" w:lastRow="0" w:firstColumn="1" w:lastColumn="0" w:noHBand="0" w:noVBand="1"/>
       </w:tblPr>
@@ -12844,7 +12783,7 @@
           </w:p>
           <w:tbl>
             <w:tblPr>
-              <w:tblStyle w:val="TableGrid"/>
+              <w:tblStyle w:val="TaulukkoRuudukko"/>
               <w:tblW w:w="0" w:type="auto"/>
               <w:tblInd w:w="15" w:type="dxa"/>
               <w:tblLook w:val="04A0" w:firstRow="1" w:lastRow="0" w:firstColumn="1" w:lastColumn="0" w:noHBand="0" w:noVBand="1"/>
@@ -13800,7 +13739,7 @@
     </w:p>
     <w:p>
       <w:pPr>
-        <w:pStyle w:val="Heading1"/>
+        <w:pStyle w:val="Otsikko1"/>
         <w:shd w:val="pct10" w:color="auto" w:fill="auto"/>
         <w:spacing w:after="240"/>
         <w:rPr>
@@ -13820,7 +13759,7 @@
     </w:p>
     <w:p>
       <w:pPr>
-        <w:pStyle w:val="ListParagraph"/>
+        <w:pStyle w:val="Luettelokappale"/>
         <w:keepNext/>
         <w:numPr>
           <w:ilvl w:val="0"/>
@@ -13838,7 +13777,7 @@
     </w:p>
     <w:p>
       <w:pPr>
-        <w:pStyle w:val="ListParagraph"/>
+        <w:pStyle w:val="Luettelokappale"/>
         <w:keepNext/>
         <w:numPr>
           <w:ilvl w:val="0"/>
@@ -13856,7 +13795,7 @@
     </w:p>
     <w:p>
       <w:pPr>
-        <w:pStyle w:val="ListParagraph"/>
+        <w:pStyle w:val="Luettelokappale"/>
         <w:keepNext/>
         <w:numPr>
           <w:ilvl w:val="0"/>
@@ -13874,7 +13813,7 @@
     </w:p>
     <w:p>
       <w:pPr>
-        <w:pStyle w:val="Heading2"/>
+        <w:pStyle w:val="Otsikko2"/>
         <w:spacing w:line="360" w:lineRule="auto"/>
         <w:rPr>
           <w:rFonts w:ascii="Verdana" w:hAnsi="Verdana" w:cs="Verdana"/>
@@ -13938,7 +13877,7 @@
     </w:p>
     <w:tbl>
       <w:tblPr>
-        <w:tblStyle w:val="TableGrid"/>
+        <w:tblStyle w:val="TaulukkoRuudukko"/>
         <w:tblW w:w="19416" w:type="dxa"/>
         <w:tblLook w:val="04A0" w:firstRow="1" w:lastRow="0" w:firstColumn="1" w:lastColumn="0" w:noHBand="0" w:noVBand="1"/>
       </w:tblPr>
@@ -13972,7 +13911,6 @@
                 <w:noProof/>
                 <w:color w:val="FF0000"/>
               </w:rPr>
-              <w:lastRenderedPageBreak/>
               <w:drawing>
                 <wp:anchor distT="0" distB="0" distL="114300" distR="114300" simplePos="0" relativeHeight="251666432" behindDoc="1" locked="0" layoutInCell="1" allowOverlap="1" wp14:anchorId="417B1A9A" wp14:editId="6012FDD4">
                   <wp:simplePos x="0" y="0"/>
@@ -14084,7 +14022,7 @@
     </w:p>
     <w:p>
       <w:pPr>
-        <w:pStyle w:val="Heading2"/>
+        <w:pStyle w:val="Otsikko2"/>
         <w:spacing w:line="360" w:lineRule="auto"/>
         <w:rPr>
           <w:rFonts w:ascii="Verdana" w:hAnsi="Verdana" w:cs="Verdana"/>
@@ -14152,7 +14090,7 @@
     </w:p>
     <w:p>
       <w:pPr>
-        <w:pStyle w:val="Header"/>
+        <w:pStyle w:val="Yltunniste"/>
         <w:tabs>
           <w:tab w:val="clear" w:pos="4819"/>
           <w:tab w:val="clear" w:pos="9638"/>
@@ -14165,7 +14103,7 @@
     </w:p>
     <w:tbl>
       <w:tblPr>
-        <w:tblStyle w:val="TableGrid"/>
+        <w:tblStyle w:val="TaulukkoRuudukko"/>
         <w:tblW w:w="9898" w:type="dxa"/>
         <w:tblLook w:val="04A0" w:firstRow="1" w:lastRow="0" w:firstColumn="1" w:lastColumn="0" w:noHBand="0" w:noVBand="1"/>
       </w:tblPr>
@@ -14481,7 +14419,7 @@
     </w:p>
     <w:p>
       <w:pPr>
-        <w:pStyle w:val="Heading1"/>
+        <w:pStyle w:val="Otsikko1"/>
         <w:shd w:val="pct10" w:color="auto" w:fill="auto"/>
         <w:spacing w:after="240"/>
         <w:rPr>
@@ -14502,7 +14440,7 @@
     </w:p>
     <w:p>
       <w:pPr>
-        <w:pStyle w:val="Header"/>
+        <w:pStyle w:val="Yltunniste"/>
         <w:tabs>
           <w:tab w:val="clear" w:pos="4819"/>
           <w:tab w:val="clear" w:pos="9638"/>
@@ -14565,7 +14503,7 @@
     </w:p>
     <w:p>
       <w:pPr>
-        <w:pStyle w:val="Header"/>
+        <w:pStyle w:val="Yltunniste"/>
         <w:tabs>
           <w:tab w:val="clear" w:pos="4819"/>
           <w:tab w:val="clear" w:pos="9638"/>
@@ -14648,7 +14586,7 @@
     </w:p>
     <w:p>
       <w:pPr>
-        <w:pStyle w:val="Header"/>
+        <w:pStyle w:val="Yltunniste"/>
         <w:tabs>
           <w:tab w:val="clear" w:pos="4819"/>
           <w:tab w:val="clear" w:pos="9638"/>
@@ -17380,7 +17318,7 @@
     <w:lvl w:ilvl="7">
       <w:start w:val="1"/>
       <w:numFmt w:val="decimal"/>
-      <w:pStyle w:val="Heading8"/>
+      <w:pStyle w:val="Otsikko8"/>
       <w:lvlText w:val="%1.%2.%3.%4.%5.%6.%7.%8"/>
       <w:lvlJc w:val="left"/>
       <w:pPr>
@@ -17396,7 +17334,7 @@
     <w:lvl w:ilvl="8">
       <w:start w:val="1"/>
       <w:numFmt w:val="decimal"/>
-      <w:pStyle w:val="Heading9"/>
+      <w:pStyle w:val="Otsikko9"/>
       <w:lvlText w:val="%1.%2.%3.%4.%5.%6.%7.%8.%9"/>
       <w:lvlJc w:val="left"/>
       <w:pPr>
@@ -18856,7 +18794,7 @@
     <w:lsdException w:name="Unresolved Mention" w:semiHidden="1" w:unhideWhenUsed="1"/>
     <w:lsdException w:name="Smart Link" w:semiHidden="1" w:unhideWhenUsed="1"/>
   </w:latentStyles>
-  <w:style w:type="paragraph" w:default="1" w:styleId="Normal">
+  <w:style w:type="paragraph" w:default="1" w:styleId="Normaali">
     <w:name w:val="Normal"/>
     <w:qFormat/>
     <w:pPr>
@@ -18869,11 +18807,11 @@
       <w:lang w:eastAsia="en-US"/>
     </w:rPr>
   </w:style>
-  <w:style w:type="paragraph" w:styleId="Heading1">
+  <w:style w:type="paragraph" w:styleId="Otsikko1">
     <w:name w:val="heading 1"/>
-    <w:basedOn w:val="Normal"/>
-    <w:next w:val="Normal"/>
-    <w:link w:val="Heading1Char"/>
+    <w:basedOn w:val="Normaali"/>
+    <w:next w:val="Normaali"/>
+    <w:link w:val="Otsikko1Char"/>
     <w:uiPriority w:val="99"/>
     <w:qFormat/>
     <w:pPr>
@@ -18890,11 +18828,11 @@
       <w:szCs w:val="32"/>
     </w:rPr>
   </w:style>
-  <w:style w:type="paragraph" w:styleId="Heading2">
+  <w:style w:type="paragraph" w:styleId="Otsikko2">
     <w:name w:val="heading 2"/>
-    <w:basedOn w:val="Normal"/>
-    <w:next w:val="Normal"/>
-    <w:link w:val="Heading2Char"/>
+    <w:basedOn w:val="Normaali"/>
+    <w:next w:val="Normaali"/>
+    <w:link w:val="Otsikko2Char"/>
     <w:uiPriority w:val="99"/>
     <w:qFormat/>
     <w:pPr>
@@ -18912,11 +18850,11 @@
       <w:szCs w:val="28"/>
     </w:rPr>
   </w:style>
-  <w:style w:type="paragraph" w:styleId="Heading3">
+  <w:style w:type="paragraph" w:styleId="Otsikko3">
     <w:name w:val="heading 3"/>
-    <w:basedOn w:val="Normal"/>
-    <w:next w:val="Normal"/>
-    <w:link w:val="Heading3Char"/>
+    <w:basedOn w:val="Normaali"/>
+    <w:next w:val="Normaali"/>
+    <w:link w:val="Otsikko3Char"/>
     <w:uiPriority w:val="99"/>
     <w:qFormat/>
     <w:pPr>
@@ -18932,11 +18870,11 @@
       <w:szCs w:val="26"/>
     </w:rPr>
   </w:style>
-  <w:style w:type="paragraph" w:styleId="Heading4">
+  <w:style w:type="paragraph" w:styleId="Otsikko4">
     <w:name w:val="heading 4"/>
-    <w:basedOn w:val="Normal"/>
-    <w:next w:val="Normal"/>
-    <w:link w:val="Heading4Char"/>
+    <w:basedOn w:val="Normaali"/>
+    <w:next w:val="Normaali"/>
+    <w:link w:val="Otsikko4Char"/>
     <w:uiPriority w:val="99"/>
     <w:qFormat/>
     <w:pPr>
@@ -18954,11 +18892,11 @@
       <w:szCs w:val="22"/>
     </w:rPr>
   </w:style>
-  <w:style w:type="paragraph" w:styleId="Heading5">
+  <w:style w:type="paragraph" w:styleId="Otsikko5">
     <w:name w:val="heading 5"/>
-    <w:basedOn w:val="Normal"/>
-    <w:next w:val="Normal"/>
-    <w:link w:val="Heading5Char"/>
+    <w:basedOn w:val="Normaali"/>
+    <w:next w:val="Normaali"/>
+    <w:link w:val="Otsikko5Char"/>
     <w:uiPriority w:val="99"/>
     <w:qFormat/>
     <w:pPr>
@@ -18973,11 +18911,11 @@
       <w:szCs w:val="20"/>
     </w:rPr>
   </w:style>
-  <w:style w:type="paragraph" w:styleId="Heading6">
+  <w:style w:type="paragraph" w:styleId="Otsikko6">
     <w:name w:val="heading 6"/>
-    <w:basedOn w:val="Normal"/>
-    <w:next w:val="Normal"/>
-    <w:link w:val="Heading6Char"/>
+    <w:basedOn w:val="Normaali"/>
+    <w:next w:val="Normaali"/>
+    <w:link w:val="Otsikko6Char"/>
     <w:uiPriority w:val="99"/>
     <w:qFormat/>
     <w:pPr>
@@ -18993,11 +18931,11 @@
       <w:szCs w:val="20"/>
     </w:rPr>
   </w:style>
-  <w:style w:type="paragraph" w:styleId="Heading7">
+  <w:style w:type="paragraph" w:styleId="Otsikko7">
     <w:name w:val="heading 7"/>
-    <w:basedOn w:val="Normal"/>
-    <w:next w:val="Normal"/>
-    <w:link w:val="Heading7Char"/>
+    <w:basedOn w:val="Normaali"/>
+    <w:next w:val="Normaali"/>
+    <w:link w:val="Otsikko7Char"/>
     <w:uiPriority w:val="99"/>
     <w:qFormat/>
     <w:pPr>
@@ -19013,11 +18951,11 @@
       <w:szCs w:val="48"/>
     </w:rPr>
   </w:style>
-  <w:style w:type="paragraph" w:styleId="Heading8">
+  <w:style w:type="paragraph" w:styleId="Otsikko8">
     <w:name w:val="heading 8"/>
-    <w:basedOn w:val="Normal"/>
-    <w:next w:val="BodyText"/>
-    <w:link w:val="Heading8Char"/>
+    <w:basedOn w:val="Normaali"/>
+    <w:next w:val="Leipteksti"/>
+    <w:link w:val="Otsikko8Char"/>
     <w:uiPriority w:val="99"/>
     <w:qFormat/>
     <w:pPr>
@@ -19041,11 +18979,11 @@
       <w:lang w:val="en-AU"/>
     </w:rPr>
   </w:style>
-  <w:style w:type="paragraph" w:styleId="Heading9">
+  <w:style w:type="paragraph" w:styleId="Otsikko9">
     <w:name w:val="heading 9"/>
-    <w:basedOn w:val="Normal"/>
-    <w:next w:val="BodyText"/>
-    <w:link w:val="Heading9Char"/>
+    <w:basedOn w:val="Normaali"/>
+    <w:next w:val="Leipteksti"/>
+    <w:link w:val="Otsikko9Char"/>
     <w:uiPriority w:val="99"/>
     <w:qFormat/>
     <w:pPr>
@@ -19067,13 +19005,13 @@
       <w:lang w:val="en-AU"/>
     </w:rPr>
   </w:style>
-  <w:style w:type="character" w:default="1" w:styleId="DefaultParagraphFont">
+  <w:style w:type="character" w:default="1" w:styleId="Kappaleenoletusfontti">
     <w:name w:val="Default Paragraph Font"/>
     <w:uiPriority w:val="1"/>
     <w:semiHidden/>
     <w:unhideWhenUsed/>
   </w:style>
-  <w:style w:type="table" w:default="1" w:styleId="TableNormal">
+  <w:style w:type="table" w:default="1" w:styleId="Normaalitaulukko">
     <w:name w:val="Normal Table"/>
     <w:uiPriority w:val="99"/>
     <w:semiHidden/>
@@ -19088,15 +19026,15 @@
       </w:tblCellMar>
     </w:tblPr>
   </w:style>
-  <w:style w:type="numbering" w:default="1" w:styleId="NoList">
+  <w:style w:type="numbering" w:default="1" w:styleId="Eiluetteloa">
     <w:name w:val="No List"/>
     <w:uiPriority w:val="99"/>
     <w:semiHidden/>
     <w:unhideWhenUsed/>
   </w:style>
-  <w:style w:type="character" w:customStyle="1" w:styleId="Heading1Char">
-    <w:name w:val="Heading 1 Char"/>
-    <w:link w:val="Heading1"/>
+  <w:style w:type="character" w:customStyle="1" w:styleId="Otsikko1Char">
+    <w:name w:val="Otsikko 1 Char"/>
+    <w:link w:val="Otsikko1"/>
     <w:uiPriority w:val="99"/>
     <w:locked/>
     <w:rPr>
@@ -19109,9 +19047,9 @@
       <w:lang w:val="fi-FI" w:eastAsia="x-none"/>
     </w:rPr>
   </w:style>
-  <w:style w:type="character" w:customStyle="1" w:styleId="Heading2Char">
-    <w:name w:val="Heading 2 Char"/>
-    <w:link w:val="Heading2"/>
+  <w:style w:type="character" w:customStyle="1" w:styleId="Otsikko2Char">
+    <w:name w:val="Otsikko 2 Char"/>
+    <w:link w:val="Otsikko2"/>
     <w:uiPriority w:val="99"/>
     <w:locked/>
     <w:rPr>
@@ -19125,9 +19063,9 @@
       <w:lang w:val="fi-FI" w:eastAsia="x-none"/>
     </w:rPr>
   </w:style>
-  <w:style w:type="character" w:customStyle="1" w:styleId="Heading3Char">
-    <w:name w:val="Heading 3 Char"/>
-    <w:link w:val="Heading3"/>
+  <w:style w:type="character" w:customStyle="1" w:styleId="Otsikko3Char">
+    <w:name w:val="Otsikko 3 Char"/>
+    <w:link w:val="Otsikko3"/>
     <w:uiPriority w:val="9"/>
     <w:semiHidden/>
     <w:locked/>
@@ -19140,9 +19078,9 @@
       <w:lang w:val="fi-FI" w:eastAsia="x-none"/>
     </w:rPr>
   </w:style>
-  <w:style w:type="character" w:customStyle="1" w:styleId="Heading4Char">
-    <w:name w:val="Heading 4 Char"/>
-    <w:link w:val="Heading4"/>
+  <w:style w:type="character" w:customStyle="1" w:styleId="Otsikko4Char">
+    <w:name w:val="Otsikko 4 Char"/>
+    <w:link w:val="Otsikko4"/>
     <w:uiPriority w:val="9"/>
     <w:semiHidden/>
     <w:locked/>
@@ -19155,9 +19093,9 @@
       <w:lang w:val="fi-FI" w:eastAsia="x-none"/>
     </w:rPr>
   </w:style>
-  <w:style w:type="character" w:customStyle="1" w:styleId="Heading5Char">
-    <w:name w:val="Heading 5 Char"/>
-    <w:link w:val="Heading5"/>
+  <w:style w:type="character" w:customStyle="1" w:styleId="Otsikko5Char">
+    <w:name w:val="Otsikko 5 Char"/>
+    <w:link w:val="Otsikko5"/>
     <w:uiPriority w:val="9"/>
     <w:semiHidden/>
     <w:locked/>
@@ -19172,9 +19110,9 @@
       <w:lang w:val="fi-FI" w:eastAsia="x-none"/>
     </w:rPr>
   </w:style>
-  <w:style w:type="character" w:customStyle="1" w:styleId="Heading6Char">
-    <w:name w:val="Heading 6 Char"/>
-    <w:link w:val="Heading6"/>
+  <w:style w:type="character" w:customStyle="1" w:styleId="Otsikko6Char">
+    <w:name w:val="Otsikko 6 Char"/>
+    <w:link w:val="Otsikko6"/>
     <w:uiPriority w:val="9"/>
     <w:semiHidden/>
     <w:locked/>
@@ -19185,9 +19123,9 @@
       <w:lang w:val="fi-FI" w:eastAsia="x-none"/>
     </w:rPr>
   </w:style>
-  <w:style w:type="character" w:customStyle="1" w:styleId="Heading7Char">
-    <w:name w:val="Heading 7 Char"/>
-    <w:link w:val="Heading7"/>
+  <w:style w:type="character" w:customStyle="1" w:styleId="Otsikko7Char">
+    <w:name w:val="Otsikko 7 Char"/>
+    <w:link w:val="Otsikko7"/>
     <w:uiPriority w:val="9"/>
     <w:semiHidden/>
     <w:locked/>
@@ -19198,9 +19136,9 @@
       <w:lang w:val="fi-FI" w:eastAsia="x-none"/>
     </w:rPr>
   </w:style>
-  <w:style w:type="character" w:customStyle="1" w:styleId="Heading8Char">
-    <w:name w:val="Heading 8 Char"/>
-    <w:link w:val="Heading8"/>
+  <w:style w:type="character" w:customStyle="1" w:styleId="Otsikko8Char">
+    <w:name w:val="Otsikko 8 Char"/>
+    <w:link w:val="Otsikko8"/>
     <w:uiPriority w:val="9"/>
     <w:semiHidden/>
     <w:locked/>
@@ -19213,9 +19151,9 @@
       <w:lang w:val="fi-FI" w:eastAsia="x-none"/>
     </w:rPr>
   </w:style>
-  <w:style w:type="character" w:customStyle="1" w:styleId="Heading9Char">
-    <w:name w:val="Heading 9 Char"/>
-    <w:link w:val="Heading9"/>
+  <w:style w:type="character" w:customStyle="1" w:styleId="Otsikko9Char">
+    <w:name w:val="Otsikko 9 Char"/>
+    <w:link w:val="Otsikko9"/>
     <w:uiPriority w:val="9"/>
     <w:semiHidden/>
     <w:locked/>
@@ -19224,10 +19162,10 @@
       <w:lang w:val="fi-FI" w:eastAsia="x-none"/>
     </w:rPr>
   </w:style>
-  <w:style w:type="paragraph" w:styleId="Header">
+  <w:style w:type="paragraph" w:styleId="Yltunniste">
     <w:name w:val="header"/>
-    <w:basedOn w:val="Normal"/>
-    <w:link w:val="HeaderChar"/>
+    <w:basedOn w:val="Normaali"/>
+    <w:link w:val="YltunnisteChar"/>
     <w:uiPriority w:val="99"/>
     <w:pPr>
       <w:tabs>
@@ -19236,9 +19174,9 @@
       </w:tabs>
     </w:pPr>
   </w:style>
-  <w:style w:type="character" w:customStyle="1" w:styleId="HeaderChar">
-    <w:name w:val="Header Char"/>
-    <w:link w:val="Header"/>
+  <w:style w:type="character" w:customStyle="1" w:styleId="YltunnisteChar">
+    <w:name w:val="Ylätunniste Char"/>
+    <w:link w:val="Yltunniste"/>
     <w:uiPriority w:val="99"/>
     <w:locked/>
     <w:rPr>
@@ -19248,10 +19186,10 @@
       <w:lang w:val="fi-FI" w:eastAsia="x-none"/>
     </w:rPr>
   </w:style>
-  <w:style w:type="paragraph" w:styleId="Footer">
+  <w:style w:type="paragraph" w:styleId="Alatunniste">
     <w:name w:val="footer"/>
-    <w:basedOn w:val="Normal"/>
-    <w:link w:val="FooterChar"/>
+    <w:basedOn w:val="Normaali"/>
+    <w:link w:val="AlatunnisteChar"/>
     <w:uiPriority w:val="99"/>
     <w:pPr>
       <w:tabs>
@@ -19260,9 +19198,9 @@
       </w:tabs>
     </w:pPr>
   </w:style>
-  <w:style w:type="character" w:customStyle="1" w:styleId="FooterChar">
-    <w:name w:val="Footer Char"/>
-    <w:link w:val="Footer"/>
+  <w:style w:type="character" w:customStyle="1" w:styleId="AlatunnisteChar">
+    <w:name w:val="Alatunniste Char"/>
+    <w:link w:val="Alatunniste"/>
     <w:uiPriority w:val="99"/>
     <w:semiHidden/>
     <w:locked/>
@@ -19273,17 +19211,17 @@
       <w:lang w:val="fi-FI" w:eastAsia="x-none"/>
     </w:rPr>
   </w:style>
-  <w:style w:type="character" w:styleId="PageNumber">
+  <w:style w:type="character" w:styleId="Sivunumero">
     <w:name w:val="page number"/>
     <w:uiPriority w:val="99"/>
     <w:rPr>
       <w:rFonts w:cs="Times New Roman"/>
     </w:rPr>
   </w:style>
-  <w:style w:type="paragraph" w:styleId="TOC1">
+  <w:style w:type="paragraph" w:styleId="Sisluet1">
     <w:name w:val="toc 1"/>
-    <w:basedOn w:val="Normal"/>
-    <w:next w:val="Normal"/>
+    <w:basedOn w:val="Normaali"/>
+    <w:next w:val="Normaali"/>
     <w:autoRedefine/>
     <w:uiPriority w:val="39"/>
     <w:pPr>
@@ -19297,10 +19235,10 @@
       <w:szCs w:val="20"/>
     </w:rPr>
   </w:style>
-  <w:style w:type="paragraph" w:styleId="TOC2">
+  <w:style w:type="paragraph" w:styleId="Sisluet2">
     <w:name w:val="toc 2"/>
-    <w:basedOn w:val="Normal"/>
-    <w:next w:val="Normal"/>
+    <w:basedOn w:val="Normaali"/>
+    <w:next w:val="Normaali"/>
     <w:autoRedefine/>
     <w:uiPriority w:val="39"/>
     <w:pPr>
@@ -19312,10 +19250,10 @@
       <w:szCs w:val="20"/>
     </w:rPr>
   </w:style>
-  <w:style w:type="paragraph" w:styleId="TOC3">
+  <w:style w:type="paragraph" w:styleId="Sisluet3">
     <w:name w:val="toc 3"/>
-    <w:basedOn w:val="Normal"/>
-    <w:next w:val="Normal"/>
+    <w:basedOn w:val="Normaali"/>
+    <w:next w:val="Normaali"/>
     <w:autoRedefine/>
     <w:uiPriority w:val="99"/>
     <w:semiHidden/>
@@ -19329,10 +19267,10 @@
       <w:szCs w:val="20"/>
     </w:rPr>
   </w:style>
-  <w:style w:type="paragraph" w:styleId="TOC4">
+  <w:style w:type="paragraph" w:styleId="Sisluet4">
     <w:name w:val="toc 4"/>
-    <w:basedOn w:val="Normal"/>
-    <w:next w:val="Normal"/>
+    <w:basedOn w:val="Normaali"/>
+    <w:next w:val="Normaali"/>
     <w:autoRedefine/>
     <w:uiPriority w:val="99"/>
     <w:semiHidden/>
@@ -19344,10 +19282,10 @@
       <w:szCs w:val="18"/>
     </w:rPr>
   </w:style>
-  <w:style w:type="paragraph" w:styleId="TOC5">
+  <w:style w:type="paragraph" w:styleId="Sisluet5">
     <w:name w:val="toc 5"/>
-    <w:basedOn w:val="Normal"/>
-    <w:next w:val="Normal"/>
+    <w:basedOn w:val="Normaali"/>
+    <w:next w:val="Normaali"/>
     <w:autoRedefine/>
     <w:uiPriority w:val="99"/>
     <w:semiHidden/>
@@ -19359,10 +19297,10 @@
       <w:szCs w:val="18"/>
     </w:rPr>
   </w:style>
-  <w:style w:type="paragraph" w:styleId="TOC6">
+  <w:style w:type="paragraph" w:styleId="Sisluet6">
     <w:name w:val="toc 6"/>
-    <w:basedOn w:val="Normal"/>
-    <w:next w:val="Normal"/>
+    <w:basedOn w:val="Normaali"/>
+    <w:next w:val="Normaali"/>
     <w:autoRedefine/>
     <w:uiPriority w:val="99"/>
     <w:semiHidden/>
@@ -19374,10 +19312,10 @@
       <w:szCs w:val="18"/>
     </w:rPr>
   </w:style>
-  <w:style w:type="paragraph" w:styleId="TOC7">
+  <w:style w:type="paragraph" w:styleId="Sisluet7">
     <w:name w:val="toc 7"/>
-    <w:basedOn w:val="Normal"/>
-    <w:next w:val="Normal"/>
+    <w:basedOn w:val="Normaali"/>
+    <w:next w:val="Normaali"/>
     <w:autoRedefine/>
     <w:uiPriority w:val="99"/>
     <w:semiHidden/>
@@ -19389,10 +19327,10 @@
       <w:szCs w:val="18"/>
     </w:rPr>
   </w:style>
-  <w:style w:type="paragraph" w:styleId="TOC8">
+  <w:style w:type="paragraph" w:styleId="Sisluet8">
     <w:name w:val="toc 8"/>
-    <w:basedOn w:val="Normal"/>
-    <w:next w:val="Normal"/>
+    <w:basedOn w:val="Normaali"/>
+    <w:next w:val="Normaali"/>
     <w:autoRedefine/>
     <w:uiPriority w:val="99"/>
     <w:semiHidden/>
@@ -19404,10 +19342,10 @@
       <w:szCs w:val="18"/>
     </w:rPr>
   </w:style>
-  <w:style w:type="paragraph" w:styleId="TOC9">
+  <w:style w:type="paragraph" w:styleId="Sisluet9">
     <w:name w:val="toc 9"/>
-    <w:basedOn w:val="Normal"/>
-    <w:next w:val="Normal"/>
+    <w:basedOn w:val="Normaali"/>
+    <w:next w:val="Normaali"/>
     <w:autoRedefine/>
     <w:uiPriority w:val="99"/>
     <w:semiHidden/>
@@ -19419,7 +19357,7 @@
       <w:szCs w:val="18"/>
     </w:rPr>
   </w:style>
-  <w:style w:type="character" w:styleId="Hyperlink">
+  <w:style w:type="character" w:styleId="Hyperlinkki">
     <w:name w:val="Hyperlink"/>
     <w:uiPriority w:val="99"/>
     <w:rPr>
@@ -19428,10 +19366,10 @@
       <w:u w:val="single"/>
     </w:rPr>
   </w:style>
-  <w:style w:type="paragraph" w:styleId="BodyText2">
+  <w:style w:type="paragraph" w:styleId="Leipteksti2">
     <w:name w:val="Body Text 2"/>
-    <w:basedOn w:val="Normal"/>
-    <w:link w:val="BodyText2Char"/>
+    <w:basedOn w:val="Normaali"/>
+    <w:link w:val="Leipteksti2Char"/>
     <w:uiPriority w:val="99"/>
     <w:pPr>
       <w:spacing w:after="120" w:line="360" w:lineRule="auto"/>
@@ -19443,9 +19381,9 @@
       <w:szCs w:val="22"/>
     </w:rPr>
   </w:style>
-  <w:style w:type="character" w:customStyle="1" w:styleId="BodyText2Char">
-    <w:name w:val="Body Text 2 Char"/>
-    <w:link w:val="BodyText2"/>
+  <w:style w:type="character" w:customStyle="1" w:styleId="Leipteksti2Char">
+    <w:name w:val="Leipäteksti 2 Char"/>
+    <w:link w:val="Leipteksti2"/>
     <w:uiPriority w:val="99"/>
     <w:semiHidden/>
     <w:locked/>
@@ -19456,10 +19394,10 @@
       <w:lang w:val="fi-FI" w:eastAsia="x-none"/>
     </w:rPr>
   </w:style>
-  <w:style w:type="paragraph" w:styleId="BodyTextIndent2">
+  <w:style w:type="paragraph" w:styleId="Sisennettyleipteksti2">
     <w:name w:val="Body Text Indent 2"/>
-    <w:basedOn w:val="Normal"/>
-    <w:link w:val="BodyTextIndent2Char"/>
+    <w:basedOn w:val="Normaali"/>
+    <w:link w:val="Sisennettyleipteksti2Char"/>
     <w:uiPriority w:val="99"/>
     <w:pPr>
       <w:spacing w:line="360" w:lineRule="auto"/>
@@ -19472,9 +19410,9 @@
       <w:szCs w:val="22"/>
     </w:rPr>
   </w:style>
-  <w:style w:type="character" w:customStyle="1" w:styleId="BodyTextIndent2Char">
-    <w:name w:val="Body Text Indent 2 Char"/>
-    <w:link w:val="BodyTextIndent2"/>
+  <w:style w:type="character" w:customStyle="1" w:styleId="Sisennettyleipteksti2Char">
+    <w:name w:val="Sisennetty leipäteksti 2 Char"/>
+    <w:link w:val="Sisennettyleipteksti2"/>
     <w:uiPriority w:val="99"/>
     <w:semiHidden/>
     <w:locked/>
@@ -19485,10 +19423,10 @@
       <w:lang w:val="fi-FI" w:eastAsia="x-none"/>
     </w:rPr>
   </w:style>
-  <w:style w:type="paragraph" w:styleId="BodyTextIndent3">
+  <w:style w:type="paragraph" w:styleId="Sisennettyleipteksti3">
     <w:name w:val="Body Text Indent 3"/>
-    <w:basedOn w:val="Normal"/>
-    <w:link w:val="BodyTextIndent3Char"/>
+    <w:basedOn w:val="Normaali"/>
+    <w:link w:val="Sisennettyleipteksti3Char"/>
     <w:uiPriority w:val="99"/>
     <w:pPr>
       <w:ind w:left="1080"/>
@@ -19499,9 +19437,9 @@
       <w:szCs w:val="20"/>
     </w:rPr>
   </w:style>
-  <w:style w:type="character" w:customStyle="1" w:styleId="BodyTextIndent3Char">
-    <w:name w:val="Body Text Indent 3 Char"/>
-    <w:link w:val="BodyTextIndent3"/>
+  <w:style w:type="character" w:customStyle="1" w:styleId="Sisennettyleipteksti3Char">
+    <w:name w:val="Sisennetty leipäteksti 3 Char"/>
+    <w:link w:val="Sisennettyleipteksti3"/>
     <w:uiPriority w:val="99"/>
     <w:semiHidden/>
     <w:locked/>
@@ -19512,10 +19450,10 @@
       <w:lang w:val="fi-FI" w:eastAsia="x-none"/>
     </w:rPr>
   </w:style>
-  <w:style w:type="paragraph" w:styleId="FootnoteText">
+  <w:style w:type="paragraph" w:styleId="Alaviitteenteksti">
     <w:name w:val="footnote text"/>
-    <w:basedOn w:val="Normal"/>
-    <w:link w:val="FootnoteTextChar"/>
+    <w:basedOn w:val="Normaali"/>
+    <w:link w:val="AlaviitteentekstiChar"/>
     <w:uiPriority w:val="99"/>
     <w:semiHidden/>
     <w:rPr>
@@ -19523,9 +19461,9 @@
       <w:szCs w:val="20"/>
     </w:rPr>
   </w:style>
-  <w:style w:type="character" w:customStyle="1" w:styleId="FootnoteTextChar">
-    <w:name w:val="Footnote Text Char"/>
-    <w:link w:val="FootnoteText"/>
+  <w:style w:type="character" w:customStyle="1" w:styleId="AlaviitteentekstiChar">
+    <w:name w:val="Alaviitteen teksti Char"/>
+    <w:link w:val="Alaviitteenteksti"/>
     <w:uiPriority w:val="99"/>
     <w:semiHidden/>
     <w:locked/>
@@ -19536,7 +19474,7 @@
       <w:lang w:val="fi-FI" w:eastAsia="x-none"/>
     </w:rPr>
   </w:style>
-  <w:style w:type="character" w:styleId="FootnoteReference">
+  <w:style w:type="character" w:styleId="Alaviitteenviite">
     <w:name w:val="footnote reference"/>
     <w:uiPriority w:val="99"/>
     <w:semiHidden/>
@@ -19545,7 +19483,7 @@
       <w:vertAlign w:val="superscript"/>
     </w:rPr>
   </w:style>
-  <w:style w:type="character" w:styleId="FollowedHyperlink">
+  <w:style w:type="character" w:styleId="AvattuHyperlinkki">
     <w:name w:val="FollowedHyperlink"/>
     <w:uiPriority w:val="99"/>
     <w:rPr>
@@ -19554,10 +19492,10 @@
       <w:u w:val="single"/>
     </w:rPr>
   </w:style>
-  <w:style w:type="paragraph" w:styleId="BodyText">
+  <w:style w:type="paragraph" w:styleId="Leipteksti">
     <w:name w:val="Body Text"/>
-    <w:basedOn w:val="Normal"/>
-    <w:link w:val="BodyTextChar"/>
+    <w:basedOn w:val="Normaali"/>
+    <w:link w:val="LeiptekstiChar"/>
     <w:uiPriority w:val="99"/>
     <w:rPr>
       <w:rFonts w:ascii="Verdana" w:hAnsi="Verdana" w:cs="Verdana"/>
@@ -19565,9 +19503,9 @@
       <w:szCs w:val="22"/>
     </w:rPr>
   </w:style>
-  <w:style w:type="character" w:customStyle="1" w:styleId="BodyTextChar">
-    <w:name w:val="Body Text Char"/>
-    <w:link w:val="BodyText"/>
+  <w:style w:type="character" w:customStyle="1" w:styleId="LeiptekstiChar">
+    <w:name w:val="Leipäteksti Char"/>
+    <w:link w:val="Leipteksti"/>
     <w:uiPriority w:val="99"/>
     <w:semiHidden/>
     <w:locked/>
@@ -19578,10 +19516,10 @@
       <w:lang w:val="fi-FI" w:eastAsia="x-none"/>
     </w:rPr>
   </w:style>
-  <w:style w:type="paragraph" w:styleId="BodyText3">
+  <w:style w:type="paragraph" w:styleId="Leipteksti3">
     <w:name w:val="Body Text 3"/>
-    <w:basedOn w:val="Normal"/>
-    <w:link w:val="BodyText3Char"/>
+    <w:basedOn w:val="Normaali"/>
+    <w:link w:val="Leipteksti3Char"/>
     <w:uiPriority w:val="99"/>
     <w:rPr>
       <w:rFonts w:ascii="Verdana" w:hAnsi="Verdana" w:cs="Verdana"/>
@@ -19589,9 +19527,9 @@
       <w:szCs w:val="20"/>
     </w:rPr>
   </w:style>
-  <w:style w:type="character" w:customStyle="1" w:styleId="BodyText3Char">
-    <w:name w:val="Body Text 3 Char"/>
-    <w:link w:val="BodyText3"/>
+  <w:style w:type="character" w:customStyle="1" w:styleId="Leipteksti3Char">
+    <w:name w:val="Leipäteksti 3 Char"/>
+    <w:link w:val="Leipteksti3"/>
     <w:uiPriority w:val="99"/>
     <w:semiHidden/>
     <w:locked/>
@@ -19602,10 +19540,10 @@
       <w:lang w:val="fi-FI" w:eastAsia="x-none"/>
     </w:rPr>
   </w:style>
-  <w:style w:type="paragraph" w:styleId="DocumentMap">
+  <w:style w:type="paragraph" w:styleId="Asiakirjanrakenneruutu">
     <w:name w:val="Document Map"/>
-    <w:basedOn w:val="Normal"/>
-    <w:link w:val="DocumentMapChar"/>
+    <w:basedOn w:val="Normaali"/>
+    <w:link w:val="AsiakirjanrakenneruutuChar"/>
     <w:uiPriority w:val="99"/>
     <w:semiHidden/>
     <w:pPr>
@@ -19615,9 +19553,9 @@
       <w:rFonts w:ascii="Tahoma" w:hAnsi="Tahoma" w:cs="Tahoma"/>
     </w:rPr>
   </w:style>
-  <w:style w:type="character" w:customStyle="1" w:styleId="DocumentMapChar">
-    <w:name w:val="Document Map Char"/>
-    <w:link w:val="DocumentMap"/>
+  <w:style w:type="character" w:customStyle="1" w:styleId="AsiakirjanrakenneruutuChar">
+    <w:name w:val="Asiakirjan rakenneruutu Char"/>
+    <w:link w:val="Asiakirjanrakenneruutu"/>
     <w:uiPriority w:val="99"/>
     <w:semiHidden/>
     <w:locked/>
@@ -19628,9 +19566,9 @@
       <w:lang w:val="fi-FI" w:eastAsia="x-none"/>
     </w:rPr>
   </w:style>
-  <w:style w:type="paragraph" w:styleId="NormalWeb">
+  <w:style w:type="paragraph" w:styleId="NormaaliWWW">
     <w:name w:val="Normal (Web)"/>
-    <w:basedOn w:val="Normal"/>
+    <w:basedOn w:val="Normaali"/>
     <w:uiPriority w:val="99"/>
     <w:pPr>
       <w:spacing w:before="100" w:after="100"/>
@@ -19638,7 +19576,7 @@
   </w:style>
   <w:style w:type="paragraph" w:customStyle="1" w:styleId="RunkoTeksti">
     <w:name w:val="RunkoTeksti"/>
-    <w:basedOn w:val="Normal"/>
+    <w:basedOn w:val="Normaali"/>
     <w:uiPriority w:val="99"/>
     <w:pPr>
       <w:spacing w:before="120" w:line="360" w:lineRule="auto"/>
@@ -19653,8 +19591,8 @@
   </w:style>
   <w:style w:type="paragraph" w:customStyle="1" w:styleId="HeaderText">
     <w:name w:val="Header Text"/>
-    <w:basedOn w:val="Header"/>
-    <w:next w:val="Header"/>
+    <w:basedOn w:val="Yltunniste"/>
+    <w:next w:val="Yltunniste"/>
     <w:uiPriority w:val="99"/>
     <w:pPr>
       <w:keepLines/>
@@ -19676,7 +19614,7 @@
   </w:style>
   <w:style w:type="paragraph" w:customStyle="1" w:styleId="HeaderText2">
     <w:name w:val="Header Text2"/>
-    <w:basedOn w:val="Header"/>
+    <w:basedOn w:val="Yltunniste"/>
     <w:uiPriority w:val="99"/>
     <w:pPr>
       <w:keepLines/>
@@ -19699,7 +19637,7 @@
   </w:style>
   <w:style w:type="paragraph" w:customStyle="1" w:styleId="Taulukko">
     <w:name w:val="Taulukko"/>
-    <w:basedOn w:val="Normal"/>
+    <w:basedOn w:val="Normaali"/>
     <w:uiPriority w:val="99"/>
     <w:rPr>
       <w:rFonts w:ascii="Arial" w:hAnsi="Arial" w:cs="Arial"/>
@@ -19708,7 +19646,7 @@
       <w:lang w:val="en-GB"/>
     </w:rPr>
   </w:style>
-  <w:style w:type="character" w:styleId="Emphasis">
+  <w:style w:type="character" w:styleId="Korostus">
     <w:name w:val="Emphasis"/>
     <w:uiPriority w:val="99"/>
     <w:qFormat/>
@@ -19718,7 +19656,7 @@
       <w:iCs/>
     </w:rPr>
   </w:style>
-  <w:style w:type="character" w:styleId="CommentReference">
+  <w:style w:type="character" w:styleId="Kommentinviite">
     <w:name w:val="annotation reference"/>
     <w:uiPriority w:val="99"/>
     <w:semiHidden/>
@@ -19729,10 +19667,10 @@
       <w:szCs w:val="16"/>
     </w:rPr>
   </w:style>
-  <w:style w:type="paragraph" w:styleId="CommentText">
+  <w:style w:type="paragraph" w:styleId="Kommentinteksti">
     <w:name w:val="annotation text"/>
-    <w:basedOn w:val="Normal"/>
-    <w:link w:val="CommentTextChar"/>
+    <w:basedOn w:val="Normaali"/>
+    <w:link w:val="KommentintekstiChar"/>
     <w:uiPriority w:val="99"/>
     <w:semiHidden/>
     <w:rsid w:val="00C40E57"/>
@@ -19741,9 +19679,9 @@
       <w:szCs w:val="20"/>
     </w:rPr>
   </w:style>
-  <w:style w:type="character" w:customStyle="1" w:styleId="CommentTextChar">
-    <w:name w:val="Comment Text Char"/>
-    <w:link w:val="CommentText"/>
+  <w:style w:type="character" w:customStyle="1" w:styleId="KommentintekstiChar">
+    <w:name w:val="Kommentin teksti Char"/>
+    <w:link w:val="Kommentinteksti"/>
     <w:uiPriority w:val="99"/>
     <w:semiHidden/>
     <w:locked/>
@@ -19754,11 +19692,11 @@
       <w:lang w:val="fi-FI" w:eastAsia="x-none"/>
     </w:rPr>
   </w:style>
-  <w:style w:type="paragraph" w:styleId="CommentSubject">
+  <w:style w:type="paragraph" w:styleId="Kommentinotsikko">
     <w:name w:val="annotation subject"/>
-    <w:basedOn w:val="CommentText"/>
-    <w:next w:val="CommentText"/>
-    <w:link w:val="CommentSubjectChar"/>
+    <w:basedOn w:val="Kommentinteksti"/>
+    <w:next w:val="Kommentinteksti"/>
+    <w:link w:val="KommentinotsikkoChar"/>
     <w:uiPriority w:val="99"/>
     <w:semiHidden/>
     <w:rsid w:val="00C40E57"/>
@@ -19767,9 +19705,9 @@
       <w:bCs/>
     </w:rPr>
   </w:style>
-  <w:style w:type="character" w:customStyle="1" w:styleId="CommentSubjectChar">
-    <w:name w:val="Comment Subject Char"/>
-    <w:link w:val="CommentSubject"/>
+  <w:style w:type="character" w:customStyle="1" w:styleId="KommentinotsikkoChar">
+    <w:name w:val="Kommentin otsikko Char"/>
+    <w:link w:val="Kommentinotsikko"/>
     <w:uiPriority w:val="99"/>
     <w:semiHidden/>
     <w:locked/>
@@ -19782,10 +19720,10 @@
       <w:lang w:val="fi-FI" w:eastAsia="x-none"/>
     </w:rPr>
   </w:style>
-  <w:style w:type="paragraph" w:styleId="BalloonText">
+  <w:style w:type="paragraph" w:styleId="Seliteteksti">
     <w:name w:val="Balloon Text"/>
-    <w:basedOn w:val="Normal"/>
-    <w:link w:val="BalloonTextChar"/>
+    <w:basedOn w:val="Normaali"/>
+    <w:link w:val="SelitetekstiChar"/>
     <w:uiPriority w:val="99"/>
     <w:semiHidden/>
     <w:rsid w:val="00C40E57"/>
@@ -19795,9 +19733,9 @@
       <w:szCs w:val="16"/>
     </w:rPr>
   </w:style>
-  <w:style w:type="character" w:customStyle="1" w:styleId="BalloonTextChar">
-    <w:name w:val="Balloon Text Char"/>
-    <w:link w:val="BalloonText"/>
+  <w:style w:type="character" w:customStyle="1" w:styleId="SelitetekstiChar">
+    <w:name w:val="Seliteteksti Char"/>
+    <w:link w:val="Seliteteksti"/>
     <w:uiPriority w:val="99"/>
     <w:semiHidden/>
     <w:locked/>
@@ -19816,7 +19754,7 @@
       <w:rFonts w:cs="Times New Roman"/>
     </w:rPr>
   </w:style>
-  <w:style w:type="paragraph" w:styleId="NoSpacing">
+  <w:style w:type="paragraph" w:styleId="Eivli">
     <w:name w:val="No Spacing"/>
     <w:uiPriority w:val="1"/>
     <w:qFormat/>
@@ -19831,9 +19769,9 @@
       <w:lang w:eastAsia="en-US"/>
     </w:rPr>
   </w:style>
-  <w:style w:type="table" w:styleId="TableGrid">
+  <w:style w:type="table" w:styleId="TaulukkoRuudukko">
     <w:name w:val="Table Grid"/>
-    <w:basedOn w:val="TableNormal"/>
+    <w:basedOn w:val="Normaalitaulukko"/>
     <w:uiPriority w:val="59"/>
     <w:rsid w:val="00A36F0B"/>
     <w:tblPr>
@@ -19847,9 +19785,9 @@
       </w:tblBorders>
     </w:tblPr>
   </w:style>
-  <w:style w:type="paragraph" w:styleId="ListParagraph">
+  <w:style w:type="paragraph" w:styleId="Luettelokappale">
     <w:name w:val="List Paragraph"/>
-    <w:basedOn w:val="Normal"/>
+    <w:basedOn w:val="Normaali"/>
     <w:uiPriority w:val="34"/>
     <w:qFormat/>
     <w:rsid w:val="002B190C"/>
@@ -19857,9 +19795,9 @@
       <w:ind w:left="1304"/>
     </w:pPr>
   </w:style>
-  <w:style w:type="character" w:styleId="UnresolvedMention">
+  <w:style w:type="character" w:styleId="Ratkaisematonmaininta">
     <w:name w:val="Unresolved Mention"/>
-    <w:basedOn w:val="DefaultParagraphFont"/>
+    <w:basedOn w:val="Kappaleenoletusfontti"/>
     <w:uiPriority w:val="99"/>
     <w:semiHidden/>
     <w:unhideWhenUsed/>
@@ -20154,10 +20092,6 @@
 </file>
 
 <file path=customXml/item1.xml><?xml version="1.0" encoding="utf-8"?>
-<b:Sources xmlns:b="http://schemas.openxmlformats.org/officeDocument/2006/bibliography" xmlns="http://schemas.openxmlformats.org/officeDocument/2006/bibliography" SelectedStyle="\APA.XSL" StyleName="APA"/>
-</file>
-
-<file path=customXml/item2.xml><?xml version="1.0" encoding="utf-8"?>
 <?mso-contentType ?>
 <FormTemplates xmlns="http://schemas.microsoft.com/sharepoint/v3/contenttype/forms">
   <Display>DocumentLibraryForm</Display>
@@ -20166,18 +20100,11 @@
 </FormTemplates>
 </file>
 
-<file path=customXml/item3.xml><?xml version="1.0" encoding="utf-8"?>
-<p:properties xmlns:p="http://schemas.microsoft.com/office/2006/metadata/properties" xmlns:xsi="http://www.w3.org/2001/XMLSchema-instance" xmlns:pc="http://schemas.microsoft.com/office/infopath/2007/PartnerControls">
-  <documentManagement>
-    <lcf76f155ced4ddcb4097134ff3c332f xmlns="d3831626-fde5-4fc8-acc5-9526b66ab2bb">
-      <Terms xmlns="http://schemas.microsoft.com/office/infopath/2007/PartnerControls"/>
-    </lcf76f155ced4ddcb4097134ff3c332f>
-    <TaxCatchAll xmlns="b5314b1c-0f5c-4851-9378-7099df4806ca" xsi:nil="true"/>
-  </documentManagement>
-</p:properties>
+<file path=customXml/item2.xml><?xml version="1.0" encoding="utf-8"?>
+<b:Sources xmlns:b="http://schemas.openxmlformats.org/officeDocument/2006/bibliography" xmlns="http://schemas.openxmlformats.org/officeDocument/2006/bibliography" SelectedStyle="\APA.XSL" StyleName="APA"/>
 </file>
 
-<file path=customXml/item4.xml><?xml version="1.0" encoding="utf-8"?>
+<file path=customXml/item3.xml><?xml version="1.0" encoding="utf-8"?>
 <ct:contentTypeSchema xmlns:ct="http://schemas.microsoft.com/office/2006/metadata/contentType" xmlns:ma="http://schemas.microsoft.com/office/2006/metadata/properties/metaAttributes" ct:_="" ma:_="" ma:contentTypeName="Document" ma:contentTypeID="0x0101009C12936ABBAE164AB3E3B1E737DB3796" ma:contentTypeVersion="12" ma:contentTypeDescription="Create a new document." ma:contentTypeScope="" ma:versionID="a3c7e968aca90f61141995ffe44e8398">
   <xsd:schema xmlns:xsd="http://www.w3.org/2001/XMLSchema" xmlns:xs="http://www.w3.org/2001/XMLSchema" xmlns:p="http://schemas.microsoft.com/office/2006/metadata/properties" xmlns:ns2="d3831626-fde5-4fc8-acc5-9526b66ab2bb" xmlns:ns3="b5314b1c-0f5c-4851-9378-7099df4806ca" targetNamespace="http://schemas.microsoft.com/office/2006/metadata/properties" ma:root="true" ma:fieldsID="87450be8a9b396dcd3e7509fc153b825" ns2:_="" ns3:_="">
     <xsd:import namespace="d3831626-fde5-4fc8-acc5-9526b66ab2bb"/>
@@ -20378,7 +20305,26 @@
 </ct:contentTypeSchema>
 </file>
 
+<file path=customXml/item4.xml><?xml version="1.0" encoding="utf-8"?>
+<p:properties xmlns:p="http://schemas.microsoft.com/office/2006/metadata/properties" xmlns:xsi="http://www.w3.org/2001/XMLSchema-instance" xmlns:pc="http://schemas.microsoft.com/office/infopath/2007/PartnerControls">
+  <documentManagement>
+    <lcf76f155ced4ddcb4097134ff3c332f xmlns="d3831626-fde5-4fc8-acc5-9526b66ab2bb">
+      <Terms xmlns="http://schemas.microsoft.com/office/infopath/2007/PartnerControls"/>
+    </lcf76f155ced4ddcb4097134ff3c332f>
+    <TaxCatchAll xmlns="b5314b1c-0f5c-4851-9378-7099df4806ca" xsi:nil="true"/>
+  </documentManagement>
+</p:properties>
+</file>
+
 <file path=customXml/itemProps1.xml><?xml version="1.0" encoding="utf-8"?>
+<ds:datastoreItem xmlns:ds="http://schemas.openxmlformats.org/officeDocument/2006/customXml" ds:itemID="{13DB4B30-73AF-4FCD-BA9E-CA11CB4B5807}">
+  <ds:schemaRefs>
+    <ds:schemaRef ds:uri="http://schemas.microsoft.com/sharepoint/v3/contenttype/forms"/>
+  </ds:schemaRefs>
+</ds:datastoreItem>
+</file>
+
+<file path=customXml/itemProps2.xml><?xml version="1.0" encoding="utf-8"?>
 <ds:datastoreItem xmlns:ds="http://schemas.openxmlformats.org/officeDocument/2006/customXml" ds:itemID="{2BA0B919-FBBB-4BB8-90D2-33E6A0B69F94}">
   <ds:schemaRefs>
     <ds:schemaRef ds:uri="http://schemas.openxmlformats.org/officeDocument/2006/bibliography"/>
@@ -20386,26 +20332,7 @@
 </ds:datastoreItem>
 </file>
 
-<file path=customXml/itemProps2.xml><?xml version="1.0" encoding="utf-8"?>
-<ds:datastoreItem xmlns:ds="http://schemas.openxmlformats.org/officeDocument/2006/customXml" ds:itemID="{13DB4B30-73AF-4FCD-BA9E-CA11CB4B5807}">
-  <ds:schemaRefs>
-    <ds:schemaRef ds:uri="http://schemas.microsoft.com/sharepoint/v3/contenttype/forms"/>
-  </ds:schemaRefs>
-</ds:datastoreItem>
-</file>
-
 <file path=customXml/itemProps3.xml><?xml version="1.0" encoding="utf-8"?>
-<ds:datastoreItem xmlns:ds="http://schemas.openxmlformats.org/officeDocument/2006/customXml" ds:itemID="{EE41A236-5C73-4451-B1B7-A171E48F7377}">
-  <ds:schemaRefs>
-    <ds:schemaRef ds:uri="http://schemas.microsoft.com/office/2006/metadata/properties"/>
-    <ds:schemaRef ds:uri="http://schemas.microsoft.com/office/infopath/2007/PartnerControls"/>
-    <ds:schemaRef ds:uri="d3831626-fde5-4fc8-acc5-9526b66ab2bb"/>
-    <ds:schemaRef ds:uri="b5314b1c-0f5c-4851-9378-7099df4806ca"/>
-  </ds:schemaRefs>
-</ds:datastoreItem>
-</file>
-
-<file path=customXml/itemProps4.xml><?xml version="1.0" encoding="utf-8"?>
 <ds:datastoreItem xmlns:ds="http://schemas.openxmlformats.org/officeDocument/2006/customXml" ds:itemID="{3BB198E8-0F36-4C71-8940-04215BB7641E}">
   <ds:schemaRefs>
     <ds:schemaRef ds:uri="http://schemas.microsoft.com/office/2006/metadata/contentType"/>
@@ -20424,6 +20351,17 @@
 </ds:datastoreItem>
 </file>
 
+<file path=customXml/itemProps4.xml><?xml version="1.0" encoding="utf-8"?>
+<ds:datastoreItem xmlns:ds="http://schemas.openxmlformats.org/officeDocument/2006/customXml" ds:itemID="{EE41A236-5C73-4451-B1B7-A171E48F7377}">
+  <ds:schemaRefs>
+    <ds:schemaRef ds:uri="http://schemas.microsoft.com/office/2006/metadata/properties"/>
+    <ds:schemaRef ds:uri="http://schemas.microsoft.com/office/infopath/2007/PartnerControls"/>
+    <ds:schemaRef ds:uri="d3831626-fde5-4fc8-acc5-9526b66ab2bb"/>
+    <ds:schemaRef ds:uri="b5314b1c-0f5c-4851-9378-7099df4806ca"/>
+  </ds:schemaRefs>
+</ds:datastoreItem>
+</file>
+
 <file path=docMetadata/LabelInfo.xml><?xml version="1.0" encoding="utf-8"?>
 <clbl:labelList xmlns:clbl="http://schemas.microsoft.com/office/2020/mipLabelMetadata">
   <clbl:label id="{9f9ce49a-5101-4aa3-8c75-0d5935ad6525}" enabled="0" method="" siteId="{9f9ce49a-5101-4aa3-8c75-0d5935ad6525}" removed="1"/>

</xml_diff>